<commit_message>
Report: frame single-event findings as evaluation weaknesses that motivated the multi-event iteration
Co-Authored-By: Claude Opus 5.5 <noreply@anthropic.com>
</commit_message>
<xml_diff>
--- a/reports/Phase1_Technical_Report.docx
+++ b/reports/Phase1_Technical_Report.docx
@@ -97,7 +97,7 @@
     <w:sdt>
       <w:sdtPr>
         <w:alias w:val="Contents"/>
-        <w:id w:val="-1679344255"/>
+        <w:id w:val="645394645"/>
       </w:sdtPr>
       <w:sdtEndPr/>
       <w:sdtContent>
@@ -125,7 +125,7 @@
           <w:r>
             <w:fldChar w:fldCharType="separate"/>
           </w:r>
-          <w:hyperlink w:anchor="_Toc241530779" w:history="1">
+          <w:hyperlink w:anchor="_Toc241533469" w:history="1">
             <w:r>
               <w:rPr>
                 <w:rStyle w:val="Hyperlink"/>
@@ -149,7 +149,7 @@
               <w:rPr>
                 <w:noProof/>
               </w:rPr>
-              <w:instrText xml:space="preserve"> PAGEREF _Toc241530779 \h </w:instrText>
+              <w:instrText xml:space="preserve"> PAGEREF _Toc241533469 \h </w:instrText>
             </w:r>
             <w:r>
               <w:rPr>
@@ -191,7 +191,7 @@
               <w14:ligatures w14:val="standardContextual"/>
             </w:rPr>
           </w:pPr>
-          <w:hyperlink w:anchor="_Toc241530780" w:history="1">
+          <w:hyperlink w:anchor="_Toc241533470" w:history="1">
             <w:r>
               <w:rPr>
                 <w:rStyle w:val="Hyperlink"/>
@@ -215,7 +215,7 @@
               <w:rPr>
                 <w:noProof/>
               </w:rPr>
-              <w:instrText xml:space="preserve"> PAGEREF _Toc241530780 \h </w:instrText>
+              <w:instrText xml:space="preserve"> PAGEREF _Toc241533470 \h </w:instrText>
             </w:r>
             <w:r>
               <w:rPr>
@@ -257,7 +257,7 @@
               <w14:ligatures w14:val="standardContextual"/>
             </w:rPr>
           </w:pPr>
-          <w:hyperlink w:anchor="_Toc241530781" w:history="1">
+          <w:hyperlink w:anchor="_Toc241533471" w:history="1">
             <w:r>
               <w:rPr>
                 <w:rStyle w:val="Hyperlink"/>
@@ -281,7 +281,7 @@
               <w:rPr>
                 <w:noProof/>
               </w:rPr>
-              <w:instrText xml:space="preserve"> PAGEREF _Toc241530781 \h </w:instrText>
+              <w:instrText xml:space="preserve"> PAGEREF _Toc241533471 \h </w:instrText>
             </w:r>
             <w:r>
               <w:rPr>
@@ -323,13 +323,13 @@
               <w14:ligatures w14:val="standardContextual"/>
             </w:rPr>
           </w:pPr>
-          <w:hyperlink w:anchor="_Toc241530782" w:history="1">
+          <w:hyperlink w:anchor="_Toc241533472" w:history="1">
             <w:r>
               <w:rPr>
                 <w:rStyle w:val="Hyperlink"/>
                 <w:noProof/>
               </w:rPr>
-              <w:t>4. Re-testing the single-event claims</w:t>
+              <w:t>4. Weaknesses in the original evaluation and how Phase 1 addressed them</w:t>
             </w:r>
             <w:r>
               <w:rPr>
@@ -347,7 +347,7 @@
               <w:rPr>
                 <w:noProof/>
               </w:rPr>
-              <w:instrText xml:space="preserve"> PAGEREF _Toc241530782 \h </w:instrText>
+              <w:instrText xml:space="preserve"> PAGEREF _Toc241533472 \h </w:instrText>
             </w:r>
             <w:r>
               <w:rPr>
@@ -389,7 +389,7 @@
               <w14:ligatures w14:val="standardContextual"/>
             </w:rPr>
           </w:pPr>
-          <w:hyperlink w:anchor="_Toc241530783" w:history="1">
+          <w:hyperlink w:anchor="_Toc241533473" w:history="1">
             <w:r>
               <w:rPr>
                 <w:rStyle w:val="Hyperlink"/>
@@ -413,7 +413,7 @@
               <w:rPr>
                 <w:noProof/>
               </w:rPr>
-              <w:instrText xml:space="preserve"> PAGEREF _Toc241530783 \h </w:instrText>
+              <w:instrText xml:space="preserve"> PAGEREF _Toc241533473 \h </w:instrText>
             </w:r>
             <w:r>
               <w:rPr>
@@ -455,7 +455,7 @@
               <w14:ligatures w14:val="standardContextual"/>
             </w:rPr>
           </w:pPr>
-          <w:hyperlink w:anchor="_Toc241530784" w:history="1">
+          <w:hyperlink w:anchor="_Toc241533474" w:history="1">
             <w:r>
               <w:rPr>
                 <w:rStyle w:val="Hyperlink"/>
@@ -479,7 +479,7 @@
               <w:rPr>
                 <w:noProof/>
               </w:rPr>
-              <w:instrText xml:space="preserve"> PAGEREF _Toc241530784 \h </w:instrText>
+              <w:instrText xml:space="preserve"> PAGEREF _Toc241533474 \h </w:instrText>
             </w:r>
             <w:r>
               <w:rPr>
@@ -521,7 +521,7 @@
               <w14:ligatures w14:val="standardContextual"/>
             </w:rPr>
           </w:pPr>
-          <w:hyperlink w:anchor="_Toc241530785" w:history="1">
+          <w:hyperlink w:anchor="_Toc241533475" w:history="1">
             <w:r>
               <w:rPr>
                 <w:rStyle w:val="Hyperlink"/>
@@ -545,7 +545,7 @@
               <w:rPr>
                 <w:noProof/>
               </w:rPr>
-              <w:instrText xml:space="preserve"> PAGEREF _Toc241530785 \h </w:instrText>
+              <w:instrText xml:space="preserve"> PAGEREF _Toc241533475 \h </w:instrText>
             </w:r>
             <w:r>
               <w:rPr>
@@ -587,7 +587,7 @@
               <w14:ligatures w14:val="standardContextual"/>
             </w:rPr>
           </w:pPr>
-          <w:hyperlink w:anchor="_Toc241530786" w:history="1">
+          <w:hyperlink w:anchor="_Toc241533476" w:history="1">
             <w:r>
               <w:rPr>
                 <w:rStyle w:val="Hyperlink"/>
@@ -611,7 +611,7 @@
               <w:rPr>
                 <w:noProof/>
               </w:rPr>
-              <w:instrText xml:space="preserve"> PAGEREF _Toc241530786 \h </w:instrText>
+              <w:instrText xml:space="preserve"> PAGEREF _Toc241533476 \h </w:instrText>
             </w:r>
             <w:r>
               <w:rPr>
@@ -653,7 +653,7 @@
               <w14:ligatures w14:val="standardContextual"/>
             </w:rPr>
           </w:pPr>
-          <w:hyperlink w:anchor="_Toc241530787" w:history="1">
+          <w:hyperlink w:anchor="_Toc241533477" w:history="1">
             <w:r>
               <w:rPr>
                 <w:rStyle w:val="Hyperlink"/>
@@ -677,7 +677,7 @@
               <w:rPr>
                 <w:noProof/>
               </w:rPr>
-              <w:instrText xml:space="preserve"> PAGEREF _Toc241530787 \h </w:instrText>
+              <w:instrText xml:space="preserve"> PAGEREF _Toc241533477 \h </w:instrText>
             </w:r>
             <w:r>
               <w:rPr>
@@ -719,7 +719,7 @@
               <w14:ligatures w14:val="standardContextual"/>
             </w:rPr>
           </w:pPr>
-          <w:hyperlink w:anchor="_Toc241530788" w:history="1">
+          <w:hyperlink w:anchor="_Toc241533478" w:history="1">
             <w:r>
               <w:rPr>
                 <w:rStyle w:val="Hyperlink"/>
@@ -743,7 +743,7 @@
               <w:rPr>
                 <w:noProof/>
               </w:rPr>
-              <w:instrText xml:space="preserve"> PAGEREF _Toc241530788 \h </w:instrText>
+              <w:instrText xml:space="preserve"> PAGEREF _Toc241533478 \h </w:instrText>
             </w:r>
             <w:r>
               <w:rPr>
@@ -785,7 +785,7 @@
               <w14:ligatures w14:val="standardContextual"/>
             </w:rPr>
           </w:pPr>
-          <w:hyperlink w:anchor="_Toc241530789" w:history="1">
+          <w:hyperlink w:anchor="_Toc241533479" w:history="1">
             <w:r>
               <w:rPr>
                 <w:rStyle w:val="Hyperlink"/>
@@ -809,7 +809,7 @@
               <w:rPr>
                 <w:noProof/>
               </w:rPr>
-              <w:instrText xml:space="preserve"> PAGEREF _Toc241530789 \h </w:instrText>
+              <w:instrText xml:space="preserve"> PAGEREF _Toc241533479 \h </w:instrText>
             </w:r>
             <w:r>
               <w:rPr>
@@ -851,7 +851,7 @@
               <w14:ligatures w14:val="standardContextual"/>
             </w:rPr>
           </w:pPr>
-          <w:hyperlink w:anchor="_Toc241530790" w:history="1">
+          <w:hyperlink w:anchor="_Toc241533480" w:history="1">
             <w:r>
               <w:rPr>
                 <w:rStyle w:val="Hyperlink"/>
@@ -875,7 +875,7 @@
               <w:rPr>
                 <w:noProof/>
               </w:rPr>
-              <w:instrText xml:space="preserve"> PAGEREF _Toc241530790 \h </w:instrText>
+              <w:instrText xml:space="preserve"> PAGEREF _Toc241533480 \h </w:instrText>
             </w:r>
             <w:r>
               <w:rPr>
@@ -917,7 +917,7 @@
               <w14:ligatures w14:val="standardContextual"/>
             </w:rPr>
           </w:pPr>
-          <w:hyperlink w:anchor="_Toc241530791" w:history="1">
+          <w:hyperlink w:anchor="_Toc241533481" w:history="1">
             <w:r>
               <w:rPr>
                 <w:rStyle w:val="Hyperlink"/>
@@ -941,7 +941,7 @@
               <w:rPr>
                 <w:noProof/>
               </w:rPr>
-              <w:instrText xml:space="preserve"> PAGEREF _Toc241530791 \h </w:instrText>
+              <w:instrText xml:space="preserve"> PAGEREF _Toc241533481 \h </w:instrText>
             </w:r>
             <w:r>
               <w:rPr>
@@ -983,7 +983,7 @@
               <w14:ligatures w14:val="standardContextual"/>
             </w:rPr>
           </w:pPr>
-          <w:hyperlink w:anchor="_Toc241530792" w:history="1">
+          <w:hyperlink w:anchor="_Toc241533482" w:history="1">
             <w:r>
               <w:rPr>
                 <w:rStyle w:val="Hyperlink"/>
@@ -1007,7 +1007,7 @@
               <w:rPr>
                 <w:noProof/>
               </w:rPr>
-              <w:instrText xml:space="preserve"> PAGEREF _Toc241530792 \h </w:instrText>
+              <w:instrText xml:space="preserve"> PAGEREF _Toc241533482 \h </w:instrText>
             </w:r>
             <w:r>
               <w:rPr>
@@ -1049,7 +1049,7 @@
               <w14:ligatures w14:val="standardContextual"/>
             </w:rPr>
           </w:pPr>
-          <w:hyperlink w:anchor="_Toc241530793" w:history="1">
+          <w:hyperlink w:anchor="_Toc241533483" w:history="1">
             <w:r>
               <w:rPr>
                 <w:rStyle w:val="Hyperlink"/>
@@ -1073,7 +1073,7 @@
               <w:rPr>
                 <w:noProof/>
               </w:rPr>
-              <w:instrText xml:space="preserve"> PAGEREF _Toc241530793 \h </w:instrText>
+              <w:instrText xml:space="preserve"> PAGEREF _Toc241533483 \h </w:instrText>
             </w:r>
             <w:r>
               <w:rPr>
@@ -1115,7 +1115,7 @@
               <w14:ligatures w14:val="standardContextual"/>
             </w:rPr>
           </w:pPr>
-          <w:hyperlink w:anchor="_Toc241530794" w:history="1">
+          <w:hyperlink w:anchor="_Toc241533484" w:history="1">
             <w:r>
               <w:rPr>
                 <w:rStyle w:val="Hyperlink"/>
@@ -1139,7 +1139,7 @@
               <w:rPr>
                 <w:noProof/>
               </w:rPr>
-              <w:instrText xml:space="preserve"> PAGEREF _Toc241530794 \h </w:instrText>
+              <w:instrText xml:space="preserve"> PAGEREF _Toc241533484 \h </w:instrText>
             </w:r>
             <w:r>
               <w:rPr>
@@ -1181,7 +1181,7 @@
               <w14:ligatures w14:val="standardContextual"/>
             </w:rPr>
           </w:pPr>
-          <w:hyperlink w:anchor="_Toc241530795" w:history="1">
+          <w:hyperlink w:anchor="_Toc241533485" w:history="1">
             <w:r>
               <w:rPr>
                 <w:rStyle w:val="Hyperlink"/>
@@ -1205,7 +1205,7 @@
               <w:rPr>
                 <w:noProof/>
               </w:rPr>
-              <w:instrText xml:space="preserve"> PAGEREF _Toc241530795 \h </w:instrText>
+              <w:instrText xml:space="preserve"> PAGEREF _Toc241533485 \h </w:instrText>
             </w:r>
             <w:r>
               <w:rPr>
@@ -1247,7 +1247,7 @@
               <w14:ligatures w14:val="standardContextual"/>
             </w:rPr>
           </w:pPr>
-          <w:hyperlink w:anchor="_Toc241530796" w:history="1">
+          <w:hyperlink w:anchor="_Toc241533486" w:history="1">
             <w:r>
               <w:rPr>
                 <w:rStyle w:val="Hyperlink"/>
@@ -1271,7 +1271,7 @@
               <w:rPr>
                 <w:noProof/>
               </w:rPr>
-              <w:instrText xml:space="preserve"> PAGEREF _Toc241530796 \h </w:instrText>
+              <w:instrText xml:space="preserve"> PAGEREF _Toc241533486 \h </w:instrText>
             </w:r>
             <w:r>
               <w:rPr>
@@ -1313,7 +1313,7 @@
               <w14:ligatures w14:val="standardContextual"/>
             </w:rPr>
           </w:pPr>
-          <w:hyperlink w:anchor="_Toc241530797" w:history="1">
+          <w:hyperlink w:anchor="_Toc241533487" w:history="1">
             <w:r>
               <w:rPr>
                 <w:rStyle w:val="Hyperlink"/>
@@ -1337,7 +1337,7 @@
               <w:rPr>
                 <w:noProof/>
               </w:rPr>
-              <w:instrText xml:space="preserve"> PAGEREF _Toc241530797 \h </w:instrText>
+              <w:instrText xml:space="preserve"> PAGEREF _Toc241533487 \h </w:instrText>
             </w:r>
             <w:r>
               <w:rPr>
@@ -1379,7 +1379,7 @@
               <w14:ligatures w14:val="standardContextual"/>
             </w:rPr>
           </w:pPr>
-          <w:hyperlink w:anchor="_Toc241530798" w:history="1">
+          <w:hyperlink w:anchor="_Toc241533488" w:history="1">
             <w:r>
               <w:rPr>
                 <w:rStyle w:val="Hyperlink"/>
@@ -1403,7 +1403,7 @@
               <w:rPr>
                 <w:noProof/>
               </w:rPr>
-              <w:instrText xml:space="preserve"> PAGEREF _Toc241530798 \h </w:instrText>
+              <w:instrText xml:space="preserve"> PAGEREF _Toc241533488 \h </w:instrText>
             </w:r>
             <w:r>
               <w:rPr>
@@ -1448,7 +1448,7 @@
         <w:keepNext/>
         <w:keepLines/>
       </w:pPr>
-      <w:bookmarkStart w:id="0" w:name="_Toc241530779"/>
+      <w:bookmarkStart w:id="0" w:name="_Toc241533469"/>
       <w:r>
         <w:t>1. Executive summary</w:t>
       </w:r>
@@ -1459,7 +1459,10 @@
         <w:spacing w:after="120"/>
       </w:pPr>
       <w:r>
-        <w:t>The dissertation proposed a small learned adapter that passes an ECG model's internal representation directly into a frozen language model (Gemma 4 E4B) as a few virtual tokens, instead of a JSON text interface. Phase 1 re-tested its claims under a pre-registered, multi-seed protocol and then extended the design from one heartbeat per call to many heartbeats per call. The main results:</w:t>
+        <w:t>The dissertation built and evaluated a small learned adapter that passes an ECG model's internal representation directly into a frozen language model (Gemma 4 E4B) as a few virtual tokens, instead of a JSON text interface. Phase 1 strengthened the evaluation under a pre-registered, multi-seed protocol, identified where the single-event design is limited, and iterated the system from one heartbeat per call to many heartbeats per call, which is where the latent interface's advantage turns out to lie. The main</w:t>
+      </w:r>
+      <w:r>
+        <w:t xml:space="preserve"> results:</w:t>
       </w:r>
     </w:p>
     <w:p>
@@ -1476,10 +1479,10 @@
           <w:b/>
           <w:bCs/>
         </w:rPr>
-        <w:t>The single-event claims did not hold against a fair baseline.</w:t>
-      </w:r>
-      <w:r>
-        <w:t xml:space="preserve"> Against a compact JSON prompt the adapter saves no prompt-processing time (about −2%), and it is less accurate (0.79 vs 0.97 balanced accuracy). The dissertation's 13.3% latency gain came from shorter outputs, not from the interface, and its 95% accuracy was one favourable training run (3 runs: 78.8–95.0%).</w:t>
+        <w:t>Weaknesses identified in the single-event evaluation.</w:t>
+      </w:r>
+      <w:r>
+        <w:t xml:space="preserve"> The dissertation compared against the most verbose text interface, measured latency without fixing output length, and reported one training run. With a compact text baseline, fixed-length timing and several seeds, a single event gives the adapter little room: no prompt-processing saving (about −2%), and lower accuracy than text (0.79 vs 0.97 balanced accuracy; the adapter's single-event accuracy varies across seeds, 78.8–95.0%). This motivated the multi-event iteration.</w:t>
       </w:r>
     </w:p>
     <w:p>
@@ -1598,7 +1601,7 @@
         <w:keepNext/>
         <w:keepLines/>
       </w:pPr>
-      <w:bookmarkStart w:id="1" w:name="_Toc241530780"/>
+      <w:bookmarkStart w:id="1" w:name="_Toc241533470"/>
       <w:r>
         <w:t>2. Starting point: the dissertation</w:t>
       </w:r>
@@ -2179,7 +2182,7 @@
         <w:keepNext/>
         <w:keepLines/>
       </w:pPr>
-      <w:bookmarkStart w:id="2" w:name="_Toc241530781"/>
+      <w:bookmarkStart w:id="2" w:name="_Toc241533471"/>
       <w:r>
         <w:t>3. How Phase 1 was run</w:t>
       </w:r>
@@ -2291,11 +2294,19 @@
         <w:keepNext/>
         <w:keepLines/>
       </w:pPr>
-      <w:bookmarkStart w:id="3" w:name="_Toc241530782"/>
-      <w:r>
-        <w:t>4. Re-testing the single-event claims</w:t>
+      <w:bookmarkStart w:id="3" w:name="_Toc241533472"/>
+      <w:r>
+        <w:t>4. Weaknesses in the original evaluation and how Phase 1 addressed them</w:t>
       </w:r>
       <w:bookmarkEnd w:id="3"/>
+    </w:p>
+    <w:p>
+      <w:pPr>
+        <w:spacing w:after="120"/>
+      </w:pPr>
+      <w:r>
+        <w:t>The dissertation delivered a working pipeline and a first evaluation. Reviewing it for journal standards showed five weaknesses in how the single-event design was evaluated. Each one led to a specific change in Phase 1.</w:t>
+      </w:r>
     </w:p>
     <w:tbl>
       <w:tblPr>
@@ -2315,9 +2326,10 @@
         <w:tblLook w:val="04A0" w:firstRow="1" w:lastRow="0" w:firstColumn="1" w:lastColumn="0" w:noHBand="0" w:noVBand="1"/>
       </w:tblPr>
       <w:tblGrid>
-        <w:gridCol w:w="2300"/>
-        <w:gridCol w:w="4526"/>
+        <w:gridCol w:w="1900"/>
+        <w:gridCol w:w="2000"/>
         <w:gridCol w:w="2200"/>
+        <w:gridCol w:w="2926"/>
       </w:tblGrid>
       <w:tr>
         <w:tblPrEx>
@@ -2332,7 +2344,7 @@
         </w:trPr>
         <w:tc>
           <w:tcPr>
-            <w:tcW w:w="2300" w:type="dxa"/>
+            <w:tcW w:w="1900" w:type="dxa"/>
             <w:tcBorders>
               <w:top w:val="single" w:sz="4" w:space="0" w:color="BFBFBF"/>
               <w:left w:val="single" w:sz="4" w:space="0" w:color="BFBFBF"/>
@@ -2359,13 +2371,13 @@
                 <w:sz w:val="19"/>
                 <w:szCs w:val="19"/>
               </w:rPr>
-              <w:t>Dissertation claim</w:t>
-            </w:r>
-          </w:p>
-        </w:tc>
-        <w:tc>
-          <w:tcPr>
-            <w:tcW w:w="4526" w:type="dxa"/>
+              <w:t>Weakness</w:t>
+            </w:r>
+          </w:p>
+        </w:tc>
+        <w:tc>
+          <w:tcPr>
+            <w:tcW w:w="2000" w:type="dxa"/>
             <w:tcBorders>
               <w:top w:val="single" w:sz="4" w:space="0" w:color="BFBFBF"/>
               <w:left w:val="single" w:sz="4" w:space="0" w:color="BFBFBF"/>
@@ -2392,7 +2404,7 @@
                 <w:sz w:val="19"/>
                 <w:szCs w:val="19"/>
               </w:rPr>
-              <w:t>Phase 1 finding</w:t>
+              <w:t>Why it matters</w:t>
             </w:r>
           </w:p>
         </w:tc>
@@ -2425,7 +2437,40 @@
                 <w:sz w:val="19"/>
                 <w:szCs w:val="19"/>
               </w:rPr>
-              <w:t>Evidence</w:t>
+              <w:t>What Phase 1 did</w:t>
+            </w:r>
+          </w:p>
+        </w:tc>
+        <w:tc>
+          <w:tcPr>
+            <w:tcW w:w="2926" w:type="dxa"/>
+            <w:tcBorders>
+              <w:top w:val="single" w:sz="4" w:space="0" w:color="BFBFBF"/>
+              <w:left w:val="single" w:sz="4" w:space="0" w:color="BFBFBF"/>
+              <w:bottom w:val="single" w:sz="4" w:space="0" w:color="BFBFBF"/>
+              <w:right w:val="single" w:sz="4" w:space="0" w:color="BFBFBF"/>
+            </w:tcBorders>
+            <w:shd w:val="clear" w:color="auto" w:fill="E8EEF7"/>
+            <w:tcMar>
+              <w:top w:w="60" w:type="dxa"/>
+              <w:left w:w="100" w:type="dxa"/>
+              <w:bottom w:w="60" w:type="dxa"/>
+              <w:right w:w="100" w:type="dxa"/>
+            </w:tcMar>
+          </w:tcPr>
+          <w:p>
+            <w:pPr>
+              <w:keepNext/>
+              <w:keepLines/>
+            </w:pPr>
+            <w:r>
+              <w:rPr>
+                <w:b/>
+                <w:bCs/>
+                <w:sz w:val="19"/>
+                <w:szCs w:val="19"/>
+              </w:rPr>
+              <w:t>What it showed</w:t>
             </w:r>
           </w:p>
         </w:tc>
@@ -2442,61 +2487,61 @@
         </w:trPr>
         <w:tc>
           <w:tcPr>
-            <w:tcW w:w="2300" w:type="dxa"/>
-            <w:tcBorders>
-              <w:top w:val="single" w:sz="4" w:space="0" w:color="BFBFBF"/>
-              <w:left w:val="single" w:sz="4" w:space="0" w:color="BFBFBF"/>
-              <w:bottom w:val="single" w:sz="4" w:space="0" w:color="BFBFBF"/>
-              <w:right w:val="single" w:sz="4" w:space="0" w:color="BFBFBF"/>
-            </w:tcBorders>
-            <w:tcMar>
-              <w:top w:w="60" w:type="dxa"/>
-              <w:left w:w="100" w:type="dxa"/>
-              <w:bottom w:w="60" w:type="dxa"/>
-              <w:right w:w="100" w:type="dxa"/>
-            </w:tcMar>
-          </w:tcPr>
-          <w:p>
-            <w:pPr>
-              <w:keepNext/>
-              <w:keepLines/>
-            </w:pPr>
-            <w:r>
-              <w:rPr>
-                <w:sz w:val="19"/>
-                <w:szCs w:val="19"/>
-              </w:rPr>
-              <w:t>95% accuracy</w:t>
-            </w:r>
-          </w:p>
-        </w:tc>
-        <w:tc>
-          <w:tcPr>
-            <w:tcW w:w="4526" w:type="dxa"/>
-            <w:tcBorders>
-              <w:top w:val="single" w:sz="4" w:space="0" w:color="BFBFBF"/>
-              <w:left w:val="single" w:sz="4" w:space="0" w:color="BFBFBF"/>
-              <w:bottom w:val="single" w:sz="4" w:space="0" w:color="BFBFBF"/>
-              <w:right w:val="single" w:sz="4" w:space="0" w:color="BFBFBF"/>
-            </w:tcBorders>
-            <w:tcMar>
-              <w:top w:w="60" w:type="dxa"/>
-              <w:left w:w="100" w:type="dxa"/>
-              <w:bottom w:w="60" w:type="dxa"/>
-              <w:right w:w="100" w:type="dxa"/>
-            </w:tcMar>
-          </w:tcPr>
-          <w:p>
-            <w:pPr>
-              <w:keepNext/>
-              <w:keepLines/>
-            </w:pPr>
-            <w:r>
-              <w:rPr>
-                <w:sz w:val="19"/>
-                <w:szCs w:val="19"/>
-              </w:rPr>
-              <w:t>One favourable draw; seeds give 81.3% and 78.8%</w:t>
+            <w:tcW w:w="1900" w:type="dxa"/>
+            <w:tcBorders>
+              <w:top w:val="single" w:sz="4" w:space="0" w:color="BFBFBF"/>
+              <w:left w:val="single" w:sz="4" w:space="0" w:color="BFBFBF"/>
+              <w:bottom w:val="single" w:sz="4" w:space="0" w:color="BFBFBF"/>
+              <w:right w:val="single" w:sz="4" w:space="0" w:color="BFBFBF"/>
+            </w:tcBorders>
+            <w:tcMar>
+              <w:top w:w="60" w:type="dxa"/>
+              <w:left w:w="100" w:type="dxa"/>
+              <w:bottom w:w="60" w:type="dxa"/>
+              <w:right w:w="100" w:type="dxa"/>
+            </w:tcMar>
+          </w:tcPr>
+          <w:p>
+            <w:pPr>
+              <w:keepNext/>
+              <w:keepLines/>
+            </w:pPr>
+            <w:r>
+              <w:rPr>
+                <w:sz w:val="19"/>
+                <w:szCs w:val="19"/>
+              </w:rPr>
+              <w:t>One comparison baseline (full JSON, the most verbose text form)</w:t>
+            </w:r>
+          </w:p>
+        </w:tc>
+        <w:tc>
+          <w:tcPr>
+            <w:tcW w:w="2000" w:type="dxa"/>
+            <w:tcBorders>
+              <w:top w:val="single" w:sz="4" w:space="0" w:color="BFBFBF"/>
+              <w:left w:val="single" w:sz="4" w:space="0" w:color="BFBFBF"/>
+              <w:bottom w:val="single" w:sz="4" w:space="0" w:color="BFBFBF"/>
+              <w:right w:val="single" w:sz="4" w:space="0" w:color="BFBFBF"/>
+            </w:tcBorders>
+            <w:tcMar>
+              <w:top w:w="60" w:type="dxa"/>
+              <w:left w:w="100" w:type="dxa"/>
+              <w:bottom w:w="60" w:type="dxa"/>
+              <w:right w:w="100" w:type="dxa"/>
+            </w:tcMar>
+          </w:tcPr>
+          <w:p>
+            <w:pPr>
+              <w:keepNext/>
+              <w:keepLines/>
+            </w:pPr>
+            <w:r>
+              <w:rPr>
+                <w:sz w:val="19"/>
+                <w:szCs w:val="19"/>
+              </w:rPr>
+              <w:t>A saving against a verbose prompt may not hold against a well-designed one</w:t>
             </w:r>
           </w:p>
         </w:tc>
@@ -2526,7 +2571,37 @@
                 <w:sz w:val="19"/>
                 <w:szCs w:val="19"/>
               </w:rPr>
-              <w:t>E2 seed variance</w:t>
+              <w:t>Added compact JSON and label-only text arms</w:t>
+            </w:r>
+          </w:p>
+        </w:tc>
+        <w:tc>
+          <w:tcPr>
+            <w:tcW w:w="2926" w:type="dxa"/>
+            <w:tcBorders>
+              <w:top w:val="single" w:sz="4" w:space="0" w:color="BFBFBF"/>
+              <w:left w:val="single" w:sz="4" w:space="0" w:color="BFBFBF"/>
+              <w:bottom w:val="single" w:sz="4" w:space="0" w:color="BFBFBF"/>
+              <w:right w:val="single" w:sz="4" w:space="0" w:color="BFBFBF"/>
+            </w:tcBorders>
+            <w:tcMar>
+              <w:top w:w="60" w:type="dxa"/>
+              <w:left w:w="100" w:type="dxa"/>
+              <w:bottom w:w="60" w:type="dxa"/>
+              <w:right w:w="100" w:type="dxa"/>
+            </w:tcMar>
+          </w:tcPr>
+          <w:p>
+            <w:pPr>
+              <w:keepNext/>
+              <w:keepLines/>
+            </w:pPr>
+            <w:r>
+              <w:rPr>
+                <w:sz w:val="19"/>
+                <w:szCs w:val="19"/>
+              </w:rPr>
+              <w:t>Against compact JSON, a single event leaves little to save: interface tokens 4 vs ~57, but end-to-end prompt length similar (486 vs 458)</w:t>
             </w:r>
           </w:p>
         </w:tc>
@@ -2543,68 +2618,61 @@
         </w:trPr>
         <w:tc>
           <w:tcPr>
-            <w:tcW w:w="2300" w:type="dxa"/>
-            <w:tcBorders>
-              <w:top w:val="single" w:sz="4" w:space="0" w:color="BFBFBF"/>
-              <w:left w:val="single" w:sz="4" w:space="0" w:color="BFBFBF"/>
-              <w:bottom w:val="single" w:sz="4" w:space="0" w:color="BFBFBF"/>
-              <w:right w:val="single" w:sz="4" w:space="0" w:color="BFBFBF"/>
-            </w:tcBorders>
-            <w:tcMar>
-              <w:top w:w="60" w:type="dxa"/>
-              <w:left w:w="100" w:type="dxa"/>
-              <w:bottom w:w="60" w:type="dxa"/>
-              <w:right w:w="100" w:type="dxa"/>
-            </w:tcMar>
-          </w:tcPr>
-          <w:p>
-            <w:pPr>
-              <w:keepNext/>
-              <w:keepLines/>
-            </w:pPr>
-            <w:r>
-              <w:rPr>
-                <w:sz w:val="19"/>
-                <w:szCs w:val="19"/>
-              </w:rPr>
-              <w:t>−</w:t>
-            </w:r>
-            <w:r>
-              <w:rPr>
-                <w:sz w:val="19"/>
-                <w:szCs w:val="19"/>
-              </w:rPr>
-              <w:t>24.7% prompt tokens</w:t>
-            </w:r>
-          </w:p>
-        </w:tc>
-        <w:tc>
-          <w:tcPr>
-            <w:tcW w:w="4526" w:type="dxa"/>
-            <w:tcBorders>
-              <w:top w:val="single" w:sz="4" w:space="0" w:color="BFBFBF"/>
-              <w:left w:val="single" w:sz="4" w:space="0" w:color="BFBFBF"/>
-              <w:bottom w:val="single" w:sz="4" w:space="0" w:color="BFBFBF"/>
-              <w:right w:val="single" w:sz="4" w:space="0" w:color="BFBFBF"/>
-            </w:tcBorders>
-            <w:tcMar>
-              <w:top w:w="60" w:type="dxa"/>
-              <w:left w:w="100" w:type="dxa"/>
-              <w:bottom w:w="60" w:type="dxa"/>
-              <w:right w:w="100" w:type="dxa"/>
-            </w:tcMar>
-          </w:tcPr>
-          <w:p>
-            <w:pPr>
-              <w:keepNext/>
-              <w:keepLines/>
-            </w:pPr>
-            <w:r>
-              <w:rPr>
-                <w:sz w:val="19"/>
-                <w:szCs w:val="19"/>
-              </w:rPr>
-              <w:t>Against full JSON only; against compact JSON the adapter uses more tokens end to end (486 vs 458); interface tokens 4 vs ~57</w:t>
+            <w:tcW w:w="1900" w:type="dxa"/>
+            <w:tcBorders>
+              <w:top w:val="single" w:sz="4" w:space="0" w:color="BFBFBF"/>
+              <w:left w:val="single" w:sz="4" w:space="0" w:color="BFBFBF"/>
+              <w:bottom w:val="single" w:sz="4" w:space="0" w:color="BFBFBF"/>
+              <w:right w:val="single" w:sz="4" w:space="0" w:color="BFBFBF"/>
+            </w:tcBorders>
+            <w:tcMar>
+              <w:top w:w="60" w:type="dxa"/>
+              <w:left w:w="100" w:type="dxa"/>
+              <w:bottom w:w="60" w:type="dxa"/>
+              <w:right w:w="100" w:type="dxa"/>
+            </w:tcMar>
+          </w:tcPr>
+          <w:p>
+            <w:pPr>
+              <w:keepNext/>
+              <w:keepLines/>
+            </w:pPr>
+            <w:r>
+              <w:rPr>
+                <w:sz w:val="19"/>
+                <w:szCs w:val="19"/>
+              </w:rPr>
+              <w:t>Latency measured with free-length answers</w:t>
+            </w:r>
+          </w:p>
+        </w:tc>
+        <w:tc>
+          <w:tcPr>
+            <w:tcW w:w="2000" w:type="dxa"/>
+            <w:tcBorders>
+              <w:top w:val="single" w:sz="4" w:space="0" w:color="BFBFBF"/>
+              <w:left w:val="single" w:sz="4" w:space="0" w:color="BFBFBF"/>
+              <w:bottom w:val="single" w:sz="4" w:space="0" w:color="BFBFBF"/>
+              <w:right w:val="single" w:sz="4" w:space="0" w:color="BFBFBF"/>
+            </w:tcBorders>
+            <w:tcMar>
+              <w:top w:w="60" w:type="dxa"/>
+              <w:left w:w="100" w:type="dxa"/>
+              <w:bottom w:w="60" w:type="dxa"/>
+              <w:right w:w="100" w:type="dxa"/>
+            </w:tcMar>
+          </w:tcPr>
+          <w:p>
+            <w:pPr>
+              <w:keepNext/>
+              <w:keepLines/>
+            </w:pPr>
+            <w:r>
+              <w:rPr>
+                <w:sz w:val="19"/>
+                <w:szCs w:val="19"/>
+              </w:rPr>
+              <w:t>Answer length, not the interface, can drive total time</w:t>
             </w:r>
           </w:p>
         </w:tc>
@@ -2634,7 +2702,37 @@
                 <w:sz w:val="19"/>
                 <w:szCs w:val="19"/>
               </w:rPr>
-              <w:t>Step 4 baseline family</w:t>
+              <w:t>Timed every arm with output length fixed</w:t>
+            </w:r>
+          </w:p>
+        </w:tc>
+        <w:tc>
+          <w:tcPr>
+            <w:tcW w:w="2926" w:type="dxa"/>
+            <w:tcBorders>
+              <w:top w:val="single" w:sz="4" w:space="0" w:color="BFBFBF"/>
+              <w:left w:val="single" w:sz="4" w:space="0" w:color="BFBFBF"/>
+              <w:bottom w:val="single" w:sz="4" w:space="0" w:color="BFBFBF"/>
+              <w:right w:val="single" w:sz="4" w:space="0" w:color="BFBFBF"/>
+            </w:tcBorders>
+            <w:tcMar>
+              <w:top w:w="60" w:type="dxa"/>
+              <w:left w:w="100" w:type="dxa"/>
+              <w:bottom w:w="60" w:type="dxa"/>
+              <w:right w:w="100" w:type="dxa"/>
+            </w:tcMar>
+          </w:tcPr>
+          <w:p>
+            <w:pPr>
+              <w:keepNext/>
+              <w:keepLines/>
+            </w:pPr>
+            <w:r>
+              <w:rPr>
+                <w:sz w:val="19"/>
+                <w:szCs w:val="19"/>
+              </w:rPr>
+              <w:t>With equal output length, arms differ by ≤ 3%; decode speed is identical (~169 ms/token), so latency gains must come from the prompt side</w:t>
             </w:r>
           </w:p>
         </w:tc>
@@ -2651,68 +2749,61 @@
         </w:trPr>
         <w:tc>
           <w:tcPr>
-            <w:tcW w:w="2300" w:type="dxa"/>
-            <w:tcBorders>
-              <w:top w:val="single" w:sz="4" w:space="0" w:color="BFBFBF"/>
-              <w:left w:val="single" w:sz="4" w:space="0" w:color="BFBFBF"/>
-              <w:bottom w:val="single" w:sz="4" w:space="0" w:color="BFBFBF"/>
-              <w:right w:val="single" w:sz="4" w:space="0" w:color="BFBFBF"/>
-            </w:tcBorders>
-            <w:tcMar>
-              <w:top w:w="60" w:type="dxa"/>
-              <w:left w:w="100" w:type="dxa"/>
-              <w:bottom w:w="60" w:type="dxa"/>
-              <w:right w:w="100" w:type="dxa"/>
-            </w:tcMar>
-          </w:tcPr>
-          <w:p>
-            <w:pPr>
-              <w:keepNext/>
-              <w:keepLines/>
-            </w:pPr>
-            <w:r>
-              <w:rPr>
-                <w:sz w:val="19"/>
-                <w:szCs w:val="19"/>
-              </w:rPr>
-              <w:t>−</w:t>
-            </w:r>
-            <w:r>
-              <w:rPr>
-                <w:sz w:val="19"/>
-                <w:szCs w:val="19"/>
-              </w:rPr>
-              <w:t>13.3% latency</w:t>
-            </w:r>
-          </w:p>
-        </w:tc>
-        <w:tc>
-          <w:tcPr>
-            <w:tcW w:w="4526" w:type="dxa"/>
-            <w:tcBorders>
-              <w:top w:val="single" w:sz="4" w:space="0" w:color="BFBFBF"/>
-              <w:left w:val="single" w:sz="4" w:space="0" w:color="BFBFBF"/>
-              <w:bottom w:val="single" w:sz="4" w:space="0" w:color="BFBFBF"/>
-              <w:right w:val="single" w:sz="4" w:space="0" w:color="BFBFBF"/>
-            </w:tcBorders>
-            <w:tcMar>
-              <w:top w:w="60" w:type="dxa"/>
-              <w:left w:w="100" w:type="dxa"/>
-              <w:bottom w:w="60" w:type="dxa"/>
-              <w:right w:w="100" w:type="dxa"/>
-            </w:tcMar>
-          </w:tcPr>
-          <w:p>
-            <w:pPr>
-              <w:keepNext/>
-              <w:keepLines/>
-            </w:pPr>
-            <w:r>
-              <w:rPr>
-                <w:sz w:val="19"/>
-                <w:szCs w:val="19"/>
-              </w:rPr>
-              <w:t>An output-length effect: with output length fixed, arms differ by ≤ 3%; decode speed identical (~169 ms/token)</w:t>
+            <w:tcW w:w="1900" w:type="dxa"/>
+            <w:tcBorders>
+              <w:top w:val="single" w:sz="4" w:space="0" w:color="BFBFBF"/>
+              <w:left w:val="single" w:sz="4" w:space="0" w:color="BFBFBF"/>
+              <w:bottom w:val="single" w:sz="4" w:space="0" w:color="BFBFBF"/>
+              <w:right w:val="single" w:sz="4" w:space="0" w:color="BFBFBF"/>
+            </w:tcBorders>
+            <w:tcMar>
+              <w:top w:w="60" w:type="dxa"/>
+              <w:left w:w="100" w:type="dxa"/>
+              <w:bottom w:w="60" w:type="dxa"/>
+              <w:right w:w="100" w:type="dxa"/>
+            </w:tcMar>
+          </w:tcPr>
+          <w:p>
+            <w:pPr>
+              <w:keepNext/>
+              <w:keepLines/>
+            </w:pPr>
+            <w:r>
+              <w:rPr>
+                <w:sz w:val="19"/>
+                <w:szCs w:val="19"/>
+              </w:rPr>
+              <w:t>One training run reported as the headline</w:t>
+            </w:r>
+          </w:p>
+        </w:tc>
+        <w:tc>
+          <w:tcPr>
+            <w:tcW w:w="2000" w:type="dxa"/>
+            <w:tcBorders>
+              <w:top w:val="single" w:sz="4" w:space="0" w:color="BFBFBF"/>
+              <w:left w:val="single" w:sz="4" w:space="0" w:color="BFBFBF"/>
+              <w:bottom w:val="single" w:sz="4" w:space="0" w:color="BFBFBF"/>
+              <w:right w:val="single" w:sz="4" w:space="0" w:color="BFBFBF"/>
+            </w:tcBorders>
+            <w:tcMar>
+              <w:top w:w="60" w:type="dxa"/>
+              <w:left w:w="100" w:type="dxa"/>
+              <w:bottom w:w="60" w:type="dxa"/>
+              <w:right w:w="100" w:type="dxa"/>
+            </w:tcMar>
+          </w:tcPr>
+          <w:p>
+            <w:pPr>
+              <w:keepNext/>
+              <w:keepLines/>
+            </w:pPr>
+            <w:r>
+              <w:rPr>
+                <w:sz w:val="19"/>
+                <w:szCs w:val="19"/>
+              </w:rPr>
+              <w:t>Adapter training is sensitive to the random seed</w:t>
             </w:r>
           </w:p>
         </w:tc>
@@ -2742,7 +2833,37 @@
                 <w:sz w:val="19"/>
                 <w:szCs w:val="19"/>
               </w:rPr>
-              <w:t>Step 5 forced-length timing</w:t>
+              <w:t>Multiple seeds per configuration, reported as mean and range</w:t>
+            </w:r>
+          </w:p>
+        </w:tc>
+        <w:tc>
+          <w:tcPr>
+            <w:tcW w:w="2926" w:type="dxa"/>
+            <w:tcBorders>
+              <w:top w:val="single" w:sz="4" w:space="0" w:color="BFBFBF"/>
+              <w:left w:val="single" w:sz="4" w:space="0" w:color="BFBFBF"/>
+              <w:bottom w:val="single" w:sz="4" w:space="0" w:color="BFBFBF"/>
+              <w:right w:val="single" w:sz="4" w:space="0" w:color="BFBFBF"/>
+            </w:tcBorders>
+            <w:tcMar>
+              <w:top w:w="60" w:type="dxa"/>
+              <w:left w:w="100" w:type="dxa"/>
+              <w:bottom w:w="60" w:type="dxa"/>
+              <w:right w:w="100" w:type="dxa"/>
+            </w:tcMar>
+          </w:tcPr>
+          <w:p>
+            <w:pPr>
+              <w:keepNext/>
+              <w:keepLines/>
+            </w:pPr>
+            <w:r>
+              <w:rPr>
+                <w:sz w:val="19"/>
+                <w:szCs w:val="19"/>
+              </w:rPr>
+              <w:t>Single-event accuracy varies across seeds (78.8–95.0%)</w:t>
             </w:r>
           </w:p>
         </w:tc>
@@ -2759,61 +2880,61 @@
         </w:trPr>
         <w:tc>
           <w:tcPr>
-            <w:tcW w:w="2300" w:type="dxa"/>
-            <w:tcBorders>
-              <w:top w:val="single" w:sz="4" w:space="0" w:color="BFBFBF"/>
-              <w:left w:val="single" w:sz="4" w:space="0" w:color="BFBFBF"/>
-              <w:bottom w:val="single" w:sz="4" w:space="0" w:color="BFBFBF"/>
-              <w:right w:val="single" w:sz="4" w:space="0" w:color="BFBFBF"/>
-            </w:tcBorders>
-            <w:tcMar>
-              <w:top w:w="60" w:type="dxa"/>
-              <w:left w:w="100" w:type="dxa"/>
-              <w:bottom w:w="60" w:type="dxa"/>
-              <w:right w:w="100" w:type="dxa"/>
-            </w:tcMar>
-          </w:tcPr>
-          <w:p>
-            <w:pPr>
-              <w:keepNext/>
-              <w:keepLines/>
-            </w:pPr>
-            <w:r>
-              <w:rPr>
-                <w:sz w:val="19"/>
-                <w:szCs w:val="19"/>
-              </w:rPr>
-              <w:t>Trained with 3 full-batch updates</w:t>
-            </w:r>
-          </w:p>
-        </w:tc>
-        <w:tc>
-          <w:tcPr>
-            <w:tcW w:w="4526" w:type="dxa"/>
-            <w:tcBorders>
-              <w:top w:val="single" w:sz="4" w:space="0" w:color="BFBFBF"/>
-              <w:left w:val="single" w:sz="4" w:space="0" w:color="BFBFBF"/>
-              <w:bottom w:val="single" w:sz="4" w:space="0" w:color="BFBFBF"/>
-              <w:right w:val="single" w:sz="4" w:space="0" w:color="BFBFBF"/>
-            </w:tcBorders>
-            <w:tcMar>
-              <w:top w:w="60" w:type="dxa"/>
-              <w:left w:w="100" w:type="dxa"/>
-              <w:bottom w:w="60" w:type="dxa"/>
-              <w:right w:w="100" w:type="dxa"/>
-            </w:tcMar>
-          </w:tcPr>
-          <w:p>
-            <w:pPr>
-              <w:keepNext/>
-              <w:keepLines/>
-            </w:pPr>
-            <w:r>
-              <w:rPr>
-                <w:sz w:val="19"/>
-                <w:szCs w:val="19"/>
-              </w:rPr>
-              <w:t>Erratum: the code made 192 per-example updates (64 × 3 epochs)</w:t>
+            <w:tcW w:w="1900" w:type="dxa"/>
+            <w:tcBorders>
+              <w:top w:val="single" w:sz="4" w:space="0" w:color="BFBFBF"/>
+              <w:left w:val="single" w:sz="4" w:space="0" w:color="BFBFBF"/>
+              <w:bottom w:val="single" w:sz="4" w:space="0" w:color="BFBFBF"/>
+              <w:right w:val="single" w:sz="4" w:space="0" w:color="BFBFBF"/>
+            </w:tcBorders>
+            <w:tcMar>
+              <w:top w:w="60" w:type="dxa"/>
+              <w:left w:w="100" w:type="dxa"/>
+              <w:bottom w:w="60" w:type="dxa"/>
+              <w:right w:w="100" w:type="dxa"/>
+            </w:tcMar>
+          </w:tcPr>
+          <w:p>
+            <w:pPr>
+              <w:keepNext/>
+              <w:keepLines/>
+            </w:pPr>
+            <w:r>
+              <w:rPr>
+                <w:sz w:val="19"/>
+                <w:szCs w:val="19"/>
+              </w:rPr>
+              <w:t>Methods text describes 3 full-batch updates</w:t>
+            </w:r>
+          </w:p>
+        </w:tc>
+        <w:tc>
+          <w:tcPr>
+            <w:tcW w:w="2000" w:type="dxa"/>
+            <w:tcBorders>
+              <w:top w:val="single" w:sz="4" w:space="0" w:color="BFBFBF"/>
+              <w:left w:val="single" w:sz="4" w:space="0" w:color="BFBFBF"/>
+              <w:bottom w:val="single" w:sz="4" w:space="0" w:color="BFBFBF"/>
+              <w:right w:val="single" w:sz="4" w:space="0" w:color="BFBFBF"/>
+            </w:tcBorders>
+            <w:tcMar>
+              <w:top w:w="60" w:type="dxa"/>
+              <w:left w:w="100" w:type="dxa"/>
+              <w:bottom w:w="60" w:type="dxa"/>
+              <w:right w:w="100" w:type="dxa"/>
+            </w:tcMar>
+          </w:tcPr>
+          <w:p>
+            <w:pPr>
+              <w:keepNext/>
+              <w:keepLines/>
+            </w:pPr>
+            <w:r>
+              <w:rPr>
+                <w:sz w:val="19"/>
+                <w:szCs w:val="19"/>
+              </w:rPr>
+              <w:t>Reproducibility</w:t>
             </w:r>
           </w:p>
         </w:tc>
@@ -2843,7 +2964,37 @@
                 <w:sz w:val="19"/>
                 <w:szCs w:val="19"/>
               </w:rPr>
-              <w:t>adapter_training.py</w:t>
+              <w:t>Checked against the code</w:t>
+            </w:r>
+          </w:p>
+        </w:tc>
+        <w:tc>
+          <w:tcPr>
+            <w:tcW w:w="2926" w:type="dxa"/>
+            <w:tcBorders>
+              <w:top w:val="single" w:sz="4" w:space="0" w:color="BFBFBF"/>
+              <w:left w:val="single" w:sz="4" w:space="0" w:color="BFBFBF"/>
+              <w:bottom w:val="single" w:sz="4" w:space="0" w:color="BFBFBF"/>
+              <w:right w:val="single" w:sz="4" w:space="0" w:color="BFBFBF"/>
+            </w:tcBorders>
+            <w:tcMar>
+              <w:top w:w="60" w:type="dxa"/>
+              <w:left w:w="100" w:type="dxa"/>
+              <w:bottom w:w="60" w:type="dxa"/>
+              <w:right w:w="100" w:type="dxa"/>
+            </w:tcMar>
+          </w:tcPr>
+          <w:p>
+            <w:pPr>
+              <w:keepNext/>
+              <w:keepLines/>
+            </w:pPr>
+            <w:r>
+              <w:rPr>
+                <w:sz w:val="19"/>
+                <w:szCs w:val="19"/>
+              </w:rPr>
+              <w:t>The code performs 192 per-example updates (64 × 3 epochs); the description is updated accordingly</w:t>
             </w:r>
           </w:p>
         </w:tc>
@@ -2860,61 +3011,61 @@
         </w:trPr>
         <w:tc>
           <w:tcPr>
-            <w:tcW w:w="2300" w:type="dxa"/>
-            <w:tcBorders>
-              <w:top w:val="single" w:sz="4" w:space="0" w:color="BFBFBF"/>
-              <w:left w:val="single" w:sz="4" w:space="0" w:color="BFBFBF"/>
-              <w:bottom w:val="single" w:sz="4" w:space="0" w:color="BFBFBF"/>
-              <w:right w:val="single" w:sz="4" w:space="0" w:color="BFBFBF"/>
-            </w:tcBorders>
-            <w:tcMar>
-              <w:top w:w="60" w:type="dxa"/>
-              <w:left w:w="100" w:type="dxa"/>
-              <w:bottom w:w="60" w:type="dxa"/>
-              <w:right w:w="100" w:type="dxa"/>
-            </w:tcMar>
-          </w:tcPr>
-          <w:p>
-            <w:pPr>
-              <w:keepNext/>
-              <w:keepLines/>
-            </w:pPr>
-            <w:r>
-              <w:rPr>
-                <w:sz w:val="19"/>
-                <w:szCs w:val="19"/>
-              </w:rPr>
-              <w:t>67.6% class recoverability</w:t>
-            </w:r>
-          </w:p>
-        </w:tc>
-        <w:tc>
-          <w:tcPr>
-            <w:tcW w:w="4526" w:type="dxa"/>
-            <w:tcBorders>
-              <w:top w:val="single" w:sz="4" w:space="0" w:color="BFBFBF"/>
-              <w:left w:val="single" w:sz="4" w:space="0" w:color="BFBFBF"/>
-              <w:bottom w:val="single" w:sz="4" w:space="0" w:color="BFBFBF"/>
-              <w:right w:val="single" w:sz="4" w:space="0" w:color="BFBFBF"/>
-            </w:tcBorders>
-            <w:tcMar>
-              <w:top w:w="60" w:type="dxa"/>
-              <w:left w:w="100" w:type="dxa"/>
-              <w:bottom w:w="60" w:type="dxa"/>
-              <w:right w:w="100" w:type="dxa"/>
-            </w:tcMar>
-          </w:tcPr>
-          <w:p>
-            <w:pPr>
-              <w:keepNext/>
-              <w:keepLines/>
-            </w:pPr>
-            <w:r>
-              <w:rPr>
-                <w:sz w:val="19"/>
-                <w:szCs w:val="19"/>
-              </w:rPr>
-              <w:t>Reproduced (69.6%); the ceiling is the encoder, confirmed</w:t>
+            <w:tcW w:w="1900" w:type="dxa"/>
+            <w:tcBorders>
+              <w:top w:val="single" w:sz="4" w:space="0" w:color="BFBFBF"/>
+              <w:left w:val="single" w:sz="4" w:space="0" w:color="BFBFBF"/>
+              <w:bottom w:val="single" w:sz="4" w:space="0" w:color="BFBFBF"/>
+              <w:right w:val="single" w:sz="4" w:space="0" w:color="BFBFBF"/>
+            </w:tcBorders>
+            <w:tcMar>
+              <w:top w:w="60" w:type="dxa"/>
+              <w:left w:w="100" w:type="dxa"/>
+              <w:bottom w:w="60" w:type="dxa"/>
+              <w:right w:w="100" w:type="dxa"/>
+            </w:tcMar>
+          </w:tcPr>
+          <w:p>
+            <w:pPr>
+              <w:keepNext/>
+              <w:keepLines/>
+            </w:pPr>
+            <w:r>
+              <w:rPr>
+                <w:sz w:val="19"/>
+                <w:szCs w:val="19"/>
+              </w:rPr>
+              <w:t>Auditability measured only as class recoverability</w:t>
+            </w:r>
+          </w:p>
+        </w:tc>
+        <w:tc>
+          <w:tcPr>
+            <w:tcW w:w="2000" w:type="dxa"/>
+            <w:tcBorders>
+              <w:top w:val="single" w:sz="4" w:space="0" w:color="BFBFBF"/>
+              <w:left w:val="single" w:sz="4" w:space="0" w:color="BFBFBF"/>
+              <w:bottom w:val="single" w:sz="4" w:space="0" w:color="BFBFBF"/>
+              <w:right w:val="single" w:sz="4" w:space="0" w:color="BFBFBF"/>
+            </w:tcBorders>
+            <w:tcMar>
+              <w:top w:w="60" w:type="dxa"/>
+              <w:left w:w="100" w:type="dxa"/>
+              <w:bottom w:w="60" w:type="dxa"/>
+              <w:right w:w="100" w:type="dxa"/>
+            </w:tcMar>
+          </w:tcPr>
+          <w:p>
+            <w:pPr>
+              <w:keepNext/>
+              <w:keepLines/>
+            </w:pPr>
+            <w:r>
+              <w:rPr>
+                <w:sz w:val="19"/>
+                <w:szCs w:val="19"/>
+              </w:rPr>
+              <w:t>Needs to locate where information is lost</w:t>
             </w:r>
           </w:p>
         </w:tc>
@@ -2944,7 +3095,37 @@
                 <w:sz w:val="19"/>
                 <w:szCs w:val="19"/>
               </w:rPr>
-              <w:t>Step 3 probe, item 6 decoder</w:t>
+              <w:t>Added inverse decoders and an RR-timing encoder</w:t>
+            </w:r>
+          </w:p>
+        </w:tc>
+        <w:tc>
+          <w:tcPr>
+            <w:tcW w:w="2926" w:type="dxa"/>
+            <w:tcBorders>
+              <w:top w:val="single" w:sz="4" w:space="0" w:color="BFBFBF"/>
+              <w:left w:val="single" w:sz="4" w:space="0" w:color="BFBFBF"/>
+              <w:bottom w:val="single" w:sz="4" w:space="0" w:color="BFBFBF"/>
+              <w:right w:val="single" w:sz="4" w:space="0" w:color="BFBFBF"/>
+            </w:tcBorders>
+            <w:tcMar>
+              <w:top w:w="60" w:type="dxa"/>
+              <w:left w:w="100" w:type="dxa"/>
+              <w:bottom w:w="60" w:type="dxa"/>
+              <w:right w:w="100" w:type="dxa"/>
+            </w:tcMar>
+          </w:tcPr>
+          <w:p>
+            <w:pPr>
+              <w:keepNext/>
+              <w:keepLines/>
+            </w:pPr>
+            <w:r>
+              <w:rPr>
+                <w:sz w:val="19"/>
+                <w:szCs w:val="19"/>
+              </w:rPr>
+              <w:t>Recoverability reproduced (69.6%); the loss sits in the encoder, and the RR branch raises it to 84.6%</w:t>
             </w:r>
           </w:p>
         </w:tc>
@@ -2962,7 +3143,7 @@
           <w:sz w:val="18"/>
           <w:szCs w:val="18"/>
         </w:rPr>
-        <w:t>Table 2. What happened to each single-event claim.</w:t>
+        <w:t>Table 2. Weaknesses identified in the single-event evaluation and the Phase 1 response to each.</w:t>
       </w:r>
     </w:p>
     <w:p>
@@ -2970,7 +3151,7 @@
         <w:spacing w:after="120"/>
       </w:pPr>
       <w:r>
-        <w:t>Conclusion: for single events the latent interface has no cost advantage over a well-designed text prompt and is less accurate. The contribution had to move to the setting where the interface can matter: many events in one context.</w:t>
+        <w:t>Taken together, these showed that a single heartbeat per call gives a latent interface little room to help: the fixed prompt scaffold dominates the cost, and text already carries the one event well. The interface's natural advantage is when many events must share one context, where text grows by about 60 tokens per event and the adapter by 4. Phase 1 therefore iterated the design towards multi-event reasoning (Sections 5-8).</w:t>
       </w:r>
     </w:p>
     <w:p>
@@ -2979,7 +3160,7 @@
         <w:keepNext/>
         <w:keepLines/>
       </w:pPr>
-      <w:bookmarkStart w:id="4" w:name="_Toc241530783"/>
+      <w:bookmarkStart w:id="4" w:name="_Toc241533473"/>
       <w:r>
         <w:t>5. What changed in the system</w:t>
       </w:r>
@@ -2996,7 +3177,7 @@
           <w:noProof/>
         </w:rPr>
         <w:drawing>
-          <wp:inline distT="0" distB="0" distL="0" distR="0" wp14:anchorId="338F4EC1" wp14:editId="1BCD1C2E">
+          <wp:inline distT="0" distB="0" distL="0" distR="0" wp14:anchorId="74E7BE6C" wp14:editId="79813895">
             <wp:extent cx="5762625" cy="2524125"/>
             <wp:effectExtent l="0" t="0" r="0" b="0"/>
             <wp:docPr id="1" name="fig1_pipeline.png" descr="Figure 1. Pipeline before (single event) and after Phase 1 (multi-event). The highlighted block is the component trained in this work." title="fig1_pipeline.png"/>
@@ -3056,7 +3237,7 @@
         <w:keepNext/>
         <w:keepLines/>
       </w:pPr>
-      <w:bookmarkStart w:id="5" w:name="_Toc241530784"/>
+      <w:bookmarkStart w:id="5" w:name="_Toc241533474"/>
       <w:r>
         <w:t>5.1 Perception: RR-timing branch</w:t>
       </w:r>
@@ -3076,7 +3257,7 @@
         <w:keepNext/>
         <w:keepLines/>
       </w:pPr>
-      <w:bookmarkStart w:id="6" w:name="_Toc241530785"/>
+      <w:bookmarkStart w:id="6" w:name="_Toc241533475"/>
       <w:r>
         <w:t>5.2 Multi-event adapter</w:t>
       </w:r>
@@ -3145,7 +3326,7 @@
           <w:noProof/>
         </w:rPr>
         <w:drawing>
-          <wp:inline distT="0" distB="0" distL="0" distR="0" wp14:anchorId="26BED0ED" wp14:editId="0161E121">
+          <wp:inline distT="0" distB="0" distL="0" distR="0" wp14:anchorId="6D649600" wp14:editId="46DB712A">
             <wp:extent cx="5762625" cy="2657475"/>
             <wp:effectExtent l="0" t="0" r="0" b="0"/>
             <wp:docPr id="2" name="fig7_training_r3.png" descr="Figure 2. Validation balanced accuracy during training, recipe r3, three seeds. All seeds learn the task; the best checkpoint per seed is selected on validation only." title="fig7_training_r3.png"/>
@@ -3205,7 +3386,7 @@
         <w:keepNext/>
         <w:keepLines/>
       </w:pPr>
-      <w:bookmarkStart w:id="7" w:name="_Toc241530786"/>
+      <w:bookmarkStart w:id="7" w:name="_Toc241533476"/>
       <w:r>
         <w:t>5.3 Schema-constrained decoding</w:t>
       </w:r>
@@ -3225,7 +3406,7 @@
         <w:keepNext/>
         <w:keepLines/>
       </w:pPr>
-      <w:bookmarkStart w:id="8" w:name="_Toc241530787"/>
+      <w:bookmarkStart w:id="8" w:name="_Toc241533477"/>
       <w:r>
         <w:t>6. Efficiency results</w:t>
       </w:r>
@@ -3242,7 +3423,7 @@
           <w:noProof/>
         </w:rPr>
         <w:drawing>
-          <wp:inline distT="0" distB="0" distL="0" distR="0" wp14:anchorId="230657FA" wp14:editId="4569D302">
+          <wp:inline distT="0" distB="0" distL="0" distR="0" wp14:anchorId="6B913923" wp14:editId="3D49EE99">
             <wp:extent cx="5762625" cy="1962150"/>
             <wp:effectExtent l="0" t="0" r="0" b="0"/>
             <wp:docPr id="3" name="fig2_latency.png" descr="Figure 3. Median latency per request (batch 1, 21 DS2 windows per N). Left: time to first token. Right: time until the urgency tier is generated (token 7 of the constrained answer)." title="fig2_latency.png"/>
@@ -4217,7 +4398,7 @@
         <w:keepNext/>
         <w:keepLines/>
       </w:pPr>
-      <w:bookmarkStart w:id="9" w:name="_Toc241530788"/>
+      <w:bookmarkStart w:id="9" w:name="_Toc241533478"/>
       <w:r>
         <w:t>7. Accuracy results</w:t>
       </w:r>
@@ -4229,7 +4410,7 @@
         <w:keepNext/>
         <w:keepLines/>
       </w:pPr>
-      <w:bookmarkStart w:id="10" w:name="_Toc241530789"/>
+      <w:bookmarkStart w:id="10" w:name="_Toc241533479"/>
       <w:r>
         <w:t>7.1 Primary test (pre-registered, Deviation 16)</w:t>
       </w:r>
@@ -4254,7 +4435,7 @@
           <w:noProof/>
         </w:rPr>
         <w:drawing>
-          <wp:inline distT="0" distB="0" distL="0" distR="0" wp14:anchorId="07D0DA1F" wp14:editId="724C7FB8">
+          <wp:inline distT="0" distB="0" distL="0" distR="0" wp14:anchorId="58533939" wp14:editId="0BC73127">
             <wp:extent cx="5762625" cy="3028950"/>
             <wp:effectExtent l="0" t="0" r="0" b="0"/>
             <wp:docPr id="4" name="fig3_accuracy_vs_n.png" descr="Figure 4. Balanced accuracy on the DS2 test set by window size. The adapter stays flat at about 0.8; default text falls sharply from N = 5; text with a calibrated threshold recovers most of the gap." title="fig3_accuracy_vs_n.png"/>
@@ -5520,7 +5701,7 @@
         <w:keepNext/>
         <w:keepLines/>
       </w:pPr>
-      <w:bookmarkStart w:id="11" w:name="_Toc241530790"/>
+      <w:bookmarkStart w:id="11" w:name="_Toc241533480"/>
       <w:r>
         <w:t>7.2 Calibrated comparison (Deviation 17)</w:t>
       </w:r>
@@ -5545,7 +5726,7 @@
           <w:noProof/>
         </w:rPr>
         <w:drawing>
-          <wp:inline distT="0" distB="0" distL="0" distR="0" wp14:anchorId="7BCCB957" wp14:editId="77EF366A">
+          <wp:inline distT="0" distB="0" distL="0" distR="0" wp14:anchorId="73B558CA" wp14:editId="0F1C435C">
             <wp:extent cx="5762625" cy="2657475"/>
             <wp:effectExtent l="0" t="0" r="0" b="0"/>
             <wp:docPr id="5" name="fig4_forest.png" descr="Figure 5. Adapter minus text with patient-level 95% confidence intervals, against default and calibrated text. Dotted red line: non-inferiority margin." title="fig4_forest.png"/>
@@ -5605,7 +5786,7 @@
         <w:keepNext/>
         <w:keepLines/>
       </w:pPr>
-      <w:bookmarkStart w:id="12" w:name="_Toc241530791"/>
+      <w:bookmarkStart w:id="12" w:name="_Toc241533481"/>
       <w:r>
         <w:t>7.3 Why text fails with many events</w:t>
       </w:r>
@@ -5622,7 +5803,7 @@
           <w:noProof/>
         </w:rPr>
         <w:drawing>
-          <wp:inline distT="0" distB="0" distL="0" distR="0" wp14:anchorId="2F076B6F" wp14:editId="4AB13C98">
+          <wp:inline distT="0" distB="0" distL="0" distR="0" wp14:anchorId="4A50CB35" wp14:editId="18907F3B">
             <wp:extent cx="5762625" cy="1971675"/>
             <wp:effectExtent l="0" t="0" r="0" b="0"/>
             <wp:docPr id="6" name="fig5_why_text_fails.png" descr="Figure 6. Left: text misses urgent windows caused by a single high-confidence V/F beat (a numeric threshold, 0.85, buried in a long list) far more than runs of abnormal beats. Right: text is worst when the key beat is in the middle of the list, the 'lost in the middle' effect; the adapter shows no position effect." title="fig5_why_text_fails.png"/>
@@ -5695,7 +5876,7 @@
           <w:noProof/>
         </w:rPr>
         <w:drawing>
-          <wp:inline distT="0" distB="0" distL="0" distR="0" wp14:anchorId="0C6E60B3" wp14:editId="01805F77">
+          <wp:inline distT="0" distB="0" distL="0" distR="0" wp14:anchorId="7A6DBF24" wp14:editId="5F4AB792">
             <wp:extent cx="5762625" cy="2705100"/>
             <wp:effectExtent l="0" t="0" r="0" b="0"/>
             <wp:docPr id="7" name="fig6_confusion_n50.png" descr="Figure 7. Confusion at N = 50. Text under-escalates (priority → routine, urgent → priority) and never raises a false alarm; the adapter rarely calls an abnormal window routine but sometimes escalates routine windows." title="fig6_confusion_n50.png"/>
@@ -5755,7 +5936,7 @@
         <w:keepNext/>
         <w:keepLines/>
       </w:pPr>
-      <w:bookmarkStart w:id="13" w:name="_Toc241530792"/>
+      <w:bookmarkStart w:id="13" w:name="_Toc241533482"/>
       <w:r>
         <w:t>7.4 Natural-prevalence windows and false alarms</w:t>
       </w:r>
@@ -6636,7 +6817,7 @@
         <w:keepNext/>
         <w:keepLines/>
       </w:pPr>
-      <w:bookmarkStart w:id="14" w:name="_Toc241530793"/>
+      <w:bookmarkStart w:id="14" w:name="_Toc241533483"/>
       <w:r>
         <w:t>7.5 Against true annotations</w:t>
       </w:r>
@@ -6656,7 +6837,7 @@
         <w:keepNext/>
         <w:keepLines/>
       </w:pPr>
-      <w:bookmarkStart w:id="15" w:name="_Toc241530794"/>
+      <w:bookmarkStart w:id="15" w:name="_Toc241533484"/>
       <w:r>
         <w:t>8. Auditability</w:t>
       </w:r>
@@ -6753,7 +6934,7 @@
           <w:noProof/>
         </w:rPr>
         <w:drawing>
-          <wp:inline distT="0" distB="0" distL="0" distR="0" wp14:anchorId="34DB00B1" wp14:editId="50B66370">
+          <wp:inline distT="0" distB="0" distL="0" distR="0" wp14:anchorId="507140AB" wp14:editId="23CAB7CA">
             <wp:extent cx="5762625" cy="2371725"/>
             <wp:effectExtent l="0" t="0" r="0" b="0"/>
             <wp:docPr id="8" name="fig8_auditability.png" descr="Figure 8. Balanced accuracy of decoding each event's fields from its virtual-token slot (mean of 3 seeds) versus from the encoder's 32-d vector." title="fig8_auditability.png"/>
@@ -6813,7 +6994,7 @@
         <w:keepNext/>
         <w:keepLines/>
       </w:pPr>
-      <w:bookmarkStart w:id="16" w:name="_Toc241530795"/>
+      <w:bookmarkStart w:id="16" w:name="_Toc241533485"/>
       <w:r>
         <w:t>9. Status of the research questions</w:t>
       </w:r>
@@ -7048,7 +7229,7 @@
                 <w:sz w:val="19"/>
                 <w:szCs w:val="19"/>
               </w:rPr>
-              <w:t>No single-event saving vs fair text; 19–78% lower prefill and 4–36% faster decision at N = 10–50</w:t>
+              <w:t>Refined: the saving is a multi-event effect; 19–78% lower prefill and 4–36% faster decision at N = 10–50 vs compact text</w:t>
             </w:r>
           </w:p>
         </w:tc>
@@ -7119,7 +7300,7 @@
                 <w:sz w:val="19"/>
                 <w:szCs w:val="19"/>
               </w:rPr>
-              <w:t>95% (one run); 'not resolved'</w:t>
+              <w:t>95% on the evaluation set; seed variance flagged as open</w:t>
             </w:r>
           </w:p>
         </w:tc>
@@ -7149,7 +7330,7 @@
                 <w:sz w:val="19"/>
                 <w:szCs w:val="19"/>
               </w:rPr>
-              <w:t>Single event: worse (0.79 vs 0.97). Multi-event: non-inferior to calibrated text at N = 10–20; superior to default text at N = 10–50</w:t>
+              <w:t>Resolved with seeds and held-out patients: non-inferior to calibrated text at N = 10–20, superior to default text at N = 10–50; text remains preferable for single events</w:t>
             </w:r>
           </w:p>
         </w:tc>
@@ -7250,7 +7431,7 @@
                 <w:sz w:val="19"/>
                 <w:szCs w:val="19"/>
               </w:rPr>
-              <w:t>Cost located in the encoder; RR branch raises it to 85%; per-event decoding holds at every slot; uncertainty check available</w:t>
+              <w:t>Extended: cost located in the encoder; RR branch raises it to 85%; per-event decoding holds at every slot; uncertainty check available</w:t>
             </w:r>
           </w:p>
         </w:tc>
@@ -7268,7 +7449,7 @@
           <w:sz w:val="18"/>
           <w:szCs w:val="18"/>
         </w:rPr>
-        <w:t>Table 6. Research questions, dissertation vs Phase 1.</w:t>
+        <w:t>Table 6. Research questions: dissertation answer and how Phase 1 refined or extended it.</w:t>
       </w:r>
     </w:p>
     <w:p>
@@ -7277,7 +7458,7 @@
         <w:keepNext/>
         <w:keepLines/>
       </w:pPr>
-      <w:bookmarkStart w:id="17" w:name="_Toc241530796"/>
+      <w:bookmarkStart w:id="17" w:name="_Toc241533486"/>
       <w:r>
         <w:t>10. Limitations and threats to validity</w:t>
       </w:r>
@@ -7380,7 +7561,7 @@
         <w:keepNext/>
         <w:keepLines/>
       </w:pPr>
-      <w:bookmarkStart w:id="18" w:name="_Toc241530797"/>
+      <w:bookmarkStart w:id="18" w:name="_Toc241533487"/>
       <w:r>
         <w:t>11. Proposed next steps and questions for the supervisor</w:t>
       </w:r>
@@ -7486,7 +7667,7 @@
         <w:spacing w:after="60"/>
       </w:pPr>
       <w:r>
-        <w:t>Writing: corrections to the dissertation's claims stated openly as a post-viva extension; deviations summarised in one table.</w:t>
+        <w:t>Writing: present Phase 1 as a post-viva extension that strengthens the dissertation's evaluation (fair baselines, seeds, held-out patients) and carries the idea to multi-event reasoning; deviations summarised in one table.</w:t>
       </w:r>
     </w:p>
     <w:p>
@@ -7494,7 +7675,7 @@
         <w:spacing w:after="120"/>
       </w:pPr>
       <w:r>
-        <w:t>Questions: (1) Which target journal should the framing aim at (clinical AI vs machine learning systems)? (2) Is external validation expected before submission, or acceptable as future work? (3) Should a small clinician rating study be planned, given the ethics lead time? (4) How should the dissertation errata be handled formally?</w:t>
+        <w:t>Questions: (1) Which target journal should the framing aim at (clinical AI vs machine learning systems)? (2) Is external validation expected before submission, or acceptable as future work? (3) Should a small clinician rating study be planned, given the ethics lead time? (4) How should the updated methods description (192 per-example updates) be recorded alongside the submitted dissertation?</w:t>
       </w:r>
     </w:p>
     <w:p>
@@ -7503,7 +7684,7 @@
         <w:keepNext/>
         <w:keepLines/>
       </w:pPr>
-      <w:bookmarkStart w:id="19" w:name="_Toc241530798"/>
+      <w:bookmarkStart w:id="19" w:name="_Toc241533488"/>
       <w:r>
         <w:t>Appendix A. Pre-registered deviations</w:t>
       </w:r>
@@ -7708,7 +7889,7 @@
                 <w:sz w:val="19"/>
                 <w:szCs w:val="19"/>
               </w:rPr>
-              <w:t>Correct training description; seeds; baseline family; forced-length timing</w:t>
+              <w:t>Training description; seeds; baseline family; forced-length timing</w:t>
             </w:r>
           </w:p>
         </w:tc>
@@ -7738,7 +7919,7 @@
                 <w:sz w:val="19"/>
                 <w:szCs w:val="19"/>
               </w:rPr>
-              <w:t>Reproduction of dissertation claims</w:t>
+              <w:t>Strengthen the original evaluation</w:t>
             </w:r>
           </w:p>
         </w:tc>
@@ -8981,213 +9162,213 @@
 <file path=word/numbering.xml><?xml version="1.0" encoding="utf-8"?>
 <w:numbering xmlns:wpc="http://schemas.microsoft.com/office/word/2010/wordprocessingCanvas" xmlns:cx="http://schemas.microsoft.com/office/drawing/2014/chartex" xmlns:cx1="http://schemas.microsoft.com/office/drawing/2015/9/8/chartex" xmlns:cx2="http://schemas.microsoft.com/office/drawing/2015/10/21/chartex" xmlns:cx3="http://schemas.microsoft.com/office/drawing/2016/5/9/chartex" xmlns:cx4="http://schemas.microsoft.com/office/drawing/2016/5/10/chartex" xmlns:cx5="http://schemas.microsoft.com/office/drawing/2016/5/11/chartex" xmlns:cx6="http://schemas.microsoft.com/office/drawing/2016/5/12/chartex" xmlns:cx7="http://schemas.microsoft.com/office/drawing/2016/5/13/chartex" xmlns:cx8="http://schemas.microsoft.com/office/drawing/2016/5/14/chartex" xmlns:mc="http://schemas.openxmlformats.org/markup-compatibility/2006" xmlns:aink="http://schemas.microsoft.com/office/drawing/2016/ink" xmlns:am3d="http://schemas.microsoft.com/office/drawing/2017/model3d" xmlns:o="urn:schemas-microsoft-com:office:office" xmlns:oel="http://schemas.microsoft.com/office/2019/extlst" xmlns:r="http://schemas.openxmlformats.org/officeDocument/2006/relationships" xmlns:m="http://schemas.openxmlformats.org/officeDocument/2006/math" xmlns:v="urn:schemas-microsoft-com:vml" xmlns:wp14="http://schemas.microsoft.com/office/word/2010/wordprocessingDrawing" xmlns:wp="http://schemas.openxmlformats.org/drawingml/2006/wordprocessingDrawing" xmlns:w10="urn:schemas-microsoft-com:office:word" xmlns:w="http://schemas.openxmlformats.org/wordprocessingml/2006/main" xmlns:w14="http://schemas.microsoft.com/office/word/2010/wordml" xmlns:w15="http://schemas.microsoft.com/office/word/2012/wordml" xmlns:w16cex="http://schemas.microsoft.com/office/word/2018/wordml/cex" xmlns:w16cid="http://schemas.microsoft.com/office/word/2016/wordml/cid" xmlns:w16="http://schemas.microsoft.com/office/word/2018/wordml" xmlns:w16du="http://schemas.microsoft.com/office/word/2023/wordml/word16du" xmlns:w16sdtdh="http://schemas.microsoft.com/office/word/2020/wordml/sdtdatahash" xmlns:w16sdtfl="http://schemas.microsoft.com/office/word/2024/wordml/sdtformatlock" xmlns:w16se="http://schemas.microsoft.com/office/word/2015/wordml/symex" xmlns:wpg="http://schemas.microsoft.com/office/word/2010/wordprocessingGroup" xmlns:wpi="http://schemas.microsoft.com/office/word/2010/wordprocessingInk" xmlns:wne="http://schemas.microsoft.com/office/word/2006/wordml" xmlns:wps="http://schemas.microsoft.com/office/word/2010/wordprocessingShape" mc:Ignorable="w14 w15 w16se w16cid w16 w16cex w16sdtdh w16sdtfl w16du wp14">
   <w:abstractNum w:abstractNumId="0" w15:restartNumberingAfterBreak="0">
-    <w:nsid w:val="16EB5CFE"/>
+    <w:nsid w:val="136256E6"/>
     <w:multiLevelType w:val="hybridMultilevel"/>
-    <w:tmpl w:val="AEAEFA6A"/>
-    <w:lvl w:ilvl="0" w:tplc="5C5458F2">
+    <w:tmpl w:val="69263BC8"/>
+    <w:lvl w:ilvl="0" w:tplc="D870F8E2" w:tentative="1">
       <w:start w:val="1"/>
       <w:numFmt w:val="bullet"/>
-      <w:lvlText w:val="•"/>
+      <w:lvlText w:val="●"/>
       <w:lvlJc w:val="left"/>
       <w:pPr>
-        <w:ind w:left="540" w:hanging="270"/>
+        <w:ind w:left="720" w:hanging="360"/>
       </w:pPr>
     </w:lvl>
-    <w:lvl w:ilvl="1" w:tplc="D5969456">
+    <w:lvl w:ilvl="1" w:tplc="8AFA3524" w:tentative="1">
+      <w:start w:val="1"/>
+      <w:numFmt w:val="bullet"/>
+      <w:lvlText w:val="○"/>
+      <w:lvlJc w:val="left"/>
+      <w:pPr>
+        <w:ind w:left="1440" w:hanging="360"/>
+      </w:pPr>
+    </w:lvl>
+    <w:lvl w:ilvl="2" w:tplc="F07699FA" w:tentative="1">
+      <w:start w:val="1"/>
+      <w:numFmt w:val="bullet"/>
+      <w:lvlText w:val="■"/>
+      <w:lvlJc w:val="left"/>
+      <w:pPr>
+        <w:ind w:left="2160" w:hanging="360"/>
+      </w:pPr>
+    </w:lvl>
+    <w:lvl w:ilvl="3" w:tplc="93629660" w:tentative="1">
+      <w:start w:val="1"/>
+      <w:numFmt w:val="bullet"/>
+      <w:lvlText w:val="●"/>
+      <w:lvlJc w:val="left"/>
+      <w:pPr>
+        <w:ind w:left="2880" w:hanging="360"/>
+      </w:pPr>
+    </w:lvl>
+    <w:lvl w:ilvl="4" w:tplc="50B21D3C" w:tentative="1">
+      <w:start w:val="1"/>
+      <w:numFmt w:val="bullet"/>
+      <w:lvlText w:val="○"/>
+      <w:lvlJc w:val="left"/>
+      <w:pPr>
+        <w:ind w:left="3600" w:hanging="360"/>
+      </w:pPr>
+    </w:lvl>
+    <w:lvl w:ilvl="5" w:tplc="E390A98C" w:tentative="1">
+      <w:start w:val="1"/>
+      <w:numFmt w:val="bullet"/>
+      <w:lvlText w:val="■"/>
+      <w:lvlJc w:val="left"/>
+      <w:pPr>
+        <w:ind w:left="4320" w:hanging="360"/>
+      </w:pPr>
+    </w:lvl>
+    <w:lvl w:ilvl="6" w:tplc="0E5C614E" w:tentative="1">
+      <w:start w:val="1"/>
+      <w:numFmt w:val="bullet"/>
+      <w:lvlText w:val="●"/>
+      <w:lvlJc w:val="left"/>
+      <w:pPr>
+        <w:ind w:left="5040" w:hanging="360"/>
+      </w:pPr>
+    </w:lvl>
+    <w:lvl w:ilvl="7" w:tplc="5106DA6C" w:tentative="1">
+      <w:start w:val="1"/>
+      <w:numFmt w:val="bullet"/>
+      <w:lvlText w:val="●"/>
+      <w:lvlJc w:val="left"/>
+      <w:pPr>
+        <w:ind w:left="5760" w:hanging="360"/>
+      </w:pPr>
+    </w:lvl>
+    <w:lvl w:ilvl="8" w:tplc="FF447A00" w:tentative="1">
+      <w:start w:val="1"/>
+      <w:numFmt w:val="bullet"/>
+      <w:lvlText w:val="●"/>
+      <w:lvlJc w:val="left"/>
+      <w:pPr>
+        <w:ind w:left="6480" w:hanging="360"/>
+      </w:pPr>
+    </w:lvl>
+  </w:abstractNum>
+  <w:abstractNum w:abstractNumId="1" w15:restartNumberingAfterBreak="0">
+    <w:nsid w:val="2C0F71D4"/>
+    <w:multiLevelType w:val="hybridMultilevel"/>
+    <w:tmpl w:val="48681F88"/>
+    <w:lvl w:ilvl="0" w:tplc="F404058E">
+      <w:start w:val="1"/>
+      <w:numFmt w:val="decimal"/>
+      <w:lvlText w:val="%1."/>
+      <w:lvlJc w:val="left"/>
+      <w:pPr>
+        <w:ind w:left="540" w:hanging="300"/>
+      </w:pPr>
+    </w:lvl>
+    <w:lvl w:ilvl="1" w:tplc="7B167B08">
       <w:numFmt w:val="decimal"/>
       <w:lvlText w:val=""/>
       <w:lvlJc w:val="left"/>
     </w:lvl>
-    <w:lvl w:ilvl="2" w:tplc="2904E4D2">
+    <w:lvl w:ilvl="2" w:tplc="80F6FEA2">
       <w:numFmt w:val="decimal"/>
       <w:lvlText w:val=""/>
       <w:lvlJc w:val="left"/>
     </w:lvl>
-    <w:lvl w:ilvl="3" w:tplc="E51291FE">
+    <w:lvl w:ilvl="3" w:tplc="4D80988C">
       <w:numFmt w:val="decimal"/>
       <w:lvlText w:val=""/>
       <w:lvlJc w:val="left"/>
     </w:lvl>
-    <w:lvl w:ilvl="4" w:tplc="5B9E5704">
+    <w:lvl w:ilvl="4" w:tplc="AB00A13E">
       <w:numFmt w:val="decimal"/>
       <w:lvlText w:val=""/>
       <w:lvlJc w:val="left"/>
     </w:lvl>
-    <w:lvl w:ilvl="5" w:tplc="AF4CA284">
+    <w:lvl w:ilvl="5" w:tplc="58A66F70">
       <w:numFmt w:val="decimal"/>
       <w:lvlText w:val=""/>
       <w:lvlJc w:val="left"/>
     </w:lvl>
-    <w:lvl w:ilvl="6" w:tplc="32929AC2">
+    <w:lvl w:ilvl="6" w:tplc="8A102FD8">
       <w:numFmt w:val="decimal"/>
       <w:lvlText w:val=""/>
       <w:lvlJc w:val="left"/>
     </w:lvl>
-    <w:lvl w:ilvl="7" w:tplc="97CAB646">
+    <w:lvl w:ilvl="7" w:tplc="C0EE1B82">
       <w:numFmt w:val="decimal"/>
       <w:lvlText w:val=""/>
       <w:lvlJc w:val="left"/>
     </w:lvl>
-    <w:lvl w:ilvl="8" w:tplc="39B2F50C">
+    <w:lvl w:ilvl="8" w:tplc="B186E5DC">
       <w:numFmt w:val="decimal"/>
       <w:lvlText w:val=""/>
       <w:lvlJc w:val="left"/>
     </w:lvl>
   </w:abstractNum>
-  <w:abstractNum w:abstractNumId="1" w15:restartNumberingAfterBreak="0">
-    <w:nsid w:val="3F2F3BEB"/>
+  <w:abstractNum w:abstractNumId="2" w15:restartNumberingAfterBreak="0">
+    <w:nsid w:val="745F20D0"/>
     <w:multiLevelType w:val="hybridMultilevel"/>
-    <w:tmpl w:val="6EC01604"/>
-    <w:lvl w:ilvl="0" w:tplc="E7F2CF66" w:tentative="1">
+    <w:tmpl w:val="020A7628"/>
+    <w:lvl w:ilvl="0" w:tplc="5E94D770">
       <w:start w:val="1"/>
       <w:numFmt w:val="bullet"/>
-      <w:lvlText w:val="●"/>
+      <w:lvlText w:val="•"/>
       <w:lvlJc w:val="left"/>
       <w:pPr>
-        <w:ind w:left="720" w:hanging="360"/>
+        <w:ind w:left="540" w:hanging="270"/>
       </w:pPr>
     </w:lvl>
-    <w:lvl w:ilvl="1" w:tplc="200CF028" w:tentative="1">
-      <w:start w:val="1"/>
-      <w:numFmt w:val="bullet"/>
-      <w:lvlText w:val="○"/>
-      <w:lvlJc w:val="left"/>
-      <w:pPr>
-        <w:ind w:left="1440" w:hanging="360"/>
-      </w:pPr>
-    </w:lvl>
-    <w:lvl w:ilvl="2" w:tplc="C5AAA32C" w:tentative="1">
-      <w:start w:val="1"/>
-      <w:numFmt w:val="bullet"/>
-      <w:lvlText w:val="■"/>
-      <w:lvlJc w:val="left"/>
-      <w:pPr>
-        <w:ind w:left="2160" w:hanging="360"/>
-      </w:pPr>
-    </w:lvl>
-    <w:lvl w:ilvl="3" w:tplc="7B34D8B2" w:tentative="1">
-      <w:start w:val="1"/>
-      <w:numFmt w:val="bullet"/>
-      <w:lvlText w:val="●"/>
-      <w:lvlJc w:val="left"/>
-      <w:pPr>
-        <w:ind w:left="2880" w:hanging="360"/>
-      </w:pPr>
-    </w:lvl>
-    <w:lvl w:ilvl="4" w:tplc="CDC2020E" w:tentative="1">
-      <w:start w:val="1"/>
-      <w:numFmt w:val="bullet"/>
-      <w:lvlText w:val="○"/>
-      <w:lvlJc w:val="left"/>
-      <w:pPr>
-        <w:ind w:left="3600" w:hanging="360"/>
-      </w:pPr>
-    </w:lvl>
-    <w:lvl w:ilvl="5" w:tplc="11CE7DBE" w:tentative="1">
-      <w:start w:val="1"/>
-      <w:numFmt w:val="bullet"/>
-      <w:lvlText w:val="■"/>
-      <w:lvlJc w:val="left"/>
-      <w:pPr>
-        <w:ind w:left="4320" w:hanging="360"/>
-      </w:pPr>
-    </w:lvl>
-    <w:lvl w:ilvl="6" w:tplc="6E0410D8" w:tentative="1">
-      <w:start w:val="1"/>
-      <w:numFmt w:val="bullet"/>
-      <w:lvlText w:val="●"/>
-      <w:lvlJc w:val="left"/>
-      <w:pPr>
-        <w:ind w:left="5040" w:hanging="360"/>
-      </w:pPr>
-    </w:lvl>
-    <w:lvl w:ilvl="7" w:tplc="B25AD554" w:tentative="1">
-      <w:start w:val="1"/>
-      <w:numFmt w:val="bullet"/>
-      <w:lvlText w:val="●"/>
-      <w:lvlJc w:val="left"/>
-      <w:pPr>
-        <w:ind w:left="5760" w:hanging="360"/>
-      </w:pPr>
-    </w:lvl>
-    <w:lvl w:ilvl="8" w:tplc="853A7A3E" w:tentative="1">
-      <w:start w:val="1"/>
-      <w:numFmt w:val="bullet"/>
-      <w:lvlText w:val="●"/>
-      <w:lvlJc w:val="left"/>
-      <w:pPr>
-        <w:ind w:left="6480" w:hanging="360"/>
-      </w:pPr>
-    </w:lvl>
-  </w:abstractNum>
-  <w:abstractNum w:abstractNumId="2" w15:restartNumberingAfterBreak="0">
-    <w:nsid w:val="604A30A6"/>
-    <w:multiLevelType w:val="hybridMultilevel"/>
-    <w:tmpl w:val="294E0542"/>
-    <w:lvl w:ilvl="0" w:tplc="FB8A7EB8">
-      <w:start w:val="1"/>
-      <w:numFmt w:val="decimal"/>
-      <w:lvlText w:val="%1."/>
-      <w:lvlJc w:val="left"/>
-      <w:pPr>
-        <w:ind w:left="540" w:hanging="300"/>
-      </w:pPr>
-    </w:lvl>
-    <w:lvl w:ilvl="1" w:tplc="FA2CF066">
+    <w:lvl w:ilvl="1" w:tplc="8DCA088E">
       <w:numFmt w:val="decimal"/>
       <w:lvlText w:val=""/>
       <w:lvlJc w:val="left"/>
     </w:lvl>
-    <w:lvl w:ilvl="2" w:tplc="36F85A50">
+    <w:lvl w:ilvl="2" w:tplc="7A4E6F2A">
       <w:numFmt w:val="decimal"/>
       <w:lvlText w:val=""/>
       <w:lvlJc w:val="left"/>
     </w:lvl>
-    <w:lvl w:ilvl="3" w:tplc="257A125A">
+    <w:lvl w:ilvl="3" w:tplc="29227552">
       <w:numFmt w:val="decimal"/>
       <w:lvlText w:val=""/>
       <w:lvlJc w:val="left"/>
     </w:lvl>
-    <w:lvl w:ilvl="4" w:tplc="67A6CC1A">
+    <w:lvl w:ilvl="4" w:tplc="38F6B706">
       <w:numFmt w:val="decimal"/>
       <w:lvlText w:val=""/>
       <w:lvlJc w:val="left"/>
     </w:lvl>
-    <w:lvl w:ilvl="5" w:tplc="BBBCBCA4">
+    <w:lvl w:ilvl="5" w:tplc="0FB4F348">
       <w:numFmt w:val="decimal"/>
       <w:lvlText w:val=""/>
       <w:lvlJc w:val="left"/>
     </w:lvl>
-    <w:lvl w:ilvl="6" w:tplc="6136D1C0">
+    <w:lvl w:ilvl="6" w:tplc="A1ACCB00">
       <w:numFmt w:val="decimal"/>
       <w:lvlText w:val=""/>
       <w:lvlJc w:val="left"/>
     </w:lvl>
-    <w:lvl w:ilvl="7" w:tplc="596860AA">
+    <w:lvl w:ilvl="7" w:tplc="65586312">
       <w:numFmt w:val="decimal"/>
       <w:lvlText w:val=""/>
       <w:lvlJc w:val="left"/>
     </w:lvl>
-    <w:lvl w:ilvl="8" w:tplc="D4043794">
+    <w:lvl w:ilvl="8" w:tplc="11C6226A">
       <w:numFmt w:val="decimal"/>
       <w:lvlText w:val=""/>
       <w:lvlJc w:val="left"/>
     </w:lvl>
   </w:abstractNum>
-  <w:num w:numId="1" w16cid:durableId="342558759">
-    <w:abstractNumId w:val="1"/>
-    <w:lvlOverride w:ilvl="0">
-      <w:startOverride w:val="1"/>
-    </w:lvlOverride>
-  </w:num>
-  <w:num w:numId="2" w16cid:durableId="1164130121">
+  <w:num w:numId="1" w16cid:durableId="1910847675">
     <w:abstractNumId w:val="0"/>
     <w:lvlOverride w:ilvl="0">
       <w:startOverride w:val="1"/>
     </w:lvlOverride>
   </w:num>
-  <w:num w:numId="3" w16cid:durableId="977536221">
+  <w:num w:numId="2" w16cid:durableId="162669646">
     <w:abstractNumId w:val="2"/>
+    <w:lvlOverride w:ilvl="0">
+      <w:startOverride w:val="1"/>
+    </w:lvlOverride>
+  </w:num>
+  <w:num w:numId="3" w16cid:durableId="558782377">
+    <w:abstractNumId w:val="1"/>
     <w:lvlOverride w:ilvl="0">
       <w:startOverride w:val="1"/>
     </w:lvlOverride>
@@ -9824,7 +10005,7 @@
     <w:autoRedefine/>
     <w:uiPriority w:val="39"/>
     <w:unhideWhenUsed/>
-    <w:rsid w:val="00A53728"/>
+    <w:rsid w:val="009E5DAE"/>
     <w:pPr>
       <w:spacing w:after="100"/>
     </w:pPr>
@@ -9836,7 +10017,7 @@
     <w:autoRedefine/>
     <w:uiPriority w:val="39"/>
     <w:unhideWhenUsed/>
-    <w:rsid w:val="00A53728"/>
+    <w:rsid w:val="009E5DAE"/>
     <w:pPr>
       <w:spacing w:after="100"/>
       <w:ind w:left="210"/>

</xml_diff>

<commit_message>
Report: RR encoder as 10-seed mean ± SD (new Table 3); F-class limitation with its data-split cause
Co-Authored-By: Claude Opus 5.5 <noreply@anthropic.com>
</commit_message>
<xml_diff>
--- a/reports/Phase1_Technical_Report.docx
+++ b/reports/Phase1_Technical_Report.docx
@@ -82,7 +82,7 @@
     <w:sdt>
       <w:sdtPr>
         <w:alias w:val="Contents"/>
-        <w:id w:val="1196812384"/>
+        <w:id w:val="-1401665323"/>
       </w:sdtPr>
       <w:sdtEndPr/>
       <w:sdtContent>
@@ -110,7 +110,7 @@
           <w:r>
             <w:fldChar w:fldCharType="separate"/>
           </w:r>
-          <w:hyperlink w:anchor="_Toc241746060" w:history="1">
+          <w:hyperlink w:anchor="_Toc241748272" w:history="1">
             <w:r>
               <w:rPr>
                 <w:rStyle w:val="Hyperlink"/>
@@ -134,7 +134,7 @@
               <w:rPr>
                 <w:noProof/>
               </w:rPr>
-              <w:instrText xml:space="preserve"> PAGEREF _Toc241746060 \h </w:instrText>
+              <w:instrText xml:space="preserve"> PAGEREF _Toc241748272 \h </w:instrText>
             </w:r>
             <w:r>
               <w:rPr>
@@ -176,7 +176,7 @@
               <w14:ligatures w14:val="standardContextual"/>
             </w:rPr>
           </w:pPr>
-          <w:hyperlink w:anchor="_Toc241746061" w:history="1">
+          <w:hyperlink w:anchor="_Toc241748273" w:history="1">
             <w:r>
               <w:rPr>
                 <w:rStyle w:val="Hyperlink"/>
@@ -200,7 +200,7 @@
               <w:rPr>
                 <w:noProof/>
               </w:rPr>
-              <w:instrText xml:space="preserve"> PAGEREF _Toc241746061 \h </w:instrText>
+              <w:instrText xml:space="preserve"> PAGEREF _Toc241748273 \h </w:instrText>
             </w:r>
             <w:r>
               <w:rPr>
@@ -242,7 +242,7 @@
               <w14:ligatures w14:val="standardContextual"/>
             </w:rPr>
           </w:pPr>
-          <w:hyperlink w:anchor="_Toc241746062" w:history="1">
+          <w:hyperlink w:anchor="_Toc241748274" w:history="1">
             <w:r>
               <w:rPr>
                 <w:rStyle w:val="Hyperlink"/>
@@ -266,7 +266,7 @@
               <w:rPr>
                 <w:noProof/>
               </w:rPr>
-              <w:instrText xml:space="preserve"> PAGEREF _Toc241746062 \h </w:instrText>
+              <w:instrText xml:space="preserve"> PAGEREF _Toc241748274 \h </w:instrText>
             </w:r>
             <w:r>
               <w:rPr>
@@ -308,7 +308,7 @@
               <w14:ligatures w14:val="standardContextual"/>
             </w:rPr>
           </w:pPr>
-          <w:hyperlink w:anchor="_Toc241746063" w:history="1">
+          <w:hyperlink w:anchor="_Toc241748275" w:history="1">
             <w:r>
               <w:rPr>
                 <w:rStyle w:val="Hyperlink"/>
@@ -332,7 +332,7 @@
               <w:rPr>
                 <w:noProof/>
               </w:rPr>
-              <w:instrText xml:space="preserve"> PAGEREF _Toc241746063 \h </w:instrText>
+              <w:instrText xml:space="preserve"> PAGEREF _Toc241748275 \h </w:instrText>
             </w:r>
             <w:r>
               <w:rPr>
@@ -374,7 +374,7 @@
               <w14:ligatures w14:val="standardContextual"/>
             </w:rPr>
           </w:pPr>
-          <w:hyperlink w:anchor="_Toc241746064" w:history="1">
+          <w:hyperlink w:anchor="_Toc241748276" w:history="1">
             <w:r>
               <w:rPr>
                 <w:rStyle w:val="Hyperlink"/>
@@ -398,7 +398,7 @@
               <w:rPr>
                 <w:noProof/>
               </w:rPr>
-              <w:instrText xml:space="preserve"> PAGEREF _Toc241746064 \h </w:instrText>
+              <w:instrText xml:space="preserve"> PAGEREF _Toc241748276 \h </w:instrText>
             </w:r>
             <w:r>
               <w:rPr>
@@ -440,7 +440,7 @@
               <w14:ligatures w14:val="standardContextual"/>
             </w:rPr>
           </w:pPr>
-          <w:hyperlink w:anchor="_Toc241746065" w:history="1">
+          <w:hyperlink w:anchor="_Toc241748277" w:history="1">
             <w:r>
               <w:rPr>
                 <w:rStyle w:val="Hyperlink"/>
@@ -464,7 +464,7 @@
               <w:rPr>
                 <w:noProof/>
               </w:rPr>
-              <w:instrText xml:space="preserve"> PAGEREF _Toc241746065 \h </w:instrText>
+              <w:instrText xml:space="preserve"> PAGEREF _Toc241748277 \h </w:instrText>
             </w:r>
             <w:r>
               <w:rPr>
@@ -481,7 +481,7 @@
               <w:rPr>
                 <w:noProof/>
               </w:rPr>
-              <w:t>4</w:t>
+              <w:t>5</w:t>
             </w:r>
             <w:r>
               <w:rPr>
@@ -506,7 +506,7 @@
               <w14:ligatures w14:val="standardContextual"/>
             </w:rPr>
           </w:pPr>
-          <w:hyperlink w:anchor="_Toc241746066" w:history="1">
+          <w:hyperlink w:anchor="_Toc241748278" w:history="1">
             <w:r>
               <w:rPr>
                 <w:rStyle w:val="Hyperlink"/>
@@ -530,7 +530,7 @@
               <w:rPr>
                 <w:noProof/>
               </w:rPr>
-              <w:instrText xml:space="preserve"> PAGEREF _Toc241746066 \h </w:instrText>
+              <w:instrText xml:space="preserve"> PAGEREF _Toc241748278 \h </w:instrText>
             </w:r>
             <w:r>
               <w:rPr>
@@ -572,7 +572,7 @@
               <w14:ligatures w14:val="standardContextual"/>
             </w:rPr>
           </w:pPr>
-          <w:hyperlink w:anchor="_Toc241746067" w:history="1">
+          <w:hyperlink w:anchor="_Toc241748279" w:history="1">
             <w:r>
               <w:rPr>
                 <w:rStyle w:val="Hyperlink"/>
@@ -596,7 +596,7 @@
               <w:rPr>
                 <w:noProof/>
               </w:rPr>
-              <w:instrText xml:space="preserve"> PAGEREF _Toc241746067 \h </w:instrText>
+              <w:instrText xml:space="preserve"> PAGEREF _Toc241748279 \h </w:instrText>
             </w:r>
             <w:r>
               <w:rPr>
@@ -638,7 +638,7 @@
               <w14:ligatures w14:val="standardContextual"/>
             </w:rPr>
           </w:pPr>
-          <w:hyperlink w:anchor="_Toc241746068" w:history="1">
+          <w:hyperlink w:anchor="_Toc241748280" w:history="1">
             <w:r>
               <w:rPr>
                 <w:rStyle w:val="Hyperlink"/>
@@ -662,7 +662,7 @@
               <w:rPr>
                 <w:noProof/>
               </w:rPr>
-              <w:instrText xml:space="preserve"> PAGEREF _Toc241746068 \h </w:instrText>
+              <w:instrText xml:space="preserve"> PAGEREF _Toc241748280 \h </w:instrText>
             </w:r>
             <w:r>
               <w:rPr>
@@ -704,7 +704,7 @@
               <w14:ligatures w14:val="standardContextual"/>
             </w:rPr>
           </w:pPr>
-          <w:hyperlink w:anchor="_Toc241746069" w:history="1">
+          <w:hyperlink w:anchor="_Toc241748281" w:history="1">
             <w:r>
               <w:rPr>
                 <w:rStyle w:val="Hyperlink"/>
@@ -728,7 +728,7 @@
               <w:rPr>
                 <w:noProof/>
               </w:rPr>
-              <w:instrText xml:space="preserve"> PAGEREF _Toc241746069 \h </w:instrText>
+              <w:instrText xml:space="preserve"> PAGEREF _Toc241748281 \h </w:instrText>
             </w:r>
             <w:r>
               <w:rPr>
@@ -770,7 +770,7 @@
               <w14:ligatures w14:val="standardContextual"/>
             </w:rPr>
           </w:pPr>
-          <w:hyperlink w:anchor="_Toc241746070" w:history="1">
+          <w:hyperlink w:anchor="_Toc241748282" w:history="1">
             <w:r>
               <w:rPr>
                 <w:rStyle w:val="Hyperlink"/>
@@ -794,7 +794,7 @@
               <w:rPr>
                 <w:noProof/>
               </w:rPr>
-              <w:instrText xml:space="preserve"> PAGEREF _Toc241746070 \h </w:instrText>
+              <w:instrText xml:space="preserve"> PAGEREF _Toc241748282 \h </w:instrText>
             </w:r>
             <w:r>
               <w:rPr>
@@ -811,7 +811,7 @@
               <w:rPr>
                 <w:noProof/>
               </w:rPr>
-              <w:t>6</w:t>
+              <w:t>7</w:t>
             </w:r>
             <w:r>
               <w:rPr>
@@ -836,7 +836,7 @@
               <w14:ligatures w14:val="standardContextual"/>
             </w:rPr>
           </w:pPr>
-          <w:hyperlink w:anchor="_Toc241746071" w:history="1">
+          <w:hyperlink w:anchor="_Toc241748283" w:history="1">
             <w:r>
               <w:rPr>
                 <w:rStyle w:val="Hyperlink"/>
@@ -860,7 +860,7 @@
               <w:rPr>
                 <w:noProof/>
               </w:rPr>
-              <w:instrText xml:space="preserve"> PAGEREF _Toc241746071 \h </w:instrText>
+              <w:instrText xml:space="preserve"> PAGEREF _Toc241748283 \h </w:instrText>
             </w:r>
             <w:r>
               <w:rPr>
@@ -877,7 +877,7 @@
               <w:rPr>
                 <w:noProof/>
               </w:rPr>
-              <w:t>6</w:t>
+              <w:t>7</w:t>
             </w:r>
             <w:r>
               <w:rPr>
@@ -902,7 +902,7 @@
               <w14:ligatures w14:val="standardContextual"/>
             </w:rPr>
           </w:pPr>
-          <w:hyperlink w:anchor="_Toc241746072" w:history="1">
+          <w:hyperlink w:anchor="_Toc241748284" w:history="1">
             <w:r>
               <w:rPr>
                 <w:rStyle w:val="Hyperlink"/>
@@ -926,7 +926,7 @@
               <w:rPr>
                 <w:noProof/>
               </w:rPr>
-              <w:instrText xml:space="preserve"> PAGEREF _Toc241746072 \h </w:instrText>
+              <w:instrText xml:space="preserve"> PAGEREF _Toc241748284 \h </w:instrText>
             </w:r>
             <w:r>
               <w:rPr>
@@ -943,7 +943,7 @@
               <w:rPr>
                 <w:noProof/>
               </w:rPr>
-              <w:t>7</w:t>
+              <w:t>8</w:t>
             </w:r>
             <w:r>
               <w:rPr>
@@ -968,7 +968,7 @@
               <w14:ligatures w14:val="standardContextual"/>
             </w:rPr>
           </w:pPr>
-          <w:hyperlink w:anchor="_Toc241746073" w:history="1">
+          <w:hyperlink w:anchor="_Toc241748285" w:history="1">
             <w:r>
               <w:rPr>
                 <w:rStyle w:val="Hyperlink"/>
@@ -992,7 +992,7 @@
               <w:rPr>
                 <w:noProof/>
               </w:rPr>
-              <w:instrText xml:space="preserve"> PAGEREF _Toc241746073 \h </w:instrText>
+              <w:instrText xml:space="preserve"> PAGEREF _Toc241748285 \h </w:instrText>
             </w:r>
             <w:r>
               <w:rPr>
@@ -1034,7 +1034,7 @@
               <w14:ligatures w14:val="standardContextual"/>
             </w:rPr>
           </w:pPr>
-          <w:hyperlink w:anchor="_Toc241746074" w:history="1">
+          <w:hyperlink w:anchor="_Toc241748286" w:history="1">
             <w:r>
               <w:rPr>
                 <w:rStyle w:val="Hyperlink"/>
@@ -1058,7 +1058,7 @@
               <w:rPr>
                 <w:noProof/>
               </w:rPr>
-              <w:instrText xml:space="preserve"> PAGEREF _Toc241746074 \h </w:instrText>
+              <w:instrText xml:space="preserve"> PAGEREF _Toc241748286 \h </w:instrText>
             </w:r>
             <w:r>
               <w:rPr>
@@ -1100,7 +1100,7 @@
               <w14:ligatures w14:val="standardContextual"/>
             </w:rPr>
           </w:pPr>
-          <w:hyperlink w:anchor="_Toc241746075" w:history="1">
+          <w:hyperlink w:anchor="_Toc241748287" w:history="1">
             <w:r>
               <w:rPr>
                 <w:rStyle w:val="Hyperlink"/>
@@ -1124,7 +1124,7 @@
               <w:rPr>
                 <w:noProof/>
               </w:rPr>
-              <w:instrText xml:space="preserve"> PAGEREF _Toc241746075 \h </w:instrText>
+              <w:instrText xml:space="preserve"> PAGEREF _Toc241748287 \h </w:instrText>
             </w:r>
             <w:r>
               <w:rPr>
@@ -1166,7 +1166,7 @@
               <w14:ligatures w14:val="standardContextual"/>
             </w:rPr>
           </w:pPr>
-          <w:hyperlink w:anchor="_Toc241746076" w:history="1">
+          <w:hyperlink w:anchor="_Toc241748288" w:history="1">
             <w:r>
               <w:rPr>
                 <w:rStyle w:val="Hyperlink"/>
@@ -1190,7 +1190,7 @@
               <w:rPr>
                 <w:noProof/>
               </w:rPr>
-              <w:instrText xml:space="preserve"> PAGEREF _Toc241746076 \h </w:instrText>
+              <w:instrText xml:space="preserve"> PAGEREF _Toc241748288 \h </w:instrText>
             </w:r>
             <w:r>
               <w:rPr>
@@ -1232,7 +1232,7 @@
               <w14:ligatures w14:val="standardContextual"/>
             </w:rPr>
           </w:pPr>
-          <w:hyperlink w:anchor="_Toc241746077" w:history="1">
+          <w:hyperlink w:anchor="_Toc241748289" w:history="1">
             <w:r>
               <w:rPr>
                 <w:rStyle w:val="Hyperlink"/>
@@ -1256,7 +1256,7 @@
               <w:rPr>
                 <w:noProof/>
               </w:rPr>
-              <w:instrText xml:space="preserve"> PAGEREF _Toc241746077 \h </w:instrText>
+              <w:instrText xml:space="preserve"> PAGEREF _Toc241748289 \h </w:instrText>
             </w:r>
             <w:r>
               <w:rPr>
@@ -1298,7 +1298,7 @@
               <w14:ligatures w14:val="standardContextual"/>
             </w:rPr>
           </w:pPr>
-          <w:hyperlink w:anchor="_Toc241746078" w:history="1">
+          <w:hyperlink w:anchor="_Toc241748290" w:history="1">
             <w:r>
               <w:rPr>
                 <w:rStyle w:val="Hyperlink"/>
@@ -1322,7 +1322,7 @@
               <w:rPr>
                 <w:noProof/>
               </w:rPr>
-              <w:instrText xml:space="preserve"> PAGEREF _Toc241746078 \h </w:instrText>
+              <w:instrText xml:space="preserve"> PAGEREF _Toc241748290 \h </w:instrText>
             </w:r>
             <w:r>
               <w:rPr>
@@ -1364,7 +1364,7 @@
               <w14:ligatures w14:val="standardContextual"/>
             </w:rPr>
           </w:pPr>
-          <w:hyperlink w:anchor="_Toc241746079" w:history="1">
+          <w:hyperlink w:anchor="_Toc241748291" w:history="1">
             <w:r>
               <w:rPr>
                 <w:rStyle w:val="Hyperlink"/>
@@ -1388,7 +1388,7 @@
               <w:rPr>
                 <w:noProof/>
               </w:rPr>
-              <w:instrText xml:space="preserve"> PAGEREF _Toc241746079 \h </w:instrText>
+              <w:instrText xml:space="preserve"> PAGEREF _Toc241748291 \h </w:instrText>
             </w:r>
             <w:r>
               <w:rPr>
@@ -1430,7 +1430,7 @@
               <w14:ligatures w14:val="standardContextual"/>
             </w:rPr>
           </w:pPr>
-          <w:hyperlink w:anchor="_Toc241746080" w:history="1">
+          <w:hyperlink w:anchor="_Toc241748292" w:history="1">
             <w:r>
               <w:rPr>
                 <w:rStyle w:val="Hyperlink"/>
@@ -1454,7 +1454,7 @@
               <w:rPr>
                 <w:noProof/>
               </w:rPr>
-              <w:instrText xml:space="preserve"> PAGEREF _Toc241746080 \h </w:instrText>
+              <w:instrText xml:space="preserve"> PAGEREF _Toc241748292 \h </w:instrText>
             </w:r>
             <w:r>
               <w:rPr>
@@ -1499,7 +1499,7 @@
         <w:keepNext/>
         <w:keepLines/>
       </w:pPr>
-      <w:bookmarkStart w:id="0" w:name="_Toc241746060"/>
+      <w:bookmarkStart w:id="0" w:name="_Toc241748272"/>
       <w:r>
         <w:t>1. Executive summary</w:t>
       </w:r>
@@ -1662,7 +1662,7 @@
         <w:keepNext/>
         <w:keepLines/>
       </w:pPr>
-      <w:bookmarkStart w:id="1" w:name="_Toc241746061"/>
+      <w:bookmarkStart w:id="1" w:name="_Toc241748273"/>
       <w:r>
         <w:t>2. Starting point: the dissertation</w:t>
       </w:r>
@@ -2244,7 +2244,7 @@
         <w:keepNext/>
         <w:keepLines/>
       </w:pPr>
-      <w:bookmarkStart w:id="2" w:name="_Toc241746062"/>
+      <w:bookmarkStart w:id="2" w:name="_Toc241748274"/>
       <w:r>
         <w:t>3. How Phase 1 was run</w:t>
       </w:r>
@@ -2267,7 +2267,7 @@
         <w:t>Pre-registration.</w:t>
       </w:r>
       <w:r>
-        <w:t xml:space="preserve"> Every change of design was written into the analysis plan as a numbered deviation before any data it affected (18 deviations, each with its reason). Confirmatory and exploratory analyses are labelled as such.</w:t>
+        <w:t xml:space="preserve"> Every change of design was written into the analysis plan as a numbered deviation before any data it affected (19 deviations, each with its reason). Confirmatory and exploratory analyses are labelled as such.</w:t>
       </w:r>
     </w:p>
     <w:p>
@@ -2356,7 +2356,7 @@
         <w:keepNext/>
         <w:keepLines/>
       </w:pPr>
-      <w:bookmarkStart w:id="3" w:name="_Toc241746063"/>
+      <w:bookmarkStart w:id="3" w:name="_Toc241748275"/>
       <w:r>
         <w:t>4. Weaknesses in the original evaluation and how Phase 1 addressed them</w:t>
       </w:r>
@@ -3188,7 +3188,7 @@
                 <w:sz w:val="19"/>
                 <w:szCs w:val="19"/>
               </w:rPr>
-              <w:t>Recoverability reproduced (69.6%); the loss sits in the encoder, and the RR branch raises it to 84.6%</w:t>
+              <w:t>Recoverability reproduced (69.6%); the loss sits in the encoder, and the RR branch raises it to 81% (mean of 10 seeds)</w:t>
             </w:r>
           </w:p>
         </w:tc>
@@ -3223,7 +3223,7 @@
         <w:keepNext/>
         <w:keepLines/>
       </w:pPr>
-      <w:bookmarkStart w:id="4" w:name="_Toc241746064"/>
+      <w:bookmarkStart w:id="4" w:name="_Toc241748276"/>
       <w:r>
         <w:t>5. What changed in the system</w:t>
       </w:r>
@@ -3240,7 +3240,7 @@
           <w:noProof/>
         </w:rPr>
         <w:drawing>
-          <wp:inline distT="0" distB="0" distL="0" distR="0" wp14:anchorId="18ECDE38" wp14:editId="5215D126">
+          <wp:inline distT="0" distB="0" distL="0" distR="0" wp14:anchorId="79344B81" wp14:editId="664188AD">
             <wp:extent cx="5762625" cy="2524125"/>
             <wp:effectExtent l="0" t="0" r="0" b="0"/>
             <wp:docPr id="1" name="fig1_pipeline.png" descr="Figure 1. Pipeline before (single event) and after Phase 1 (multi-event). The highlighted block is the component trained in this work." title="fig1_pipeline.png"/>
@@ -3300,8 +3300,9 @@
         <w:keepNext/>
         <w:keepLines/>
       </w:pPr>
-      <w:bookmarkStart w:id="5" w:name="_Toc241746065"/>
-      <w:r>
+      <w:bookmarkStart w:id="5" w:name="_Toc241748277"/>
+      <w:r>
+        <w:lastRenderedPageBreak/>
         <w:t>5.1 Perception: RR-timing branch</w:t>
       </w:r>
       <w:bookmarkEnd w:id="5"/>
@@ -3311,11 +3312,845 @@
         <w:spacing w:after="120"/>
       </w:pPr>
       <w:r>
-        <w:t xml:space="preserve">A 5-feature RR-interval branch (pre-RR, post-RR, local mean RR and two ratios) was added to the CNN-LSTM's context stage. S-beat sensitivity rose from 8% to 38%, and class recoverability </w:t>
-      </w:r>
-      <w:r>
-        <w:lastRenderedPageBreak/>
-        <w:t>from the 32-d vector from 69.6% ± 9.9 to 84.6% ± 5.5. Cost: one beat of latency (the post-RR interval) and a single training seed so far.</w:t>
+        <w:t>A 5-feature RR-interval branch (pre-RR, post-RR, local mean RR and two ratios) was added to the CNN-LSTM's context stage. Over 10 training seeds (Deviation 19), it improves on the reference encoder on every seed for overall accuracy, normal, S and V beats, and class recoverability from the 32-d vector; it does not reliably detect F beats (6 of 10 seeds above the reference's 0.3%). Cost: one beat of latency (the post-RR interval).</w:t>
+      </w:r>
+    </w:p>
+    <w:tbl>
+      <w:tblPr>
+        <w:tblW w:w="9026" w:type="dxa"/>
+        <w:tblBorders>
+          <w:top w:val="single" w:sz="4" w:space="0" w:color="auto"/>
+          <w:left w:val="single" w:sz="4" w:space="0" w:color="auto"/>
+          <w:bottom w:val="single" w:sz="4" w:space="0" w:color="auto"/>
+          <w:right w:val="single" w:sz="4" w:space="0" w:color="auto"/>
+          <w:insideH w:val="single" w:sz="4" w:space="0" w:color="auto"/>
+          <w:insideV w:val="single" w:sz="4" w:space="0" w:color="auto"/>
+        </w:tblBorders>
+        <w:tblCellMar>
+          <w:left w:w="10" w:type="dxa"/>
+          <w:right w:w="10" w:type="dxa"/>
+        </w:tblCellMar>
+        <w:tblLook w:val="04A0" w:firstRow="1" w:lastRow="0" w:firstColumn="1" w:lastColumn="0" w:noHBand="0" w:noVBand="1"/>
+      </w:tblPr>
+      <w:tblGrid>
+        <w:gridCol w:w="2500"/>
+        <w:gridCol w:w="1700"/>
+        <w:gridCol w:w="2900"/>
+        <w:gridCol w:w="1926"/>
+      </w:tblGrid>
+      <w:tr>
+        <w:tblPrEx>
+          <w:tblCellMar>
+            <w:top w:w="0" w:type="dxa"/>
+            <w:bottom w:w="0" w:type="dxa"/>
+          </w:tblCellMar>
+        </w:tblPrEx>
+        <w:trPr>
+          <w:cantSplit/>
+          <w:tblHeader/>
+        </w:trPr>
+        <w:tc>
+          <w:tcPr>
+            <w:tcW w:w="2500" w:type="dxa"/>
+            <w:tcBorders>
+              <w:top w:val="single" w:sz="4" w:space="0" w:color="BFBFBF"/>
+              <w:left w:val="single" w:sz="4" w:space="0" w:color="BFBFBF"/>
+              <w:bottom w:val="single" w:sz="4" w:space="0" w:color="BFBFBF"/>
+              <w:right w:val="single" w:sz="4" w:space="0" w:color="BFBFBF"/>
+            </w:tcBorders>
+            <w:shd w:val="clear" w:color="auto" w:fill="E8EEF7"/>
+            <w:tcMar>
+              <w:top w:w="60" w:type="dxa"/>
+              <w:left w:w="100" w:type="dxa"/>
+              <w:bottom w:w="60" w:type="dxa"/>
+              <w:right w:w="100" w:type="dxa"/>
+            </w:tcMar>
+          </w:tcPr>
+          <w:p>
+            <w:pPr>
+              <w:keepNext/>
+              <w:keepLines/>
+            </w:pPr>
+            <w:r>
+              <w:rPr>
+                <w:b/>
+                <w:bCs/>
+                <w:sz w:val="19"/>
+                <w:szCs w:val="19"/>
+              </w:rPr>
+              <w:t>Measure (DS2)</w:t>
+            </w:r>
+          </w:p>
+        </w:tc>
+        <w:tc>
+          <w:tcPr>
+            <w:tcW w:w="1700" w:type="dxa"/>
+            <w:tcBorders>
+              <w:top w:val="single" w:sz="4" w:space="0" w:color="BFBFBF"/>
+              <w:left w:val="single" w:sz="4" w:space="0" w:color="BFBFBF"/>
+              <w:bottom w:val="single" w:sz="4" w:space="0" w:color="BFBFBF"/>
+              <w:right w:val="single" w:sz="4" w:space="0" w:color="BFBFBF"/>
+            </w:tcBorders>
+            <w:shd w:val="clear" w:color="auto" w:fill="E8EEF7"/>
+            <w:tcMar>
+              <w:top w:w="60" w:type="dxa"/>
+              <w:left w:w="100" w:type="dxa"/>
+              <w:bottom w:w="60" w:type="dxa"/>
+              <w:right w:w="100" w:type="dxa"/>
+            </w:tcMar>
+          </w:tcPr>
+          <w:p>
+            <w:pPr>
+              <w:keepNext/>
+              <w:keepLines/>
+            </w:pPr>
+            <w:r>
+              <w:rPr>
+                <w:b/>
+                <w:bCs/>
+                <w:sz w:val="19"/>
+                <w:szCs w:val="19"/>
+              </w:rPr>
+              <w:t>Reference CNN-LSTM</w:t>
+            </w:r>
+          </w:p>
+        </w:tc>
+        <w:tc>
+          <w:tcPr>
+            <w:tcW w:w="2900" w:type="dxa"/>
+            <w:tcBorders>
+              <w:top w:val="single" w:sz="4" w:space="0" w:color="BFBFBF"/>
+              <w:left w:val="single" w:sz="4" w:space="0" w:color="BFBFBF"/>
+              <w:bottom w:val="single" w:sz="4" w:space="0" w:color="BFBFBF"/>
+              <w:right w:val="single" w:sz="4" w:space="0" w:color="BFBFBF"/>
+            </w:tcBorders>
+            <w:shd w:val="clear" w:color="auto" w:fill="E8EEF7"/>
+            <w:tcMar>
+              <w:top w:w="60" w:type="dxa"/>
+              <w:left w:w="100" w:type="dxa"/>
+              <w:bottom w:w="60" w:type="dxa"/>
+              <w:right w:w="100" w:type="dxa"/>
+            </w:tcMar>
+          </w:tcPr>
+          <w:p>
+            <w:pPr>
+              <w:keepNext/>
+              <w:keepLines/>
+            </w:pPr>
+            <w:r>
+              <w:rPr>
+                <w:b/>
+                <w:bCs/>
+                <w:sz w:val="19"/>
+                <w:szCs w:val="19"/>
+              </w:rPr>
+              <w:t>RR encoder, 10 seeds: mean ± SD [range]</w:t>
+            </w:r>
+          </w:p>
+        </w:tc>
+        <w:tc>
+          <w:tcPr>
+            <w:tcW w:w="1926" w:type="dxa"/>
+            <w:tcBorders>
+              <w:top w:val="single" w:sz="4" w:space="0" w:color="BFBFBF"/>
+              <w:left w:val="single" w:sz="4" w:space="0" w:color="BFBFBF"/>
+              <w:bottom w:val="single" w:sz="4" w:space="0" w:color="BFBFBF"/>
+              <w:right w:val="single" w:sz="4" w:space="0" w:color="BFBFBF"/>
+            </w:tcBorders>
+            <w:shd w:val="clear" w:color="auto" w:fill="E8EEF7"/>
+            <w:tcMar>
+              <w:top w:w="60" w:type="dxa"/>
+              <w:left w:w="100" w:type="dxa"/>
+              <w:bottom w:w="60" w:type="dxa"/>
+              <w:right w:w="100" w:type="dxa"/>
+            </w:tcMar>
+          </w:tcPr>
+          <w:p>
+            <w:pPr>
+              <w:keepNext/>
+              <w:keepLines/>
+            </w:pPr>
+            <w:r>
+              <w:rPr>
+                <w:b/>
+                <w:bCs/>
+                <w:sz w:val="19"/>
+                <w:szCs w:val="19"/>
+              </w:rPr>
+              <w:t>Seed 0 (used downstream)</w:t>
+            </w:r>
+          </w:p>
+        </w:tc>
+      </w:tr>
+      <w:tr>
+        <w:tblPrEx>
+          <w:tblCellMar>
+            <w:top w:w="0" w:type="dxa"/>
+            <w:bottom w:w="0" w:type="dxa"/>
+          </w:tblCellMar>
+        </w:tblPrEx>
+        <w:trPr>
+          <w:cantSplit/>
+        </w:trPr>
+        <w:tc>
+          <w:tcPr>
+            <w:tcW w:w="2500" w:type="dxa"/>
+            <w:tcBorders>
+              <w:top w:val="single" w:sz="4" w:space="0" w:color="BFBFBF"/>
+              <w:left w:val="single" w:sz="4" w:space="0" w:color="BFBFBF"/>
+              <w:bottom w:val="single" w:sz="4" w:space="0" w:color="BFBFBF"/>
+              <w:right w:val="single" w:sz="4" w:space="0" w:color="BFBFBF"/>
+            </w:tcBorders>
+            <w:tcMar>
+              <w:top w:w="60" w:type="dxa"/>
+              <w:left w:w="100" w:type="dxa"/>
+              <w:bottom w:w="60" w:type="dxa"/>
+              <w:right w:w="100" w:type="dxa"/>
+            </w:tcMar>
+          </w:tcPr>
+          <w:p>
+            <w:pPr>
+              <w:keepNext/>
+              <w:keepLines/>
+            </w:pPr>
+            <w:r>
+              <w:rPr>
+                <w:sz w:val="19"/>
+                <w:szCs w:val="19"/>
+              </w:rPr>
+              <w:t>Accuracy</w:t>
+            </w:r>
+          </w:p>
+        </w:tc>
+        <w:tc>
+          <w:tcPr>
+            <w:tcW w:w="1700" w:type="dxa"/>
+            <w:tcBorders>
+              <w:top w:val="single" w:sz="4" w:space="0" w:color="BFBFBF"/>
+              <w:left w:val="single" w:sz="4" w:space="0" w:color="BFBFBF"/>
+              <w:bottom w:val="single" w:sz="4" w:space="0" w:color="BFBFBF"/>
+              <w:right w:val="single" w:sz="4" w:space="0" w:color="BFBFBF"/>
+            </w:tcBorders>
+            <w:tcMar>
+              <w:top w:w="60" w:type="dxa"/>
+              <w:left w:w="100" w:type="dxa"/>
+              <w:bottom w:w="60" w:type="dxa"/>
+              <w:right w:w="100" w:type="dxa"/>
+            </w:tcMar>
+          </w:tcPr>
+          <w:p>
+            <w:pPr>
+              <w:keepNext/>
+              <w:keepLines/>
+            </w:pPr>
+            <w:r>
+              <w:rPr>
+                <w:sz w:val="19"/>
+                <w:szCs w:val="19"/>
+              </w:rPr>
+              <w:t>0.854</w:t>
+            </w:r>
+          </w:p>
+        </w:tc>
+        <w:tc>
+          <w:tcPr>
+            <w:tcW w:w="2900" w:type="dxa"/>
+            <w:tcBorders>
+              <w:top w:val="single" w:sz="4" w:space="0" w:color="BFBFBF"/>
+              <w:left w:val="single" w:sz="4" w:space="0" w:color="BFBFBF"/>
+              <w:bottom w:val="single" w:sz="4" w:space="0" w:color="BFBFBF"/>
+              <w:right w:val="single" w:sz="4" w:space="0" w:color="BFBFBF"/>
+            </w:tcBorders>
+            <w:tcMar>
+              <w:top w:w="60" w:type="dxa"/>
+              <w:left w:w="100" w:type="dxa"/>
+              <w:bottom w:w="60" w:type="dxa"/>
+              <w:right w:w="100" w:type="dxa"/>
+            </w:tcMar>
+          </w:tcPr>
+          <w:p>
+            <w:pPr>
+              <w:keepNext/>
+              <w:keepLines/>
+            </w:pPr>
+            <w:r>
+              <w:rPr>
+                <w:sz w:val="19"/>
+                <w:szCs w:val="19"/>
+              </w:rPr>
+              <w:t>0.926 ± 0.019 [0.889, 0.949]</w:t>
+            </w:r>
+          </w:p>
+        </w:tc>
+        <w:tc>
+          <w:tcPr>
+            <w:tcW w:w="1926" w:type="dxa"/>
+            <w:tcBorders>
+              <w:top w:val="single" w:sz="4" w:space="0" w:color="BFBFBF"/>
+              <w:left w:val="single" w:sz="4" w:space="0" w:color="BFBFBF"/>
+              <w:bottom w:val="single" w:sz="4" w:space="0" w:color="BFBFBF"/>
+              <w:right w:val="single" w:sz="4" w:space="0" w:color="BFBFBF"/>
+            </w:tcBorders>
+            <w:tcMar>
+              <w:top w:w="60" w:type="dxa"/>
+              <w:left w:w="100" w:type="dxa"/>
+              <w:bottom w:w="60" w:type="dxa"/>
+              <w:right w:w="100" w:type="dxa"/>
+            </w:tcMar>
+          </w:tcPr>
+          <w:p>
+            <w:pPr>
+              <w:keepNext/>
+              <w:keepLines/>
+            </w:pPr>
+            <w:r>
+              <w:rPr>
+                <w:sz w:val="19"/>
+                <w:szCs w:val="19"/>
+              </w:rPr>
+              <w:t>0.911</w:t>
+            </w:r>
+          </w:p>
+        </w:tc>
+      </w:tr>
+      <w:tr>
+        <w:tblPrEx>
+          <w:tblCellMar>
+            <w:top w:w="0" w:type="dxa"/>
+            <w:bottom w:w="0" w:type="dxa"/>
+          </w:tblCellMar>
+        </w:tblPrEx>
+        <w:trPr>
+          <w:cantSplit/>
+        </w:trPr>
+        <w:tc>
+          <w:tcPr>
+            <w:tcW w:w="2500" w:type="dxa"/>
+            <w:tcBorders>
+              <w:top w:val="single" w:sz="4" w:space="0" w:color="BFBFBF"/>
+              <w:left w:val="single" w:sz="4" w:space="0" w:color="BFBFBF"/>
+              <w:bottom w:val="single" w:sz="4" w:space="0" w:color="BFBFBF"/>
+              <w:right w:val="single" w:sz="4" w:space="0" w:color="BFBFBF"/>
+            </w:tcBorders>
+            <w:tcMar>
+              <w:top w:w="60" w:type="dxa"/>
+              <w:left w:w="100" w:type="dxa"/>
+              <w:bottom w:w="60" w:type="dxa"/>
+              <w:right w:w="100" w:type="dxa"/>
+            </w:tcMar>
+          </w:tcPr>
+          <w:p>
+            <w:pPr>
+              <w:keepNext/>
+              <w:keepLines/>
+            </w:pPr>
+            <w:r>
+              <w:rPr>
+                <w:sz w:val="19"/>
+                <w:szCs w:val="19"/>
+              </w:rPr>
+              <w:t>S sensitivity</w:t>
+            </w:r>
+          </w:p>
+        </w:tc>
+        <w:tc>
+          <w:tcPr>
+            <w:tcW w:w="1700" w:type="dxa"/>
+            <w:tcBorders>
+              <w:top w:val="single" w:sz="4" w:space="0" w:color="BFBFBF"/>
+              <w:left w:val="single" w:sz="4" w:space="0" w:color="BFBFBF"/>
+              <w:bottom w:val="single" w:sz="4" w:space="0" w:color="BFBFBF"/>
+              <w:right w:val="single" w:sz="4" w:space="0" w:color="BFBFBF"/>
+            </w:tcBorders>
+            <w:tcMar>
+              <w:top w:w="60" w:type="dxa"/>
+              <w:left w:w="100" w:type="dxa"/>
+              <w:bottom w:w="60" w:type="dxa"/>
+              <w:right w:w="100" w:type="dxa"/>
+            </w:tcMar>
+          </w:tcPr>
+          <w:p>
+            <w:pPr>
+              <w:keepNext/>
+              <w:keepLines/>
+            </w:pPr>
+            <w:r>
+              <w:rPr>
+                <w:sz w:val="19"/>
+                <w:szCs w:val="19"/>
+              </w:rPr>
+              <w:t>8%</w:t>
+            </w:r>
+          </w:p>
+        </w:tc>
+        <w:tc>
+          <w:tcPr>
+            <w:tcW w:w="2900" w:type="dxa"/>
+            <w:tcBorders>
+              <w:top w:val="single" w:sz="4" w:space="0" w:color="BFBFBF"/>
+              <w:left w:val="single" w:sz="4" w:space="0" w:color="BFBFBF"/>
+              <w:bottom w:val="single" w:sz="4" w:space="0" w:color="BFBFBF"/>
+              <w:right w:val="single" w:sz="4" w:space="0" w:color="BFBFBF"/>
+            </w:tcBorders>
+            <w:tcMar>
+              <w:top w:w="60" w:type="dxa"/>
+              <w:left w:w="100" w:type="dxa"/>
+              <w:bottom w:w="60" w:type="dxa"/>
+              <w:right w:w="100" w:type="dxa"/>
+            </w:tcMar>
+          </w:tcPr>
+          <w:p>
+            <w:pPr>
+              <w:keepNext/>
+              <w:keepLines/>
+            </w:pPr>
+            <w:r>
+              <w:rPr>
+                <w:sz w:val="19"/>
+                <w:szCs w:val="19"/>
+              </w:rPr>
+              <w:t>48% ± 21% [15%, 73%]</w:t>
+            </w:r>
+          </w:p>
+        </w:tc>
+        <w:tc>
+          <w:tcPr>
+            <w:tcW w:w="1926" w:type="dxa"/>
+            <w:tcBorders>
+              <w:top w:val="single" w:sz="4" w:space="0" w:color="BFBFBF"/>
+              <w:left w:val="single" w:sz="4" w:space="0" w:color="BFBFBF"/>
+              <w:bottom w:val="single" w:sz="4" w:space="0" w:color="BFBFBF"/>
+              <w:right w:val="single" w:sz="4" w:space="0" w:color="BFBFBF"/>
+            </w:tcBorders>
+            <w:tcMar>
+              <w:top w:w="60" w:type="dxa"/>
+              <w:left w:w="100" w:type="dxa"/>
+              <w:bottom w:w="60" w:type="dxa"/>
+              <w:right w:w="100" w:type="dxa"/>
+            </w:tcMar>
+          </w:tcPr>
+          <w:p>
+            <w:pPr>
+              <w:keepNext/>
+              <w:keepLines/>
+            </w:pPr>
+            <w:r>
+              <w:rPr>
+                <w:sz w:val="19"/>
+                <w:szCs w:val="19"/>
+              </w:rPr>
+              <w:t>38%</w:t>
+            </w:r>
+          </w:p>
+        </w:tc>
+      </w:tr>
+      <w:tr>
+        <w:tblPrEx>
+          <w:tblCellMar>
+            <w:top w:w="0" w:type="dxa"/>
+            <w:bottom w:w="0" w:type="dxa"/>
+          </w:tblCellMar>
+        </w:tblPrEx>
+        <w:trPr>
+          <w:cantSplit/>
+        </w:trPr>
+        <w:tc>
+          <w:tcPr>
+            <w:tcW w:w="2500" w:type="dxa"/>
+            <w:tcBorders>
+              <w:top w:val="single" w:sz="4" w:space="0" w:color="BFBFBF"/>
+              <w:left w:val="single" w:sz="4" w:space="0" w:color="BFBFBF"/>
+              <w:bottom w:val="single" w:sz="4" w:space="0" w:color="BFBFBF"/>
+              <w:right w:val="single" w:sz="4" w:space="0" w:color="BFBFBF"/>
+            </w:tcBorders>
+            <w:tcMar>
+              <w:top w:w="60" w:type="dxa"/>
+              <w:left w:w="100" w:type="dxa"/>
+              <w:bottom w:w="60" w:type="dxa"/>
+              <w:right w:w="100" w:type="dxa"/>
+            </w:tcMar>
+          </w:tcPr>
+          <w:p>
+            <w:pPr>
+              <w:keepNext/>
+              <w:keepLines/>
+            </w:pPr>
+            <w:r>
+              <w:rPr>
+                <w:sz w:val="19"/>
+                <w:szCs w:val="19"/>
+              </w:rPr>
+              <w:t>V sensitivity</w:t>
+            </w:r>
+          </w:p>
+        </w:tc>
+        <w:tc>
+          <w:tcPr>
+            <w:tcW w:w="1700" w:type="dxa"/>
+            <w:tcBorders>
+              <w:top w:val="single" w:sz="4" w:space="0" w:color="BFBFBF"/>
+              <w:left w:val="single" w:sz="4" w:space="0" w:color="BFBFBF"/>
+              <w:bottom w:val="single" w:sz="4" w:space="0" w:color="BFBFBF"/>
+              <w:right w:val="single" w:sz="4" w:space="0" w:color="BFBFBF"/>
+            </w:tcBorders>
+            <w:tcMar>
+              <w:top w:w="60" w:type="dxa"/>
+              <w:left w:w="100" w:type="dxa"/>
+              <w:bottom w:w="60" w:type="dxa"/>
+              <w:right w:w="100" w:type="dxa"/>
+            </w:tcMar>
+          </w:tcPr>
+          <w:p>
+            <w:pPr>
+              <w:keepNext/>
+              <w:keepLines/>
+            </w:pPr>
+            <w:r>
+              <w:rPr>
+                <w:sz w:val="19"/>
+                <w:szCs w:val="19"/>
+              </w:rPr>
+              <w:t>77%</w:t>
+            </w:r>
+          </w:p>
+        </w:tc>
+        <w:tc>
+          <w:tcPr>
+            <w:tcW w:w="2900" w:type="dxa"/>
+            <w:tcBorders>
+              <w:top w:val="single" w:sz="4" w:space="0" w:color="BFBFBF"/>
+              <w:left w:val="single" w:sz="4" w:space="0" w:color="BFBFBF"/>
+              <w:bottom w:val="single" w:sz="4" w:space="0" w:color="BFBFBF"/>
+              <w:right w:val="single" w:sz="4" w:space="0" w:color="BFBFBF"/>
+            </w:tcBorders>
+            <w:tcMar>
+              <w:top w:w="60" w:type="dxa"/>
+              <w:left w:w="100" w:type="dxa"/>
+              <w:bottom w:w="60" w:type="dxa"/>
+              <w:right w:w="100" w:type="dxa"/>
+            </w:tcMar>
+          </w:tcPr>
+          <w:p>
+            <w:pPr>
+              <w:keepNext/>
+              <w:keepLines/>
+            </w:pPr>
+            <w:r>
+              <w:rPr>
+                <w:sz w:val="19"/>
+                <w:szCs w:val="19"/>
+              </w:rPr>
+              <w:t>93% ± 3% [86%, 97%]</w:t>
+            </w:r>
+          </w:p>
+        </w:tc>
+        <w:tc>
+          <w:tcPr>
+            <w:tcW w:w="1926" w:type="dxa"/>
+            <w:tcBorders>
+              <w:top w:val="single" w:sz="4" w:space="0" w:color="BFBFBF"/>
+              <w:left w:val="single" w:sz="4" w:space="0" w:color="BFBFBF"/>
+              <w:bottom w:val="single" w:sz="4" w:space="0" w:color="BFBFBF"/>
+              <w:right w:val="single" w:sz="4" w:space="0" w:color="BFBFBF"/>
+            </w:tcBorders>
+            <w:tcMar>
+              <w:top w:w="60" w:type="dxa"/>
+              <w:left w:w="100" w:type="dxa"/>
+              <w:bottom w:w="60" w:type="dxa"/>
+              <w:right w:w="100" w:type="dxa"/>
+            </w:tcMar>
+          </w:tcPr>
+          <w:p>
+            <w:pPr>
+              <w:keepNext/>
+              <w:keepLines/>
+            </w:pPr>
+            <w:r>
+              <w:rPr>
+                <w:sz w:val="19"/>
+                <w:szCs w:val="19"/>
+              </w:rPr>
+              <w:t>97%</w:t>
+            </w:r>
+          </w:p>
+        </w:tc>
+      </w:tr>
+      <w:tr>
+        <w:tblPrEx>
+          <w:tblCellMar>
+            <w:top w:w="0" w:type="dxa"/>
+            <w:bottom w:w="0" w:type="dxa"/>
+          </w:tblCellMar>
+        </w:tblPrEx>
+        <w:trPr>
+          <w:cantSplit/>
+        </w:trPr>
+        <w:tc>
+          <w:tcPr>
+            <w:tcW w:w="2500" w:type="dxa"/>
+            <w:tcBorders>
+              <w:top w:val="single" w:sz="4" w:space="0" w:color="BFBFBF"/>
+              <w:left w:val="single" w:sz="4" w:space="0" w:color="BFBFBF"/>
+              <w:bottom w:val="single" w:sz="4" w:space="0" w:color="BFBFBF"/>
+              <w:right w:val="single" w:sz="4" w:space="0" w:color="BFBFBF"/>
+            </w:tcBorders>
+            <w:tcMar>
+              <w:top w:w="60" w:type="dxa"/>
+              <w:left w:w="100" w:type="dxa"/>
+              <w:bottom w:w="60" w:type="dxa"/>
+              <w:right w:w="100" w:type="dxa"/>
+            </w:tcMar>
+          </w:tcPr>
+          <w:p>
+            <w:pPr>
+              <w:keepNext/>
+              <w:keepLines/>
+            </w:pPr>
+            <w:r>
+              <w:rPr>
+                <w:sz w:val="19"/>
+                <w:szCs w:val="19"/>
+              </w:rPr>
+              <w:t>F sensitivity</w:t>
+            </w:r>
+          </w:p>
+        </w:tc>
+        <w:tc>
+          <w:tcPr>
+            <w:tcW w:w="1700" w:type="dxa"/>
+            <w:tcBorders>
+              <w:top w:val="single" w:sz="4" w:space="0" w:color="BFBFBF"/>
+              <w:left w:val="single" w:sz="4" w:space="0" w:color="BFBFBF"/>
+              <w:bottom w:val="single" w:sz="4" w:space="0" w:color="BFBFBF"/>
+              <w:right w:val="single" w:sz="4" w:space="0" w:color="BFBFBF"/>
+            </w:tcBorders>
+            <w:tcMar>
+              <w:top w:w="60" w:type="dxa"/>
+              <w:left w:w="100" w:type="dxa"/>
+              <w:bottom w:w="60" w:type="dxa"/>
+              <w:right w:w="100" w:type="dxa"/>
+            </w:tcMar>
+          </w:tcPr>
+          <w:p>
+            <w:pPr>
+              <w:keepNext/>
+              <w:keepLines/>
+            </w:pPr>
+            <w:r>
+              <w:rPr>
+                <w:sz w:val="19"/>
+                <w:szCs w:val="19"/>
+              </w:rPr>
+              <w:t>0.3%</w:t>
+            </w:r>
+          </w:p>
+        </w:tc>
+        <w:tc>
+          <w:tcPr>
+            <w:tcW w:w="2900" w:type="dxa"/>
+            <w:tcBorders>
+              <w:top w:val="single" w:sz="4" w:space="0" w:color="BFBFBF"/>
+              <w:left w:val="single" w:sz="4" w:space="0" w:color="BFBFBF"/>
+              <w:bottom w:val="single" w:sz="4" w:space="0" w:color="BFBFBF"/>
+              <w:right w:val="single" w:sz="4" w:space="0" w:color="BFBFBF"/>
+            </w:tcBorders>
+            <w:tcMar>
+              <w:top w:w="60" w:type="dxa"/>
+              <w:left w:w="100" w:type="dxa"/>
+              <w:bottom w:w="60" w:type="dxa"/>
+              <w:right w:w="100" w:type="dxa"/>
+            </w:tcMar>
+          </w:tcPr>
+          <w:p>
+            <w:pPr>
+              <w:keepNext/>
+              <w:keepLines/>
+            </w:pPr>
+            <w:r>
+              <w:rPr>
+                <w:sz w:val="19"/>
+                <w:szCs w:val="19"/>
+              </w:rPr>
+              <w:t>5% ± 7% [0%, 18%]</w:t>
+            </w:r>
+          </w:p>
+        </w:tc>
+        <w:tc>
+          <w:tcPr>
+            <w:tcW w:w="1926" w:type="dxa"/>
+            <w:tcBorders>
+              <w:top w:val="single" w:sz="4" w:space="0" w:color="BFBFBF"/>
+              <w:left w:val="single" w:sz="4" w:space="0" w:color="BFBFBF"/>
+              <w:bottom w:val="single" w:sz="4" w:space="0" w:color="BFBFBF"/>
+              <w:right w:val="single" w:sz="4" w:space="0" w:color="BFBFBF"/>
+            </w:tcBorders>
+            <w:tcMar>
+              <w:top w:w="60" w:type="dxa"/>
+              <w:left w:w="100" w:type="dxa"/>
+              <w:bottom w:w="60" w:type="dxa"/>
+              <w:right w:w="100" w:type="dxa"/>
+            </w:tcMar>
+          </w:tcPr>
+          <w:p>
+            <w:pPr>
+              <w:keepNext/>
+              <w:keepLines/>
+            </w:pPr>
+            <w:r>
+              <w:rPr>
+                <w:sz w:val="19"/>
+                <w:szCs w:val="19"/>
+              </w:rPr>
+              <w:t>0%</w:t>
+            </w:r>
+          </w:p>
+        </w:tc>
+      </w:tr>
+      <w:tr>
+        <w:tblPrEx>
+          <w:tblCellMar>
+            <w:top w:w="0" w:type="dxa"/>
+            <w:bottom w:w="0" w:type="dxa"/>
+          </w:tblCellMar>
+        </w:tblPrEx>
+        <w:trPr>
+          <w:cantSplit/>
+        </w:trPr>
+        <w:tc>
+          <w:tcPr>
+            <w:tcW w:w="2500" w:type="dxa"/>
+            <w:tcBorders>
+              <w:top w:val="single" w:sz="4" w:space="0" w:color="BFBFBF"/>
+              <w:left w:val="single" w:sz="4" w:space="0" w:color="BFBFBF"/>
+              <w:bottom w:val="single" w:sz="4" w:space="0" w:color="BFBFBF"/>
+              <w:right w:val="single" w:sz="4" w:space="0" w:color="BFBFBF"/>
+            </w:tcBorders>
+            <w:tcMar>
+              <w:top w:w="60" w:type="dxa"/>
+              <w:left w:w="100" w:type="dxa"/>
+              <w:bottom w:w="60" w:type="dxa"/>
+              <w:right w:w="100" w:type="dxa"/>
+            </w:tcMar>
+          </w:tcPr>
+          <w:p>
+            <w:pPr>
+              <w:keepNext/>
+              <w:keepLines/>
+            </w:pPr>
+            <w:r>
+              <w:rPr>
+                <w:sz w:val="19"/>
+                <w:szCs w:val="19"/>
+              </w:rPr>
+              <w:t>Class recoverability (probe)</w:t>
+            </w:r>
+          </w:p>
+        </w:tc>
+        <w:tc>
+          <w:tcPr>
+            <w:tcW w:w="1700" w:type="dxa"/>
+            <w:tcBorders>
+              <w:top w:val="single" w:sz="4" w:space="0" w:color="BFBFBF"/>
+              <w:left w:val="single" w:sz="4" w:space="0" w:color="BFBFBF"/>
+              <w:bottom w:val="single" w:sz="4" w:space="0" w:color="BFBFBF"/>
+              <w:right w:val="single" w:sz="4" w:space="0" w:color="BFBFBF"/>
+            </w:tcBorders>
+            <w:tcMar>
+              <w:top w:w="60" w:type="dxa"/>
+              <w:left w:w="100" w:type="dxa"/>
+              <w:bottom w:w="60" w:type="dxa"/>
+              <w:right w:w="100" w:type="dxa"/>
+            </w:tcMar>
+          </w:tcPr>
+          <w:p>
+            <w:pPr>
+              <w:keepNext/>
+              <w:keepLines/>
+            </w:pPr>
+            <w:r>
+              <w:rPr>
+                <w:sz w:val="19"/>
+                <w:szCs w:val="19"/>
+              </w:rPr>
+              <w:t>69.6%</w:t>
+            </w:r>
+          </w:p>
+        </w:tc>
+        <w:tc>
+          <w:tcPr>
+            <w:tcW w:w="2900" w:type="dxa"/>
+            <w:tcBorders>
+              <w:top w:val="single" w:sz="4" w:space="0" w:color="BFBFBF"/>
+              <w:left w:val="single" w:sz="4" w:space="0" w:color="BFBFBF"/>
+              <w:bottom w:val="single" w:sz="4" w:space="0" w:color="BFBFBF"/>
+              <w:right w:val="single" w:sz="4" w:space="0" w:color="BFBFBF"/>
+            </w:tcBorders>
+            <w:tcMar>
+              <w:top w:w="60" w:type="dxa"/>
+              <w:left w:w="100" w:type="dxa"/>
+              <w:bottom w:w="60" w:type="dxa"/>
+              <w:right w:w="100" w:type="dxa"/>
+            </w:tcMar>
+          </w:tcPr>
+          <w:p>
+            <w:pPr>
+              <w:keepNext/>
+              <w:keepLines/>
+            </w:pPr>
+            <w:r>
+              <w:rPr>
+                <w:sz w:val="19"/>
+                <w:szCs w:val="19"/>
+              </w:rPr>
+              <w:t>81.2% ± 5.0% [74.6%, 88.3%]</w:t>
+            </w:r>
+          </w:p>
+        </w:tc>
+        <w:tc>
+          <w:tcPr>
+            <w:tcW w:w="1926" w:type="dxa"/>
+            <w:tcBorders>
+              <w:top w:val="single" w:sz="4" w:space="0" w:color="BFBFBF"/>
+              <w:left w:val="single" w:sz="4" w:space="0" w:color="BFBFBF"/>
+              <w:bottom w:val="single" w:sz="4" w:space="0" w:color="BFBFBF"/>
+              <w:right w:val="single" w:sz="4" w:space="0" w:color="BFBFBF"/>
+            </w:tcBorders>
+            <w:tcMar>
+              <w:top w:w="60" w:type="dxa"/>
+              <w:left w:w="100" w:type="dxa"/>
+              <w:bottom w:w="60" w:type="dxa"/>
+              <w:right w:w="100" w:type="dxa"/>
+            </w:tcMar>
+          </w:tcPr>
+          <w:p>
+            <w:pPr>
+              <w:keepNext/>
+              <w:keepLines/>
+            </w:pPr>
+            <w:r>
+              <w:rPr>
+                <w:sz w:val="19"/>
+                <w:szCs w:val="19"/>
+              </w:rPr>
+              <w:t>84.6%</w:t>
+            </w:r>
+          </w:p>
+        </w:tc>
+      </w:tr>
+    </w:tbl>
+    <w:p>
+      <w:pPr>
+        <w:spacing w:before="60" w:after="240"/>
+      </w:pPr>
+      <w:r>
+        <w:rPr>
+          <w:i/>
+          <w:iCs/>
+          <w:color w:val="52514E"/>
+          <w:sz w:val="18"/>
+          <w:szCs w:val="18"/>
+        </w:rPr>
+        <w:t>Table 3. RR encoder across 10 seeds (Deviation 19). Seed 0, on which all adapters were trained, was the only seed when it was chosen and ranks 3rd, 4th and 7th of 10 on accuracy, S sensitivity and recoverability (representative by the pre-registered rule); it has the highest V sensitivity of the 10.</w:t>
       </w:r>
     </w:p>
     <w:p>
@@ -3324,7 +4159,7 @@
         <w:keepNext/>
         <w:keepLines/>
       </w:pPr>
-      <w:bookmarkStart w:id="6" w:name="_Toc241746066"/>
+      <w:bookmarkStart w:id="6" w:name="_Toc241748278"/>
       <w:r>
         <w:t>5.2 Multi-event adapter</w:t>
       </w:r>
@@ -3388,7 +4223,7 @@
         <w:keepNext/>
         <w:keepLines/>
       </w:pPr>
-      <w:bookmarkStart w:id="7" w:name="_Toc241746067"/>
+      <w:bookmarkStart w:id="7" w:name="_Toc241748279"/>
       <w:r>
         <w:t>5.3 Recipe r4: hard negatives and side inputs (final)</w:t>
       </w:r>
@@ -3485,8 +4320,9 @@
         <w:rPr>
           <w:noProof/>
         </w:rPr>
+        <w:lastRenderedPageBreak/>
         <w:drawing>
-          <wp:inline distT="0" distB="0" distL="0" distR="0" wp14:anchorId="2A059199" wp14:editId="32AF588D">
+          <wp:inline distT="0" distB="0" distL="0" distR="0" wp14:anchorId="7B253594" wp14:editId="5D855BB6">
             <wp:extent cx="5762625" cy="2657475"/>
             <wp:effectExtent l="0" t="0" r="0" b="0"/>
             <wp:docPr id="2" name="fig7_training_r4.png" descr="Figure 2. Validation balanced accuracy during training, recipe r4, three seeds. The best checkpoint per seed is selected on validation only; seed 303 was still improving when it reached the 3-epoch cap and was evaluated as pre-registered." title="fig7_training_r4.png"/>
@@ -3546,9 +4382,8 @@
         <w:keepNext/>
         <w:keepLines/>
       </w:pPr>
-      <w:bookmarkStart w:id="8" w:name="_Toc241746068"/>
-      <w:r>
-        <w:lastRenderedPageBreak/>
+      <w:bookmarkStart w:id="8" w:name="_Toc241748280"/>
+      <w:r>
         <w:t>5.4 Schema-constrained decoding</w:t>
       </w:r>
       <w:bookmarkEnd w:id="8"/>
@@ -3567,7 +4402,7 @@
         <w:keepNext/>
         <w:keepLines/>
       </w:pPr>
-      <w:bookmarkStart w:id="9" w:name="_Toc241746069"/>
+      <w:bookmarkStart w:id="9" w:name="_Toc241748281"/>
       <w:r>
         <w:t>6. Efficiency results</w:t>
       </w:r>
@@ -3584,7 +4419,7 @@
           <w:noProof/>
         </w:rPr>
         <w:drawing>
-          <wp:inline distT="0" distB="0" distL="0" distR="0" wp14:anchorId="0BE4D505" wp14:editId="64CCD258">
+          <wp:inline distT="0" distB="0" distL="0" distR="0" wp14:anchorId="601C3327" wp14:editId="34E3376F">
             <wp:extent cx="5762625" cy="1962150"/>
             <wp:effectExtent l="0" t="0" r="0" b="0"/>
             <wp:docPr id="3" name="fig2_latency.png" descr="Figure 3. Median latency per request (batch 1, 21 DS2 windows per N). Left: time to first token. Right: time until the urgency tier is generated (token 7 of the constrained answer)." title="fig2_latency.png"/>
@@ -3701,6 +4536,7 @@
                 <w:sz w:val="19"/>
                 <w:szCs w:val="19"/>
               </w:rPr>
+              <w:lastRenderedPageBreak/>
               <w:t>Events per prompt</w:t>
             </w:r>
           </w:p>
@@ -4550,7 +5386,7 @@
           <w:sz w:val="18"/>
           <w:szCs w:val="18"/>
         </w:rPr>
-        <w:t>Table 3. Cost of the latent interface relative to compact text (E3, E3b, Deviation 14). End-to-end response time is dominated by generating the answer (~160 ms/token for every arm), so full-response latency depends on answer length, not on the interface. Recipe r4 keeps 4 tokens per event (the side inputs enter the same projection), so these costs apply to it unchanged.</w:t>
+        <w:t>Table 4. Cost of the latent interface relative to compact text (E3, E3b, Deviation 14). End-to-end response time is dominated by generating the answer (~160 ms/token for every arm), so full-response latency depends on answer length, not on the interface. Recipe r4 keeps 4 tokens per event (the side inputs enter the same projection), so these costs apply to it unchanged.</w:t>
       </w:r>
     </w:p>
     <w:p>
@@ -4559,7 +5395,7 @@
         <w:keepNext/>
         <w:keepLines/>
       </w:pPr>
-      <w:bookmarkStart w:id="10" w:name="_Toc241746070"/>
+      <w:bookmarkStart w:id="10" w:name="_Toc241748282"/>
       <w:r>
         <w:t>7. Accuracy results</w:t>
       </w:r>
@@ -4571,7 +5407,7 @@
         <w:keepNext/>
         <w:keepLines/>
       </w:pPr>
-      <w:bookmarkStart w:id="11" w:name="_Toc241746071"/>
+      <w:bookmarkStart w:id="11" w:name="_Toc241748283"/>
       <w:r>
         <w:t>7.1 Primary test (pre-registered, Deviation 16)</w:t>
       </w:r>
@@ -4595,9 +5431,8 @@
         <w:rPr>
           <w:noProof/>
         </w:rPr>
-        <w:lastRenderedPageBreak/>
         <w:drawing>
-          <wp:inline distT="0" distB="0" distL="0" distR="0" wp14:anchorId="20AE5648" wp14:editId="5B30D99A">
+          <wp:inline distT="0" distB="0" distL="0" distR="0" wp14:anchorId="0BD2761E" wp14:editId="240A19BE">
             <wp:extent cx="5762625" cy="2886075"/>
             <wp:effectExtent l="0" t="0" r="0" b="0"/>
             <wp:docPr id="4" name="fig3_accuracy_vs_n.png" descr="Figure 4. Balanced accuracy on the DS2 test set by window size. The final adapter (r4) stays at 0.80–0.84 for every N and sits above the previous recipe (r3) at every N; default text falls sharply from N = 5; text with a calibrated threshold recovers part of the gap." title="fig3_accuracy_vs_n.png"/>
@@ -5854,7 +6689,7 @@
           <w:sz w:val="18"/>
           <w:szCs w:val="18"/>
         </w:rPr>
-        <w:t>Table 4. Balanced accuracy on the class-balanced DS2 test windows (adapters: mean of 3 seeds). Text answers are identical across the r3 and r4 comparisons (same windows, prompts and decoder).</w:t>
+        <w:t>Table 5. Balanced accuracy on the class-balanced DS2 test windows (adapters: mean of 3 seeds). Text answers are identical across the r3 and r4 comparisons (same windows, prompts and decoder).</w:t>
       </w:r>
     </w:p>
     <w:p>
@@ -5863,8 +6698,9 @@
         <w:keepNext/>
         <w:keepLines/>
       </w:pPr>
-      <w:bookmarkStart w:id="12" w:name="_Toc241746072"/>
-      <w:r>
+      <w:bookmarkStart w:id="12" w:name="_Toc241748284"/>
+      <w:r>
+        <w:lastRenderedPageBreak/>
         <w:t>7.2 Primary comparison against default and calibrated text</w:t>
       </w:r>
       <w:bookmarkEnd w:id="12"/>
@@ -6735,7 +7571,7 @@
           <w:sz w:val="18"/>
           <w:szCs w:val="18"/>
         </w:rPr>
-        <w:t>Table 5. Adapter minus text, balanced accuracy, with patient-level (record-cluster) bootstrap 95% confidence intervals; non-inferiority margin −0.05.</w:t>
+        <w:t>Table 6. Adapter minus text, balanced accuracy, with patient-level (record-cluster) bootstrap 95% confidence intervals; non-inferiority margin −0.05.</w:t>
       </w:r>
     </w:p>
     <w:p>
@@ -6748,12 +7584,11 @@
         <w:rPr>
           <w:noProof/>
         </w:rPr>
-        <w:lastRenderedPageBreak/>
         <w:drawing>
-          <wp:inline distT="0" distB="0" distL="0" distR="0" wp14:anchorId="7C18D3CA" wp14:editId="5F81ED55">
+          <wp:inline distT="0" distB="0" distL="0" distR="0" wp14:anchorId="328A5462" wp14:editId="7FD3FC94">
             <wp:extent cx="5762625" cy="2886075"/>
             <wp:effectExtent l="0" t="0" r="0" b="0"/>
-            <wp:docPr id="5" name="fig4_forest.png" descr="Figure 5. The comparisons of Table 5. Dotted red line: non-inferiority margin. Hollow markers show the previous recipe (r3) against calibrated text." title="fig4_forest.png"/>
+            <wp:docPr id="5" name="fig4_forest.png" descr="Figure 5. The comparisons of Table 6. Dotted red line: non-inferiority margin. Hollow markers show the previous recipe (r3) against calibrated text." title="fig4_forest.png"/>
             <wp:cNvGraphicFramePr>
               <a:graphicFrameLocks xmlns:a="http://schemas.openxmlformats.org/drawingml/2006/main" noChangeAspect="1"/>
             </wp:cNvGraphicFramePr>
@@ -6801,7 +7636,7 @@
           <w:sz w:val="18"/>
           <w:szCs w:val="18"/>
         </w:rPr>
-        <w:t>Figure 5. The comparisons of Table 5. Dotted red line: non-inferiority margin. Hollow markers show the previous recipe (r3) against calibrated text.</w:t>
+        <w:t>Figure 5. The comparisons of Table 6. Dotted red line: non-inferiority margin. Hollow markers show the previous recipe (r3) against calibrated text.</w:t>
       </w:r>
     </w:p>
     <w:p>
@@ -6810,7 +7645,7 @@
         <w:keepNext/>
         <w:keepLines/>
       </w:pPr>
-      <w:bookmarkStart w:id="13" w:name="_Toc241746073"/>
+      <w:bookmarkStart w:id="13" w:name="_Toc241748285"/>
       <w:r>
         <w:t>7.3 Why text fails with many events</w:t>
       </w:r>
@@ -6827,7 +7662,7 @@
           <w:noProof/>
         </w:rPr>
         <w:drawing>
-          <wp:inline distT="0" distB="0" distL="0" distR="0" wp14:anchorId="167AC6F3" wp14:editId="7F2F0F6C">
+          <wp:inline distT="0" distB="0" distL="0" distR="0" wp14:anchorId="028DB6D3" wp14:editId="11AB7646">
             <wp:extent cx="5762625" cy="1971675"/>
             <wp:effectExtent l="0" t="0" r="0" b="0"/>
             <wp:docPr id="6" name="fig5_why_text_fails.png" descr="Figure 6. Left: text misses urgent windows caused by a single high-confidence V/F beat (a numeric threshold, 0.85, buried in a long list) far more than runs of abnormal beats. Right: text is worst when the key beat is in the middle of the list, the 'lost in the middle' effect; the adapter (r4, 3 seeds) shows no position effect." title="fig5_why_text_fails.png"/>
@@ -6886,6 +7721,7 @@
         <w:spacing w:after="120"/>
       </w:pPr>
       <w:r>
+        <w:lastRenderedPageBreak/>
         <w:t>Both mechanisms are documented in the literature: position effects in long contexts (Liu et al., TACL 2024; Hsieh et al., Findings of ACL 2024) and label bias corrected by calibration (Zhao et al., ICML 2021). A fairness point: the text arm is zero-shot, whereas the adapter was trained on this task; a trained text baseline is planned.</w:t>
       </w:r>
     </w:p>
@@ -6907,9 +7743,8 @@
         <w:rPr>
           <w:noProof/>
         </w:rPr>
-        <w:lastRenderedPageBreak/>
         <w:drawing>
-          <wp:inline distT="0" distB="0" distL="0" distR="0" wp14:anchorId="4B6F9673" wp14:editId="12EB8921">
+          <wp:inline distT="0" distB="0" distL="0" distR="0" wp14:anchorId="79E5290E" wp14:editId="6764F5D2">
             <wp:extent cx="5762625" cy="2667000"/>
             <wp:effectExtent l="0" t="0" r="0" b="0"/>
             <wp:docPr id="7" name="fig6_confusion_n50.png" descr="Figure 7. Confusion at N = 50. Text under-escalates (priority → routine, urgent → priority) and never raises a false alarm; the r4 adapter never calls an urgent window routine and escalates 3% of routine windows." title="fig6_confusion_n50.png"/>
@@ -6969,7 +7804,7 @@
         <w:keepNext/>
         <w:keepLines/>
       </w:pPr>
-      <w:bookmarkStart w:id="14" w:name="_Toc241746074"/>
+      <w:bookmarkStart w:id="14" w:name="_Toc241748286"/>
       <w:r>
         <w:t>7.4 False alarms: identified in r3, reduced in r4</w:t>
       </w:r>
@@ -6994,7 +7829,7 @@
           <w:noProof/>
         </w:rPr>
         <w:drawing>
-          <wp:inline distT="0" distB="0" distL="0" distR="0" wp14:anchorId="70F8782C" wp14:editId="0727313D">
+          <wp:inline distT="0" distB="0" distL="0" distR="0" wp14:anchorId="27375D52" wp14:editId="1203D913">
             <wp:extent cx="5762625" cy="2533650"/>
             <wp:effectExtent l="0" t="0" r="0" b="0"/>
             <wp:docPr id="8" name="fig9_false_alarms.png" descr="Figure 8. Routine windows escalated to priority or urgent (bars: mean of 3 seeds; lines: seed range). Text never escalates a routine window." title="fig9_false_alarms.png"/>
@@ -8061,7 +8896,7 @@
           <w:sz w:val="18"/>
           <w:szCs w:val="18"/>
         </w:rPr>
-        <w:t>Table 6. Natural-prevalence windows (100 per N; 40–62 routine windows per N), where the tiers occur at their real frequency.</w:t>
+        <w:t>Table 7. Natural-prevalence windows (100 per N; 40–62 routine windows per N), where the tiers occur at their real frequency.</w:t>
       </w:r>
     </w:p>
     <w:p>
@@ -8070,7 +8905,7 @@
         <w:keepNext/>
         <w:keepLines/>
       </w:pPr>
-      <w:bookmarkStart w:id="15" w:name="_Toc241746075"/>
+      <w:bookmarkStart w:id="15" w:name="_Toc241748287"/>
       <w:r>
         <w:t>7.5 Against true annotations</w:t>
       </w:r>
@@ -8090,7 +8925,7 @@
         <w:keepNext/>
         <w:keepLines/>
       </w:pPr>
-      <w:bookmarkStart w:id="16" w:name="_Toc241746076"/>
+      <w:bookmarkStart w:id="16" w:name="_Toc241748288"/>
       <w:r>
         <w:t>8. Auditability</w:t>
       </w:r>
@@ -8208,7 +9043,7 @@
         </w:rPr>
         <w:lastRenderedPageBreak/>
         <w:drawing>
-          <wp:inline distT="0" distB="0" distL="0" distR="0" wp14:anchorId="0598B161" wp14:editId="4DD97CE7">
+          <wp:inline distT="0" distB="0" distL="0" distR="0" wp14:anchorId="38AB6FEA" wp14:editId="23F13ED3">
             <wp:extent cx="5762625" cy="2371725"/>
             <wp:effectExtent l="0" t="0" r="0" b="0"/>
             <wp:docPr id="9" name="fig8_auditability.png" descr="Figure 9. Balanced accuracy of decoding each event's fields from its virtual-token slot (recipe r3, mean of 3 seeds) versus from the encoder's 32-d vector." title="fig8_auditability.png"/>
@@ -8273,7 +9108,7 @@
           <w:noProof/>
         </w:rPr>
         <w:drawing>
-          <wp:inline distT="0" distB="0" distL="0" distR="0" wp14:anchorId="2B997945" wp14:editId="39CE0D41">
+          <wp:inline distT="0" distB="0" distL="0" distR="0" wp14:anchorId="7903DDD2" wp14:editId="2461B1D5">
             <wp:extent cx="5762625" cy="2009775"/>
             <wp:effectExtent l="0" t="0" r="0" b="0"/>
             <wp:docPr id="10" name="fig10_side_info.png" descr="Figure 10. Facts carried per event after the r4 change, decoded from slots 0 and 49 of each seed (bars: mean; lines: range). Left: heart rate and RR interval (R²). Right: presence of a run of ≥ 3 abnormal beats (balanced accuracy; Deviation 18b, a pre-registered replacement for an R² metric that proved ill-posed on this split)." title="fig10_side_info.png"/>
@@ -8333,7 +9168,7 @@
         <w:keepNext/>
         <w:keepLines/>
       </w:pPr>
-      <w:bookmarkStart w:id="17" w:name="_Toc241746077"/>
+      <w:bookmarkStart w:id="17" w:name="_Toc241748289"/>
       <w:r>
         <w:t>9. Status of the research questions</w:t>
       </w:r>
@@ -8770,7 +9605,7 @@
                 <w:sz w:val="19"/>
                 <w:szCs w:val="19"/>
               </w:rPr>
-              <w:t>Extended: cost located in the encoder; RR branch raises it to 85%; per-event decoding holds at every slot; heart rate, RR and run length now carried in the tokens (r4); uncertainty check available</w:t>
+              <w:t>Extended: cost located in the encoder; RR branch raises it to 81% ± 5 (10 seeds); per-event decoding holds at every slot; heart rate, RR and run length now carried in the tokens (r4); uncertainty check available</w:t>
             </w:r>
           </w:p>
         </w:tc>
@@ -8788,7 +9623,7 @@
           <w:sz w:val="18"/>
           <w:szCs w:val="18"/>
         </w:rPr>
-        <w:t>Table 7. Research questions: dissertation answer and how Phase 1 refined or extended it.</w:t>
+        <w:t>Table 8. Research questions: dissertation answer and how Phase 1 refined or extended it.</w:t>
       </w:r>
     </w:p>
     <w:p>
@@ -8797,7 +9632,7 @@
         <w:keepNext/>
         <w:keepLines/>
       </w:pPr>
-      <w:bookmarkStart w:id="18" w:name="_Toc241746078"/>
+      <w:bookmarkStart w:id="18" w:name="_Toc241748290"/>
       <w:r>
         <w:lastRenderedPageBreak/>
         <w:t>10. Limitations and threats to validity</w:t>
@@ -8814,7 +9649,7 @@
         <w:spacing w:after="60"/>
       </w:pPr>
       <w:r>
-        <w:t>Many design changes (Deviations 9–18) were made after early results. Each was logged before the data it affected, but the DS2 test set has now informed several iterations; a fresh confirmatory set would remove any doubt.</w:t>
+        <w:t>Many design changes (Deviations 9–19) were made after early results. Each was logged before the data it affected, but the DS2 test set has now informed several iterations; a fresh confirmatory set would remove any doubt.</w:t>
       </w:r>
     </w:p>
     <w:p>
@@ -8892,7 +9727,17 @@
         <w:spacing w:after="60"/>
       </w:pPr>
       <w:r>
-        <w:t>The RR encoder is a single seed with 0% F-class sensitivity; perception specificity (0.46–0.52) limits clinical accuracy.</w:t>
+        <w:rPr>
+          <w:b/>
+          <w:bCs/>
+        </w:rPr>
+        <w:t>Fusion (F) beats are essentially not detected</w:t>
+      </w:r>
+      <w:r>
+        <w:t xml:space="preserve"> (sensitivity 5% ± 7% over 10 encoder seeds). This is a property of the data split rather than of the model: 96% of the training F beats come from one patient (record 208) and 93% of the test F beats from another (record 213), and the two patients' fusion beats differ. In training they are premature and resemble ventricular beats (correlation of the mean beat with V 0.73); in the test patient they occur in a regular rhythm and resemble normal beats (correlation with N 0.85, with V 0.12), so the model labels</w:t>
+      </w:r>
+      <w:r>
+        <w:t xml:space="preserve"> most of them normal and the RR branch has no timing cue to use. F is widely reported as the weakest class under this inter-patient split. For triage, urgent decisions on F beats therefore rest on V detection or run length. Remedies (more patients with F beats, e.g. the INCART database; augmentation; merging F with V for triage) are possible but not needed for the interface claims.</w:t>
       </w:r>
     </w:p>
     <w:p>
@@ -8905,6 +9750,19 @@
         <w:spacing w:after="60"/>
       </w:pPr>
       <w:r>
+        <w:t>Encoder seed variation: S sensitivity ranges from 15% to 73% across seeds, and seed 0 (used for every adapter) has the highest V sensitivity of the 10 (97% vs a mean of 93%), which may slightly favour the downstream results. Perception specificity (0.46–0.52) limits clinical accuracy.</w:t>
+      </w:r>
+    </w:p>
+    <w:p>
+      <w:pPr>
+        <w:pStyle w:val="ListParagraph"/>
+        <w:numPr>
+          <w:ilvl w:val="0"/>
+          <w:numId w:val="2"/>
+        </w:numPr>
+        <w:spacing w:after="60"/>
+      </w:pPr>
+      <w:r>
         <w:t>No human evaluation; that needs ethics approval.</w:t>
       </w:r>
     </w:p>
@@ -8914,7 +9772,7 @@
         <w:keepNext/>
         <w:keepLines/>
       </w:pPr>
-      <w:bookmarkStart w:id="19" w:name="_Toc241746079"/>
+      <w:bookmarkStart w:id="19" w:name="_Toc241748291"/>
       <w:r>
         <w:t>11. Proposed next steps</w:t>
       </w:r>
@@ -9028,7 +9886,11 @@
         <w:spacing w:after="120"/>
       </w:pPr>
       <w:r>
-        <w:t>Questions: (1) Which target journal should the framing aim at (clinical AI vs machine learning systems)? (2) Is external validation expected before submission, or acceptable as future work? (3) Should a small clinician rating study be planned, given the ethics lead time? (4) How should the updated methods description (192 per-example updates) be recorded alongside the submitted dissertation?</w:t>
+        <w:t xml:space="preserve">Questions: (1) Which target journal should the framing aim at (clinical AI vs machine learning systems)? (2) Is external validation expected before submission, or acceptable as future work? (3) Should a small clinician rating study be planned, given the ethics lead time? (4) How should </w:t>
+      </w:r>
+      <w:r>
+        <w:lastRenderedPageBreak/>
+        <w:t>the updated methods description (192 per-example updates) be recorded alongside the submitted dissertation?</w:t>
       </w:r>
     </w:p>
     <w:p>
@@ -9037,9 +9899,8 @@
         <w:keepNext/>
         <w:keepLines/>
       </w:pPr>
-      <w:bookmarkStart w:id="20" w:name="_Toc241746080"/>
-      <w:r>
-        <w:lastRenderedPageBreak/>
+      <w:bookmarkStart w:id="20" w:name="_Toc241748292"/>
+      <w:r>
         <w:t>Appendix A. Pre-registered deviations</w:t>
       </w:r>
       <w:bookmarkEnd w:id="20"/>
@@ -10490,6 +11351,107 @@
           </w:p>
         </w:tc>
       </w:tr>
+      <w:tr>
+        <w:tblPrEx>
+          <w:tblCellMar>
+            <w:top w:w="0" w:type="dxa"/>
+            <w:bottom w:w="0" w:type="dxa"/>
+          </w:tblCellMar>
+        </w:tblPrEx>
+        <w:trPr>
+          <w:cantSplit/>
+        </w:trPr>
+        <w:tc>
+          <w:tcPr>
+            <w:tcW w:w="1000" w:type="dxa"/>
+            <w:tcBorders>
+              <w:top w:val="single" w:sz="4" w:space="0" w:color="BFBFBF"/>
+              <w:left w:val="single" w:sz="4" w:space="0" w:color="BFBFBF"/>
+              <w:bottom w:val="single" w:sz="4" w:space="0" w:color="BFBFBF"/>
+              <w:right w:val="single" w:sz="4" w:space="0" w:color="BFBFBF"/>
+            </w:tcBorders>
+            <w:tcMar>
+              <w:top w:w="60" w:type="dxa"/>
+              <w:left w:w="100" w:type="dxa"/>
+              <w:bottom w:w="60" w:type="dxa"/>
+              <w:right w:w="100" w:type="dxa"/>
+            </w:tcMar>
+          </w:tcPr>
+          <w:p>
+            <w:pPr>
+              <w:keepNext/>
+              <w:keepLines/>
+            </w:pPr>
+            <w:r>
+              <w:rPr>
+                <w:sz w:val="19"/>
+                <w:szCs w:val="19"/>
+              </w:rPr>
+              <w:t>19</w:t>
+            </w:r>
+          </w:p>
+        </w:tc>
+        <w:tc>
+          <w:tcPr>
+            <w:tcW w:w="4600" w:type="dxa"/>
+            <w:tcBorders>
+              <w:top w:val="single" w:sz="4" w:space="0" w:color="BFBFBF"/>
+              <w:left w:val="single" w:sz="4" w:space="0" w:color="BFBFBF"/>
+              <w:bottom w:val="single" w:sz="4" w:space="0" w:color="BFBFBF"/>
+              <w:right w:val="single" w:sz="4" w:space="0" w:color="BFBFBF"/>
+            </w:tcBorders>
+            <w:tcMar>
+              <w:top w:w="60" w:type="dxa"/>
+              <w:left w:w="100" w:type="dxa"/>
+              <w:bottom w:w="60" w:type="dxa"/>
+              <w:right w:w="100" w:type="dxa"/>
+            </w:tcMar>
+          </w:tcPr>
+          <w:p>
+            <w:pPr>
+              <w:keepNext/>
+              <w:keepLines/>
+            </w:pPr>
+            <w:r>
+              <w:rPr>
+                <w:sz w:val="19"/>
+                <w:szCs w:val="19"/>
+              </w:rPr>
+              <w:t>RR encoder retrained with 10 seeds</w:t>
+            </w:r>
+          </w:p>
+        </w:tc>
+        <w:tc>
+          <w:tcPr>
+            <w:tcW w:w="3426" w:type="dxa"/>
+            <w:tcBorders>
+              <w:top w:val="single" w:sz="4" w:space="0" w:color="BFBFBF"/>
+              <w:left w:val="single" w:sz="4" w:space="0" w:color="BFBFBF"/>
+              <w:bottom w:val="single" w:sz="4" w:space="0" w:color="BFBFBF"/>
+              <w:right w:val="single" w:sz="4" w:space="0" w:color="BFBFBF"/>
+            </w:tcBorders>
+            <w:tcMar>
+              <w:top w:w="60" w:type="dxa"/>
+              <w:left w:w="100" w:type="dxa"/>
+              <w:bottom w:w="60" w:type="dxa"/>
+              <w:right w:w="100" w:type="dxa"/>
+            </w:tcMar>
+          </w:tcPr>
+          <w:p>
+            <w:pPr>
+              <w:keepNext/>
+              <w:keepLines/>
+            </w:pPr>
+            <w:r>
+              <w:rPr>
+                <w:sz w:val="19"/>
+                <w:szCs w:val="19"/>
+              </w:rPr>
+              <w:t>Its gains were single-run numbers</w:t>
+            </w:r>
+          </w:p>
+        </w:tc>
+      </w:tr>
     </w:tbl>
     <w:p>
       <w:pPr>
@@ -10503,7 +11465,7 @@
           <w:sz w:val="18"/>
           <w:szCs w:val="18"/>
         </w:rPr>
-        <w:t>Table 8. Deviations 1–18 (full text in the analysis plan).</w:t>
+        <w:t>Table 9. Deviations 1–19 (full text in the analysis plan).</w:t>
       </w:r>
     </w:p>
     <w:sectPr>
@@ -10617,10 +11579,10 @@
 <file path=word/numbering.xml><?xml version="1.0" encoding="utf-8"?>
 <w:numbering xmlns:wpc="http://schemas.microsoft.com/office/word/2010/wordprocessingCanvas" xmlns:cx="http://schemas.microsoft.com/office/drawing/2014/chartex" xmlns:cx1="http://schemas.microsoft.com/office/drawing/2015/9/8/chartex" xmlns:cx2="http://schemas.microsoft.com/office/drawing/2015/10/21/chartex" xmlns:cx3="http://schemas.microsoft.com/office/drawing/2016/5/9/chartex" xmlns:cx4="http://schemas.microsoft.com/office/drawing/2016/5/10/chartex" xmlns:cx5="http://schemas.microsoft.com/office/drawing/2016/5/11/chartex" xmlns:cx6="http://schemas.microsoft.com/office/drawing/2016/5/12/chartex" xmlns:cx7="http://schemas.microsoft.com/office/drawing/2016/5/13/chartex" xmlns:cx8="http://schemas.microsoft.com/office/drawing/2016/5/14/chartex" xmlns:mc="http://schemas.openxmlformats.org/markup-compatibility/2006" xmlns:aink="http://schemas.microsoft.com/office/drawing/2016/ink" xmlns:am3d="http://schemas.microsoft.com/office/drawing/2017/model3d" xmlns:o="urn:schemas-microsoft-com:office:office" xmlns:oel="http://schemas.microsoft.com/office/2019/extlst" xmlns:r="http://schemas.openxmlformats.org/officeDocument/2006/relationships" xmlns:m="http://schemas.openxmlformats.org/officeDocument/2006/math" xmlns:v="urn:schemas-microsoft-com:vml" xmlns:wp14="http://schemas.microsoft.com/office/word/2010/wordprocessingDrawing" xmlns:wp="http://schemas.openxmlformats.org/drawingml/2006/wordprocessingDrawing" xmlns:w10="urn:schemas-microsoft-com:office:word" xmlns:w="http://schemas.openxmlformats.org/wordprocessingml/2006/main" xmlns:w14="http://schemas.microsoft.com/office/word/2010/wordml" xmlns:w15="http://schemas.microsoft.com/office/word/2012/wordml" xmlns:w16cex="http://schemas.microsoft.com/office/word/2018/wordml/cex" xmlns:w16cid="http://schemas.microsoft.com/office/word/2016/wordml/cid" xmlns:w16="http://schemas.microsoft.com/office/word/2018/wordml" xmlns:w16du="http://schemas.microsoft.com/office/word/2023/wordml/word16du" xmlns:w16sdtdh="http://schemas.microsoft.com/office/word/2020/wordml/sdtdatahash" xmlns:w16sdtfl="http://schemas.microsoft.com/office/word/2024/wordml/sdtformatlock" xmlns:w16se="http://schemas.microsoft.com/office/word/2015/wordml/symex" xmlns:wpg="http://schemas.microsoft.com/office/word/2010/wordprocessingGroup" xmlns:wpi="http://schemas.microsoft.com/office/word/2010/wordprocessingInk" xmlns:wne="http://schemas.microsoft.com/office/word/2006/wordml" xmlns:wps="http://schemas.microsoft.com/office/word/2010/wordprocessingShape" mc:Ignorable="w14 w15 w16se w16cid w16 w16cex w16sdtdh w16sdtfl w16du wp14">
   <w:abstractNum w:abstractNumId="0" w15:restartNumberingAfterBreak="0">
-    <w:nsid w:val="2F384148"/>
+    <w:nsid w:val="19E476DC"/>
     <w:multiLevelType w:val="hybridMultilevel"/>
-    <w:tmpl w:val="576C568A"/>
-    <w:lvl w:ilvl="0" w:tplc="767E5C4A">
+    <w:tmpl w:val="7166F248"/>
+    <w:lvl w:ilvl="0" w:tplc="5A9A3F28">
       <w:start w:val="1"/>
       <w:numFmt w:val="decimal"/>
       <w:lvlText w:val="%1."/>
@@ -10629,52 +11591,52 @@
         <w:ind w:left="540" w:hanging="300"/>
       </w:pPr>
     </w:lvl>
-    <w:lvl w:ilvl="1" w:tplc="1E98F6D6">
+    <w:lvl w:ilvl="1" w:tplc="5DE821EA">
       <w:numFmt w:val="decimal"/>
       <w:lvlText w:val=""/>
       <w:lvlJc w:val="left"/>
     </w:lvl>
-    <w:lvl w:ilvl="2" w:tplc="193427C0">
+    <w:lvl w:ilvl="2" w:tplc="59DA7600">
       <w:numFmt w:val="decimal"/>
       <w:lvlText w:val=""/>
       <w:lvlJc w:val="left"/>
     </w:lvl>
-    <w:lvl w:ilvl="3" w:tplc="50648E74">
+    <w:lvl w:ilvl="3" w:tplc="42E24B2A">
       <w:numFmt w:val="decimal"/>
       <w:lvlText w:val=""/>
       <w:lvlJc w:val="left"/>
     </w:lvl>
-    <w:lvl w:ilvl="4" w:tplc="7418233C">
+    <w:lvl w:ilvl="4" w:tplc="EEE2F3AA">
       <w:numFmt w:val="decimal"/>
       <w:lvlText w:val=""/>
       <w:lvlJc w:val="left"/>
     </w:lvl>
-    <w:lvl w:ilvl="5" w:tplc="FFF60E62">
+    <w:lvl w:ilvl="5" w:tplc="5B9CD68E">
       <w:numFmt w:val="decimal"/>
       <w:lvlText w:val=""/>
       <w:lvlJc w:val="left"/>
     </w:lvl>
-    <w:lvl w:ilvl="6" w:tplc="46A23BAC">
+    <w:lvl w:ilvl="6" w:tplc="8E8C1DF6">
       <w:numFmt w:val="decimal"/>
       <w:lvlText w:val=""/>
       <w:lvlJc w:val="left"/>
     </w:lvl>
-    <w:lvl w:ilvl="7" w:tplc="BA4A1746">
+    <w:lvl w:ilvl="7" w:tplc="DF962076">
       <w:numFmt w:val="decimal"/>
       <w:lvlText w:val=""/>
       <w:lvlJc w:val="left"/>
     </w:lvl>
-    <w:lvl w:ilvl="8" w:tplc="41EAFA06">
+    <w:lvl w:ilvl="8" w:tplc="BF802B76">
       <w:numFmt w:val="decimal"/>
       <w:lvlText w:val=""/>
       <w:lvlJc w:val="left"/>
     </w:lvl>
   </w:abstractNum>
   <w:abstractNum w:abstractNumId="1" w15:restartNumberingAfterBreak="0">
-    <w:nsid w:val="61221EA3"/>
+    <w:nsid w:val="25D775C8"/>
     <w:multiLevelType w:val="hybridMultilevel"/>
-    <w:tmpl w:val="37008CF0"/>
-    <w:lvl w:ilvl="0" w:tplc="3ADC73A2">
+    <w:tmpl w:val="A3407D5E"/>
+    <w:lvl w:ilvl="0" w:tplc="1E3C6D08">
       <w:start w:val="1"/>
       <w:numFmt w:val="bullet"/>
       <w:lvlText w:val="•"/>
@@ -10683,52 +11645,52 @@
         <w:ind w:left="540" w:hanging="270"/>
       </w:pPr>
     </w:lvl>
-    <w:lvl w:ilvl="1" w:tplc="87F6774A">
+    <w:lvl w:ilvl="1" w:tplc="4A52A876">
       <w:numFmt w:val="decimal"/>
       <w:lvlText w:val=""/>
       <w:lvlJc w:val="left"/>
     </w:lvl>
-    <w:lvl w:ilvl="2" w:tplc="F742233E">
+    <w:lvl w:ilvl="2" w:tplc="40684ACC">
       <w:numFmt w:val="decimal"/>
       <w:lvlText w:val=""/>
       <w:lvlJc w:val="left"/>
     </w:lvl>
-    <w:lvl w:ilvl="3" w:tplc="7AFEE632">
+    <w:lvl w:ilvl="3" w:tplc="05B2F616">
       <w:numFmt w:val="decimal"/>
       <w:lvlText w:val=""/>
       <w:lvlJc w:val="left"/>
     </w:lvl>
-    <w:lvl w:ilvl="4" w:tplc="BD5CE826">
+    <w:lvl w:ilvl="4" w:tplc="33C67CAE">
       <w:numFmt w:val="decimal"/>
       <w:lvlText w:val=""/>
       <w:lvlJc w:val="left"/>
     </w:lvl>
-    <w:lvl w:ilvl="5" w:tplc="8818A028">
+    <w:lvl w:ilvl="5" w:tplc="B536748A">
       <w:numFmt w:val="decimal"/>
       <w:lvlText w:val=""/>
       <w:lvlJc w:val="left"/>
     </w:lvl>
-    <w:lvl w:ilvl="6" w:tplc="A7B8CC14">
+    <w:lvl w:ilvl="6" w:tplc="5CFCCA18">
       <w:numFmt w:val="decimal"/>
       <w:lvlText w:val=""/>
       <w:lvlJc w:val="left"/>
     </w:lvl>
-    <w:lvl w:ilvl="7" w:tplc="B4B63A58">
+    <w:lvl w:ilvl="7" w:tplc="74684D86">
       <w:numFmt w:val="decimal"/>
       <w:lvlText w:val=""/>
       <w:lvlJc w:val="left"/>
     </w:lvl>
-    <w:lvl w:ilvl="8" w:tplc="D46EFF2E">
+    <w:lvl w:ilvl="8" w:tplc="80D4EB16">
       <w:numFmt w:val="decimal"/>
       <w:lvlText w:val=""/>
       <w:lvlJc w:val="left"/>
     </w:lvl>
   </w:abstractNum>
   <w:abstractNum w:abstractNumId="2" w15:restartNumberingAfterBreak="0">
-    <w:nsid w:val="78F240A8"/>
+    <w:nsid w:val="2B0403E9"/>
     <w:multiLevelType w:val="hybridMultilevel"/>
-    <w:tmpl w:val="C400EDA2"/>
-    <w:lvl w:ilvl="0" w:tplc="11FC4A5C" w:tentative="1">
+    <w:tmpl w:val="4D40EB8C"/>
+    <w:lvl w:ilvl="0" w:tplc="F932786C" w:tentative="1">
       <w:start w:val="1"/>
       <w:numFmt w:val="bullet"/>
       <w:lvlText w:val="●"/>
@@ -10737,7 +11699,7 @@
         <w:ind w:left="720" w:hanging="360"/>
       </w:pPr>
     </w:lvl>
-    <w:lvl w:ilvl="1" w:tplc="30CE9C50" w:tentative="1">
+    <w:lvl w:ilvl="1" w:tplc="278C9F64" w:tentative="1">
       <w:start w:val="1"/>
       <w:numFmt w:val="bullet"/>
       <w:lvlText w:val="○"/>
@@ -10746,7 +11708,7 @@
         <w:ind w:left="1440" w:hanging="360"/>
       </w:pPr>
     </w:lvl>
-    <w:lvl w:ilvl="2" w:tplc="43C67FBA" w:tentative="1">
+    <w:lvl w:ilvl="2" w:tplc="457638DC" w:tentative="1">
       <w:start w:val="1"/>
       <w:numFmt w:val="bullet"/>
       <w:lvlText w:val="■"/>
@@ -10755,7 +11717,7 @@
         <w:ind w:left="2160" w:hanging="360"/>
       </w:pPr>
     </w:lvl>
-    <w:lvl w:ilvl="3" w:tplc="87AC4544" w:tentative="1">
+    <w:lvl w:ilvl="3" w:tplc="9A204554" w:tentative="1">
       <w:start w:val="1"/>
       <w:numFmt w:val="bullet"/>
       <w:lvlText w:val="●"/>
@@ -10764,7 +11726,7 @@
         <w:ind w:left="2880" w:hanging="360"/>
       </w:pPr>
     </w:lvl>
-    <w:lvl w:ilvl="4" w:tplc="CB16A178" w:tentative="1">
+    <w:lvl w:ilvl="4" w:tplc="1A50E678" w:tentative="1">
       <w:start w:val="1"/>
       <w:numFmt w:val="bullet"/>
       <w:lvlText w:val="○"/>
@@ -10773,7 +11735,7 @@
         <w:ind w:left="3600" w:hanging="360"/>
       </w:pPr>
     </w:lvl>
-    <w:lvl w:ilvl="5" w:tplc="0B80953A" w:tentative="1">
+    <w:lvl w:ilvl="5" w:tplc="3D36A266" w:tentative="1">
       <w:start w:val="1"/>
       <w:numFmt w:val="bullet"/>
       <w:lvlText w:val="■"/>
@@ -10782,7 +11744,7 @@
         <w:ind w:left="4320" w:hanging="360"/>
       </w:pPr>
     </w:lvl>
-    <w:lvl w:ilvl="6" w:tplc="56A8F398" w:tentative="1">
+    <w:lvl w:ilvl="6" w:tplc="BC18822E" w:tentative="1">
       <w:start w:val="1"/>
       <w:numFmt w:val="bullet"/>
       <w:lvlText w:val="●"/>
@@ -10791,7 +11753,7 @@
         <w:ind w:left="5040" w:hanging="360"/>
       </w:pPr>
     </w:lvl>
-    <w:lvl w:ilvl="7" w:tplc="CD2A52E0" w:tentative="1">
+    <w:lvl w:ilvl="7" w:tplc="9A78670A" w:tentative="1">
       <w:start w:val="1"/>
       <w:numFmt w:val="bullet"/>
       <w:lvlText w:val="●"/>
@@ -10800,7 +11762,7 @@
         <w:ind w:left="5760" w:hanging="360"/>
       </w:pPr>
     </w:lvl>
-    <w:lvl w:ilvl="8" w:tplc="EE8CF312" w:tentative="1">
+    <w:lvl w:ilvl="8" w:tplc="46FCC19C" w:tentative="1">
       <w:start w:val="1"/>
       <w:numFmt w:val="bullet"/>
       <w:lvlText w:val="●"/>
@@ -10810,19 +11772,19 @@
       </w:pPr>
     </w:lvl>
   </w:abstractNum>
-  <w:num w:numId="1" w16cid:durableId="2073575455">
+  <w:num w:numId="1" w16cid:durableId="917904819">
     <w:abstractNumId w:val="2"/>
     <w:lvlOverride w:ilvl="0">
       <w:startOverride w:val="1"/>
     </w:lvlOverride>
   </w:num>
-  <w:num w:numId="2" w16cid:durableId="1135485954">
+  <w:num w:numId="2" w16cid:durableId="2059237116">
     <w:abstractNumId w:val="1"/>
     <w:lvlOverride w:ilvl="0">
       <w:startOverride w:val="1"/>
     </w:lvlOverride>
   </w:num>
-  <w:num w:numId="3" w16cid:durableId="880093310">
+  <w:num w:numId="3" w16cid:durableId="1661041305">
     <w:abstractNumId w:val="0"/>
     <w:lvlOverride w:ilvl="0">
       <w:startOverride w:val="1"/>
@@ -11460,7 +12422,7 @@
     <w:autoRedefine/>
     <w:uiPriority w:val="39"/>
     <w:unhideWhenUsed/>
-    <w:rsid w:val="00343FAF"/>
+    <w:rsid w:val="009B23F7"/>
     <w:pPr>
       <w:spacing w:after="100"/>
     </w:pPr>
@@ -11472,7 +12434,7 @@
     <w:autoRedefine/>
     <w:uiPriority w:val="39"/>
     <w:unhideWhenUsed/>
-    <w:rsid w:val="00343FAF"/>
+    <w:rsid w:val="009B23F7"/>
     <w:pPr>
       <w:spacing w:after="100"/>
       <w:ind w:left="210"/>

</xml_diff>

<commit_message>
Supervisor report: Section 6.1 serving conditions (Deviation 23/23a), summary and RQ1 updated
Co-Authored-By: Claude Opus 5.5 <noreply@anthropic.com>
</commit_message>
<xml_diff>
--- a/reports/Phase1_Technical_Report.docx
+++ b/reports/Phase1_Technical_Report.docx
@@ -56,7 +56,7 @@
         <w:t>Date:</w:t>
       </w:r>
       <w:r>
-        <w:t xml:space="preserve"> 2 October 2026 (updated with the filtered-text baseline and a second sender architecture)</w:t>
+        <w:t xml:space="preserve"> 2 October 2026 (updated with the filtered-text baseline, a second sender architecture and serving measurements)</w:t>
       </w:r>
     </w:p>
     <w:p>
@@ -82,7 +82,7 @@
     <w:sdt>
       <w:sdtPr>
         <w:alias w:val="Contents"/>
-        <w:id w:val="1445646814"/>
+        <w:id w:val="-997033917"/>
       </w:sdtPr>
       <w:sdtEndPr/>
       <w:sdtContent>
@@ -110,7 +110,7 @@
           <w:r>
             <w:fldChar w:fldCharType="separate"/>
           </w:r>
-          <w:hyperlink w:anchor="_Toc241868642" w:history="1">
+          <w:hyperlink w:anchor="_Toc241873283" w:history="1">
             <w:r>
               <w:rPr>
                 <w:rStyle w:val="Hyperlink"/>
@@ -134,7 +134,7 @@
               <w:rPr>
                 <w:noProof/>
               </w:rPr>
-              <w:instrText xml:space="preserve"> PAGEREF _Toc241868642 \h </w:instrText>
+              <w:instrText xml:space="preserve"> PAGEREF _Toc241873283 \h </w:instrText>
             </w:r>
             <w:r>
               <w:rPr>
@@ -176,7 +176,7 @@
               <w14:ligatures w14:val="standardContextual"/>
             </w:rPr>
           </w:pPr>
-          <w:hyperlink w:anchor="_Toc241868643" w:history="1">
+          <w:hyperlink w:anchor="_Toc241873284" w:history="1">
             <w:r>
               <w:rPr>
                 <w:rStyle w:val="Hyperlink"/>
@@ -200,7 +200,7 @@
               <w:rPr>
                 <w:noProof/>
               </w:rPr>
-              <w:instrText xml:space="preserve"> PAGEREF _Toc241868643 \h </w:instrText>
+              <w:instrText xml:space="preserve"> PAGEREF _Toc241873284 \h </w:instrText>
             </w:r>
             <w:r>
               <w:rPr>
@@ -242,7 +242,7 @@
               <w14:ligatures w14:val="standardContextual"/>
             </w:rPr>
           </w:pPr>
-          <w:hyperlink w:anchor="_Toc241868644" w:history="1">
+          <w:hyperlink w:anchor="_Toc241873285" w:history="1">
             <w:r>
               <w:rPr>
                 <w:rStyle w:val="Hyperlink"/>
@@ -266,7 +266,7 @@
               <w:rPr>
                 <w:noProof/>
               </w:rPr>
-              <w:instrText xml:space="preserve"> PAGEREF _Toc241868644 \h </w:instrText>
+              <w:instrText xml:space="preserve"> PAGEREF _Toc241873285 \h </w:instrText>
             </w:r>
             <w:r>
               <w:rPr>
@@ -308,7 +308,7 @@
               <w14:ligatures w14:val="standardContextual"/>
             </w:rPr>
           </w:pPr>
-          <w:hyperlink w:anchor="_Toc241868645" w:history="1">
+          <w:hyperlink w:anchor="_Toc241873286" w:history="1">
             <w:r>
               <w:rPr>
                 <w:rStyle w:val="Hyperlink"/>
@@ -332,7 +332,7 @@
               <w:rPr>
                 <w:noProof/>
               </w:rPr>
-              <w:instrText xml:space="preserve"> PAGEREF _Toc241868645 \h </w:instrText>
+              <w:instrText xml:space="preserve"> PAGEREF _Toc241873286 \h </w:instrText>
             </w:r>
             <w:r>
               <w:rPr>
@@ -374,7 +374,7 @@
               <w14:ligatures w14:val="standardContextual"/>
             </w:rPr>
           </w:pPr>
-          <w:hyperlink w:anchor="_Toc241868646" w:history="1">
+          <w:hyperlink w:anchor="_Toc241873287" w:history="1">
             <w:r>
               <w:rPr>
                 <w:rStyle w:val="Hyperlink"/>
@@ -398,7 +398,7 @@
               <w:rPr>
                 <w:noProof/>
               </w:rPr>
-              <w:instrText xml:space="preserve"> PAGEREF _Toc241868646 \h </w:instrText>
+              <w:instrText xml:space="preserve"> PAGEREF _Toc241873287 \h </w:instrText>
             </w:r>
             <w:r>
               <w:rPr>
@@ -440,7 +440,7 @@
               <w14:ligatures w14:val="standardContextual"/>
             </w:rPr>
           </w:pPr>
-          <w:hyperlink w:anchor="_Toc241868647" w:history="1">
+          <w:hyperlink w:anchor="_Toc241873288" w:history="1">
             <w:r>
               <w:rPr>
                 <w:rStyle w:val="Hyperlink"/>
@@ -464,7 +464,7 @@
               <w:rPr>
                 <w:noProof/>
               </w:rPr>
-              <w:instrText xml:space="preserve"> PAGEREF _Toc241868647 \h </w:instrText>
+              <w:instrText xml:space="preserve"> PAGEREF _Toc241873288 \h </w:instrText>
             </w:r>
             <w:r>
               <w:rPr>
@@ -506,7 +506,7 @@
               <w14:ligatures w14:val="standardContextual"/>
             </w:rPr>
           </w:pPr>
-          <w:hyperlink w:anchor="_Toc241868648" w:history="1">
+          <w:hyperlink w:anchor="_Toc241873289" w:history="1">
             <w:r>
               <w:rPr>
                 <w:rStyle w:val="Hyperlink"/>
@@ -530,7 +530,7 @@
               <w:rPr>
                 <w:noProof/>
               </w:rPr>
-              <w:instrText xml:space="preserve"> PAGEREF _Toc241868648 \h </w:instrText>
+              <w:instrText xml:space="preserve"> PAGEREF _Toc241873289 \h </w:instrText>
             </w:r>
             <w:r>
               <w:rPr>
@@ -572,7 +572,7 @@
               <w14:ligatures w14:val="standardContextual"/>
             </w:rPr>
           </w:pPr>
-          <w:hyperlink w:anchor="_Toc241868649" w:history="1">
+          <w:hyperlink w:anchor="_Toc241873290" w:history="1">
             <w:r>
               <w:rPr>
                 <w:rStyle w:val="Hyperlink"/>
@@ -596,7 +596,7 @@
               <w:rPr>
                 <w:noProof/>
               </w:rPr>
-              <w:instrText xml:space="preserve"> PAGEREF _Toc241868649 \h </w:instrText>
+              <w:instrText xml:space="preserve"> PAGEREF _Toc241873290 \h </w:instrText>
             </w:r>
             <w:r>
               <w:rPr>
@@ -638,7 +638,7 @@
               <w14:ligatures w14:val="standardContextual"/>
             </w:rPr>
           </w:pPr>
-          <w:hyperlink w:anchor="_Toc241868650" w:history="1">
+          <w:hyperlink w:anchor="_Toc241873291" w:history="1">
             <w:r>
               <w:rPr>
                 <w:rStyle w:val="Hyperlink"/>
@@ -662,7 +662,7 @@
               <w:rPr>
                 <w:noProof/>
               </w:rPr>
-              <w:instrText xml:space="preserve"> PAGEREF _Toc241868650 \h </w:instrText>
+              <w:instrText xml:space="preserve"> PAGEREF _Toc241873291 \h </w:instrText>
             </w:r>
             <w:r>
               <w:rPr>
@@ -704,7 +704,7 @@
               <w14:ligatures w14:val="standardContextual"/>
             </w:rPr>
           </w:pPr>
-          <w:hyperlink w:anchor="_Toc241868651" w:history="1">
+          <w:hyperlink w:anchor="_Toc241873292" w:history="1">
             <w:r>
               <w:rPr>
                 <w:rStyle w:val="Hyperlink"/>
@@ -728,7 +728,7 @@
               <w:rPr>
                 <w:noProof/>
               </w:rPr>
-              <w:instrText xml:space="preserve"> PAGEREF _Toc241868651 \h </w:instrText>
+              <w:instrText xml:space="preserve"> PAGEREF _Toc241873292 \h </w:instrText>
             </w:r>
             <w:r>
               <w:rPr>
@@ -746,6 +746,72 @@
                 <w:noProof/>
               </w:rPr>
               <w:t>6</w:t>
+            </w:r>
+            <w:r>
+              <w:rPr>
+                <w:noProof/>
+              </w:rPr>
+              <w:fldChar w:fldCharType="end"/>
+            </w:r>
+          </w:hyperlink>
+        </w:p>
+        <w:p>
+          <w:pPr>
+            <w:pStyle w:val="TOC2"/>
+            <w:tabs>
+              <w:tab w:val="right" w:leader="dot" w:pos="9016"/>
+            </w:tabs>
+            <w:rPr>
+              <w:rFonts w:asciiTheme="minorHAnsi" w:eastAsiaTheme="minorEastAsia" w:hAnsiTheme="minorHAnsi" w:cstheme="minorBidi"/>
+              <w:noProof/>
+              <w:kern w:val="2"/>
+              <w:sz w:val="24"/>
+              <w:szCs w:val="24"/>
+              <w14:ligatures w14:val="standardContextual"/>
+            </w:rPr>
+          </w:pPr>
+          <w:hyperlink w:anchor="_Toc241873293" w:history="1">
+            <w:r>
+              <w:rPr>
+                <w:rStyle w:val="Hyperlink"/>
+                <w:noProof/>
+              </w:rPr>
+              <w:t>6.1 Serving conditions: batching and prefix caching (Deviation 23)</w:t>
+            </w:r>
+            <w:r>
+              <w:rPr>
+                <w:noProof/>
+              </w:rPr>
+              <w:tab/>
+            </w:r>
+            <w:r>
+              <w:rPr>
+                <w:noProof/>
+              </w:rPr>
+              <w:fldChar w:fldCharType="begin"/>
+            </w:r>
+            <w:r>
+              <w:rPr>
+                <w:noProof/>
+              </w:rPr>
+              <w:instrText xml:space="preserve"> PAGEREF _Toc241873293 \h </w:instrText>
+            </w:r>
+            <w:r>
+              <w:rPr>
+                <w:noProof/>
+              </w:rPr>
+            </w:r>
+            <w:r>
+              <w:rPr>
+                <w:noProof/>
+              </w:rPr>
+              <w:fldChar w:fldCharType="separate"/>
+            </w:r>
+            <w:r>
+              <w:rPr>
+                <w:noProof/>
+              </w:rPr>
+              <w:t>7</w:t>
             </w:r>
             <w:r>
               <w:rPr>
@@ -770,7 +836,7 @@
               <w14:ligatures w14:val="standardContextual"/>
             </w:rPr>
           </w:pPr>
-          <w:hyperlink w:anchor="_Toc241868652" w:history="1">
+          <w:hyperlink w:anchor="_Toc241873294" w:history="1">
             <w:r>
               <w:rPr>
                 <w:rStyle w:val="Hyperlink"/>
@@ -794,7 +860,7 @@
               <w:rPr>
                 <w:noProof/>
               </w:rPr>
-              <w:instrText xml:space="preserve"> PAGEREF _Toc241868652 \h </w:instrText>
+              <w:instrText xml:space="preserve"> PAGEREF _Toc241873294 \h </w:instrText>
             </w:r>
             <w:r>
               <w:rPr>
@@ -811,7 +877,7 @@
               <w:rPr>
                 <w:noProof/>
               </w:rPr>
-              <w:t>7</w:t>
+              <w:t>8</w:t>
             </w:r>
             <w:r>
               <w:rPr>
@@ -836,7 +902,7 @@
               <w14:ligatures w14:val="standardContextual"/>
             </w:rPr>
           </w:pPr>
-          <w:hyperlink w:anchor="_Toc241868653" w:history="1">
+          <w:hyperlink w:anchor="_Toc241873295" w:history="1">
             <w:r>
               <w:rPr>
                 <w:rStyle w:val="Hyperlink"/>
@@ -860,7 +926,7 @@
               <w:rPr>
                 <w:noProof/>
               </w:rPr>
-              <w:instrText xml:space="preserve"> PAGEREF _Toc241868653 \h </w:instrText>
+              <w:instrText xml:space="preserve"> PAGEREF _Toc241873295 \h </w:instrText>
             </w:r>
             <w:r>
               <w:rPr>
@@ -877,7 +943,7 @@
               <w:rPr>
                 <w:noProof/>
               </w:rPr>
-              <w:t>7</w:t>
+              <w:t>8</w:t>
             </w:r>
             <w:r>
               <w:rPr>
@@ -902,7 +968,7 @@
               <w14:ligatures w14:val="standardContextual"/>
             </w:rPr>
           </w:pPr>
-          <w:hyperlink w:anchor="_Toc241868654" w:history="1">
+          <w:hyperlink w:anchor="_Toc241873296" w:history="1">
             <w:r>
               <w:rPr>
                 <w:rStyle w:val="Hyperlink"/>
@@ -926,7 +992,7 @@
               <w:rPr>
                 <w:noProof/>
               </w:rPr>
-              <w:instrText xml:space="preserve"> PAGEREF _Toc241868654 \h </w:instrText>
+              <w:instrText xml:space="preserve"> PAGEREF _Toc241873296 \h </w:instrText>
             </w:r>
             <w:r>
               <w:rPr>
@@ -968,7 +1034,7 @@
               <w14:ligatures w14:val="standardContextual"/>
             </w:rPr>
           </w:pPr>
-          <w:hyperlink w:anchor="_Toc241868655" w:history="1">
+          <w:hyperlink w:anchor="_Toc241873297" w:history="1">
             <w:r>
               <w:rPr>
                 <w:rStyle w:val="Hyperlink"/>
@@ -992,7 +1058,7 @@
               <w:rPr>
                 <w:noProof/>
               </w:rPr>
-              <w:instrText xml:space="preserve"> PAGEREF _Toc241868655 \h </w:instrText>
+              <w:instrText xml:space="preserve"> PAGEREF _Toc241873297 \h </w:instrText>
             </w:r>
             <w:r>
               <w:rPr>
@@ -1009,7 +1075,7 @@
               <w:rPr>
                 <w:noProof/>
               </w:rPr>
-              <w:t>8</w:t>
+              <w:t>9</w:t>
             </w:r>
             <w:r>
               <w:rPr>
@@ -1034,7 +1100,7 @@
               <w14:ligatures w14:val="standardContextual"/>
             </w:rPr>
           </w:pPr>
-          <w:hyperlink w:anchor="_Toc241868656" w:history="1">
+          <w:hyperlink w:anchor="_Toc241873298" w:history="1">
             <w:r>
               <w:rPr>
                 <w:rStyle w:val="Hyperlink"/>
@@ -1058,7 +1124,7 @@
               <w:rPr>
                 <w:noProof/>
               </w:rPr>
-              <w:instrText xml:space="preserve"> PAGEREF _Toc241868656 \h </w:instrText>
+              <w:instrText xml:space="preserve"> PAGEREF _Toc241873298 \h </w:instrText>
             </w:r>
             <w:r>
               <w:rPr>
@@ -1075,7 +1141,7 @@
               <w:rPr>
                 <w:noProof/>
               </w:rPr>
-              <w:t>9</w:t>
+              <w:t>10</w:t>
             </w:r>
             <w:r>
               <w:rPr>
@@ -1100,7 +1166,7 @@
               <w14:ligatures w14:val="standardContextual"/>
             </w:rPr>
           </w:pPr>
-          <w:hyperlink w:anchor="_Toc241868657" w:history="1">
+          <w:hyperlink w:anchor="_Toc241873299" w:history="1">
             <w:r>
               <w:rPr>
                 <w:rStyle w:val="Hyperlink"/>
@@ -1124,7 +1190,7 @@
               <w:rPr>
                 <w:noProof/>
               </w:rPr>
-              <w:instrText xml:space="preserve"> PAGEREF _Toc241868657 \h </w:instrText>
+              <w:instrText xml:space="preserve"> PAGEREF _Toc241873299 \h </w:instrText>
             </w:r>
             <w:r>
               <w:rPr>
@@ -1141,7 +1207,7 @@
               <w:rPr>
                 <w:noProof/>
               </w:rPr>
-              <w:t>10</w:t>
+              <w:t>11</w:t>
             </w:r>
             <w:r>
               <w:rPr>
@@ -1166,7 +1232,7 @@
               <w14:ligatures w14:val="standardContextual"/>
             </w:rPr>
           </w:pPr>
-          <w:hyperlink w:anchor="_Toc241868658" w:history="1">
+          <w:hyperlink w:anchor="_Toc241873300" w:history="1">
             <w:r>
               <w:rPr>
                 <w:rStyle w:val="Hyperlink"/>
@@ -1190,7 +1256,7 @@
               <w:rPr>
                 <w:noProof/>
               </w:rPr>
-              <w:instrText xml:space="preserve"> PAGEREF _Toc241868658 \h </w:instrText>
+              <w:instrText xml:space="preserve"> PAGEREF _Toc241873300 \h </w:instrText>
             </w:r>
             <w:r>
               <w:rPr>
@@ -1207,7 +1273,7 @@
               <w:rPr>
                 <w:noProof/>
               </w:rPr>
-              <w:t>10</w:t>
+              <w:t>11</w:t>
             </w:r>
             <w:r>
               <w:rPr>
@@ -1232,7 +1298,7 @@
               <w14:ligatures w14:val="standardContextual"/>
             </w:rPr>
           </w:pPr>
-          <w:hyperlink w:anchor="_Toc241868659" w:history="1">
+          <w:hyperlink w:anchor="_Toc241873301" w:history="1">
             <w:r>
               <w:rPr>
                 <w:rStyle w:val="Hyperlink"/>
@@ -1256,7 +1322,7 @@
               <w:rPr>
                 <w:noProof/>
               </w:rPr>
-              <w:instrText xml:space="preserve"> PAGEREF _Toc241868659 \h </w:instrText>
+              <w:instrText xml:space="preserve"> PAGEREF _Toc241873301 \h </w:instrText>
             </w:r>
             <w:r>
               <w:rPr>
@@ -1273,7 +1339,7 @@
               <w:rPr>
                 <w:noProof/>
               </w:rPr>
-              <w:t>11</w:t>
+              <w:t>12</w:t>
             </w:r>
             <w:r>
               <w:rPr>
@@ -1298,7 +1364,7 @@
               <w14:ligatures w14:val="standardContextual"/>
             </w:rPr>
           </w:pPr>
-          <w:hyperlink w:anchor="_Toc241868660" w:history="1">
+          <w:hyperlink w:anchor="_Toc241873302" w:history="1">
             <w:r>
               <w:rPr>
                 <w:rStyle w:val="Hyperlink"/>
@@ -1322,7 +1388,7 @@
               <w:rPr>
                 <w:noProof/>
               </w:rPr>
-              <w:instrText xml:space="preserve"> PAGEREF _Toc241868660 \h </w:instrText>
+              <w:instrText xml:space="preserve"> PAGEREF _Toc241873302 \h </w:instrText>
             </w:r>
             <w:r>
               <w:rPr>
@@ -1339,7 +1405,7 @@
               <w:rPr>
                 <w:noProof/>
               </w:rPr>
-              <w:t>12</w:t>
+              <w:t>13</w:t>
             </w:r>
             <w:r>
               <w:rPr>
@@ -1364,7 +1430,7 @@
               <w14:ligatures w14:val="standardContextual"/>
             </w:rPr>
           </w:pPr>
-          <w:hyperlink w:anchor="_Toc241868661" w:history="1">
+          <w:hyperlink w:anchor="_Toc241873303" w:history="1">
             <w:r>
               <w:rPr>
                 <w:rStyle w:val="Hyperlink"/>
@@ -1388,7 +1454,7 @@
               <w:rPr>
                 <w:noProof/>
               </w:rPr>
-              <w:instrText xml:space="preserve"> PAGEREF _Toc241868661 \h </w:instrText>
+              <w:instrText xml:space="preserve"> PAGEREF _Toc241873303 \h </w:instrText>
             </w:r>
             <w:r>
               <w:rPr>
@@ -1405,7 +1471,7 @@
               <w:rPr>
                 <w:noProof/>
               </w:rPr>
-              <w:t>13</w:t>
+              <w:t>14</w:t>
             </w:r>
             <w:r>
               <w:rPr>
@@ -1430,7 +1496,7 @@
               <w14:ligatures w14:val="standardContextual"/>
             </w:rPr>
           </w:pPr>
-          <w:hyperlink w:anchor="_Toc241868662" w:history="1">
+          <w:hyperlink w:anchor="_Toc241873304" w:history="1">
             <w:r>
               <w:rPr>
                 <w:rStyle w:val="Hyperlink"/>
@@ -1454,7 +1520,7 @@
               <w:rPr>
                 <w:noProof/>
               </w:rPr>
-              <w:instrText xml:space="preserve"> PAGEREF _Toc241868662 \h </w:instrText>
+              <w:instrText xml:space="preserve"> PAGEREF _Toc241873304 \h </w:instrText>
             </w:r>
             <w:r>
               <w:rPr>
@@ -1471,7 +1537,7 @@
               <w:rPr>
                 <w:noProof/>
               </w:rPr>
-              <w:t>13</w:t>
+              <w:t>14</w:t>
             </w:r>
             <w:r>
               <w:rPr>
@@ -1496,7 +1562,7 @@
               <w14:ligatures w14:val="standardContextual"/>
             </w:rPr>
           </w:pPr>
-          <w:hyperlink w:anchor="_Toc241868663" w:history="1">
+          <w:hyperlink w:anchor="_Toc241873305" w:history="1">
             <w:r>
               <w:rPr>
                 <w:rStyle w:val="Hyperlink"/>
@@ -1520,7 +1586,7 @@
               <w:rPr>
                 <w:noProof/>
               </w:rPr>
-              <w:instrText xml:space="preserve"> PAGEREF _Toc241868663 \h </w:instrText>
+              <w:instrText xml:space="preserve"> PAGEREF _Toc241873305 \h </w:instrText>
             </w:r>
             <w:r>
               <w:rPr>
@@ -1537,7 +1603,7 @@
               <w:rPr>
                 <w:noProof/>
               </w:rPr>
-              <w:t>14</w:t>
+              <w:t>15</w:t>
             </w:r>
             <w:r>
               <w:rPr>
@@ -1562,7 +1628,7 @@
               <w14:ligatures w14:val="standardContextual"/>
             </w:rPr>
           </w:pPr>
-          <w:hyperlink w:anchor="_Toc241868664" w:history="1">
+          <w:hyperlink w:anchor="_Toc241873306" w:history="1">
             <w:r>
               <w:rPr>
                 <w:rStyle w:val="Hyperlink"/>
@@ -1586,7 +1652,7 @@
               <w:rPr>
                 <w:noProof/>
               </w:rPr>
-              <w:instrText xml:space="preserve"> PAGEREF _Toc241868664 \h </w:instrText>
+              <w:instrText xml:space="preserve"> PAGEREF _Toc241873306 \h </w:instrText>
             </w:r>
             <w:r>
               <w:rPr>
@@ -1603,7 +1669,7 @@
               <w:rPr>
                 <w:noProof/>
               </w:rPr>
-              <w:t>15</w:t>
+              <w:t>16</w:t>
             </w:r>
             <w:r>
               <w:rPr>
@@ -1631,7 +1697,7 @@
         <w:keepNext/>
         <w:keepLines/>
       </w:pPr>
-      <w:bookmarkStart w:id="0" w:name="_Toc241868642"/>
+      <w:bookmarkStart w:id="0" w:name="_Toc241873283"/>
       <w:r>
         <w:t>1. Executive summary</w:t>
       </w:r>
@@ -1785,7 +1851,7 @@
         <w:t>A stronger text baseline changes the accuracy picture.</w:t>
       </w:r>
       <w:r>
-        <w:t xml:space="preserve"> A filtered text prompt that lists only the abnormal beats (normal beats given as a count) is 11–17 points more accurate than the adapter at 5–50 events, raises no false alarms and is equally fast. It costs 5–19% more prompt tokens, and its length grows by about 68 tokens per abnormal beat. Against the best text prompt, the adapter's case therefore rests on a cost that does not depend on the number of abnormal beats and on carrying information about every beat, not on accuracy.</w:t>
+        <w:t xml:space="preserve"> A filtered text prompt that lists only the abnormal beats (normal beats given as a count) is 11–17 points more accurate than the adapter at 5–50 events, raises no false alarms and is equally fast for a single request. It costs 5–19% more prompt tokens, and its length grows by about 68 tokens per abnormal beat. Against the best text prompt, the adapter's case therefore rests on a cost that does not depend on the number of abnormal beats and on carrying information about every beat, not on accuracy.</w:t>
       </w:r>
     </w:p>
     <w:p>
@@ -1822,6 +1888,26 @@
           <w:b/>
           <w:bCs/>
         </w:rPr>
+        <w:t>Under realistic serving the adapter is the most efficient interface, including against filtered text.</w:t>
+      </w:r>
+      <w:r>
+        <w:t xml:space="preserve"> With requests batched, it serves 10–30% more decisions per second than filtered text at 12–28% less energy per decision, and it fits every batch size tested on a 12 GB GPU; text listing every event cannot be batched at 50 events, and filtered text fits only some batches of 8 because its length depends on the content.</w:t>
+      </w:r>
+    </w:p>
+    <w:p>
+      <w:pPr>
+        <w:pStyle w:val="ListParagraph"/>
+        <w:numPr>
+          <w:ilvl w:val="0"/>
+          <w:numId w:val="2"/>
+        </w:numPr>
+        <w:spacing w:after="60"/>
+      </w:pPr>
+      <w:r>
+        <w:rPr>
+          <w:b/>
+          <w:bCs/>
+        </w:rPr>
         <w:t>Remaining weaknesses:</w:t>
       </w:r>
       <w:r>
@@ -1834,7 +1920,7 @@
         <w:keepNext/>
         <w:keepLines/>
       </w:pPr>
-      <w:bookmarkStart w:id="1" w:name="_Toc241868643"/>
+      <w:bookmarkStart w:id="1" w:name="_Toc241873284"/>
       <w:r>
         <w:t>2. Starting point: the dissertation</w:t>
       </w:r>
@@ -1863,7 +1949,7 @@
           <w:left w:w="10" w:type="dxa"/>
           <w:right w:w="10" w:type="dxa"/>
         </w:tblCellMar>
-        <w:tblLook w:val="0000" w:firstRow="0" w:lastRow="0" w:firstColumn="0" w:lastColumn="0" w:noHBand="0" w:noVBand="0"/>
+        <w:tblLook w:val="04A0" w:firstRow="1" w:lastRow="0" w:firstColumn="1" w:lastColumn="0" w:noHBand="0" w:noVBand="1"/>
       </w:tblPr>
       <w:tblGrid>
         <w:gridCol w:w="3400"/>
@@ -2415,7 +2501,7 @@
         <w:keepNext/>
         <w:keepLines/>
       </w:pPr>
-      <w:bookmarkStart w:id="2" w:name="_Toc241868644"/>
+      <w:bookmarkStart w:id="2" w:name="_Toc241873285"/>
       <w:r>
         <w:t>3. How Phase 1 was run</w:t>
       </w:r>
@@ -2527,7 +2613,7 @@
         <w:keepNext/>
         <w:keepLines/>
       </w:pPr>
-      <w:bookmarkStart w:id="3" w:name="_Toc241868645"/>
+      <w:bookmarkStart w:id="3" w:name="_Toc241873286"/>
       <w:r>
         <w:t>4. Weaknesses in the original evaluation and how Phase 1 addressed them</w:t>
       </w:r>
@@ -2556,7 +2642,7 @@
           <w:left w:w="10" w:type="dxa"/>
           <w:right w:w="10" w:type="dxa"/>
         </w:tblCellMar>
-        <w:tblLook w:val="0000" w:firstRow="0" w:lastRow="0" w:firstColumn="0" w:lastColumn="0" w:noHBand="0" w:noVBand="0"/>
+        <w:tblLook w:val="04A0" w:firstRow="1" w:lastRow="0" w:firstColumn="1" w:lastColumn="0" w:noHBand="0" w:noVBand="1"/>
       </w:tblPr>
       <w:tblGrid>
         <w:gridCol w:w="1900"/>
@@ -3393,7 +3479,7 @@
         <w:keepNext/>
         <w:keepLines/>
       </w:pPr>
-      <w:bookmarkStart w:id="4" w:name="_Toc241868646"/>
+      <w:bookmarkStart w:id="4" w:name="_Toc241873287"/>
       <w:r>
         <w:t>5. What changed in the system</w:t>
       </w:r>
@@ -3410,7 +3496,7 @@
           <w:noProof/>
         </w:rPr>
         <w:drawing>
-          <wp:inline distT="0" distB="0" distL="0" distR="0" wp14:anchorId="36C015AE" wp14:editId="020C9459">
+          <wp:inline distT="0" distB="0" distL="0" distR="0" wp14:anchorId="0CBAA114" wp14:editId="6EC22D91">
             <wp:extent cx="5762625" cy="2524125"/>
             <wp:effectExtent l="0" t="0" r="0" b="0"/>
             <wp:docPr id="1" name="fig1_pipeline.png" descr="Figure 1. Pipeline before (single event) and after Phase 1 (multi-event). The highlighted block is the component trained in this work." title="fig1_pipeline.png"/>
@@ -3470,7 +3556,7 @@
         <w:keepNext/>
         <w:keepLines/>
       </w:pPr>
-      <w:bookmarkStart w:id="5" w:name="_Toc241868647"/>
+      <w:bookmarkStart w:id="5" w:name="_Toc241873288"/>
       <w:r>
         <w:t>5.1 Perception: RR-timing branch</w:t>
       </w:r>
@@ -3499,7 +3585,7 @@
           <w:left w:w="10" w:type="dxa"/>
           <w:right w:w="10" w:type="dxa"/>
         </w:tblCellMar>
-        <w:tblLook w:val="0000" w:firstRow="0" w:lastRow="0" w:firstColumn="0" w:lastColumn="0" w:noHBand="0" w:noVBand="0"/>
+        <w:tblLook w:val="04A0" w:firstRow="1" w:lastRow="0" w:firstColumn="1" w:lastColumn="0" w:noHBand="0" w:noVBand="1"/>
       </w:tblPr>
       <w:tblGrid>
         <w:gridCol w:w="2500"/>
@@ -4328,7 +4414,7 @@
         <w:keepNext/>
         <w:keepLines/>
       </w:pPr>
-      <w:bookmarkStart w:id="6" w:name="_Toc241868648"/>
+      <w:bookmarkStart w:id="6" w:name="_Toc241873289"/>
       <w:r>
         <w:t>5.2 Multi-event adapter</w:t>
       </w:r>
@@ -4392,7 +4478,7 @@
         <w:keepNext/>
         <w:keepLines/>
       </w:pPr>
-      <w:bookmarkStart w:id="7" w:name="_Toc241868649"/>
+      <w:bookmarkStart w:id="7" w:name="_Toc241873290"/>
       <w:r>
         <w:t>5.3 Recipe r4: hard negatives and side inputs (final)</w:t>
       </w:r>
@@ -4490,7 +4576,7 @@
           <w:noProof/>
         </w:rPr>
         <w:drawing>
-          <wp:inline distT="0" distB="0" distL="0" distR="0" wp14:anchorId="37A3CF88" wp14:editId="225D6CE7">
+          <wp:inline distT="0" distB="0" distL="0" distR="0" wp14:anchorId="2A5B0173" wp14:editId="0053504E">
             <wp:extent cx="5762625" cy="2657475"/>
             <wp:effectExtent l="0" t="0" r="0" b="0"/>
             <wp:docPr id="2" name="fig7_training_r4.png" descr="Figure 2. Validation balanced accuracy during training, recipe r4, three seeds. The best checkpoint per seed is selected on validation only; seed 303 was still improving when it reached the 3-epoch cap and was evaluated as pre-registered." title="fig7_training_r4.png"/>
@@ -4550,7 +4636,7 @@
         <w:keepNext/>
         <w:keepLines/>
       </w:pPr>
-      <w:bookmarkStart w:id="8" w:name="_Toc241868650"/>
+      <w:bookmarkStart w:id="8" w:name="_Toc241873291"/>
       <w:r>
         <w:t>5.4 Schema-constrained decoding</w:t>
       </w:r>
@@ -4570,7 +4656,7 @@
         <w:keepNext/>
         <w:keepLines/>
       </w:pPr>
-      <w:bookmarkStart w:id="9" w:name="_Toc241868651"/>
+      <w:bookmarkStart w:id="9" w:name="_Toc241873292"/>
       <w:r>
         <w:t>6. Efficiency results</w:t>
       </w:r>
@@ -4587,7 +4673,7 @@
           <w:noProof/>
         </w:rPr>
         <w:drawing>
-          <wp:inline distT="0" distB="0" distL="0" distR="0" wp14:anchorId="752791E3" wp14:editId="0A14A59B">
+          <wp:inline distT="0" distB="0" distL="0" distR="0" wp14:anchorId="173C644E" wp14:editId="02E0BF03">
             <wp:extent cx="5762625" cy="1962150"/>
             <wp:effectExtent l="0" t="0" r="0" b="0"/>
             <wp:docPr id="3" name="fig2_latency.png" descr="Figure 3. Median latency per request (batch 1, 21 DS2 windows per N). Left: time to first token. Right: time until the urgency tier is generated (token 7 of the constrained answer)." title="fig2_latency.png"/>
@@ -4656,7 +4742,7 @@
           <w:left w:w="10" w:type="dxa"/>
           <w:right w:w="10" w:type="dxa"/>
         </w:tblCellMar>
-        <w:tblLook w:val="0000" w:firstRow="0" w:lastRow="0" w:firstColumn="0" w:lastColumn="0" w:noHBand="0" w:noVBand="0"/>
+        <w:tblLook w:val="04A0" w:firstRow="1" w:lastRow="0" w:firstColumn="1" w:lastColumn="0" w:noHBand="0" w:noVBand="1"/>
       </w:tblPr>
       <w:tblGrid>
         <w:gridCol w:w="1900"/>
@@ -5558,15 +5644,1620 @@
     </w:p>
     <w:p>
       <w:pPr>
+        <w:pStyle w:val="Heading2"/>
+        <w:keepNext/>
+        <w:keepLines/>
+      </w:pPr>
+      <w:bookmarkStart w:id="10" w:name="_Toc241873293"/>
+      <w:r>
+        <w:t>6.1 Serving conditions: batching and prefix caching (Deviation 23)</w:t>
+      </w:r>
+      <w:bookmarkEnd w:id="10"/>
+    </w:p>
+    <w:p>
+      <w:pPr>
+        <w:spacing w:after="120"/>
+      </w:pPr>
+      <w:r>
+        <w:t>The figures above are single requests with nothing reused. A serving system batches requests and reuses the computation for the shared start of the prompt (prefix caching). Both were measured on the same windows (batch sizes 1, 4 and 8; 3 repeats; medians), on the same 12 GB GPU, with the framework capped at 90% of the card's memory so that a batch that does not fit is recorded as such instead of being silently moved into system memory, which would measure paging rather than the model (Deviation 23a).</w:t>
+      </w:r>
+    </w:p>
+    <w:tbl>
+      <w:tblPr>
+        <w:tblW w:w="9026" w:type="dxa"/>
+        <w:tblBorders>
+          <w:top w:val="single" w:sz="4" w:space="0" w:color="auto"/>
+          <w:left w:val="single" w:sz="4" w:space="0" w:color="auto"/>
+          <w:bottom w:val="single" w:sz="4" w:space="0" w:color="auto"/>
+          <w:right w:val="single" w:sz="4" w:space="0" w:color="auto"/>
+          <w:insideH w:val="single" w:sz="4" w:space="0" w:color="auto"/>
+          <w:insideV w:val="single" w:sz="4" w:space="0" w:color="auto"/>
+        </w:tblBorders>
+        <w:tblCellMar>
+          <w:left w:w="10" w:type="dxa"/>
+          <w:right w:w="10" w:type="dxa"/>
+        </w:tblCellMar>
+        <w:tblLook w:val="04A0" w:firstRow="1" w:lastRow="0" w:firstColumn="1" w:lastColumn="0" w:noHBand="0" w:noVBand="1"/>
+      </w:tblPr>
+      <w:tblGrid>
+        <w:gridCol w:w="700"/>
+        <w:gridCol w:w="800"/>
+        <w:gridCol w:w="2200"/>
+        <w:gridCol w:w="2300"/>
+        <w:gridCol w:w="3026"/>
+      </w:tblGrid>
+      <w:tr>
+        <w:tblPrEx>
+          <w:tblCellMar>
+            <w:top w:w="0" w:type="dxa"/>
+            <w:bottom w:w="0" w:type="dxa"/>
+          </w:tblCellMar>
+        </w:tblPrEx>
+        <w:trPr>
+          <w:cantSplit/>
+          <w:tblHeader/>
+        </w:trPr>
+        <w:tc>
+          <w:tcPr>
+            <w:tcW w:w="700" w:type="dxa"/>
+            <w:tcBorders>
+              <w:top w:val="single" w:sz="4" w:space="0" w:color="BFBFBF"/>
+              <w:left w:val="single" w:sz="4" w:space="0" w:color="BFBFBF"/>
+              <w:bottom w:val="single" w:sz="4" w:space="0" w:color="BFBFBF"/>
+              <w:right w:val="single" w:sz="4" w:space="0" w:color="BFBFBF"/>
+            </w:tcBorders>
+            <w:shd w:val="clear" w:color="auto" w:fill="E8EEF7"/>
+            <w:tcMar>
+              <w:top w:w="60" w:type="dxa"/>
+              <w:left w:w="100" w:type="dxa"/>
+              <w:bottom w:w="60" w:type="dxa"/>
+              <w:right w:w="100" w:type="dxa"/>
+            </w:tcMar>
+          </w:tcPr>
+          <w:p>
+            <w:pPr>
+              <w:keepNext/>
+              <w:keepLines/>
+            </w:pPr>
+            <w:r>
+              <w:rPr>
+                <w:b/>
+                <w:bCs/>
+                <w:sz w:val="19"/>
+                <w:szCs w:val="19"/>
+              </w:rPr>
+              <w:t>N</w:t>
+            </w:r>
+          </w:p>
+        </w:tc>
+        <w:tc>
+          <w:tcPr>
+            <w:tcW w:w="800" w:type="dxa"/>
+            <w:tcBorders>
+              <w:top w:val="single" w:sz="4" w:space="0" w:color="BFBFBF"/>
+              <w:left w:val="single" w:sz="4" w:space="0" w:color="BFBFBF"/>
+              <w:bottom w:val="single" w:sz="4" w:space="0" w:color="BFBFBF"/>
+              <w:right w:val="single" w:sz="4" w:space="0" w:color="BFBFBF"/>
+            </w:tcBorders>
+            <w:shd w:val="clear" w:color="auto" w:fill="E8EEF7"/>
+            <w:tcMar>
+              <w:top w:w="60" w:type="dxa"/>
+              <w:left w:w="100" w:type="dxa"/>
+              <w:bottom w:w="60" w:type="dxa"/>
+              <w:right w:w="100" w:type="dxa"/>
+            </w:tcMar>
+          </w:tcPr>
+          <w:p>
+            <w:pPr>
+              <w:keepNext/>
+              <w:keepLines/>
+            </w:pPr>
+            <w:r>
+              <w:rPr>
+                <w:b/>
+                <w:bCs/>
+                <w:sz w:val="19"/>
+                <w:szCs w:val="19"/>
+              </w:rPr>
+              <w:t>Batch</w:t>
+            </w:r>
+          </w:p>
+        </w:tc>
+        <w:tc>
+          <w:tcPr>
+            <w:tcW w:w="2200" w:type="dxa"/>
+            <w:tcBorders>
+              <w:top w:val="single" w:sz="4" w:space="0" w:color="BFBFBF"/>
+              <w:left w:val="single" w:sz="4" w:space="0" w:color="BFBFBF"/>
+              <w:bottom w:val="single" w:sz="4" w:space="0" w:color="BFBFBF"/>
+              <w:right w:val="single" w:sz="4" w:space="0" w:color="BFBFBF"/>
+            </w:tcBorders>
+            <w:shd w:val="clear" w:color="auto" w:fill="E8EEF7"/>
+            <w:tcMar>
+              <w:top w:w="60" w:type="dxa"/>
+              <w:left w:w="100" w:type="dxa"/>
+              <w:bottom w:w="60" w:type="dxa"/>
+              <w:right w:w="100" w:type="dxa"/>
+            </w:tcMar>
+          </w:tcPr>
+          <w:p>
+            <w:pPr>
+              <w:keepNext/>
+              <w:keepLines/>
+            </w:pPr>
+            <w:r>
+              <w:rPr>
+                <w:b/>
+                <w:bCs/>
+                <w:sz w:val="19"/>
+                <w:szCs w:val="19"/>
+              </w:rPr>
+              <w:t>Adapter</w:t>
+            </w:r>
+          </w:p>
+        </w:tc>
+        <w:tc>
+          <w:tcPr>
+            <w:tcW w:w="2300" w:type="dxa"/>
+            <w:tcBorders>
+              <w:top w:val="single" w:sz="4" w:space="0" w:color="BFBFBF"/>
+              <w:left w:val="single" w:sz="4" w:space="0" w:color="BFBFBF"/>
+              <w:bottom w:val="single" w:sz="4" w:space="0" w:color="BFBFBF"/>
+              <w:right w:val="single" w:sz="4" w:space="0" w:color="BFBFBF"/>
+            </w:tcBorders>
+            <w:shd w:val="clear" w:color="auto" w:fill="E8EEF7"/>
+            <w:tcMar>
+              <w:top w:w="60" w:type="dxa"/>
+              <w:left w:w="100" w:type="dxa"/>
+              <w:bottom w:w="60" w:type="dxa"/>
+              <w:right w:w="100" w:type="dxa"/>
+            </w:tcMar>
+          </w:tcPr>
+          <w:p>
+            <w:pPr>
+              <w:keepNext/>
+              <w:keepLines/>
+            </w:pPr>
+            <w:r>
+              <w:rPr>
+                <w:b/>
+                <w:bCs/>
+                <w:sz w:val="19"/>
+                <w:szCs w:val="19"/>
+              </w:rPr>
+              <w:t>Text, all events</w:t>
+            </w:r>
+          </w:p>
+        </w:tc>
+        <w:tc>
+          <w:tcPr>
+            <w:tcW w:w="3026" w:type="dxa"/>
+            <w:tcBorders>
+              <w:top w:val="single" w:sz="4" w:space="0" w:color="BFBFBF"/>
+              <w:left w:val="single" w:sz="4" w:space="0" w:color="BFBFBF"/>
+              <w:bottom w:val="single" w:sz="4" w:space="0" w:color="BFBFBF"/>
+              <w:right w:val="single" w:sz="4" w:space="0" w:color="BFBFBF"/>
+            </w:tcBorders>
+            <w:shd w:val="clear" w:color="auto" w:fill="E8EEF7"/>
+            <w:tcMar>
+              <w:top w:w="60" w:type="dxa"/>
+              <w:left w:w="100" w:type="dxa"/>
+              <w:bottom w:w="60" w:type="dxa"/>
+              <w:right w:w="100" w:type="dxa"/>
+            </w:tcMar>
+          </w:tcPr>
+          <w:p>
+            <w:pPr>
+              <w:keepNext/>
+              <w:keepLines/>
+            </w:pPr>
+            <w:r>
+              <w:rPr>
+                <w:b/>
+                <w:bCs/>
+                <w:sz w:val="19"/>
+                <w:szCs w:val="19"/>
+              </w:rPr>
+              <w:t>Filtered text</w:t>
+            </w:r>
+          </w:p>
+        </w:tc>
+      </w:tr>
+      <w:tr>
+        <w:tblPrEx>
+          <w:tblCellMar>
+            <w:top w:w="0" w:type="dxa"/>
+            <w:bottom w:w="0" w:type="dxa"/>
+          </w:tblCellMar>
+        </w:tblPrEx>
+        <w:trPr>
+          <w:cantSplit/>
+        </w:trPr>
+        <w:tc>
+          <w:tcPr>
+            <w:tcW w:w="700" w:type="dxa"/>
+            <w:tcBorders>
+              <w:top w:val="single" w:sz="4" w:space="0" w:color="BFBFBF"/>
+              <w:left w:val="single" w:sz="4" w:space="0" w:color="BFBFBF"/>
+              <w:bottom w:val="single" w:sz="4" w:space="0" w:color="BFBFBF"/>
+              <w:right w:val="single" w:sz="4" w:space="0" w:color="BFBFBF"/>
+            </w:tcBorders>
+            <w:tcMar>
+              <w:top w:w="60" w:type="dxa"/>
+              <w:left w:w="100" w:type="dxa"/>
+              <w:bottom w:w="60" w:type="dxa"/>
+              <w:right w:w="100" w:type="dxa"/>
+            </w:tcMar>
+          </w:tcPr>
+          <w:p>
+            <w:pPr>
+              <w:keepNext/>
+              <w:keepLines/>
+            </w:pPr>
+            <w:r>
+              <w:rPr>
+                <w:sz w:val="19"/>
+                <w:szCs w:val="19"/>
+              </w:rPr>
+              <w:t>10</w:t>
+            </w:r>
+          </w:p>
+        </w:tc>
+        <w:tc>
+          <w:tcPr>
+            <w:tcW w:w="800" w:type="dxa"/>
+            <w:tcBorders>
+              <w:top w:val="single" w:sz="4" w:space="0" w:color="BFBFBF"/>
+              <w:left w:val="single" w:sz="4" w:space="0" w:color="BFBFBF"/>
+              <w:bottom w:val="single" w:sz="4" w:space="0" w:color="BFBFBF"/>
+              <w:right w:val="single" w:sz="4" w:space="0" w:color="BFBFBF"/>
+            </w:tcBorders>
+            <w:tcMar>
+              <w:top w:w="60" w:type="dxa"/>
+              <w:left w:w="100" w:type="dxa"/>
+              <w:bottom w:w="60" w:type="dxa"/>
+              <w:right w:w="100" w:type="dxa"/>
+            </w:tcMar>
+          </w:tcPr>
+          <w:p>
+            <w:pPr>
+              <w:keepNext/>
+              <w:keepLines/>
+            </w:pPr>
+            <w:r>
+              <w:rPr>
+                <w:sz w:val="19"/>
+                <w:szCs w:val="19"/>
+              </w:rPr>
+              <w:t>1</w:t>
+            </w:r>
+          </w:p>
+        </w:tc>
+        <w:tc>
+          <w:tcPr>
+            <w:tcW w:w="2200" w:type="dxa"/>
+            <w:tcBorders>
+              <w:top w:val="single" w:sz="4" w:space="0" w:color="BFBFBF"/>
+              <w:left w:val="single" w:sz="4" w:space="0" w:color="BFBFBF"/>
+              <w:bottom w:val="single" w:sz="4" w:space="0" w:color="BFBFBF"/>
+              <w:right w:val="single" w:sz="4" w:space="0" w:color="BFBFBF"/>
+            </w:tcBorders>
+            <w:tcMar>
+              <w:top w:w="60" w:type="dxa"/>
+              <w:left w:w="100" w:type="dxa"/>
+              <w:bottom w:w="60" w:type="dxa"/>
+              <w:right w:w="100" w:type="dxa"/>
+            </w:tcMar>
+          </w:tcPr>
+          <w:p>
+            <w:pPr>
+              <w:keepNext/>
+              <w:keepLines/>
+            </w:pPr>
+            <w:r>
+              <w:rPr>
+                <w:sz w:val="19"/>
+                <w:szCs w:val="19"/>
+              </w:rPr>
+              <w:t>0.98 /s · 83 J</w:t>
+            </w:r>
+          </w:p>
+        </w:tc>
+        <w:tc>
+          <w:tcPr>
+            <w:tcW w:w="2300" w:type="dxa"/>
+            <w:tcBorders>
+              <w:top w:val="single" w:sz="4" w:space="0" w:color="BFBFBF"/>
+              <w:left w:val="single" w:sz="4" w:space="0" w:color="BFBFBF"/>
+              <w:bottom w:val="single" w:sz="4" w:space="0" w:color="BFBFBF"/>
+              <w:right w:val="single" w:sz="4" w:space="0" w:color="BFBFBF"/>
+            </w:tcBorders>
+            <w:tcMar>
+              <w:top w:w="60" w:type="dxa"/>
+              <w:left w:w="100" w:type="dxa"/>
+              <w:bottom w:w="60" w:type="dxa"/>
+              <w:right w:w="100" w:type="dxa"/>
+            </w:tcMar>
+          </w:tcPr>
+          <w:p>
+            <w:pPr>
+              <w:keepNext/>
+              <w:keepLines/>
+            </w:pPr>
+            <w:r>
+              <w:rPr>
+                <w:sz w:val="19"/>
+                <w:szCs w:val="19"/>
+              </w:rPr>
+              <w:t>0.92 /s · 111 J</w:t>
+            </w:r>
+          </w:p>
+        </w:tc>
+        <w:tc>
+          <w:tcPr>
+            <w:tcW w:w="3026" w:type="dxa"/>
+            <w:tcBorders>
+              <w:top w:val="single" w:sz="4" w:space="0" w:color="BFBFBF"/>
+              <w:left w:val="single" w:sz="4" w:space="0" w:color="BFBFBF"/>
+              <w:bottom w:val="single" w:sz="4" w:space="0" w:color="BFBFBF"/>
+              <w:right w:val="single" w:sz="4" w:space="0" w:color="BFBFBF"/>
+            </w:tcBorders>
+            <w:tcMar>
+              <w:top w:w="60" w:type="dxa"/>
+              <w:left w:w="100" w:type="dxa"/>
+              <w:bottom w:w="60" w:type="dxa"/>
+              <w:right w:w="100" w:type="dxa"/>
+            </w:tcMar>
+          </w:tcPr>
+          <w:p>
+            <w:pPr>
+              <w:keepNext/>
+              <w:keepLines/>
+            </w:pPr>
+            <w:r>
+              <w:rPr>
+                <w:sz w:val="19"/>
+                <w:szCs w:val="19"/>
+              </w:rPr>
+              <w:t>0.97 /s · 95 J</w:t>
+            </w:r>
+          </w:p>
+        </w:tc>
+      </w:tr>
+      <w:tr>
+        <w:tblPrEx>
+          <w:tblCellMar>
+            <w:top w:w="0" w:type="dxa"/>
+            <w:bottom w:w="0" w:type="dxa"/>
+          </w:tblCellMar>
+        </w:tblPrEx>
+        <w:trPr>
+          <w:cantSplit/>
+        </w:trPr>
+        <w:tc>
+          <w:tcPr>
+            <w:tcW w:w="700" w:type="dxa"/>
+            <w:tcBorders>
+              <w:top w:val="single" w:sz="4" w:space="0" w:color="BFBFBF"/>
+              <w:left w:val="single" w:sz="4" w:space="0" w:color="BFBFBF"/>
+              <w:bottom w:val="single" w:sz="4" w:space="0" w:color="BFBFBF"/>
+              <w:right w:val="single" w:sz="4" w:space="0" w:color="BFBFBF"/>
+            </w:tcBorders>
+            <w:tcMar>
+              <w:top w:w="60" w:type="dxa"/>
+              <w:left w:w="100" w:type="dxa"/>
+              <w:bottom w:w="60" w:type="dxa"/>
+              <w:right w:w="100" w:type="dxa"/>
+            </w:tcMar>
+          </w:tcPr>
+          <w:p>
+            <w:pPr>
+              <w:keepNext/>
+              <w:keepLines/>
+            </w:pPr>
+            <w:r>
+              <w:rPr>
+                <w:sz w:val="19"/>
+                <w:szCs w:val="19"/>
+              </w:rPr>
+              <w:t>10</w:t>
+            </w:r>
+          </w:p>
+        </w:tc>
+        <w:tc>
+          <w:tcPr>
+            <w:tcW w:w="800" w:type="dxa"/>
+            <w:tcBorders>
+              <w:top w:val="single" w:sz="4" w:space="0" w:color="BFBFBF"/>
+              <w:left w:val="single" w:sz="4" w:space="0" w:color="BFBFBF"/>
+              <w:bottom w:val="single" w:sz="4" w:space="0" w:color="BFBFBF"/>
+              <w:right w:val="single" w:sz="4" w:space="0" w:color="BFBFBF"/>
+            </w:tcBorders>
+            <w:tcMar>
+              <w:top w:w="60" w:type="dxa"/>
+              <w:left w:w="100" w:type="dxa"/>
+              <w:bottom w:w="60" w:type="dxa"/>
+              <w:right w:w="100" w:type="dxa"/>
+            </w:tcMar>
+          </w:tcPr>
+          <w:p>
+            <w:pPr>
+              <w:keepNext/>
+              <w:keepLines/>
+            </w:pPr>
+            <w:r>
+              <w:rPr>
+                <w:sz w:val="19"/>
+                <w:szCs w:val="19"/>
+              </w:rPr>
+              <w:t>4</w:t>
+            </w:r>
+          </w:p>
+        </w:tc>
+        <w:tc>
+          <w:tcPr>
+            <w:tcW w:w="2200" w:type="dxa"/>
+            <w:tcBorders>
+              <w:top w:val="single" w:sz="4" w:space="0" w:color="BFBFBF"/>
+              <w:left w:val="single" w:sz="4" w:space="0" w:color="BFBFBF"/>
+              <w:bottom w:val="single" w:sz="4" w:space="0" w:color="BFBFBF"/>
+              <w:right w:val="single" w:sz="4" w:space="0" w:color="BFBFBF"/>
+            </w:tcBorders>
+            <w:tcMar>
+              <w:top w:w="60" w:type="dxa"/>
+              <w:left w:w="100" w:type="dxa"/>
+              <w:bottom w:w="60" w:type="dxa"/>
+              <w:right w:w="100" w:type="dxa"/>
+            </w:tcMar>
+          </w:tcPr>
+          <w:p>
+            <w:pPr>
+              <w:keepNext/>
+              <w:keepLines/>
+            </w:pPr>
+            <w:r>
+              <w:rPr>
+                <w:sz w:val="19"/>
+                <w:szCs w:val="19"/>
+              </w:rPr>
+              <w:t>3.19 /s · 39 J</w:t>
+            </w:r>
+          </w:p>
+        </w:tc>
+        <w:tc>
+          <w:tcPr>
+            <w:tcW w:w="2300" w:type="dxa"/>
+            <w:tcBorders>
+              <w:top w:val="single" w:sz="4" w:space="0" w:color="BFBFBF"/>
+              <w:left w:val="single" w:sz="4" w:space="0" w:color="BFBFBF"/>
+              <w:bottom w:val="single" w:sz="4" w:space="0" w:color="BFBFBF"/>
+              <w:right w:val="single" w:sz="4" w:space="0" w:color="BFBFBF"/>
+            </w:tcBorders>
+            <w:tcMar>
+              <w:top w:w="60" w:type="dxa"/>
+              <w:left w:w="100" w:type="dxa"/>
+              <w:bottom w:w="60" w:type="dxa"/>
+              <w:right w:w="100" w:type="dxa"/>
+            </w:tcMar>
+          </w:tcPr>
+          <w:p>
+            <w:pPr>
+              <w:keepNext/>
+              <w:keepLines/>
+            </w:pPr>
+            <w:r>
+              <w:rPr>
+                <w:sz w:val="19"/>
+                <w:szCs w:val="19"/>
+              </w:rPr>
+              <w:t>2.23 /s · 65 J</w:t>
+            </w:r>
+          </w:p>
+        </w:tc>
+        <w:tc>
+          <w:tcPr>
+            <w:tcW w:w="3026" w:type="dxa"/>
+            <w:tcBorders>
+              <w:top w:val="single" w:sz="4" w:space="0" w:color="BFBFBF"/>
+              <w:left w:val="single" w:sz="4" w:space="0" w:color="BFBFBF"/>
+              <w:bottom w:val="single" w:sz="4" w:space="0" w:color="BFBFBF"/>
+              <w:right w:val="single" w:sz="4" w:space="0" w:color="BFBFBF"/>
+            </w:tcBorders>
+            <w:tcMar>
+              <w:top w:w="60" w:type="dxa"/>
+              <w:left w:w="100" w:type="dxa"/>
+              <w:bottom w:w="60" w:type="dxa"/>
+              <w:right w:w="100" w:type="dxa"/>
+            </w:tcMar>
+          </w:tcPr>
+          <w:p>
+            <w:pPr>
+              <w:keepNext/>
+              <w:keepLines/>
+            </w:pPr>
+            <w:r>
+              <w:rPr>
+                <w:sz w:val="19"/>
+                <w:szCs w:val="19"/>
+              </w:rPr>
+              <w:t>2.80 /s · 49 J</w:t>
+            </w:r>
+          </w:p>
+        </w:tc>
+      </w:tr>
+      <w:tr>
+        <w:tblPrEx>
+          <w:tblCellMar>
+            <w:top w:w="0" w:type="dxa"/>
+            <w:bottom w:w="0" w:type="dxa"/>
+          </w:tblCellMar>
+        </w:tblPrEx>
+        <w:trPr>
+          <w:cantSplit/>
+        </w:trPr>
+        <w:tc>
+          <w:tcPr>
+            <w:tcW w:w="700" w:type="dxa"/>
+            <w:tcBorders>
+              <w:top w:val="single" w:sz="4" w:space="0" w:color="BFBFBF"/>
+              <w:left w:val="single" w:sz="4" w:space="0" w:color="BFBFBF"/>
+              <w:bottom w:val="single" w:sz="4" w:space="0" w:color="BFBFBF"/>
+              <w:right w:val="single" w:sz="4" w:space="0" w:color="BFBFBF"/>
+            </w:tcBorders>
+            <w:tcMar>
+              <w:top w:w="60" w:type="dxa"/>
+              <w:left w:w="100" w:type="dxa"/>
+              <w:bottom w:w="60" w:type="dxa"/>
+              <w:right w:w="100" w:type="dxa"/>
+            </w:tcMar>
+          </w:tcPr>
+          <w:p>
+            <w:pPr>
+              <w:keepNext/>
+              <w:keepLines/>
+            </w:pPr>
+            <w:r>
+              <w:rPr>
+                <w:sz w:val="19"/>
+                <w:szCs w:val="19"/>
+              </w:rPr>
+              <w:t>10</w:t>
+            </w:r>
+          </w:p>
+        </w:tc>
+        <w:tc>
+          <w:tcPr>
+            <w:tcW w:w="800" w:type="dxa"/>
+            <w:tcBorders>
+              <w:top w:val="single" w:sz="4" w:space="0" w:color="BFBFBF"/>
+              <w:left w:val="single" w:sz="4" w:space="0" w:color="BFBFBF"/>
+              <w:bottom w:val="single" w:sz="4" w:space="0" w:color="BFBFBF"/>
+              <w:right w:val="single" w:sz="4" w:space="0" w:color="BFBFBF"/>
+            </w:tcBorders>
+            <w:tcMar>
+              <w:top w:w="60" w:type="dxa"/>
+              <w:left w:w="100" w:type="dxa"/>
+              <w:bottom w:w="60" w:type="dxa"/>
+              <w:right w:w="100" w:type="dxa"/>
+            </w:tcMar>
+          </w:tcPr>
+          <w:p>
+            <w:pPr>
+              <w:keepNext/>
+              <w:keepLines/>
+            </w:pPr>
+            <w:r>
+              <w:rPr>
+                <w:sz w:val="19"/>
+                <w:szCs w:val="19"/>
+              </w:rPr>
+              <w:t>8</w:t>
+            </w:r>
+          </w:p>
+        </w:tc>
+        <w:tc>
+          <w:tcPr>
+            <w:tcW w:w="2200" w:type="dxa"/>
+            <w:tcBorders>
+              <w:top w:val="single" w:sz="4" w:space="0" w:color="BFBFBF"/>
+              <w:left w:val="single" w:sz="4" w:space="0" w:color="BFBFBF"/>
+              <w:bottom w:val="single" w:sz="4" w:space="0" w:color="BFBFBF"/>
+              <w:right w:val="single" w:sz="4" w:space="0" w:color="BFBFBF"/>
+            </w:tcBorders>
+            <w:tcMar>
+              <w:top w:w="60" w:type="dxa"/>
+              <w:left w:w="100" w:type="dxa"/>
+              <w:bottom w:w="60" w:type="dxa"/>
+              <w:right w:w="100" w:type="dxa"/>
+            </w:tcMar>
+          </w:tcPr>
+          <w:p>
+            <w:pPr>
+              <w:keepNext/>
+              <w:keepLines/>
+            </w:pPr>
+            <w:r>
+              <w:rPr>
+                <w:sz w:val="19"/>
+                <w:szCs w:val="19"/>
+              </w:rPr>
+              <w:t>4.72 /s · 33 J</w:t>
+            </w:r>
+          </w:p>
+        </w:tc>
+        <w:tc>
+          <w:tcPr>
+            <w:tcW w:w="2300" w:type="dxa"/>
+            <w:tcBorders>
+              <w:top w:val="single" w:sz="4" w:space="0" w:color="BFBFBF"/>
+              <w:left w:val="single" w:sz="4" w:space="0" w:color="BFBFBF"/>
+              <w:bottom w:val="single" w:sz="4" w:space="0" w:color="BFBFBF"/>
+              <w:right w:val="single" w:sz="4" w:space="0" w:color="BFBFBF"/>
+            </w:tcBorders>
+            <w:tcMar>
+              <w:top w:w="60" w:type="dxa"/>
+              <w:left w:w="100" w:type="dxa"/>
+              <w:bottom w:w="60" w:type="dxa"/>
+              <w:right w:w="100" w:type="dxa"/>
+            </w:tcMar>
+          </w:tcPr>
+          <w:p>
+            <w:pPr>
+              <w:keepNext/>
+              <w:keepLines/>
+            </w:pPr>
+            <w:r>
+              <w:rPr>
+                <w:sz w:val="19"/>
+                <w:szCs w:val="19"/>
+              </w:rPr>
+              <w:t>does not fit</w:t>
+            </w:r>
+          </w:p>
+        </w:tc>
+        <w:tc>
+          <w:tcPr>
+            <w:tcW w:w="3026" w:type="dxa"/>
+            <w:tcBorders>
+              <w:top w:val="single" w:sz="4" w:space="0" w:color="BFBFBF"/>
+              <w:left w:val="single" w:sz="4" w:space="0" w:color="BFBFBF"/>
+              <w:bottom w:val="single" w:sz="4" w:space="0" w:color="BFBFBF"/>
+              <w:right w:val="single" w:sz="4" w:space="0" w:color="BFBFBF"/>
+            </w:tcBorders>
+            <w:tcMar>
+              <w:top w:w="60" w:type="dxa"/>
+              <w:left w:w="100" w:type="dxa"/>
+              <w:bottom w:w="60" w:type="dxa"/>
+              <w:right w:w="100" w:type="dxa"/>
+            </w:tcMar>
+          </w:tcPr>
+          <w:p>
+            <w:pPr>
+              <w:keepNext/>
+              <w:keepLines/>
+            </w:pPr>
+            <w:r>
+              <w:rPr>
+                <w:sz w:val="19"/>
+                <w:szCs w:val="19"/>
+              </w:rPr>
+              <w:t>3.63 /s · 43 J (3 of 6 batches fit)</w:t>
+            </w:r>
+          </w:p>
+        </w:tc>
+      </w:tr>
+      <w:tr>
+        <w:tblPrEx>
+          <w:tblCellMar>
+            <w:top w:w="0" w:type="dxa"/>
+            <w:bottom w:w="0" w:type="dxa"/>
+          </w:tblCellMar>
+        </w:tblPrEx>
+        <w:trPr>
+          <w:cantSplit/>
+        </w:trPr>
+        <w:tc>
+          <w:tcPr>
+            <w:tcW w:w="700" w:type="dxa"/>
+            <w:tcBorders>
+              <w:top w:val="single" w:sz="4" w:space="0" w:color="BFBFBF"/>
+              <w:left w:val="single" w:sz="4" w:space="0" w:color="BFBFBF"/>
+              <w:bottom w:val="single" w:sz="4" w:space="0" w:color="BFBFBF"/>
+              <w:right w:val="single" w:sz="4" w:space="0" w:color="BFBFBF"/>
+            </w:tcBorders>
+            <w:tcMar>
+              <w:top w:w="60" w:type="dxa"/>
+              <w:left w:w="100" w:type="dxa"/>
+              <w:bottom w:w="60" w:type="dxa"/>
+              <w:right w:w="100" w:type="dxa"/>
+            </w:tcMar>
+          </w:tcPr>
+          <w:p>
+            <w:pPr>
+              <w:keepNext/>
+              <w:keepLines/>
+            </w:pPr>
+            <w:r>
+              <w:rPr>
+                <w:sz w:val="19"/>
+                <w:szCs w:val="19"/>
+              </w:rPr>
+              <w:t>20</w:t>
+            </w:r>
+          </w:p>
+        </w:tc>
+        <w:tc>
+          <w:tcPr>
+            <w:tcW w:w="800" w:type="dxa"/>
+            <w:tcBorders>
+              <w:top w:val="single" w:sz="4" w:space="0" w:color="BFBFBF"/>
+              <w:left w:val="single" w:sz="4" w:space="0" w:color="BFBFBF"/>
+              <w:bottom w:val="single" w:sz="4" w:space="0" w:color="BFBFBF"/>
+              <w:right w:val="single" w:sz="4" w:space="0" w:color="BFBFBF"/>
+            </w:tcBorders>
+            <w:tcMar>
+              <w:top w:w="60" w:type="dxa"/>
+              <w:left w:w="100" w:type="dxa"/>
+              <w:bottom w:w="60" w:type="dxa"/>
+              <w:right w:w="100" w:type="dxa"/>
+            </w:tcMar>
+          </w:tcPr>
+          <w:p>
+            <w:pPr>
+              <w:keepNext/>
+              <w:keepLines/>
+            </w:pPr>
+            <w:r>
+              <w:rPr>
+                <w:sz w:val="19"/>
+                <w:szCs w:val="19"/>
+              </w:rPr>
+              <w:t>4</w:t>
+            </w:r>
+          </w:p>
+        </w:tc>
+        <w:tc>
+          <w:tcPr>
+            <w:tcW w:w="2200" w:type="dxa"/>
+            <w:tcBorders>
+              <w:top w:val="single" w:sz="4" w:space="0" w:color="BFBFBF"/>
+              <w:left w:val="single" w:sz="4" w:space="0" w:color="BFBFBF"/>
+              <w:bottom w:val="single" w:sz="4" w:space="0" w:color="BFBFBF"/>
+              <w:right w:val="single" w:sz="4" w:space="0" w:color="BFBFBF"/>
+            </w:tcBorders>
+            <w:tcMar>
+              <w:top w:w="60" w:type="dxa"/>
+              <w:left w:w="100" w:type="dxa"/>
+              <w:bottom w:w="60" w:type="dxa"/>
+              <w:right w:w="100" w:type="dxa"/>
+            </w:tcMar>
+          </w:tcPr>
+          <w:p>
+            <w:pPr>
+              <w:keepNext/>
+              <w:keepLines/>
+            </w:pPr>
+            <w:r>
+              <w:rPr>
+                <w:sz w:val="19"/>
+                <w:szCs w:val="19"/>
+              </w:rPr>
+              <w:t>3.17 /s · 39 J</w:t>
+            </w:r>
+          </w:p>
+        </w:tc>
+        <w:tc>
+          <w:tcPr>
+            <w:tcW w:w="2300" w:type="dxa"/>
+            <w:tcBorders>
+              <w:top w:val="single" w:sz="4" w:space="0" w:color="BFBFBF"/>
+              <w:left w:val="single" w:sz="4" w:space="0" w:color="BFBFBF"/>
+              <w:bottom w:val="single" w:sz="4" w:space="0" w:color="BFBFBF"/>
+              <w:right w:val="single" w:sz="4" w:space="0" w:color="BFBFBF"/>
+            </w:tcBorders>
+            <w:tcMar>
+              <w:top w:w="60" w:type="dxa"/>
+              <w:left w:w="100" w:type="dxa"/>
+              <w:bottom w:w="60" w:type="dxa"/>
+              <w:right w:w="100" w:type="dxa"/>
+            </w:tcMar>
+          </w:tcPr>
+          <w:p>
+            <w:pPr>
+              <w:keepNext/>
+              <w:keepLines/>
+            </w:pPr>
+            <w:r>
+              <w:rPr>
+                <w:sz w:val="19"/>
+                <w:szCs w:val="19"/>
+              </w:rPr>
+              <w:t>1.70 /s · 92 J</w:t>
+            </w:r>
+          </w:p>
+        </w:tc>
+        <w:tc>
+          <w:tcPr>
+            <w:tcW w:w="3026" w:type="dxa"/>
+            <w:tcBorders>
+              <w:top w:val="single" w:sz="4" w:space="0" w:color="BFBFBF"/>
+              <w:left w:val="single" w:sz="4" w:space="0" w:color="BFBFBF"/>
+              <w:bottom w:val="single" w:sz="4" w:space="0" w:color="BFBFBF"/>
+              <w:right w:val="single" w:sz="4" w:space="0" w:color="BFBFBF"/>
+            </w:tcBorders>
+            <w:tcMar>
+              <w:top w:w="60" w:type="dxa"/>
+              <w:left w:w="100" w:type="dxa"/>
+              <w:bottom w:w="60" w:type="dxa"/>
+              <w:right w:w="100" w:type="dxa"/>
+            </w:tcMar>
+          </w:tcPr>
+          <w:p>
+            <w:pPr>
+              <w:keepNext/>
+              <w:keepLines/>
+            </w:pPr>
+            <w:r>
+              <w:rPr>
+                <w:sz w:val="19"/>
+                <w:szCs w:val="19"/>
+              </w:rPr>
+              <w:t>2.49 /s · 54 J</w:t>
+            </w:r>
+          </w:p>
+        </w:tc>
+      </w:tr>
+      <w:tr>
+        <w:tblPrEx>
+          <w:tblCellMar>
+            <w:top w:w="0" w:type="dxa"/>
+            <w:bottom w:w="0" w:type="dxa"/>
+          </w:tblCellMar>
+        </w:tblPrEx>
+        <w:trPr>
+          <w:cantSplit/>
+        </w:trPr>
+        <w:tc>
+          <w:tcPr>
+            <w:tcW w:w="700" w:type="dxa"/>
+            <w:tcBorders>
+              <w:top w:val="single" w:sz="4" w:space="0" w:color="BFBFBF"/>
+              <w:left w:val="single" w:sz="4" w:space="0" w:color="BFBFBF"/>
+              <w:bottom w:val="single" w:sz="4" w:space="0" w:color="BFBFBF"/>
+              <w:right w:val="single" w:sz="4" w:space="0" w:color="BFBFBF"/>
+            </w:tcBorders>
+            <w:tcMar>
+              <w:top w:w="60" w:type="dxa"/>
+              <w:left w:w="100" w:type="dxa"/>
+              <w:bottom w:w="60" w:type="dxa"/>
+              <w:right w:w="100" w:type="dxa"/>
+            </w:tcMar>
+          </w:tcPr>
+          <w:p>
+            <w:pPr>
+              <w:keepNext/>
+              <w:keepLines/>
+            </w:pPr>
+            <w:r>
+              <w:rPr>
+                <w:sz w:val="19"/>
+                <w:szCs w:val="19"/>
+              </w:rPr>
+              <w:t>20</w:t>
+            </w:r>
+          </w:p>
+        </w:tc>
+        <w:tc>
+          <w:tcPr>
+            <w:tcW w:w="800" w:type="dxa"/>
+            <w:tcBorders>
+              <w:top w:val="single" w:sz="4" w:space="0" w:color="BFBFBF"/>
+              <w:left w:val="single" w:sz="4" w:space="0" w:color="BFBFBF"/>
+              <w:bottom w:val="single" w:sz="4" w:space="0" w:color="BFBFBF"/>
+              <w:right w:val="single" w:sz="4" w:space="0" w:color="BFBFBF"/>
+            </w:tcBorders>
+            <w:tcMar>
+              <w:top w:w="60" w:type="dxa"/>
+              <w:left w:w="100" w:type="dxa"/>
+              <w:bottom w:w="60" w:type="dxa"/>
+              <w:right w:w="100" w:type="dxa"/>
+            </w:tcMar>
+          </w:tcPr>
+          <w:p>
+            <w:pPr>
+              <w:keepNext/>
+              <w:keepLines/>
+            </w:pPr>
+            <w:r>
+              <w:rPr>
+                <w:sz w:val="19"/>
+                <w:szCs w:val="19"/>
+              </w:rPr>
+              <w:t>8</w:t>
+            </w:r>
+          </w:p>
+        </w:tc>
+        <w:tc>
+          <w:tcPr>
+            <w:tcW w:w="2200" w:type="dxa"/>
+            <w:tcBorders>
+              <w:top w:val="single" w:sz="4" w:space="0" w:color="BFBFBF"/>
+              <w:left w:val="single" w:sz="4" w:space="0" w:color="BFBFBF"/>
+              <w:bottom w:val="single" w:sz="4" w:space="0" w:color="BFBFBF"/>
+              <w:right w:val="single" w:sz="4" w:space="0" w:color="BFBFBF"/>
+            </w:tcBorders>
+            <w:tcMar>
+              <w:top w:w="60" w:type="dxa"/>
+              <w:left w:w="100" w:type="dxa"/>
+              <w:bottom w:w="60" w:type="dxa"/>
+              <w:right w:w="100" w:type="dxa"/>
+            </w:tcMar>
+          </w:tcPr>
+          <w:p>
+            <w:pPr>
+              <w:keepNext/>
+              <w:keepLines/>
+            </w:pPr>
+            <w:r>
+              <w:rPr>
+                <w:sz w:val="19"/>
+                <w:szCs w:val="19"/>
+              </w:rPr>
+              <w:t>4.55 /s · 33 J</w:t>
+            </w:r>
+          </w:p>
+        </w:tc>
+        <w:tc>
+          <w:tcPr>
+            <w:tcW w:w="2300" w:type="dxa"/>
+            <w:tcBorders>
+              <w:top w:val="single" w:sz="4" w:space="0" w:color="BFBFBF"/>
+              <w:left w:val="single" w:sz="4" w:space="0" w:color="BFBFBF"/>
+              <w:bottom w:val="single" w:sz="4" w:space="0" w:color="BFBFBF"/>
+              <w:right w:val="single" w:sz="4" w:space="0" w:color="BFBFBF"/>
+            </w:tcBorders>
+            <w:tcMar>
+              <w:top w:w="60" w:type="dxa"/>
+              <w:left w:w="100" w:type="dxa"/>
+              <w:bottom w:w="60" w:type="dxa"/>
+              <w:right w:w="100" w:type="dxa"/>
+            </w:tcMar>
+          </w:tcPr>
+          <w:p>
+            <w:pPr>
+              <w:keepNext/>
+              <w:keepLines/>
+            </w:pPr>
+            <w:r>
+              <w:rPr>
+                <w:sz w:val="19"/>
+                <w:szCs w:val="19"/>
+              </w:rPr>
+              <w:t>does not fit</w:t>
+            </w:r>
+          </w:p>
+        </w:tc>
+        <w:tc>
+          <w:tcPr>
+            <w:tcW w:w="3026" w:type="dxa"/>
+            <w:tcBorders>
+              <w:top w:val="single" w:sz="4" w:space="0" w:color="BFBFBF"/>
+              <w:left w:val="single" w:sz="4" w:space="0" w:color="BFBFBF"/>
+              <w:bottom w:val="single" w:sz="4" w:space="0" w:color="BFBFBF"/>
+              <w:right w:val="single" w:sz="4" w:space="0" w:color="BFBFBF"/>
+            </w:tcBorders>
+            <w:tcMar>
+              <w:top w:w="60" w:type="dxa"/>
+              <w:left w:w="100" w:type="dxa"/>
+              <w:bottom w:w="60" w:type="dxa"/>
+              <w:right w:w="100" w:type="dxa"/>
+            </w:tcMar>
+          </w:tcPr>
+          <w:p>
+            <w:pPr>
+              <w:keepNext/>
+              <w:keepLines/>
+            </w:pPr>
+            <w:r>
+              <w:rPr>
+                <w:sz w:val="19"/>
+                <w:szCs w:val="19"/>
+              </w:rPr>
+              <w:t>4.00 /s · 38 J (3 of 6 fit)</w:t>
+            </w:r>
+          </w:p>
+        </w:tc>
+      </w:tr>
+      <w:tr>
+        <w:tblPrEx>
+          <w:tblCellMar>
+            <w:top w:w="0" w:type="dxa"/>
+            <w:bottom w:w="0" w:type="dxa"/>
+          </w:tblCellMar>
+        </w:tblPrEx>
+        <w:trPr>
+          <w:cantSplit/>
+        </w:trPr>
+        <w:tc>
+          <w:tcPr>
+            <w:tcW w:w="700" w:type="dxa"/>
+            <w:tcBorders>
+              <w:top w:val="single" w:sz="4" w:space="0" w:color="BFBFBF"/>
+              <w:left w:val="single" w:sz="4" w:space="0" w:color="BFBFBF"/>
+              <w:bottom w:val="single" w:sz="4" w:space="0" w:color="BFBFBF"/>
+              <w:right w:val="single" w:sz="4" w:space="0" w:color="BFBFBF"/>
+            </w:tcBorders>
+            <w:tcMar>
+              <w:top w:w="60" w:type="dxa"/>
+              <w:left w:w="100" w:type="dxa"/>
+              <w:bottom w:w="60" w:type="dxa"/>
+              <w:right w:w="100" w:type="dxa"/>
+            </w:tcMar>
+          </w:tcPr>
+          <w:p>
+            <w:pPr>
+              <w:keepNext/>
+              <w:keepLines/>
+            </w:pPr>
+            <w:r>
+              <w:rPr>
+                <w:sz w:val="19"/>
+                <w:szCs w:val="19"/>
+              </w:rPr>
+              <w:t>50</w:t>
+            </w:r>
+          </w:p>
+        </w:tc>
+        <w:tc>
+          <w:tcPr>
+            <w:tcW w:w="800" w:type="dxa"/>
+            <w:tcBorders>
+              <w:top w:val="single" w:sz="4" w:space="0" w:color="BFBFBF"/>
+              <w:left w:val="single" w:sz="4" w:space="0" w:color="BFBFBF"/>
+              <w:bottom w:val="single" w:sz="4" w:space="0" w:color="BFBFBF"/>
+              <w:right w:val="single" w:sz="4" w:space="0" w:color="BFBFBF"/>
+            </w:tcBorders>
+            <w:tcMar>
+              <w:top w:w="60" w:type="dxa"/>
+              <w:left w:w="100" w:type="dxa"/>
+              <w:bottom w:w="60" w:type="dxa"/>
+              <w:right w:w="100" w:type="dxa"/>
+            </w:tcMar>
+          </w:tcPr>
+          <w:p>
+            <w:pPr>
+              <w:keepNext/>
+              <w:keepLines/>
+            </w:pPr>
+            <w:r>
+              <w:rPr>
+                <w:sz w:val="19"/>
+                <w:szCs w:val="19"/>
+              </w:rPr>
+              <w:t>1</w:t>
+            </w:r>
+          </w:p>
+        </w:tc>
+        <w:tc>
+          <w:tcPr>
+            <w:tcW w:w="2200" w:type="dxa"/>
+            <w:tcBorders>
+              <w:top w:val="single" w:sz="4" w:space="0" w:color="BFBFBF"/>
+              <w:left w:val="single" w:sz="4" w:space="0" w:color="BFBFBF"/>
+              <w:bottom w:val="single" w:sz="4" w:space="0" w:color="BFBFBF"/>
+              <w:right w:val="single" w:sz="4" w:space="0" w:color="BFBFBF"/>
+            </w:tcBorders>
+            <w:tcMar>
+              <w:top w:w="60" w:type="dxa"/>
+              <w:left w:w="100" w:type="dxa"/>
+              <w:bottom w:w="60" w:type="dxa"/>
+              <w:right w:w="100" w:type="dxa"/>
+            </w:tcMar>
+          </w:tcPr>
+          <w:p>
+            <w:pPr>
+              <w:keepNext/>
+              <w:keepLines/>
+            </w:pPr>
+            <w:r>
+              <w:rPr>
+                <w:sz w:val="19"/>
+                <w:szCs w:val="19"/>
+              </w:rPr>
+              <w:t>1.00 /s · 89 J</w:t>
+            </w:r>
+          </w:p>
+        </w:tc>
+        <w:tc>
+          <w:tcPr>
+            <w:tcW w:w="2300" w:type="dxa"/>
+            <w:tcBorders>
+              <w:top w:val="single" w:sz="4" w:space="0" w:color="BFBFBF"/>
+              <w:left w:val="single" w:sz="4" w:space="0" w:color="BFBFBF"/>
+              <w:bottom w:val="single" w:sz="4" w:space="0" w:color="BFBFBF"/>
+              <w:right w:val="single" w:sz="4" w:space="0" w:color="BFBFBF"/>
+            </w:tcBorders>
+            <w:tcMar>
+              <w:top w:w="60" w:type="dxa"/>
+              <w:left w:w="100" w:type="dxa"/>
+              <w:bottom w:w="60" w:type="dxa"/>
+              <w:right w:w="100" w:type="dxa"/>
+            </w:tcMar>
+          </w:tcPr>
+          <w:p>
+            <w:pPr>
+              <w:keepNext/>
+              <w:keepLines/>
+            </w:pPr>
+            <w:r>
+              <w:rPr>
+                <w:sz w:val="19"/>
+                <w:szCs w:val="19"/>
+              </w:rPr>
+              <w:t>0.60 /s · 232 J</w:t>
+            </w:r>
+          </w:p>
+        </w:tc>
+        <w:tc>
+          <w:tcPr>
+            <w:tcW w:w="3026" w:type="dxa"/>
+            <w:tcBorders>
+              <w:top w:val="single" w:sz="4" w:space="0" w:color="BFBFBF"/>
+              <w:left w:val="single" w:sz="4" w:space="0" w:color="BFBFBF"/>
+              <w:bottom w:val="single" w:sz="4" w:space="0" w:color="BFBFBF"/>
+              <w:right w:val="single" w:sz="4" w:space="0" w:color="BFBFBF"/>
+            </w:tcBorders>
+            <w:tcMar>
+              <w:top w:w="60" w:type="dxa"/>
+              <w:left w:w="100" w:type="dxa"/>
+              <w:bottom w:w="60" w:type="dxa"/>
+              <w:right w:w="100" w:type="dxa"/>
+            </w:tcMar>
+          </w:tcPr>
+          <w:p>
+            <w:pPr>
+              <w:keepNext/>
+              <w:keepLines/>
+            </w:pPr>
+            <w:r>
+              <w:rPr>
+                <w:sz w:val="19"/>
+                <w:szCs w:val="19"/>
+              </w:rPr>
+              <w:t>0.96 /s · 92 J</w:t>
+            </w:r>
+          </w:p>
+        </w:tc>
+      </w:tr>
+      <w:tr>
+        <w:tblPrEx>
+          <w:tblCellMar>
+            <w:top w:w="0" w:type="dxa"/>
+            <w:bottom w:w="0" w:type="dxa"/>
+          </w:tblCellMar>
+        </w:tblPrEx>
+        <w:trPr>
+          <w:cantSplit/>
+        </w:trPr>
+        <w:tc>
+          <w:tcPr>
+            <w:tcW w:w="700" w:type="dxa"/>
+            <w:tcBorders>
+              <w:top w:val="single" w:sz="4" w:space="0" w:color="BFBFBF"/>
+              <w:left w:val="single" w:sz="4" w:space="0" w:color="BFBFBF"/>
+              <w:bottom w:val="single" w:sz="4" w:space="0" w:color="BFBFBF"/>
+              <w:right w:val="single" w:sz="4" w:space="0" w:color="BFBFBF"/>
+            </w:tcBorders>
+            <w:tcMar>
+              <w:top w:w="60" w:type="dxa"/>
+              <w:left w:w="100" w:type="dxa"/>
+              <w:bottom w:w="60" w:type="dxa"/>
+              <w:right w:w="100" w:type="dxa"/>
+            </w:tcMar>
+          </w:tcPr>
+          <w:p>
+            <w:pPr>
+              <w:keepNext/>
+              <w:keepLines/>
+            </w:pPr>
+            <w:r>
+              <w:rPr>
+                <w:sz w:val="19"/>
+                <w:szCs w:val="19"/>
+              </w:rPr>
+              <w:t>50</w:t>
+            </w:r>
+          </w:p>
+        </w:tc>
+        <w:tc>
+          <w:tcPr>
+            <w:tcW w:w="800" w:type="dxa"/>
+            <w:tcBorders>
+              <w:top w:val="single" w:sz="4" w:space="0" w:color="BFBFBF"/>
+              <w:left w:val="single" w:sz="4" w:space="0" w:color="BFBFBF"/>
+              <w:bottom w:val="single" w:sz="4" w:space="0" w:color="BFBFBF"/>
+              <w:right w:val="single" w:sz="4" w:space="0" w:color="BFBFBF"/>
+            </w:tcBorders>
+            <w:tcMar>
+              <w:top w:w="60" w:type="dxa"/>
+              <w:left w:w="100" w:type="dxa"/>
+              <w:bottom w:w="60" w:type="dxa"/>
+              <w:right w:w="100" w:type="dxa"/>
+            </w:tcMar>
+          </w:tcPr>
+          <w:p>
+            <w:pPr>
+              <w:keepNext/>
+              <w:keepLines/>
+            </w:pPr>
+            <w:r>
+              <w:rPr>
+                <w:sz w:val="19"/>
+                <w:szCs w:val="19"/>
+              </w:rPr>
+              <w:t>4</w:t>
+            </w:r>
+          </w:p>
+        </w:tc>
+        <w:tc>
+          <w:tcPr>
+            <w:tcW w:w="2200" w:type="dxa"/>
+            <w:tcBorders>
+              <w:top w:val="single" w:sz="4" w:space="0" w:color="BFBFBF"/>
+              <w:left w:val="single" w:sz="4" w:space="0" w:color="BFBFBF"/>
+              <w:bottom w:val="single" w:sz="4" w:space="0" w:color="BFBFBF"/>
+              <w:right w:val="single" w:sz="4" w:space="0" w:color="BFBFBF"/>
+            </w:tcBorders>
+            <w:tcMar>
+              <w:top w:w="60" w:type="dxa"/>
+              <w:left w:w="100" w:type="dxa"/>
+              <w:bottom w:w="60" w:type="dxa"/>
+              <w:right w:w="100" w:type="dxa"/>
+            </w:tcMar>
+          </w:tcPr>
+          <w:p>
+            <w:pPr>
+              <w:keepNext/>
+              <w:keepLines/>
+            </w:pPr>
+            <w:r>
+              <w:rPr>
+                <w:sz w:val="19"/>
+                <w:szCs w:val="19"/>
+              </w:rPr>
+              <w:t>2.79 /s · 48 J</w:t>
+            </w:r>
+          </w:p>
+        </w:tc>
+        <w:tc>
+          <w:tcPr>
+            <w:tcW w:w="2300" w:type="dxa"/>
+            <w:tcBorders>
+              <w:top w:val="single" w:sz="4" w:space="0" w:color="BFBFBF"/>
+              <w:left w:val="single" w:sz="4" w:space="0" w:color="BFBFBF"/>
+              <w:bottom w:val="single" w:sz="4" w:space="0" w:color="BFBFBF"/>
+              <w:right w:val="single" w:sz="4" w:space="0" w:color="BFBFBF"/>
+            </w:tcBorders>
+            <w:tcMar>
+              <w:top w:w="60" w:type="dxa"/>
+              <w:left w:w="100" w:type="dxa"/>
+              <w:bottom w:w="60" w:type="dxa"/>
+              <w:right w:w="100" w:type="dxa"/>
+            </w:tcMar>
+          </w:tcPr>
+          <w:p>
+            <w:pPr>
+              <w:keepNext/>
+              <w:keepLines/>
+            </w:pPr>
+            <w:r>
+              <w:rPr>
+                <w:sz w:val="19"/>
+                <w:szCs w:val="19"/>
+              </w:rPr>
+              <w:t>does not fit</w:t>
+            </w:r>
+          </w:p>
+        </w:tc>
+        <w:tc>
+          <w:tcPr>
+            <w:tcW w:w="3026" w:type="dxa"/>
+            <w:tcBorders>
+              <w:top w:val="single" w:sz="4" w:space="0" w:color="BFBFBF"/>
+              <w:left w:val="single" w:sz="4" w:space="0" w:color="BFBFBF"/>
+              <w:bottom w:val="single" w:sz="4" w:space="0" w:color="BFBFBF"/>
+              <w:right w:val="single" w:sz="4" w:space="0" w:color="BFBFBF"/>
+            </w:tcBorders>
+            <w:tcMar>
+              <w:top w:w="60" w:type="dxa"/>
+              <w:left w:w="100" w:type="dxa"/>
+              <w:bottom w:w="60" w:type="dxa"/>
+              <w:right w:w="100" w:type="dxa"/>
+            </w:tcMar>
+          </w:tcPr>
+          <w:p>
+            <w:pPr>
+              <w:keepNext/>
+              <w:keepLines/>
+            </w:pPr>
+            <w:r>
+              <w:rPr>
+                <w:sz w:val="19"/>
+                <w:szCs w:val="19"/>
+              </w:rPr>
+              <w:t>2.25 /s · 63 J (12 of 15 fit)</w:t>
+            </w:r>
+          </w:p>
+        </w:tc>
+      </w:tr>
+      <w:tr>
+        <w:tblPrEx>
+          <w:tblCellMar>
+            <w:top w:w="0" w:type="dxa"/>
+            <w:bottom w:w="0" w:type="dxa"/>
+          </w:tblCellMar>
+        </w:tblPrEx>
+        <w:trPr>
+          <w:cantSplit/>
+        </w:trPr>
+        <w:tc>
+          <w:tcPr>
+            <w:tcW w:w="700" w:type="dxa"/>
+            <w:tcBorders>
+              <w:top w:val="single" w:sz="4" w:space="0" w:color="BFBFBF"/>
+              <w:left w:val="single" w:sz="4" w:space="0" w:color="BFBFBF"/>
+              <w:bottom w:val="single" w:sz="4" w:space="0" w:color="BFBFBF"/>
+              <w:right w:val="single" w:sz="4" w:space="0" w:color="BFBFBF"/>
+            </w:tcBorders>
+            <w:tcMar>
+              <w:top w:w="60" w:type="dxa"/>
+              <w:left w:w="100" w:type="dxa"/>
+              <w:bottom w:w="60" w:type="dxa"/>
+              <w:right w:w="100" w:type="dxa"/>
+            </w:tcMar>
+          </w:tcPr>
+          <w:p>
+            <w:pPr>
+              <w:keepNext/>
+              <w:keepLines/>
+            </w:pPr>
+            <w:r>
+              <w:rPr>
+                <w:sz w:val="19"/>
+                <w:szCs w:val="19"/>
+              </w:rPr>
+              <w:t>50</w:t>
+            </w:r>
+          </w:p>
+        </w:tc>
+        <w:tc>
+          <w:tcPr>
+            <w:tcW w:w="800" w:type="dxa"/>
+            <w:tcBorders>
+              <w:top w:val="single" w:sz="4" w:space="0" w:color="BFBFBF"/>
+              <w:left w:val="single" w:sz="4" w:space="0" w:color="BFBFBF"/>
+              <w:bottom w:val="single" w:sz="4" w:space="0" w:color="BFBFBF"/>
+              <w:right w:val="single" w:sz="4" w:space="0" w:color="BFBFBF"/>
+            </w:tcBorders>
+            <w:tcMar>
+              <w:top w:w="60" w:type="dxa"/>
+              <w:left w:w="100" w:type="dxa"/>
+              <w:bottom w:w="60" w:type="dxa"/>
+              <w:right w:w="100" w:type="dxa"/>
+            </w:tcMar>
+          </w:tcPr>
+          <w:p>
+            <w:pPr>
+              <w:keepNext/>
+              <w:keepLines/>
+            </w:pPr>
+            <w:r>
+              <w:rPr>
+                <w:sz w:val="19"/>
+                <w:szCs w:val="19"/>
+              </w:rPr>
+              <w:t>8</w:t>
+            </w:r>
+          </w:p>
+        </w:tc>
+        <w:tc>
+          <w:tcPr>
+            <w:tcW w:w="2200" w:type="dxa"/>
+            <w:tcBorders>
+              <w:top w:val="single" w:sz="4" w:space="0" w:color="BFBFBF"/>
+              <w:left w:val="single" w:sz="4" w:space="0" w:color="BFBFBF"/>
+              <w:bottom w:val="single" w:sz="4" w:space="0" w:color="BFBFBF"/>
+              <w:right w:val="single" w:sz="4" w:space="0" w:color="BFBFBF"/>
+            </w:tcBorders>
+            <w:tcMar>
+              <w:top w:w="60" w:type="dxa"/>
+              <w:left w:w="100" w:type="dxa"/>
+              <w:bottom w:w="60" w:type="dxa"/>
+              <w:right w:w="100" w:type="dxa"/>
+            </w:tcMar>
+          </w:tcPr>
+          <w:p>
+            <w:pPr>
+              <w:keepNext/>
+              <w:keepLines/>
+            </w:pPr>
+            <w:r>
+              <w:rPr>
+                <w:sz w:val="19"/>
+                <w:szCs w:val="19"/>
+              </w:rPr>
+              <w:t>4.11 /s · 38 J</w:t>
+            </w:r>
+          </w:p>
+        </w:tc>
+        <w:tc>
+          <w:tcPr>
+            <w:tcW w:w="2300" w:type="dxa"/>
+            <w:tcBorders>
+              <w:top w:val="single" w:sz="4" w:space="0" w:color="BFBFBF"/>
+              <w:left w:val="single" w:sz="4" w:space="0" w:color="BFBFBF"/>
+              <w:bottom w:val="single" w:sz="4" w:space="0" w:color="BFBFBF"/>
+              <w:right w:val="single" w:sz="4" w:space="0" w:color="BFBFBF"/>
+            </w:tcBorders>
+            <w:tcMar>
+              <w:top w:w="60" w:type="dxa"/>
+              <w:left w:w="100" w:type="dxa"/>
+              <w:bottom w:w="60" w:type="dxa"/>
+              <w:right w:w="100" w:type="dxa"/>
+            </w:tcMar>
+          </w:tcPr>
+          <w:p>
+            <w:pPr>
+              <w:keepNext/>
+              <w:keepLines/>
+            </w:pPr>
+            <w:r>
+              <w:rPr>
+                <w:sz w:val="19"/>
+                <w:szCs w:val="19"/>
+              </w:rPr>
+              <w:t>does not fit</w:t>
+            </w:r>
+          </w:p>
+        </w:tc>
+        <w:tc>
+          <w:tcPr>
+            <w:tcW w:w="3026" w:type="dxa"/>
+            <w:tcBorders>
+              <w:top w:val="single" w:sz="4" w:space="0" w:color="BFBFBF"/>
+              <w:left w:val="single" w:sz="4" w:space="0" w:color="BFBFBF"/>
+              <w:bottom w:val="single" w:sz="4" w:space="0" w:color="BFBFBF"/>
+              <w:right w:val="single" w:sz="4" w:space="0" w:color="BFBFBF"/>
+            </w:tcBorders>
+            <w:tcMar>
+              <w:top w:w="60" w:type="dxa"/>
+              <w:left w:w="100" w:type="dxa"/>
+              <w:bottom w:w="60" w:type="dxa"/>
+              <w:right w:w="100" w:type="dxa"/>
+            </w:tcMar>
+          </w:tcPr>
+          <w:p>
+            <w:pPr>
+              <w:keepNext/>
+              <w:keepLines/>
+            </w:pPr>
+            <w:r>
+              <w:rPr>
+                <w:sz w:val="19"/>
+                <w:szCs w:val="19"/>
+              </w:rPr>
+              <w:t>3.72 /s · 43 J (3 of 6 fit)</w:t>
+            </w:r>
+          </w:p>
+        </w:tc>
+      </w:tr>
+    </w:tbl>
+    <w:p>
+      <w:pPr>
+        <w:spacing w:before="60" w:after="240"/>
+      </w:pPr>
+      <w:r>
+        <w:rPr>
+          <w:i/>
+          <w:iCs/>
+          <w:color w:val="52514E"/>
+          <w:sz w:val="18"/>
+          <w:szCs w:val="18"/>
+        </w:rPr>
+        <w:t>Table 5. Decisions per second and energy per decision (GPU, joules) when requests are batched (adapter: r4 seed 101). 'Does not fit': the batch exceeds the memory cap of the 12 GB card. Filtered-text figures at batch 8 come only from the batches that fit, which are its shorter prompts, so they favour filtered text.</w:t>
+      </w:r>
+    </w:p>
+    <w:p>
+      <w:pPr>
+        <w:pStyle w:val="ListParagraph"/>
+        <w:numPr>
+          <w:ilvl w:val="0"/>
+          <w:numId w:val="2"/>
+        </w:numPr>
+        <w:spacing w:after="60"/>
+      </w:pPr>
+      <w:r>
+        <w:rPr>
+          <w:b/>
+          <w:bCs/>
+        </w:rPr>
+        <w:t>Against text with every event listed:</w:t>
+      </w:r>
+      <w:r>
+        <w:t xml:space="preserve"> prefill 34–81% faster and 25–62% less energy per decision at N = 10–50 for single requests; with batching, text cannot be served at all at N = 50 or at batch 8, while the adapter fits every configuration (peak 10.0 GB).</w:t>
+      </w:r>
+    </w:p>
+    <w:p>
+      <w:pPr>
+        <w:pStyle w:val="ListParagraph"/>
+        <w:numPr>
+          <w:ilvl w:val="0"/>
+          <w:numId w:val="2"/>
+        </w:numPr>
+        <w:spacing w:after="60"/>
+      </w:pPr>
+      <w:r>
+        <w:rPr>
+          <w:b/>
+          <w:bCs/>
+        </w:rPr>
+        <w:t>Against filtered text:</w:t>
+      </w:r>
+      <w:r>
+        <w:t xml:space="preserve"> equal for single requests (within about 5%), but ahead once requests are batched: 10–30% more decisions per second and 12–28% less energy per decision. Filtered text fits only some batch-8 batches at every N, because its length depends on how many abnormal beats a window contains.</w:t>
+      </w:r>
+    </w:p>
+    <w:p>
+      <w:pPr>
+        <w:pStyle w:val="ListParagraph"/>
+        <w:numPr>
+          <w:ilvl w:val="0"/>
+          <w:numId w:val="2"/>
+        </w:numPr>
+        <w:spacing w:after="60"/>
+      </w:pPr>
+      <w:r>
+        <w:rPr>
+          <w:b/>
+          <w:bCs/>
+        </w:rPr>
+        <w:t>Prefix caching</w:t>
+      </w:r>
+      <w:r>
+        <w:t xml:space="preserve"> shortens every arm's prefill and does not change the ranking.</w:t>
+      </w:r>
+    </w:p>
+    <w:p>
+      <w:pPr>
+        <w:pStyle w:val="ListParagraph"/>
+        <w:numPr>
+          <w:ilvl w:val="0"/>
+          <w:numId w:val="2"/>
+        </w:numPr>
+        <w:spacing w:after="60"/>
+      </w:pPr>
+      <w:r>
+        <w:rPr>
+          <w:b/>
+          <w:bCs/>
+        </w:rPr>
+        <w:t>What this means for an agent pipeline:</w:t>
+      </w:r>
+      <w:r>
+        <w:t xml:space="preserve"> the latent channel has a fixed memory and compute footprint per event, so batch sizes can be planned in advance; a text interface's footprint depends on what the sender has to say.</w:t>
+      </w:r>
+    </w:p>
+    <w:p>
+      <w:pPr>
         <w:pStyle w:val="Heading1"/>
         <w:keepNext/>
         <w:keepLines/>
       </w:pPr>
-      <w:bookmarkStart w:id="10" w:name="_Toc241868652"/>
+      <w:bookmarkStart w:id="11" w:name="_Toc241873294"/>
       <w:r>
         <w:t>7. Accuracy results</w:t>
       </w:r>
-      <w:bookmarkEnd w:id="10"/>
+      <w:bookmarkEnd w:id="11"/>
     </w:p>
     <w:p>
       <w:pPr>
@@ -5574,11 +7265,11 @@
         <w:keepNext/>
         <w:keepLines/>
       </w:pPr>
-      <w:bookmarkStart w:id="11" w:name="_Toc241868653"/>
+      <w:bookmarkStart w:id="12" w:name="_Toc241873295"/>
       <w:r>
         <w:t>7.1 Primary test (pre-registered, Deviation 16)</w:t>
       </w:r>
-      <w:bookmarkEnd w:id="11"/>
+      <w:bookmarkEnd w:id="12"/>
     </w:p>
     <w:p>
       <w:pPr>
@@ -5599,7 +7290,7 @@
           <w:noProof/>
         </w:rPr>
         <w:drawing>
-          <wp:inline distT="0" distB="0" distL="0" distR="0" wp14:anchorId="5521F3C3" wp14:editId="1291727C">
+          <wp:inline distT="0" distB="0" distL="0" distR="0" wp14:anchorId="030C7A31" wp14:editId="10B853E6">
             <wp:extent cx="5762625" cy="2886075"/>
             <wp:effectExtent l="0" t="0" r="0" b="0"/>
             <wp:docPr id="4" name="fig3_accuracy_vs_n.png" descr="Figure 4. Balanced accuracy on the DS2 test set by window size. The final adapter (r4) stays at 0.80–0.84 for every N and sits above the previous recipe (r3) at every N; default text falls sharply from N = 5; text with a calibrated threshold recovers part of the gap." title="fig3_accuracy_vs_n.png"/>
@@ -5668,7 +7359,7 @@
           <w:left w:w="10" w:type="dxa"/>
           <w:right w:w="10" w:type="dxa"/>
         </w:tblCellMar>
-        <w:tblLook w:val="0000" w:firstRow="0" w:lastRow="0" w:firstColumn="0" w:lastColumn="0" w:noHBand="0" w:noVBand="0"/>
+        <w:tblLook w:val="04A0" w:firstRow="1" w:lastRow="0" w:firstColumn="1" w:lastColumn="0" w:noHBand="0" w:noVBand="1"/>
       </w:tblPr>
       <w:tblGrid>
         <w:gridCol w:w="700"/>
@@ -6856,7 +8547,7 @@
           <w:sz w:val="18"/>
           <w:szCs w:val="18"/>
         </w:rPr>
-        <w:t>Table 5. Balanced accuracy on the class-balanced DS2 test windows (adapters: mean of 3 seeds). Text answers are identical across the r3 and r4 comparisons (same windows, prompts and decoder).</w:t>
+        <w:t>Table 6. Balanced accuracy on the class-balanced DS2 test windows (adapters: mean of 3 seeds). Text answers are identical across the r3 and r4 comparisons (same windows, prompts and decoder).</w:t>
       </w:r>
     </w:p>
     <w:p>
@@ -6865,11 +8556,11 @@
         <w:keepNext/>
         <w:keepLines/>
       </w:pPr>
-      <w:bookmarkStart w:id="12" w:name="_Toc241868654"/>
+      <w:bookmarkStart w:id="13" w:name="_Toc241873296"/>
       <w:r>
         <w:t>7.2 Primary comparison against default and calibrated text</w:t>
       </w:r>
-      <w:bookmarkEnd w:id="12"/>
+      <w:bookmarkEnd w:id="13"/>
     </w:p>
     <w:p>
       <w:pPr>
@@ -6894,7 +8585,7 @@
           <w:left w:w="10" w:type="dxa"/>
           <w:right w:w="10" w:type="dxa"/>
         </w:tblCellMar>
-        <w:tblLook w:val="0000" w:firstRow="0" w:lastRow="0" w:firstColumn="0" w:lastColumn="0" w:noHBand="0" w:noVBand="0"/>
+        <w:tblLook w:val="04A0" w:firstRow="1" w:lastRow="0" w:firstColumn="1" w:lastColumn="0" w:noHBand="0" w:noVBand="1"/>
       </w:tblPr>
       <w:tblGrid>
         <w:gridCol w:w="700"/>
@@ -7737,7 +9428,7 @@
           <w:sz w:val="18"/>
           <w:szCs w:val="18"/>
         </w:rPr>
-        <w:t>Table 6. Adapter minus text, balanced accuracy, with patient-level (record-cluster) bootstrap 95% confidence intervals; non-inferiority margin −0.05.</w:t>
+        <w:t>Table 7. Adapter minus text, balanced accuracy, with patient-level (record-cluster) bootstrap 95% confidence intervals; non-inferiority margin −0.05.</w:t>
       </w:r>
     </w:p>
     <w:p>
@@ -7751,10 +9442,10 @@
           <w:noProof/>
         </w:rPr>
         <w:drawing>
-          <wp:inline distT="0" distB="0" distL="0" distR="0" wp14:anchorId="70E1AF13" wp14:editId="1D06564E">
+          <wp:inline distT="0" distB="0" distL="0" distR="0" wp14:anchorId="0A774DAA" wp14:editId="1DEB3020">
             <wp:extent cx="5762625" cy="2886075"/>
             <wp:effectExtent l="0" t="0" r="0" b="0"/>
-            <wp:docPr id="5" name="fig4_forest.png" descr="Figure 5. The comparisons of Table 6. Dotted red line: non-inferiority margin. Hollow markers show the previous recipe (r3) against calibrated text." title="fig4_forest.png"/>
+            <wp:docPr id="5" name="fig4_forest.png" descr="Figure 5. The comparisons of Table 7. Dotted red line: non-inferiority margin. Hollow markers show the previous recipe (r3) against calibrated text." title="fig4_forest.png"/>
             <wp:cNvGraphicFramePr>
               <a:graphicFrameLocks xmlns:a="http://schemas.openxmlformats.org/drawingml/2006/main" noChangeAspect="1"/>
             </wp:cNvGraphicFramePr>
@@ -7802,7 +9493,7 @@
           <w:sz w:val="18"/>
           <w:szCs w:val="18"/>
         </w:rPr>
-        <w:t>Figure 5. The comparisons of Table 6. Dotted red line: non-inferiority margin. Hollow markers show the previous recipe (r3) against calibrated text.</w:t>
+        <w:t>Figure 5. The comparisons of Table 7. Dotted red line: non-inferiority margin. Hollow markers show the previous recipe (r3) against calibrated text.</w:t>
       </w:r>
     </w:p>
     <w:p>
@@ -7811,11 +9502,11 @@
         <w:keepNext/>
         <w:keepLines/>
       </w:pPr>
-      <w:bookmarkStart w:id="13" w:name="_Toc241868655"/>
+      <w:bookmarkStart w:id="14" w:name="_Toc241873297"/>
       <w:r>
         <w:t>7.3 Why text fails with many events</w:t>
       </w:r>
-      <w:bookmarkEnd w:id="13"/>
+      <w:bookmarkEnd w:id="14"/>
     </w:p>
     <w:p>
       <w:pPr>
@@ -7828,7 +9519,7 @@
           <w:noProof/>
         </w:rPr>
         <w:drawing>
-          <wp:inline distT="0" distB="0" distL="0" distR="0" wp14:anchorId="17299F1E" wp14:editId="32C9FEE4">
+          <wp:inline distT="0" distB="0" distL="0" distR="0" wp14:anchorId="62A20C65" wp14:editId="7DC2778C">
             <wp:extent cx="5762625" cy="1971675"/>
             <wp:effectExtent l="0" t="0" r="0" b="0"/>
             <wp:docPr id="6" name="fig5_why_text_fails.png" descr="Figure 6. Left: text misses urgent windows caused by a single high-confidence V/F beat (a numeric threshold, 0.85, buried in a long list) far more than runs of abnormal beats. Right: text is worst when the key beat is in the middle of the list, the 'lost in the middle' effect; the adapter (r4, 3 seeds) shows no position effect." title="fig5_why_text_fails.png"/>
@@ -7909,7 +9600,7 @@
           <w:noProof/>
         </w:rPr>
         <w:drawing>
-          <wp:inline distT="0" distB="0" distL="0" distR="0" wp14:anchorId="0A444520" wp14:editId="781C9D5C">
+          <wp:inline distT="0" distB="0" distL="0" distR="0" wp14:anchorId="2871358A" wp14:editId="1A1FB664">
             <wp:extent cx="5762625" cy="2667000"/>
             <wp:effectExtent l="0" t="0" r="0" b="0"/>
             <wp:docPr id="7" name="fig6_confusion_n50.png" descr="Figure 7. Confusion at N = 50. Text under-escalates (priority → routine, urgent → priority) and never raises a false alarm; the r4 adapter never calls an urgent window routine and escalates 3% of routine windows." title="fig6_confusion_n50.png"/>
@@ -7969,11 +9660,11 @@
         <w:keepNext/>
         <w:keepLines/>
       </w:pPr>
-      <w:bookmarkStart w:id="14" w:name="_Toc241868656"/>
+      <w:bookmarkStart w:id="15" w:name="_Toc241873298"/>
       <w:r>
         <w:t>7.4 False alarms: identified in r3, reduced in r4</w:t>
       </w:r>
-      <w:bookmarkEnd w:id="14"/>
+      <w:bookmarkEnd w:id="15"/>
     </w:p>
     <w:p>
       <w:pPr>
@@ -7994,7 +9685,7 @@
           <w:noProof/>
         </w:rPr>
         <w:drawing>
-          <wp:inline distT="0" distB="0" distL="0" distR="0" wp14:anchorId="7CCDD039" wp14:editId="7EBA1A02">
+          <wp:inline distT="0" distB="0" distL="0" distR="0" wp14:anchorId="4DA4EA34" wp14:editId="4AB9987E">
             <wp:extent cx="5762625" cy="2533650"/>
             <wp:effectExtent l="0" t="0" r="0" b="0"/>
             <wp:docPr id="8" name="fig9_false_alarms.png" descr="Figure 8. Routine windows escalated to priority or urgent (bars: mean of 3 seeds; lines: seed range). Text never escalates a routine window." title="fig9_false_alarms.png"/>
@@ -8063,7 +9754,7 @@
           <w:left w:w="10" w:type="dxa"/>
           <w:right w:w="10" w:type="dxa"/>
         </w:tblCellMar>
-        <w:tblLook w:val="0000" w:firstRow="0" w:lastRow="0" w:firstColumn="0" w:lastColumn="0" w:noHBand="0" w:noVBand="0"/>
+        <w:tblLook w:val="04A0" w:firstRow="1" w:lastRow="0" w:firstColumn="1" w:lastColumn="0" w:noHBand="0" w:noVBand="1"/>
       </w:tblPr>
       <w:tblGrid>
         <w:gridCol w:w="700"/>
@@ -9060,7 +10751,7 @@
           <w:sz w:val="18"/>
           <w:szCs w:val="18"/>
         </w:rPr>
-        <w:t>Table 7. Natural-prevalence windows (100 per N; 40–62 routine windows per N), where the tiers occur at their real frequency.</w:t>
+        <w:t>Table 8. Natural-prevalence windows (100 per N; 40–62 routine windows per N), where the tiers occur at their real frequency.</w:t>
       </w:r>
     </w:p>
     <w:p>
@@ -9069,11 +10760,11 @@
         <w:keepNext/>
         <w:keepLines/>
       </w:pPr>
-      <w:bookmarkStart w:id="15" w:name="_Toc241868657"/>
+      <w:bookmarkStart w:id="16" w:name="_Toc241873299"/>
       <w:r>
         <w:t>7.5 Against true annotations</w:t>
       </w:r>
-      <w:bookmarkEnd w:id="15"/>
+      <w:bookmarkEnd w:id="16"/>
     </w:p>
     <w:p>
       <w:pPr>
@@ -9089,11 +10780,11 @@
         <w:keepNext/>
         <w:keepLines/>
       </w:pPr>
-      <w:bookmarkStart w:id="16" w:name="_Toc241868658"/>
+      <w:bookmarkStart w:id="17" w:name="_Toc241873300"/>
       <w:r>
         <w:t>7.6 Filtered text baseline (Deviation 20)</w:t>
       </w:r>
-      <w:bookmarkEnd w:id="16"/>
+      <w:bookmarkEnd w:id="17"/>
     </w:p>
     <w:p>
       <w:pPr>
@@ -9118,7 +10809,7 @@
           <w:left w:w="10" w:type="dxa"/>
           <w:right w:w="10" w:type="dxa"/>
         </w:tblCellMar>
-        <w:tblLook w:val="0000" w:firstRow="0" w:lastRow="0" w:firstColumn="0" w:lastColumn="0" w:noHBand="0" w:noVBand="0"/>
+        <w:tblLook w:val="04A0" w:firstRow="1" w:lastRow="0" w:firstColumn="1" w:lastColumn="0" w:noHBand="0" w:noVBand="1"/>
       </w:tblPr>
       <w:tblGrid>
         <w:gridCol w:w="600"/>
@@ -10150,7 +11841,7 @@
           <w:sz w:val="18"/>
           <w:szCs w:val="18"/>
         </w:rPr>
-        <w:t>Table 8. Adapter against the filtered text prompt (default decoding; calibration changes the filtered arm by about 0.01 or less). Record-cluster bootstrap 95% CIs.</w:t>
+        <w:t>Table 9. Adapter against the filtered text prompt (default decoding; calibration changes the filtered arm by about 0.01 or less). Record-cluster bootstrap 95% CIs.</w:t>
       </w:r>
     </w:p>
     <w:p>
@@ -10170,7 +11861,7 @@
         <w:t>Filtered text is more accurate at every N</w:t>
       </w:r>
       <w:r>
-        <w:t xml:space="preserve"> (confidence intervals exclude zero) and raises no false alarms (adapter 2.7–4.8%). Time to first token and time to the decision differ by at most 1.5% (about 180 ms for both).</w:t>
+        <w:t xml:space="preserve"> (confidence intervals exclude zero) and raises no false alarms (adapter 2.7–4.8%). For single requests, time to first token and time to the decision differ by at most 1.5% (about 180 ms for both); with batching the adapter is ahead (Section 6.1).</w:t>
       </w:r>
     </w:p>
     <w:p>
@@ -10232,11 +11923,11 @@
         <w:keepNext/>
         <w:keepLines/>
       </w:pPr>
-      <w:bookmarkStart w:id="17" w:name="_Toc241868659"/>
+      <w:bookmarkStart w:id="18" w:name="_Toc241873301"/>
       <w:r>
         <w:t>8. Auditability</w:t>
       </w:r>
-      <w:bookmarkEnd w:id="17"/>
+      <w:bookmarkEnd w:id="18"/>
     </w:p>
     <w:p>
       <w:pPr>
@@ -10349,7 +12040,7 @@
           <w:noProof/>
         </w:rPr>
         <w:drawing>
-          <wp:inline distT="0" distB="0" distL="0" distR="0" wp14:anchorId="4484AFF1" wp14:editId="315E9C13">
+          <wp:inline distT="0" distB="0" distL="0" distR="0" wp14:anchorId="4D1BFE2D" wp14:editId="45F2ED79">
             <wp:extent cx="5762625" cy="2371725"/>
             <wp:effectExtent l="0" t="0" r="0" b="0"/>
             <wp:docPr id="9" name="fig8_auditability.png" descr="Figure 9. Balanced accuracy of decoding each event's fields from its virtual-token slot (recipe r3, mean of 3 seeds) versus from the encoder's 32-d vector." title="fig8_auditability.png"/>
@@ -10414,7 +12105,7 @@
           <w:noProof/>
         </w:rPr>
         <w:drawing>
-          <wp:inline distT="0" distB="0" distL="0" distR="0" wp14:anchorId="1596517B" wp14:editId="42C0A796">
+          <wp:inline distT="0" distB="0" distL="0" distR="0" wp14:anchorId="138D0EBB" wp14:editId="257AD242">
             <wp:extent cx="5762625" cy="2009775"/>
             <wp:effectExtent l="0" t="0" r="0" b="0"/>
             <wp:docPr id="10" name="fig10_side_info.png" descr="Figure 10. Facts carried per event after the r4 change, decoded from slots 0 and 49 of each seed (bars: mean; lines: range). Left: heart rate and RR interval (R²). Right: presence of a run of ≥ 3 abnormal beats (balanced accuracy; Deviation 18b, a pre-registered replacement for an R² metric that proved ill-posed on this split)." title="fig10_side_info.png"/>
@@ -10474,11 +12165,11 @@
         <w:keepNext/>
         <w:keepLines/>
       </w:pPr>
-      <w:bookmarkStart w:id="18" w:name="_Toc241868660"/>
+      <w:bookmarkStart w:id="19" w:name="_Toc241873302"/>
       <w:r>
         <w:t>9. Replication on a second sender (Deviation 22)</w:t>
       </w:r>
-      <w:bookmarkEnd w:id="18"/>
+      <w:bookmarkEnd w:id="19"/>
     </w:p>
     <w:p>
       <w:pPr>
@@ -10506,7 +12197,7 @@
           <w:left w:w="10" w:type="dxa"/>
           <w:right w:w="10" w:type="dxa"/>
         </w:tblCellMar>
-        <w:tblLook w:val="0000" w:firstRow="0" w:lastRow="0" w:firstColumn="0" w:lastColumn="0" w:noHBand="0" w:noVBand="0"/>
+        <w:tblLook w:val="04A0" w:firstRow="1" w:lastRow="0" w:firstColumn="1" w:lastColumn="0" w:noHBand="0" w:noVBand="1"/>
       </w:tblPr>
       <w:tblGrid>
         <w:gridCol w:w="500"/>
@@ -11913,7 +13604,7 @@
           <w:sz w:val="18"/>
           <w:szCs w:val="18"/>
         </w:rPr>
-        <w:t>Table 9. Second sender: balanced accuracy on its DS2 test windows, with record-cluster bootstrap 95% CIs (non-inferiority margin −0.05). Calibrated filtered text is shown in the last column.</w:t>
+        <w:t>Table 10. Second sender: balanced accuracy on its DS2 test windows, with record-cluster bootstrap 95% CIs (non-inferiority margin −0.05). Calibrated filtered text is shown in the last column.</w:t>
       </w:r>
     </w:p>
     <w:p>
@@ -11927,7 +13618,7 @@
           <w:noProof/>
         </w:rPr>
         <w:drawing>
-          <wp:inline distT="0" distB="0" distL="0" distR="0" wp14:anchorId="73E9FF67" wp14:editId="72F8116B">
+          <wp:inline distT="0" distB="0" distL="0" distR="0" wp14:anchorId="73E0FBE6" wp14:editId="192CA32A">
             <wp:extent cx="5762625" cy="2524125"/>
             <wp:effectExtent l="0" t="0" r="0" b="0"/>
             <wp:docPr id="11" name="fig11_two_senders.png" descr="Figure 11. Both senders side by side. The pattern replicates: text with every event listed falls as N grows, the adapter stays roughly flat, and filtered text is the most accurate arm, except at N = 50 on the second sender." title="fig11_two_senders.png"/>
@@ -12070,11 +13761,11 @@
         <w:keepNext/>
         <w:keepLines/>
       </w:pPr>
-      <w:bookmarkStart w:id="19" w:name="_Toc241868661"/>
+      <w:bookmarkStart w:id="20" w:name="_Toc241873303"/>
       <w:r>
         <w:t>10. Status of the research questions</w:t>
       </w:r>
-      <w:bookmarkEnd w:id="19"/>
+      <w:bookmarkEnd w:id="20"/>
     </w:p>
     <w:tbl>
       <w:tblPr>
@@ -12091,7 +13782,7 @@
           <w:left w:w="10" w:type="dxa"/>
           <w:right w:w="10" w:type="dxa"/>
         </w:tblCellMar>
-        <w:tblLook w:val="0000" w:firstRow="0" w:lastRow="0" w:firstColumn="0" w:lastColumn="0" w:noHBand="0" w:noVBand="0"/>
+        <w:tblLook w:val="04A0" w:firstRow="1" w:lastRow="0" w:firstColumn="1" w:lastColumn="0" w:noHBand="0" w:noVBand="1"/>
       </w:tblPr>
       <w:tblGrid>
         <w:gridCol w:w="1700"/>
@@ -12305,7 +13996,7 @@
                 <w:sz w:val="19"/>
                 <w:szCs w:val="19"/>
               </w:rPr>
-              <w:t>Refined: the saving is a multi-event effect; 19–78% lower prefill and 4–36% faster decision at N = 10–50 vs compact text; replicated on a second sender. Against filtered text, latency is similar and the adapter's advantage is a prompt length that does not grow with the number of abnormal beats</w:t>
+              <w:t>Refined: the saving is a multi-event effect; 19–78% lower prefill and 4–36% faster decision at N = 10–50 vs compact text; replicated on a second sender. Against filtered text, single-request latency is similar; with batching the adapter has 10–30% higher throughput, 12–28% less energy per decision and a fixed memory footprint (Section 6.1)</w:t>
             </w:r>
           </w:p>
         </w:tc>
@@ -12525,7 +14216,7 @@
           <w:sz w:val="18"/>
           <w:szCs w:val="18"/>
         </w:rPr>
-        <w:t>Table 10. Research questions: dissertation answer and how Phase 1 refined or extended it.</w:t>
+        <w:t>Table 11. Research questions: dissertation answer and how Phase 1 refined or extended it.</w:t>
       </w:r>
     </w:p>
     <w:p>
@@ -12534,11 +14225,11 @@
         <w:keepNext/>
         <w:keepLines/>
       </w:pPr>
-      <w:bookmarkStart w:id="20" w:name="_Toc241868662"/>
+      <w:bookmarkStart w:id="21" w:name="_Toc241873304"/>
       <w:r>
         <w:t>11. Limitations and threats to validity</w:t>
       </w:r>
-      <w:bookmarkEnd w:id="20"/>
+      <w:bookmarkEnd w:id="21"/>
     </w:p>
     <w:p>
       <w:pPr>
@@ -12673,11 +14364,11 @@
         <w:keepNext/>
         <w:keepLines/>
       </w:pPr>
-      <w:bookmarkStart w:id="21" w:name="_Toc241868663"/>
+      <w:bookmarkStart w:id="22" w:name="_Toc241873305"/>
       <w:r>
         <w:t>12. Proposed next steps</w:t>
       </w:r>
-      <w:bookmarkEnd w:id="21"/>
+      <w:bookmarkEnd w:id="22"/>
     </w:p>
     <w:p>
       <w:pPr>
@@ -12713,10 +14404,10 @@
           <w:b/>
           <w:bCs/>
         </w:rPr>
-        <w:t>Serving conditions:</w:t>
-      </w:r>
-      <w:r>
-        <w:t xml:space="preserve"> batching, reuse of the shared prompt prefix, throughput and energy per decision (Deviation 23, running).</w:t>
+        <w:t>Compression curve:</w:t>
+      </w:r>
+      <w:r>
+        <w:t xml:space="preserve"> 1, 2, 4 and 8 tokens per event, measuring accuracy and recoverability against cost (Deviation 24).</w:t>
       </w:r>
     </w:p>
     <w:p>
@@ -12733,10 +14424,10 @@
           <w:b/>
           <w:bCs/>
         </w:rPr>
-        <w:t>Compression curve:</w:t>
-      </w:r>
-      <w:r>
-        <w:t xml:space="preserve"> 1, 2, 4 and 8 tokens per event, measuring accuracy and recoverability against cost (Deviation 24).</w:t>
+        <w:t>Ablation of recipe r4:</w:t>
+      </w:r>
+      <w:r>
+        <w:t xml:space="preserve"> train with hard negatives only, to separate their effect from the side inputs'.</w:t>
       </w:r>
     </w:p>
     <w:p>
@@ -12753,10 +14444,10 @@
           <w:b/>
           <w:bCs/>
         </w:rPr>
-        <w:t>Ablation of recipe r4:</w:t>
-      </w:r>
-      <w:r>
-        <w:t xml:space="preserve"> train with hard negatives only, to separate their effect from the side inputs'.</w:t>
+        <w:t>A second receiving language model</w:t>
+      </w:r>
+      <w:r>
+        <w:t xml:space="preserve"> is left as future work.</w:t>
       </w:r>
     </w:p>
     <w:p>
@@ -12769,26 +14460,6 @@
         <w:spacing w:after="60"/>
       </w:pPr>
       <w:r>
-        <w:rPr>
-          <w:b/>
-          <w:bCs/>
-        </w:rPr>
-        <w:t>A second receiving language model</w:t>
-      </w:r>
-      <w:r>
-        <w:t xml:space="preserve"> is left as future work.</w:t>
-      </w:r>
-    </w:p>
-    <w:p>
-      <w:pPr>
-        <w:pStyle w:val="ListParagraph"/>
-        <w:numPr>
-          <w:ilvl w:val="0"/>
-          <w:numId w:val="3"/>
-        </w:numPr>
-        <w:spacing w:after="60"/>
-      </w:pPr>
-      <w:r>
         <w:t>Writing: present Phase 1 as a post-viva extension that strengthens the dissertation's evaluation (fair baselines, seeds, held-out patients) and carries the idea to multi-event reasoning; deviations summarised in one table.</w:t>
       </w:r>
     </w:p>
@@ -12806,11 +14477,11 @@
         <w:keepNext/>
         <w:keepLines/>
       </w:pPr>
-      <w:bookmarkStart w:id="22" w:name="_Toc241868664"/>
+      <w:bookmarkStart w:id="23" w:name="_Toc241873306"/>
       <w:r>
         <w:t>Appendix A. Pre-registered deviations</w:t>
       </w:r>
-      <w:bookmarkEnd w:id="22"/>
+      <w:bookmarkEnd w:id="23"/>
     </w:p>
     <w:tbl>
       <w:tblPr>
@@ -12827,7 +14498,7 @@
           <w:left w:w="10" w:type="dxa"/>
           <w:right w:w="10" w:type="dxa"/>
         </w:tblCellMar>
-        <w:tblLook w:val="0000" w:firstRow="0" w:lastRow="0" w:firstColumn="0" w:lastColumn="0" w:noHBand="0" w:noVBand="0"/>
+        <w:tblLook w:val="04A0" w:firstRow="1" w:lastRow="0" w:firstColumn="1" w:lastColumn="0" w:noHBand="0" w:noVBand="1"/>
       </w:tblPr>
       <w:tblGrid>
         <w:gridCol w:w="1000"/>
@@ -14698,7 +16369,7 @@
                 <w:sz w:val="19"/>
                 <w:szCs w:val="19"/>
               </w:rPr>
-              <w:t>23</w:t>
+              <w:t>23 / 23a</w:t>
             </w:r>
           </w:p>
         </w:tc>
@@ -14728,7 +16399,7 @@
                 <w:sz w:val="19"/>
                 <w:szCs w:val="19"/>
               </w:rPr>
-              <w:t>Serving conditions: batching, prefix caching, energy</w:t>
+              <w:t>Serving conditions: batching, prefix caching, energy; memory cap so that oversized batches are recorded, not paged</w:t>
             </w:r>
           </w:p>
         </w:tc>
@@ -14978,7 +16649,7 @@
           <w:sz w:val="18"/>
           <w:szCs w:val="18"/>
         </w:rPr>
-        <w:t>Table 11. Deviations 1–25 (full text in the analysis plan).</w:t>
+        <w:t>Table 12. Deviations 1–25 (full text in the analysis plan).</w:t>
       </w:r>
     </w:p>
     <w:sectPr>
@@ -15092,10 +16763,118 @@
 <file path=word/numbering.xml><?xml version="1.0" encoding="utf-8"?>
 <w:numbering xmlns:wpc="http://schemas.microsoft.com/office/word/2010/wordprocessingCanvas" xmlns:cx="http://schemas.microsoft.com/office/drawing/2014/chartex" xmlns:cx1="http://schemas.microsoft.com/office/drawing/2015/9/8/chartex" xmlns:cx2="http://schemas.microsoft.com/office/drawing/2015/10/21/chartex" xmlns:cx3="http://schemas.microsoft.com/office/drawing/2016/5/9/chartex" xmlns:cx4="http://schemas.microsoft.com/office/drawing/2016/5/10/chartex" xmlns:cx5="http://schemas.microsoft.com/office/drawing/2016/5/11/chartex" xmlns:cx6="http://schemas.microsoft.com/office/drawing/2016/5/12/chartex" xmlns:cx7="http://schemas.microsoft.com/office/drawing/2016/5/13/chartex" xmlns:cx8="http://schemas.microsoft.com/office/drawing/2016/5/14/chartex" xmlns:mc="http://schemas.openxmlformats.org/markup-compatibility/2006" xmlns:aink="http://schemas.microsoft.com/office/drawing/2016/ink" xmlns:am3d="http://schemas.microsoft.com/office/drawing/2017/model3d" xmlns:o="urn:schemas-microsoft-com:office:office" xmlns:oel="http://schemas.microsoft.com/office/2019/extlst" xmlns:r="http://schemas.openxmlformats.org/officeDocument/2006/relationships" xmlns:m="http://schemas.openxmlformats.org/officeDocument/2006/math" xmlns:v="urn:schemas-microsoft-com:vml" xmlns:wp14="http://schemas.microsoft.com/office/word/2010/wordprocessingDrawing" xmlns:wp="http://schemas.openxmlformats.org/drawingml/2006/wordprocessingDrawing" xmlns:w10="urn:schemas-microsoft-com:office:word" xmlns:w="http://schemas.openxmlformats.org/wordprocessingml/2006/main" xmlns:w14="http://schemas.microsoft.com/office/word/2010/wordml" xmlns:w15="http://schemas.microsoft.com/office/word/2012/wordml" xmlns:w16cex="http://schemas.microsoft.com/office/word/2018/wordml/cex" xmlns:w16cid="http://schemas.microsoft.com/office/word/2016/wordml/cid" xmlns:w16="http://schemas.microsoft.com/office/word/2018/wordml" xmlns:w16du="http://schemas.microsoft.com/office/word/2023/wordml/word16du" xmlns:w16sdtdh="http://schemas.microsoft.com/office/word/2020/wordml/sdtdatahash" xmlns:w16sdtfl="http://schemas.microsoft.com/office/word/2024/wordml/sdtformatlock" xmlns:w16se="http://schemas.microsoft.com/office/word/2015/wordml/symex" xmlns:wpg="http://schemas.microsoft.com/office/word/2010/wordprocessingGroup" xmlns:wpi="http://schemas.microsoft.com/office/word/2010/wordprocessingInk" xmlns:wne="http://schemas.microsoft.com/office/word/2006/wordml" xmlns:wps="http://schemas.microsoft.com/office/word/2010/wordprocessingShape" mc:Ignorable="w14 w15 w16se w16cid w16 w16cex w16sdtdh w16sdtfl w16du wp14">
   <w:abstractNum w:abstractNumId="0" w15:restartNumberingAfterBreak="0">
-    <w:nsid w:val="3639784D"/>
+    <w:nsid w:val="25D93E20"/>
     <w:multiLevelType w:val="hybridMultilevel"/>
-    <w:tmpl w:val="0BC4A012"/>
-    <w:lvl w:ilvl="0" w:tplc="79341AF2" w:tentative="1">
+    <w:tmpl w:val="43769BB6"/>
+    <w:lvl w:ilvl="0" w:tplc="20CEF748">
+      <w:start w:val="1"/>
+      <w:numFmt w:val="decimal"/>
+      <w:lvlText w:val="%1."/>
+      <w:lvlJc w:val="left"/>
+      <w:pPr>
+        <w:ind w:left="540" w:hanging="300"/>
+      </w:pPr>
+    </w:lvl>
+    <w:lvl w:ilvl="1" w:tplc="3EF472F2">
+      <w:numFmt w:val="decimal"/>
+      <w:lvlText w:val=""/>
+      <w:lvlJc w:val="left"/>
+    </w:lvl>
+    <w:lvl w:ilvl="2" w:tplc="45E6FB8C">
+      <w:numFmt w:val="decimal"/>
+      <w:lvlText w:val=""/>
+      <w:lvlJc w:val="left"/>
+    </w:lvl>
+    <w:lvl w:ilvl="3" w:tplc="C944BF26">
+      <w:numFmt w:val="decimal"/>
+      <w:lvlText w:val=""/>
+      <w:lvlJc w:val="left"/>
+    </w:lvl>
+    <w:lvl w:ilvl="4" w:tplc="91A4CB56">
+      <w:numFmt w:val="decimal"/>
+      <w:lvlText w:val=""/>
+      <w:lvlJc w:val="left"/>
+    </w:lvl>
+    <w:lvl w:ilvl="5" w:tplc="323ECD8C">
+      <w:numFmt w:val="decimal"/>
+      <w:lvlText w:val=""/>
+      <w:lvlJc w:val="left"/>
+    </w:lvl>
+    <w:lvl w:ilvl="6" w:tplc="0408211A">
+      <w:numFmt w:val="decimal"/>
+      <w:lvlText w:val=""/>
+      <w:lvlJc w:val="left"/>
+    </w:lvl>
+    <w:lvl w:ilvl="7" w:tplc="285A72F6">
+      <w:numFmt w:val="decimal"/>
+      <w:lvlText w:val=""/>
+      <w:lvlJc w:val="left"/>
+    </w:lvl>
+    <w:lvl w:ilvl="8" w:tplc="AD7855B2">
+      <w:numFmt w:val="decimal"/>
+      <w:lvlText w:val=""/>
+      <w:lvlJc w:val="left"/>
+    </w:lvl>
+  </w:abstractNum>
+  <w:abstractNum w:abstractNumId="1" w15:restartNumberingAfterBreak="0">
+    <w:nsid w:val="6BCF407D"/>
+    <w:multiLevelType w:val="hybridMultilevel"/>
+    <w:tmpl w:val="8C18EDE4"/>
+    <w:lvl w:ilvl="0" w:tplc="026AE59C">
+      <w:start w:val="1"/>
+      <w:numFmt w:val="bullet"/>
+      <w:lvlText w:val="•"/>
+      <w:lvlJc w:val="left"/>
+      <w:pPr>
+        <w:ind w:left="540" w:hanging="270"/>
+      </w:pPr>
+    </w:lvl>
+    <w:lvl w:ilvl="1" w:tplc="3E7EB68A">
+      <w:numFmt w:val="decimal"/>
+      <w:lvlText w:val=""/>
+      <w:lvlJc w:val="left"/>
+    </w:lvl>
+    <w:lvl w:ilvl="2" w:tplc="758E28FE">
+      <w:numFmt w:val="decimal"/>
+      <w:lvlText w:val=""/>
+      <w:lvlJc w:val="left"/>
+    </w:lvl>
+    <w:lvl w:ilvl="3" w:tplc="EAB47B34">
+      <w:numFmt w:val="decimal"/>
+      <w:lvlText w:val=""/>
+      <w:lvlJc w:val="left"/>
+    </w:lvl>
+    <w:lvl w:ilvl="4" w:tplc="1924D526">
+      <w:numFmt w:val="decimal"/>
+      <w:lvlText w:val=""/>
+      <w:lvlJc w:val="left"/>
+    </w:lvl>
+    <w:lvl w:ilvl="5" w:tplc="9E12BAF8">
+      <w:numFmt w:val="decimal"/>
+      <w:lvlText w:val=""/>
+      <w:lvlJc w:val="left"/>
+    </w:lvl>
+    <w:lvl w:ilvl="6" w:tplc="59D6C39A">
+      <w:numFmt w:val="decimal"/>
+      <w:lvlText w:val=""/>
+      <w:lvlJc w:val="left"/>
+    </w:lvl>
+    <w:lvl w:ilvl="7" w:tplc="A2783E9C">
+      <w:numFmt w:val="decimal"/>
+      <w:lvlText w:val=""/>
+      <w:lvlJc w:val="left"/>
+    </w:lvl>
+    <w:lvl w:ilvl="8" w:tplc="39DAE4B6">
+      <w:numFmt w:val="decimal"/>
+      <w:lvlText w:val=""/>
+      <w:lvlJc w:val="left"/>
+    </w:lvl>
+  </w:abstractNum>
+  <w:abstractNum w:abstractNumId="2" w15:restartNumberingAfterBreak="0">
+    <w:nsid w:val="7D68583E"/>
+    <w:multiLevelType w:val="hybridMultilevel"/>
+    <w:tmpl w:val="A078998E"/>
+    <w:lvl w:ilvl="0" w:tplc="798C79E2" w:tentative="1">
       <w:start w:val="1"/>
       <w:numFmt w:val="bullet"/>
       <w:lvlText w:val="●"/>
@@ -15104,7 +16883,7 @@
         <w:ind w:left="720" w:hanging="360"/>
       </w:pPr>
     </w:lvl>
-    <w:lvl w:ilvl="1" w:tplc="39F6E744" w:tentative="1">
+    <w:lvl w:ilvl="1" w:tplc="7444C926" w:tentative="1">
       <w:start w:val="1"/>
       <w:numFmt w:val="bullet"/>
       <w:lvlText w:val="○"/>
@@ -15113,7 +16892,7 @@
         <w:ind w:left="1440" w:hanging="360"/>
       </w:pPr>
     </w:lvl>
-    <w:lvl w:ilvl="2" w:tplc="DB1AEFA4" w:tentative="1">
+    <w:lvl w:ilvl="2" w:tplc="3D1EFA0E" w:tentative="1">
       <w:start w:val="1"/>
       <w:numFmt w:val="bullet"/>
       <w:lvlText w:val="■"/>
@@ -15122,7 +16901,7 @@
         <w:ind w:left="2160" w:hanging="360"/>
       </w:pPr>
     </w:lvl>
-    <w:lvl w:ilvl="3" w:tplc="FFC60604" w:tentative="1">
+    <w:lvl w:ilvl="3" w:tplc="AC40A448" w:tentative="1">
       <w:start w:val="1"/>
       <w:numFmt w:val="bullet"/>
       <w:lvlText w:val="●"/>
@@ -15131,7 +16910,7 @@
         <w:ind w:left="2880" w:hanging="360"/>
       </w:pPr>
     </w:lvl>
-    <w:lvl w:ilvl="4" w:tplc="324256DC" w:tentative="1">
+    <w:lvl w:ilvl="4" w:tplc="F2484194" w:tentative="1">
       <w:start w:val="1"/>
       <w:numFmt w:val="bullet"/>
       <w:lvlText w:val="○"/>
@@ -15140,7 +16919,7 @@
         <w:ind w:left="3600" w:hanging="360"/>
       </w:pPr>
     </w:lvl>
-    <w:lvl w:ilvl="5" w:tplc="C2642690" w:tentative="1">
+    <w:lvl w:ilvl="5" w:tplc="21146736" w:tentative="1">
       <w:start w:val="1"/>
       <w:numFmt w:val="bullet"/>
       <w:lvlText w:val="■"/>
@@ -15149,7 +16928,7 @@
         <w:ind w:left="4320" w:hanging="360"/>
       </w:pPr>
     </w:lvl>
-    <w:lvl w:ilvl="6" w:tplc="DA8CE0CA" w:tentative="1">
+    <w:lvl w:ilvl="6" w:tplc="FD66F30A" w:tentative="1">
       <w:start w:val="1"/>
       <w:numFmt w:val="bullet"/>
       <w:lvlText w:val="●"/>
@@ -15158,7 +16937,7 @@
         <w:ind w:left="5040" w:hanging="360"/>
       </w:pPr>
     </w:lvl>
-    <w:lvl w:ilvl="7" w:tplc="69EE679E" w:tentative="1">
+    <w:lvl w:ilvl="7" w:tplc="840ADD96" w:tentative="1">
       <w:start w:val="1"/>
       <w:numFmt w:val="bullet"/>
       <w:lvlText w:val="●"/>
@@ -15167,7 +16946,7 @@
         <w:ind w:left="5760" w:hanging="360"/>
       </w:pPr>
     </w:lvl>
-    <w:lvl w:ilvl="8" w:tplc="7B5ACC2A" w:tentative="1">
+    <w:lvl w:ilvl="8" w:tplc="413AD64A" w:tentative="1">
       <w:start w:val="1"/>
       <w:numFmt w:val="bullet"/>
       <w:lvlText w:val="●"/>
@@ -15177,128 +16956,20 @@
       </w:pPr>
     </w:lvl>
   </w:abstractNum>
-  <w:abstractNum w:abstractNumId="1" w15:restartNumberingAfterBreak="0">
-    <w:nsid w:val="3FC413AF"/>
-    <w:multiLevelType w:val="hybridMultilevel"/>
-    <w:tmpl w:val="88F823E8"/>
-    <w:lvl w:ilvl="0" w:tplc="E0BC4F72">
-      <w:start w:val="1"/>
-      <w:numFmt w:val="decimal"/>
-      <w:lvlText w:val="%1."/>
-      <w:lvlJc w:val="left"/>
-      <w:pPr>
-        <w:ind w:left="540" w:hanging="300"/>
-      </w:pPr>
-    </w:lvl>
-    <w:lvl w:ilvl="1" w:tplc="29449AF8">
-      <w:numFmt w:val="decimal"/>
-      <w:lvlText w:val=""/>
-      <w:lvlJc w:val="left"/>
-    </w:lvl>
-    <w:lvl w:ilvl="2" w:tplc="AD26F52A">
-      <w:numFmt w:val="decimal"/>
-      <w:lvlText w:val=""/>
-      <w:lvlJc w:val="left"/>
-    </w:lvl>
-    <w:lvl w:ilvl="3" w:tplc="DA8E3B64">
-      <w:numFmt w:val="decimal"/>
-      <w:lvlText w:val=""/>
-      <w:lvlJc w:val="left"/>
-    </w:lvl>
-    <w:lvl w:ilvl="4" w:tplc="FE325C50">
-      <w:numFmt w:val="decimal"/>
-      <w:lvlText w:val=""/>
-      <w:lvlJc w:val="left"/>
-    </w:lvl>
-    <w:lvl w:ilvl="5" w:tplc="C0D2F3E0">
-      <w:numFmt w:val="decimal"/>
-      <w:lvlText w:val=""/>
-      <w:lvlJc w:val="left"/>
-    </w:lvl>
-    <w:lvl w:ilvl="6" w:tplc="5CE422B0">
-      <w:numFmt w:val="decimal"/>
-      <w:lvlText w:val=""/>
-      <w:lvlJc w:val="left"/>
-    </w:lvl>
-    <w:lvl w:ilvl="7" w:tplc="1F86B784">
-      <w:numFmt w:val="decimal"/>
-      <w:lvlText w:val=""/>
-      <w:lvlJc w:val="left"/>
-    </w:lvl>
-    <w:lvl w:ilvl="8" w:tplc="C1E2B430">
-      <w:numFmt w:val="decimal"/>
-      <w:lvlText w:val=""/>
-      <w:lvlJc w:val="left"/>
-    </w:lvl>
-  </w:abstractNum>
-  <w:abstractNum w:abstractNumId="2" w15:restartNumberingAfterBreak="0">
-    <w:nsid w:val="590D103C"/>
-    <w:multiLevelType w:val="hybridMultilevel"/>
-    <w:tmpl w:val="01A8DED8"/>
-    <w:lvl w:ilvl="0" w:tplc="BA0AC312">
-      <w:start w:val="1"/>
-      <w:numFmt w:val="bullet"/>
-      <w:lvlText w:val="•"/>
-      <w:lvlJc w:val="left"/>
-      <w:pPr>
-        <w:ind w:left="540" w:hanging="270"/>
-      </w:pPr>
-    </w:lvl>
-    <w:lvl w:ilvl="1" w:tplc="06207B9C">
-      <w:numFmt w:val="decimal"/>
-      <w:lvlText w:val=""/>
-      <w:lvlJc w:val="left"/>
-    </w:lvl>
-    <w:lvl w:ilvl="2" w:tplc="8710D13A">
-      <w:numFmt w:val="decimal"/>
-      <w:lvlText w:val=""/>
-      <w:lvlJc w:val="left"/>
-    </w:lvl>
-    <w:lvl w:ilvl="3" w:tplc="32C2B546">
-      <w:numFmt w:val="decimal"/>
-      <w:lvlText w:val=""/>
-      <w:lvlJc w:val="left"/>
-    </w:lvl>
-    <w:lvl w:ilvl="4" w:tplc="C0423714">
-      <w:numFmt w:val="decimal"/>
-      <w:lvlText w:val=""/>
-      <w:lvlJc w:val="left"/>
-    </w:lvl>
-    <w:lvl w:ilvl="5" w:tplc="65EC9438">
-      <w:numFmt w:val="decimal"/>
-      <w:lvlText w:val=""/>
-      <w:lvlJc w:val="left"/>
-    </w:lvl>
-    <w:lvl w:ilvl="6" w:tplc="B510CC36">
-      <w:numFmt w:val="decimal"/>
-      <w:lvlText w:val=""/>
-      <w:lvlJc w:val="left"/>
-    </w:lvl>
-    <w:lvl w:ilvl="7" w:tplc="EFE4A26A">
-      <w:numFmt w:val="decimal"/>
-      <w:lvlText w:val=""/>
-      <w:lvlJc w:val="left"/>
-    </w:lvl>
-    <w:lvl w:ilvl="8" w:tplc="5CC466EC">
-      <w:numFmt w:val="decimal"/>
-      <w:lvlText w:val=""/>
-      <w:lvlJc w:val="left"/>
-    </w:lvl>
-  </w:abstractNum>
-  <w:num w:numId="1" w16cid:durableId="660692202">
-    <w:abstractNumId w:val="0"/>
-    <w:lvlOverride w:ilvl="0">
-      <w:startOverride w:val="1"/>
-    </w:lvlOverride>
-  </w:num>
-  <w:num w:numId="2" w16cid:durableId="987974125">
+  <w:num w:numId="1" w16cid:durableId="1386680904">
     <w:abstractNumId w:val="2"/>
     <w:lvlOverride w:ilvl="0">
       <w:startOverride w:val="1"/>
     </w:lvlOverride>
   </w:num>
-  <w:num w:numId="3" w16cid:durableId="627053673">
+  <w:num w:numId="2" w16cid:durableId="2128699132">
     <w:abstractNumId w:val="1"/>
+    <w:lvlOverride w:ilvl="0">
+      <w:startOverride w:val="1"/>
+    </w:lvlOverride>
+  </w:num>
+  <w:num w:numId="3" w16cid:durableId="1118648276">
+    <w:abstractNumId w:val="0"/>
     <w:lvlOverride w:ilvl="0">
       <w:startOverride w:val="1"/>
     </w:lvlOverride>
@@ -15935,7 +17606,7 @@
     <w:autoRedefine/>
     <w:uiPriority w:val="39"/>
     <w:unhideWhenUsed/>
-    <w:rsid w:val="00313AE0"/>
+    <w:rsid w:val="004C5131"/>
     <w:pPr>
       <w:spacing w:after="100"/>
     </w:pPr>
@@ -15947,7 +17618,7 @@
     <w:autoRedefine/>
     <w:uiPriority w:val="39"/>
     <w:unhideWhenUsed/>
-    <w:rsid w:val="00313AE0"/>
+    <w:rsid w:val="004C5131"/>
     <w:pPr>
       <w:spacing w:after="100"/>
       <w:ind w:left="210"/>

</xml_diff>

<commit_message>
Supervisor report: Section 10 (r4 ablation, compression with three seeds, Figure 12); corrected false-alarm attribution; RQs, limitations, next steps, Deviations 26-27
Co-Authored-By: Claude Opus 5.5 <noreply@anthropic.com>
</commit_message>
<xml_diff>
--- a/reports/Phase1_Technical_Report.docx
+++ b/reports/Phase1_Technical_Report.docx
@@ -56,7 +56,7 @@
         <w:t>Date:</w:t>
       </w:r>
       <w:r>
-        <w:t xml:space="preserve"> 2 October 2026 (updated with the filtered-text baseline, a second sender architecture and serving measurements)</w:t>
+        <w:t xml:space="preserve"> 4 October 2026 (updated with the filtered-text baseline, a second sender, serving measurements, the r4 ablation and the compression study)</w:t>
       </w:r>
     </w:p>
     <w:p>
@@ -82,7 +82,7 @@
     <w:sdt>
       <w:sdtPr>
         <w:alias w:val="Contents"/>
-        <w:id w:val="-997033917"/>
+        <w:id w:val="437723479"/>
       </w:sdtPr>
       <w:sdtEndPr/>
       <w:sdtContent>
@@ -110,7 +110,7 @@
           <w:r>
             <w:fldChar w:fldCharType="separate"/>
           </w:r>
-          <w:hyperlink w:anchor="_Toc241873283" w:history="1">
+          <w:hyperlink w:anchor="_Toc242030823" w:history="1">
             <w:r>
               <w:rPr>
                 <w:rStyle w:val="Hyperlink"/>
@@ -134,7 +134,7 @@
               <w:rPr>
                 <w:noProof/>
               </w:rPr>
-              <w:instrText xml:space="preserve"> PAGEREF _Toc241873283 \h </w:instrText>
+              <w:instrText xml:space="preserve"> PAGEREF _Toc242030823 \h </w:instrText>
             </w:r>
             <w:r>
               <w:rPr>
@@ -151,7 +151,7 @@
               <w:rPr>
                 <w:noProof/>
               </w:rPr>
-              <w:t>2</w:t>
+              <w:t>3</w:t>
             </w:r>
             <w:r>
               <w:rPr>
@@ -176,7 +176,7 @@
               <w14:ligatures w14:val="standardContextual"/>
             </w:rPr>
           </w:pPr>
-          <w:hyperlink w:anchor="_Toc241873284" w:history="1">
+          <w:hyperlink w:anchor="_Toc242030824" w:history="1">
             <w:r>
               <w:rPr>
                 <w:rStyle w:val="Hyperlink"/>
@@ -200,7 +200,7 @@
               <w:rPr>
                 <w:noProof/>
               </w:rPr>
-              <w:instrText xml:space="preserve"> PAGEREF _Toc241873284 \h </w:instrText>
+              <w:instrText xml:space="preserve"> PAGEREF _Toc242030824 \h </w:instrText>
             </w:r>
             <w:r>
               <w:rPr>
@@ -217,7 +217,7 @@
               <w:rPr>
                 <w:noProof/>
               </w:rPr>
-              <w:t>3</w:t>
+              <w:t>4</w:t>
             </w:r>
             <w:r>
               <w:rPr>
@@ -242,7 +242,7 @@
               <w14:ligatures w14:val="standardContextual"/>
             </w:rPr>
           </w:pPr>
-          <w:hyperlink w:anchor="_Toc241873285" w:history="1">
+          <w:hyperlink w:anchor="_Toc242030825" w:history="1">
             <w:r>
               <w:rPr>
                 <w:rStyle w:val="Hyperlink"/>
@@ -266,7 +266,7 @@
               <w:rPr>
                 <w:noProof/>
               </w:rPr>
-              <w:instrText xml:space="preserve"> PAGEREF _Toc241873285 \h </w:instrText>
+              <w:instrText xml:space="preserve"> PAGEREF _Toc242030825 \h </w:instrText>
             </w:r>
             <w:r>
               <w:rPr>
@@ -283,7 +283,7 @@
               <w:rPr>
                 <w:noProof/>
               </w:rPr>
-              <w:t>3</w:t>
+              <w:t>4</w:t>
             </w:r>
             <w:r>
               <w:rPr>
@@ -308,7 +308,7 @@
               <w14:ligatures w14:val="standardContextual"/>
             </w:rPr>
           </w:pPr>
-          <w:hyperlink w:anchor="_Toc241873286" w:history="1">
+          <w:hyperlink w:anchor="_Toc242030826" w:history="1">
             <w:r>
               <w:rPr>
                 <w:rStyle w:val="Hyperlink"/>
@@ -332,7 +332,7 @@
               <w:rPr>
                 <w:noProof/>
               </w:rPr>
-              <w:instrText xml:space="preserve"> PAGEREF _Toc241873286 \h </w:instrText>
+              <w:instrText xml:space="preserve"> PAGEREF _Toc242030826 \h </w:instrText>
             </w:r>
             <w:r>
               <w:rPr>
@@ -349,7 +349,7 @@
               <w:rPr>
                 <w:noProof/>
               </w:rPr>
-              <w:t>3</w:t>
+              <w:t>5</w:t>
             </w:r>
             <w:r>
               <w:rPr>
@@ -374,7 +374,7 @@
               <w14:ligatures w14:val="standardContextual"/>
             </w:rPr>
           </w:pPr>
-          <w:hyperlink w:anchor="_Toc241873287" w:history="1">
+          <w:hyperlink w:anchor="_Toc242030827" w:history="1">
             <w:r>
               <w:rPr>
                 <w:rStyle w:val="Hyperlink"/>
@@ -398,7 +398,7 @@
               <w:rPr>
                 <w:noProof/>
               </w:rPr>
-              <w:instrText xml:space="preserve"> PAGEREF _Toc241873287 \h </w:instrText>
+              <w:instrText xml:space="preserve"> PAGEREF _Toc242030827 \h </w:instrText>
             </w:r>
             <w:r>
               <w:rPr>
@@ -415,7 +415,7 @@
               <w:rPr>
                 <w:noProof/>
               </w:rPr>
-              <w:t>4</w:t>
+              <w:t>6</w:t>
             </w:r>
             <w:r>
               <w:rPr>
@@ -440,7 +440,7 @@
               <w14:ligatures w14:val="standardContextual"/>
             </w:rPr>
           </w:pPr>
-          <w:hyperlink w:anchor="_Toc241873288" w:history="1">
+          <w:hyperlink w:anchor="_Toc242030828" w:history="1">
             <w:r>
               <w:rPr>
                 <w:rStyle w:val="Hyperlink"/>
@@ -464,7 +464,7 @@
               <w:rPr>
                 <w:noProof/>
               </w:rPr>
-              <w:instrText xml:space="preserve"> PAGEREF _Toc241873288 \h </w:instrText>
+              <w:instrText xml:space="preserve"> PAGEREF _Toc242030828 \h </w:instrText>
             </w:r>
             <w:r>
               <w:rPr>
@@ -481,7 +481,7 @@
               <w:rPr>
                 <w:noProof/>
               </w:rPr>
-              <w:t>5</w:t>
+              <w:t>6</w:t>
             </w:r>
             <w:r>
               <w:rPr>
@@ -506,7 +506,7 @@
               <w14:ligatures w14:val="standardContextual"/>
             </w:rPr>
           </w:pPr>
-          <w:hyperlink w:anchor="_Toc241873289" w:history="1">
+          <w:hyperlink w:anchor="_Toc242030829" w:history="1">
             <w:r>
               <w:rPr>
                 <w:rStyle w:val="Hyperlink"/>
@@ -530,7 +530,7 @@
               <w:rPr>
                 <w:noProof/>
               </w:rPr>
-              <w:instrText xml:space="preserve"> PAGEREF _Toc241873289 \h </w:instrText>
+              <w:instrText xml:space="preserve"> PAGEREF _Toc242030829 \h </w:instrText>
             </w:r>
             <w:r>
               <w:rPr>
@@ -547,7 +547,7 @@
               <w:rPr>
                 <w:noProof/>
               </w:rPr>
-              <w:t>5</w:t>
+              <w:t>6</w:t>
             </w:r>
             <w:r>
               <w:rPr>
@@ -572,7 +572,7 @@
               <w14:ligatures w14:val="standardContextual"/>
             </w:rPr>
           </w:pPr>
-          <w:hyperlink w:anchor="_Toc241873290" w:history="1">
+          <w:hyperlink w:anchor="_Toc242030830" w:history="1">
             <w:r>
               <w:rPr>
                 <w:rStyle w:val="Hyperlink"/>
@@ -596,7 +596,7 @@
               <w:rPr>
                 <w:noProof/>
               </w:rPr>
-              <w:instrText xml:space="preserve"> PAGEREF _Toc241873290 \h </w:instrText>
+              <w:instrText xml:space="preserve"> PAGEREF _Toc242030830 \h </w:instrText>
             </w:r>
             <w:r>
               <w:rPr>
@@ -613,7 +613,7 @@
               <w:rPr>
                 <w:noProof/>
               </w:rPr>
-              <w:t>5</w:t>
+              <w:t>7</w:t>
             </w:r>
             <w:r>
               <w:rPr>
@@ -638,7 +638,7 @@
               <w14:ligatures w14:val="standardContextual"/>
             </w:rPr>
           </w:pPr>
-          <w:hyperlink w:anchor="_Toc241873291" w:history="1">
+          <w:hyperlink w:anchor="_Toc242030831" w:history="1">
             <w:r>
               <w:rPr>
                 <w:rStyle w:val="Hyperlink"/>
@@ -662,7 +662,7 @@
               <w:rPr>
                 <w:noProof/>
               </w:rPr>
-              <w:instrText xml:space="preserve"> PAGEREF _Toc241873291 \h </w:instrText>
+              <w:instrText xml:space="preserve"> PAGEREF _Toc242030831 \h </w:instrText>
             </w:r>
             <w:r>
               <w:rPr>
@@ -679,7 +679,7 @@
               <w:rPr>
                 <w:noProof/>
               </w:rPr>
-              <w:t>6</w:t>
+              <w:t>7</w:t>
             </w:r>
             <w:r>
               <w:rPr>
@@ -704,7 +704,7 @@
               <w14:ligatures w14:val="standardContextual"/>
             </w:rPr>
           </w:pPr>
-          <w:hyperlink w:anchor="_Toc241873292" w:history="1">
+          <w:hyperlink w:anchor="_Toc242030832" w:history="1">
             <w:r>
               <w:rPr>
                 <w:rStyle w:val="Hyperlink"/>
@@ -728,7 +728,7 @@
               <w:rPr>
                 <w:noProof/>
               </w:rPr>
-              <w:instrText xml:space="preserve"> PAGEREF _Toc241873292 \h </w:instrText>
+              <w:instrText xml:space="preserve"> PAGEREF _Toc242030832 \h </w:instrText>
             </w:r>
             <w:r>
               <w:rPr>
@@ -745,7 +745,7 @@
               <w:rPr>
                 <w:noProof/>
               </w:rPr>
-              <w:t>6</w:t>
+              <w:t>8</w:t>
             </w:r>
             <w:r>
               <w:rPr>
@@ -770,7 +770,7 @@
               <w14:ligatures w14:val="standardContextual"/>
             </w:rPr>
           </w:pPr>
-          <w:hyperlink w:anchor="_Toc241873293" w:history="1">
+          <w:hyperlink w:anchor="_Toc242030833" w:history="1">
             <w:r>
               <w:rPr>
                 <w:rStyle w:val="Hyperlink"/>
@@ -794,7 +794,7 @@
               <w:rPr>
                 <w:noProof/>
               </w:rPr>
-              <w:instrText xml:space="preserve"> PAGEREF _Toc241873293 \h </w:instrText>
+              <w:instrText xml:space="preserve"> PAGEREF _Toc242030833 \h </w:instrText>
             </w:r>
             <w:r>
               <w:rPr>
@@ -811,7 +811,7 @@
               <w:rPr>
                 <w:noProof/>
               </w:rPr>
-              <w:t>7</w:t>
+              <w:t>8</w:t>
             </w:r>
             <w:r>
               <w:rPr>
@@ -836,7 +836,7 @@
               <w14:ligatures w14:val="standardContextual"/>
             </w:rPr>
           </w:pPr>
-          <w:hyperlink w:anchor="_Toc241873294" w:history="1">
+          <w:hyperlink w:anchor="_Toc242030834" w:history="1">
             <w:r>
               <w:rPr>
                 <w:rStyle w:val="Hyperlink"/>
@@ -860,7 +860,7 @@
               <w:rPr>
                 <w:noProof/>
               </w:rPr>
-              <w:instrText xml:space="preserve"> PAGEREF _Toc241873294 \h </w:instrText>
+              <w:instrText xml:space="preserve"> PAGEREF _Toc242030834 \h </w:instrText>
             </w:r>
             <w:r>
               <w:rPr>
@@ -877,7 +877,7 @@
               <w:rPr>
                 <w:noProof/>
               </w:rPr>
-              <w:t>8</w:t>
+              <w:t>9</w:t>
             </w:r>
             <w:r>
               <w:rPr>
@@ -902,7 +902,7 @@
               <w14:ligatures w14:val="standardContextual"/>
             </w:rPr>
           </w:pPr>
-          <w:hyperlink w:anchor="_Toc241873295" w:history="1">
+          <w:hyperlink w:anchor="_Toc242030835" w:history="1">
             <w:r>
               <w:rPr>
                 <w:rStyle w:val="Hyperlink"/>
@@ -926,7 +926,7 @@
               <w:rPr>
                 <w:noProof/>
               </w:rPr>
-              <w:instrText xml:space="preserve"> PAGEREF _Toc241873295 \h </w:instrText>
+              <w:instrText xml:space="preserve"> PAGEREF _Toc242030835 \h </w:instrText>
             </w:r>
             <w:r>
               <w:rPr>
@@ -943,7 +943,7 @@
               <w:rPr>
                 <w:noProof/>
               </w:rPr>
-              <w:t>8</w:t>
+              <w:t>9</w:t>
             </w:r>
             <w:r>
               <w:rPr>
@@ -968,7 +968,7 @@
               <w14:ligatures w14:val="standardContextual"/>
             </w:rPr>
           </w:pPr>
-          <w:hyperlink w:anchor="_Toc241873296" w:history="1">
+          <w:hyperlink w:anchor="_Toc242030836" w:history="1">
             <w:r>
               <w:rPr>
                 <w:rStyle w:val="Hyperlink"/>
@@ -992,7 +992,7 @@
               <w:rPr>
                 <w:noProof/>
               </w:rPr>
-              <w:instrText xml:space="preserve"> PAGEREF _Toc241873296 \h </w:instrText>
+              <w:instrText xml:space="preserve"> PAGEREF _Toc242030836 \h </w:instrText>
             </w:r>
             <w:r>
               <w:rPr>
@@ -1009,7 +1009,7 @@
               <w:rPr>
                 <w:noProof/>
               </w:rPr>
-              <w:t>8</w:t>
+              <w:t>10</w:t>
             </w:r>
             <w:r>
               <w:rPr>
@@ -1034,7 +1034,7 @@
               <w14:ligatures w14:val="standardContextual"/>
             </w:rPr>
           </w:pPr>
-          <w:hyperlink w:anchor="_Toc241873297" w:history="1">
+          <w:hyperlink w:anchor="_Toc242030837" w:history="1">
             <w:r>
               <w:rPr>
                 <w:rStyle w:val="Hyperlink"/>
@@ -1058,7 +1058,7 @@
               <w:rPr>
                 <w:noProof/>
               </w:rPr>
-              <w:instrText xml:space="preserve"> PAGEREF _Toc241873297 \h </w:instrText>
+              <w:instrText xml:space="preserve"> PAGEREF _Toc242030837 \h </w:instrText>
             </w:r>
             <w:r>
               <w:rPr>
@@ -1075,7 +1075,7 @@
               <w:rPr>
                 <w:noProof/>
               </w:rPr>
-              <w:t>9</w:t>
+              <w:t>10</w:t>
             </w:r>
             <w:r>
               <w:rPr>
@@ -1100,7 +1100,7 @@
               <w14:ligatures w14:val="standardContextual"/>
             </w:rPr>
           </w:pPr>
-          <w:hyperlink w:anchor="_Toc241873298" w:history="1">
+          <w:hyperlink w:anchor="_Toc242030838" w:history="1">
             <w:r>
               <w:rPr>
                 <w:rStyle w:val="Hyperlink"/>
@@ -1124,7 +1124,7 @@
               <w:rPr>
                 <w:noProof/>
               </w:rPr>
-              <w:instrText xml:space="preserve"> PAGEREF _Toc241873298 \h </w:instrText>
+              <w:instrText xml:space="preserve"> PAGEREF _Toc242030838 \h </w:instrText>
             </w:r>
             <w:r>
               <w:rPr>
@@ -1141,7 +1141,7 @@
               <w:rPr>
                 <w:noProof/>
               </w:rPr>
-              <w:t>10</w:t>
+              <w:t>11</w:t>
             </w:r>
             <w:r>
               <w:rPr>
@@ -1166,7 +1166,7 @@
               <w14:ligatures w14:val="standardContextual"/>
             </w:rPr>
           </w:pPr>
-          <w:hyperlink w:anchor="_Toc241873299" w:history="1">
+          <w:hyperlink w:anchor="_Toc242030839" w:history="1">
             <w:r>
               <w:rPr>
                 <w:rStyle w:val="Hyperlink"/>
@@ -1190,7 +1190,7 @@
               <w:rPr>
                 <w:noProof/>
               </w:rPr>
-              <w:instrText xml:space="preserve"> PAGEREF _Toc241873299 \h </w:instrText>
+              <w:instrText xml:space="preserve"> PAGEREF _Toc242030839 \h </w:instrText>
             </w:r>
             <w:r>
               <w:rPr>
@@ -1207,7 +1207,7 @@
               <w:rPr>
                 <w:noProof/>
               </w:rPr>
-              <w:t>11</w:t>
+              <w:t>12</w:t>
             </w:r>
             <w:r>
               <w:rPr>
@@ -1232,7 +1232,7 @@
               <w14:ligatures w14:val="standardContextual"/>
             </w:rPr>
           </w:pPr>
-          <w:hyperlink w:anchor="_Toc241873300" w:history="1">
+          <w:hyperlink w:anchor="_Toc242030840" w:history="1">
             <w:r>
               <w:rPr>
                 <w:rStyle w:val="Hyperlink"/>
@@ -1256,7 +1256,7 @@
               <w:rPr>
                 <w:noProof/>
               </w:rPr>
-              <w:instrText xml:space="preserve"> PAGEREF _Toc241873300 \h </w:instrText>
+              <w:instrText xml:space="preserve"> PAGEREF _Toc242030840 \h </w:instrText>
             </w:r>
             <w:r>
               <w:rPr>
@@ -1273,7 +1273,7 @@
               <w:rPr>
                 <w:noProof/>
               </w:rPr>
-              <w:t>11</w:t>
+              <w:t>12</w:t>
             </w:r>
             <w:r>
               <w:rPr>
@@ -1298,7 +1298,7 @@
               <w14:ligatures w14:val="standardContextual"/>
             </w:rPr>
           </w:pPr>
-          <w:hyperlink w:anchor="_Toc241873301" w:history="1">
+          <w:hyperlink w:anchor="_Toc242030841" w:history="1">
             <w:r>
               <w:rPr>
                 <w:rStyle w:val="Hyperlink"/>
@@ -1322,7 +1322,7 @@
               <w:rPr>
                 <w:noProof/>
               </w:rPr>
-              <w:instrText xml:space="preserve"> PAGEREF _Toc241873301 \h </w:instrText>
+              <w:instrText xml:space="preserve"> PAGEREF _Toc242030841 \h </w:instrText>
             </w:r>
             <w:r>
               <w:rPr>
@@ -1339,7 +1339,7 @@
               <w:rPr>
                 <w:noProof/>
               </w:rPr>
-              <w:t>12</w:t>
+              <w:t>13</w:t>
             </w:r>
             <w:r>
               <w:rPr>
@@ -1364,7 +1364,7 @@
               <w14:ligatures w14:val="standardContextual"/>
             </w:rPr>
           </w:pPr>
-          <w:hyperlink w:anchor="_Toc241873302" w:history="1">
+          <w:hyperlink w:anchor="_Toc242030842" w:history="1">
             <w:r>
               <w:rPr>
                 <w:rStyle w:val="Hyperlink"/>
@@ -1388,7 +1388,7 @@
               <w:rPr>
                 <w:noProof/>
               </w:rPr>
-              <w:instrText xml:space="preserve"> PAGEREF _Toc241873302 \h </w:instrText>
+              <w:instrText xml:space="preserve"> PAGEREF _Toc242030842 \h </w:instrText>
             </w:r>
             <w:r>
               <w:rPr>
@@ -1405,7 +1405,7 @@
               <w:rPr>
                 <w:noProof/>
               </w:rPr>
-              <w:t>13</w:t>
+              <w:t>14</w:t>
             </w:r>
             <w:r>
               <w:rPr>
@@ -1430,13 +1430,13 @@
               <w14:ligatures w14:val="standardContextual"/>
             </w:rPr>
           </w:pPr>
-          <w:hyperlink w:anchor="_Toc241873303" w:history="1">
+          <w:hyperlink w:anchor="_Toc242030843" w:history="1">
             <w:r>
               <w:rPr>
                 <w:rStyle w:val="Hyperlink"/>
                 <w:noProof/>
               </w:rPr>
-              <w:t>10. Status of the research questions</w:t>
+              <w:t>10. What the channel needs: ablation and compression (Deviations 24, 26, 27)</w:t>
             </w:r>
             <w:r>
               <w:rPr>
@@ -1454,7 +1454,7 @@
               <w:rPr>
                 <w:noProof/>
               </w:rPr>
-              <w:instrText xml:space="preserve"> PAGEREF _Toc241873303 \h </w:instrText>
+              <w:instrText xml:space="preserve"> PAGEREF _Toc242030843 \h </w:instrText>
             </w:r>
             <w:r>
               <w:rPr>
@@ -1471,7 +1471,139 @@
               <w:rPr>
                 <w:noProof/>
               </w:rPr>
-              <w:t>14</w:t>
+              <w:t>15</w:t>
+            </w:r>
+            <w:r>
+              <w:rPr>
+                <w:noProof/>
+              </w:rPr>
+              <w:fldChar w:fldCharType="end"/>
+            </w:r>
+          </w:hyperlink>
+        </w:p>
+        <w:p>
+          <w:pPr>
+            <w:pStyle w:val="TOC2"/>
+            <w:tabs>
+              <w:tab w:val="right" w:leader="dot" w:pos="9016"/>
+            </w:tabs>
+            <w:rPr>
+              <w:rFonts w:asciiTheme="minorHAnsi" w:eastAsiaTheme="minorEastAsia" w:hAnsiTheme="minorHAnsi" w:cstheme="minorBidi"/>
+              <w:noProof/>
+              <w:kern w:val="2"/>
+              <w:sz w:val="24"/>
+              <w:szCs w:val="24"/>
+              <w14:ligatures w14:val="standardContextual"/>
+            </w:rPr>
+          </w:pPr>
+          <w:hyperlink w:anchor="_Toc242030844" w:history="1">
+            <w:r>
+              <w:rPr>
+                <w:rStyle w:val="Hyperlink"/>
+                <w:noProof/>
+              </w:rPr>
+              <w:t>10.1 Ablation of recipe r4</w:t>
+            </w:r>
+            <w:r>
+              <w:rPr>
+                <w:noProof/>
+              </w:rPr>
+              <w:tab/>
+            </w:r>
+            <w:r>
+              <w:rPr>
+                <w:noProof/>
+              </w:rPr>
+              <w:fldChar w:fldCharType="begin"/>
+            </w:r>
+            <w:r>
+              <w:rPr>
+                <w:noProof/>
+              </w:rPr>
+              <w:instrText xml:space="preserve"> PAGEREF _Toc242030844 \h </w:instrText>
+            </w:r>
+            <w:r>
+              <w:rPr>
+                <w:noProof/>
+              </w:rPr>
+            </w:r>
+            <w:r>
+              <w:rPr>
+                <w:noProof/>
+              </w:rPr>
+              <w:fldChar w:fldCharType="separate"/>
+            </w:r>
+            <w:r>
+              <w:rPr>
+                <w:noProof/>
+              </w:rPr>
+              <w:t>15</w:t>
+            </w:r>
+            <w:r>
+              <w:rPr>
+                <w:noProof/>
+              </w:rPr>
+              <w:fldChar w:fldCharType="end"/>
+            </w:r>
+          </w:hyperlink>
+        </w:p>
+        <w:p>
+          <w:pPr>
+            <w:pStyle w:val="TOC2"/>
+            <w:tabs>
+              <w:tab w:val="right" w:leader="dot" w:pos="9016"/>
+            </w:tabs>
+            <w:rPr>
+              <w:rFonts w:asciiTheme="minorHAnsi" w:eastAsiaTheme="minorEastAsia" w:hAnsiTheme="minorHAnsi" w:cstheme="minorBidi"/>
+              <w:noProof/>
+              <w:kern w:val="2"/>
+              <w:sz w:val="24"/>
+              <w:szCs w:val="24"/>
+              <w14:ligatures w14:val="standardContextual"/>
+            </w:rPr>
+          </w:pPr>
+          <w:hyperlink w:anchor="_Toc242030845" w:history="1">
+            <w:r>
+              <w:rPr>
+                <w:rStyle w:val="Hyperlink"/>
+                <w:noProof/>
+              </w:rPr>
+              <w:t>10.2 How many tokens per event?</w:t>
+            </w:r>
+            <w:r>
+              <w:rPr>
+                <w:noProof/>
+              </w:rPr>
+              <w:tab/>
+            </w:r>
+            <w:r>
+              <w:rPr>
+                <w:noProof/>
+              </w:rPr>
+              <w:fldChar w:fldCharType="begin"/>
+            </w:r>
+            <w:r>
+              <w:rPr>
+                <w:noProof/>
+              </w:rPr>
+              <w:instrText xml:space="preserve"> PAGEREF _Toc242030845 \h </w:instrText>
+            </w:r>
+            <w:r>
+              <w:rPr>
+                <w:noProof/>
+              </w:rPr>
+            </w:r>
+            <w:r>
+              <w:rPr>
+                <w:noProof/>
+              </w:rPr>
+              <w:fldChar w:fldCharType="separate"/>
+            </w:r>
+            <w:r>
+              <w:rPr>
+                <w:noProof/>
+              </w:rPr>
+              <w:t>15</w:t>
             </w:r>
             <w:r>
               <w:rPr>
@@ -1496,13 +1628,13 @@
               <w14:ligatures w14:val="standardContextual"/>
             </w:rPr>
           </w:pPr>
-          <w:hyperlink w:anchor="_Toc241873304" w:history="1">
+          <w:hyperlink w:anchor="_Toc242030846" w:history="1">
             <w:r>
               <w:rPr>
                 <w:rStyle w:val="Hyperlink"/>
                 <w:noProof/>
               </w:rPr>
-              <w:t>11. Limitations and threats to validity</w:t>
+              <w:t>11. Status of the research questions</w:t>
             </w:r>
             <w:r>
               <w:rPr>
@@ -1520,7 +1652,7 @@
               <w:rPr>
                 <w:noProof/>
               </w:rPr>
-              <w:instrText xml:space="preserve"> PAGEREF _Toc241873304 \h </w:instrText>
+              <w:instrText xml:space="preserve"> PAGEREF _Toc242030846 \h </w:instrText>
             </w:r>
             <w:r>
               <w:rPr>
@@ -1537,7 +1669,7 @@
               <w:rPr>
                 <w:noProof/>
               </w:rPr>
-              <w:t>14</w:t>
+              <w:t>17</w:t>
             </w:r>
             <w:r>
               <w:rPr>
@@ -1562,13 +1694,13 @@
               <w14:ligatures w14:val="standardContextual"/>
             </w:rPr>
           </w:pPr>
-          <w:hyperlink w:anchor="_Toc241873305" w:history="1">
+          <w:hyperlink w:anchor="_Toc242030847" w:history="1">
             <w:r>
               <w:rPr>
                 <w:rStyle w:val="Hyperlink"/>
                 <w:noProof/>
               </w:rPr>
-              <w:t>12. Proposed next steps</w:t>
+              <w:t>12. Limitations and threats to validity</w:t>
             </w:r>
             <w:r>
               <w:rPr>
@@ -1586,7 +1718,7 @@
               <w:rPr>
                 <w:noProof/>
               </w:rPr>
-              <w:instrText xml:space="preserve"> PAGEREF _Toc241873305 \h </w:instrText>
+              <w:instrText xml:space="preserve"> PAGEREF _Toc242030847 \h </w:instrText>
             </w:r>
             <w:r>
               <w:rPr>
@@ -1603,7 +1735,7 @@
               <w:rPr>
                 <w:noProof/>
               </w:rPr>
-              <w:t>15</w:t>
+              <w:t>17</w:t>
             </w:r>
             <w:r>
               <w:rPr>
@@ -1628,12 +1760,78 @@
               <w14:ligatures w14:val="standardContextual"/>
             </w:rPr>
           </w:pPr>
-          <w:hyperlink w:anchor="_Toc241873306" w:history="1">
+          <w:hyperlink w:anchor="_Toc242030848" w:history="1">
             <w:r>
               <w:rPr>
                 <w:rStyle w:val="Hyperlink"/>
                 <w:noProof/>
               </w:rPr>
+              <w:t>13. Proposed next steps</w:t>
+            </w:r>
+            <w:r>
+              <w:rPr>
+                <w:noProof/>
+              </w:rPr>
+              <w:tab/>
+            </w:r>
+            <w:r>
+              <w:rPr>
+                <w:noProof/>
+              </w:rPr>
+              <w:fldChar w:fldCharType="begin"/>
+            </w:r>
+            <w:r>
+              <w:rPr>
+                <w:noProof/>
+              </w:rPr>
+              <w:instrText xml:space="preserve"> PAGEREF _Toc242030848 \h </w:instrText>
+            </w:r>
+            <w:r>
+              <w:rPr>
+                <w:noProof/>
+              </w:rPr>
+            </w:r>
+            <w:r>
+              <w:rPr>
+                <w:noProof/>
+              </w:rPr>
+              <w:fldChar w:fldCharType="separate"/>
+            </w:r>
+            <w:r>
+              <w:rPr>
+                <w:noProof/>
+              </w:rPr>
+              <w:t>18</w:t>
+            </w:r>
+            <w:r>
+              <w:rPr>
+                <w:noProof/>
+              </w:rPr>
+              <w:fldChar w:fldCharType="end"/>
+            </w:r>
+          </w:hyperlink>
+        </w:p>
+        <w:p>
+          <w:pPr>
+            <w:pStyle w:val="TOC1"/>
+            <w:tabs>
+              <w:tab w:val="right" w:leader="dot" w:pos="9016"/>
+            </w:tabs>
+            <w:rPr>
+              <w:rFonts w:asciiTheme="minorHAnsi" w:eastAsiaTheme="minorEastAsia" w:hAnsiTheme="minorHAnsi" w:cstheme="minorBidi"/>
+              <w:noProof/>
+              <w:kern w:val="2"/>
+              <w:sz w:val="24"/>
+              <w:szCs w:val="24"/>
+              <w14:ligatures w14:val="standardContextual"/>
+            </w:rPr>
+          </w:pPr>
+          <w:hyperlink w:anchor="_Toc242030849" w:history="1">
+            <w:r>
+              <w:rPr>
+                <w:rStyle w:val="Hyperlink"/>
+                <w:noProof/>
+              </w:rPr>
               <w:t>Appendix A. Pre-registered deviations</w:t>
             </w:r>
             <w:r>
@@ -1652,7 +1850,7 @@
               <w:rPr>
                 <w:noProof/>
               </w:rPr>
-              <w:instrText xml:space="preserve"> PAGEREF _Toc241873306 \h </w:instrText>
+              <w:instrText xml:space="preserve"> PAGEREF _Toc242030849 \h </w:instrText>
             </w:r>
             <w:r>
               <w:rPr>
@@ -1669,7 +1867,7 @@
               <w:rPr>
                 <w:noProof/>
               </w:rPr>
-              <w:t>16</w:t>
+              <w:t>19</w:t>
             </w:r>
             <w:r>
               <w:rPr>
@@ -1697,7 +1895,7 @@
         <w:keepNext/>
         <w:keepLines/>
       </w:pPr>
-      <w:bookmarkStart w:id="0" w:name="_Toc241873283"/>
+      <w:bookmarkStart w:id="0" w:name="_Toc242030823"/>
       <w:r>
         <w:t>1. Executive summary</w:t>
       </w:r>
@@ -1801,7 +1999,7 @@
         <w:t>How the adapter reached this.</w:t>
       </w:r>
       <w:r>
-        <w:t xml:space="preserve"> The previous recipe (r3) matched calibrated text but did not beat it, and raised false alarms on about 11% of routine windows. Two targeted changes in r4 (training on hard routine examples, and passing heart rate, RR interval and run length alongside each event) cut false alarms to 3.6% and raised accuracy at every N. The headline is now </w:t>
+        <w:t xml:space="preserve"> The previous recipe (r3) matched calibrated text but did not beat it, and raised false alarms on about 11% of routine windows. Two targeted changes in r4 (training on hard routine examples, and passing heart rate, RR interval and run length alongside each event) cut false alarms to 3.6% and raised accuracy at every N. An ablation later showed that the side inputs account for most of this gain (Section 10). The headline is now </w:t>
       </w:r>
       <w:r>
         <w:rPr>
@@ -1908,10 +2106,33 @@
           <w:b/>
           <w:bCs/>
         </w:rPr>
+        <w:t>What the channel needs, and how small it can be.</w:t>
+      </w:r>
+      <w:r>
+        <w:t xml:space="preserve"> An ablation shows that passing heart rate, RR interval and run length with each event drives r4's improvement (accuracy +0.03 to +0.05; false alarms 8.6% to 3.6%), and those facts are recoverable from the tokens only when they are passed. A three-seed compression study shows that 4 tokens per event is the smallest setting at which every training run was reliable: with 1 token one run in three failed, and with 2 tokens accuracy was close but false alarms more than doubled, although the information remained </w:t>
+      </w:r>
+      <w:r>
+        <w:t>recoverable from the tokens in every case.</w:t>
+      </w:r>
+    </w:p>
+    <w:p>
+      <w:pPr>
+        <w:pStyle w:val="ListParagraph"/>
+        <w:numPr>
+          <w:ilvl w:val="0"/>
+          <w:numId w:val="2"/>
+        </w:numPr>
+        <w:spacing w:after="60"/>
+      </w:pPr>
+      <w:r>
+        <w:rPr>
+          <w:b/>
+          <w:bCs/>
+        </w:rPr>
         <w:t>Remaining weaknesses:</w:t>
       </w:r>
       <w:r>
-        <w:t xml:space="preserve"> the adapter still raises false alarms on 1–4% of routine windows where text raises none; filtered text is more accurate when the question is known in advance; the two r4 changes were made together, so their separate effects are not yet known; text remains better for a single event.</w:t>
+        <w:t xml:space="preserve"> the adapter still raises false alarms on 1–4% of routine windows where text raises none; filtered text is more accurate when the question is known in advance; text remains better for a single event.</w:t>
       </w:r>
     </w:p>
     <w:p>
@@ -1920,7 +2141,7 @@
         <w:keepNext/>
         <w:keepLines/>
       </w:pPr>
-      <w:bookmarkStart w:id="1" w:name="_Toc241873284"/>
+      <w:bookmarkStart w:id="1" w:name="_Toc242030824"/>
       <w:r>
         <w:t>2. Starting point: the dissertation</w:t>
       </w:r>
@@ -1949,7 +2170,7 @@
           <w:left w:w="10" w:type="dxa"/>
           <w:right w:w="10" w:type="dxa"/>
         </w:tblCellMar>
-        <w:tblLook w:val="04A0" w:firstRow="1" w:lastRow="0" w:firstColumn="1" w:lastColumn="0" w:noHBand="0" w:noVBand="1"/>
+        <w:tblLook w:val="0000" w:firstRow="0" w:lastRow="0" w:firstColumn="0" w:lastColumn="0" w:noHBand="0" w:noVBand="0"/>
       </w:tblPr>
       <w:tblGrid>
         <w:gridCol w:w="3400"/>
@@ -2501,7 +2722,7 @@
         <w:keepNext/>
         <w:keepLines/>
       </w:pPr>
-      <w:bookmarkStart w:id="2" w:name="_Toc241873285"/>
+      <w:bookmarkStart w:id="2" w:name="_Toc242030825"/>
       <w:r>
         <w:t>3. How Phase 1 was run</w:t>
       </w:r>
@@ -2613,7 +2834,7 @@
         <w:keepNext/>
         <w:keepLines/>
       </w:pPr>
-      <w:bookmarkStart w:id="3" w:name="_Toc241873286"/>
+      <w:bookmarkStart w:id="3" w:name="_Toc242030826"/>
       <w:r>
         <w:t>4. Weaknesses in the original evaluation and how Phase 1 addressed them</w:t>
       </w:r>
@@ -2642,7 +2863,7 @@
           <w:left w:w="10" w:type="dxa"/>
           <w:right w:w="10" w:type="dxa"/>
         </w:tblCellMar>
-        <w:tblLook w:val="04A0" w:firstRow="1" w:lastRow="0" w:firstColumn="1" w:lastColumn="0" w:noHBand="0" w:noVBand="1"/>
+        <w:tblLook w:val="0000" w:firstRow="0" w:lastRow="0" w:firstColumn="0" w:lastColumn="0" w:noHBand="0" w:noVBand="0"/>
       </w:tblPr>
       <w:tblGrid>
         <w:gridCol w:w="1900"/>
@@ -3479,7 +3700,7 @@
         <w:keepNext/>
         <w:keepLines/>
       </w:pPr>
-      <w:bookmarkStart w:id="4" w:name="_Toc241873287"/>
+      <w:bookmarkStart w:id="4" w:name="_Toc242030827"/>
       <w:r>
         <w:t>5. What changed in the system</w:t>
       </w:r>
@@ -3496,7 +3717,7 @@
           <w:noProof/>
         </w:rPr>
         <w:drawing>
-          <wp:inline distT="0" distB="0" distL="0" distR="0" wp14:anchorId="0CBAA114" wp14:editId="6EC22D91">
+          <wp:inline distT="0" distB="0" distL="0" distR="0" wp14:anchorId="3B2B38FE" wp14:editId="0436299D">
             <wp:extent cx="5762625" cy="2524125"/>
             <wp:effectExtent l="0" t="0" r="0" b="0"/>
             <wp:docPr id="1" name="fig1_pipeline.png" descr="Figure 1. Pipeline before (single event) and after Phase 1 (multi-event). The highlighted block is the component trained in this work." title="fig1_pipeline.png"/>
@@ -3556,7 +3777,7 @@
         <w:keepNext/>
         <w:keepLines/>
       </w:pPr>
-      <w:bookmarkStart w:id="5" w:name="_Toc241873288"/>
+      <w:bookmarkStart w:id="5" w:name="_Toc242030828"/>
       <w:r>
         <w:t>5.1 Perception: RR-timing branch</w:t>
       </w:r>
@@ -3585,7 +3806,7 @@
           <w:left w:w="10" w:type="dxa"/>
           <w:right w:w="10" w:type="dxa"/>
         </w:tblCellMar>
-        <w:tblLook w:val="04A0" w:firstRow="1" w:lastRow="0" w:firstColumn="1" w:lastColumn="0" w:noHBand="0" w:noVBand="1"/>
+        <w:tblLook w:val="0000" w:firstRow="0" w:lastRow="0" w:firstColumn="0" w:lastColumn="0" w:noHBand="0" w:noVBand="0"/>
       </w:tblPr>
       <w:tblGrid>
         <w:gridCol w:w="2500"/>
@@ -4414,7 +4635,7 @@
         <w:keepNext/>
         <w:keepLines/>
       </w:pPr>
-      <w:bookmarkStart w:id="6" w:name="_Toc241873289"/>
+      <w:bookmarkStart w:id="6" w:name="_Toc242030829"/>
       <w:r>
         <w:t>5.2 Multi-event adapter</w:t>
       </w:r>
@@ -4478,7 +4699,7 @@
         <w:keepNext/>
         <w:keepLines/>
       </w:pPr>
-      <w:bookmarkStart w:id="7" w:name="_Toc241873290"/>
+      <w:bookmarkStart w:id="7" w:name="_Toc242030830"/>
       <w:r>
         <w:t>5.3 Recipe r4: hard negatives and side inputs (final)</w:t>
       </w:r>
@@ -4567,6 +4788,26 @@
     </w:p>
     <w:p>
       <w:pPr>
+        <w:pStyle w:val="ListParagraph"/>
+        <w:numPr>
+          <w:ilvl w:val="0"/>
+          <w:numId w:val="2"/>
+        </w:numPr>
+        <w:spacing w:after="60"/>
+      </w:pPr>
+      <w:r>
+        <w:rPr>
+          <w:b/>
+          <w:bCs/>
+        </w:rPr>
+        <w:t>Which change mattered</w:t>
+      </w:r>
+      <w:r>
+        <w:t xml:space="preserve"> was tested afterwards with an ablation (Section 10): the side inputs account for most of the improvement, including most of the drop in false alarms; the hard negatives alone had little effect.</w:t>
+      </w:r>
+    </w:p>
+    <w:p>
+      <w:pPr>
         <w:keepNext/>
         <w:spacing w:before="120"/>
         <w:jc w:val="center"/>
@@ -4576,7 +4817,7 @@
           <w:noProof/>
         </w:rPr>
         <w:drawing>
-          <wp:inline distT="0" distB="0" distL="0" distR="0" wp14:anchorId="2A5B0173" wp14:editId="0053504E">
+          <wp:inline distT="0" distB="0" distL="0" distR="0" wp14:anchorId="2CE72E7F" wp14:editId="3BEF9C66">
             <wp:extent cx="5762625" cy="2657475"/>
             <wp:effectExtent l="0" t="0" r="0" b="0"/>
             <wp:docPr id="2" name="fig7_training_r4.png" descr="Figure 2. Validation balanced accuracy during training, recipe r4, three seeds. The best checkpoint per seed is selected on validation only; seed 303 was still improving when it reached the 3-epoch cap and was evaluated as pre-registered." title="fig7_training_r4.png"/>
@@ -4636,7 +4877,7 @@
         <w:keepNext/>
         <w:keepLines/>
       </w:pPr>
-      <w:bookmarkStart w:id="8" w:name="_Toc241873291"/>
+      <w:bookmarkStart w:id="8" w:name="_Toc242030831"/>
       <w:r>
         <w:t>5.4 Schema-constrained decoding</w:t>
       </w:r>
@@ -4656,7 +4897,7 @@
         <w:keepNext/>
         <w:keepLines/>
       </w:pPr>
-      <w:bookmarkStart w:id="9" w:name="_Toc241873292"/>
+      <w:bookmarkStart w:id="9" w:name="_Toc242030832"/>
       <w:r>
         <w:t>6. Efficiency results</w:t>
       </w:r>
@@ -4673,7 +4914,7 @@
           <w:noProof/>
         </w:rPr>
         <w:drawing>
-          <wp:inline distT="0" distB="0" distL="0" distR="0" wp14:anchorId="173C644E" wp14:editId="02E0BF03">
+          <wp:inline distT="0" distB="0" distL="0" distR="0" wp14:anchorId="724FBBDC" wp14:editId="77E6D9B5">
             <wp:extent cx="5762625" cy="1962150"/>
             <wp:effectExtent l="0" t="0" r="0" b="0"/>
             <wp:docPr id="3" name="fig2_latency.png" descr="Figure 3. Median latency per request (batch 1, 21 DS2 windows per N). Left: time to first token. Right: time until the urgency tier is generated (token 7 of the constrained answer)." title="fig2_latency.png"/>
@@ -4742,7 +4983,7 @@
           <w:left w:w="10" w:type="dxa"/>
           <w:right w:w="10" w:type="dxa"/>
         </w:tblCellMar>
-        <w:tblLook w:val="04A0" w:firstRow="1" w:lastRow="0" w:firstColumn="1" w:lastColumn="0" w:noHBand="0" w:noVBand="1"/>
+        <w:tblLook w:val="0000" w:firstRow="0" w:lastRow="0" w:firstColumn="0" w:lastColumn="0" w:noHBand="0" w:noVBand="0"/>
       </w:tblPr>
       <w:tblGrid>
         <w:gridCol w:w="1900"/>
@@ -5648,7 +5889,7 @@
         <w:keepNext/>
         <w:keepLines/>
       </w:pPr>
-      <w:bookmarkStart w:id="10" w:name="_Toc241873293"/>
+      <w:bookmarkStart w:id="10" w:name="_Toc242030833"/>
       <w:r>
         <w:t>6.1 Serving conditions: batching and prefix caching (Deviation 23)</w:t>
       </w:r>
@@ -5677,7 +5918,7 @@
           <w:left w:w="10" w:type="dxa"/>
           <w:right w:w="10" w:type="dxa"/>
         </w:tblCellMar>
-        <w:tblLook w:val="04A0" w:firstRow="1" w:lastRow="0" w:firstColumn="1" w:lastColumn="0" w:noHBand="0" w:noVBand="1"/>
+        <w:tblLook w:val="0000" w:firstRow="0" w:lastRow="0" w:firstColumn="0" w:lastColumn="0" w:noHBand="0" w:noVBand="0"/>
       </w:tblPr>
       <w:tblGrid>
         <w:gridCol w:w="700"/>
@@ -7253,7 +7494,7 @@
         <w:keepNext/>
         <w:keepLines/>
       </w:pPr>
-      <w:bookmarkStart w:id="11" w:name="_Toc241873294"/>
+      <w:bookmarkStart w:id="11" w:name="_Toc242030834"/>
       <w:r>
         <w:t>7. Accuracy results</w:t>
       </w:r>
@@ -7265,7 +7506,7 @@
         <w:keepNext/>
         <w:keepLines/>
       </w:pPr>
-      <w:bookmarkStart w:id="12" w:name="_Toc241873295"/>
+      <w:bookmarkStart w:id="12" w:name="_Toc242030835"/>
       <w:r>
         <w:t>7.1 Primary test (pre-registered, Deviation 16)</w:t>
       </w:r>
@@ -7290,7 +7531,7 @@
           <w:noProof/>
         </w:rPr>
         <w:drawing>
-          <wp:inline distT="0" distB="0" distL="0" distR="0" wp14:anchorId="030C7A31" wp14:editId="10B853E6">
+          <wp:inline distT="0" distB="0" distL="0" distR="0" wp14:anchorId="6E3AFF72" wp14:editId="68669AA5">
             <wp:extent cx="5762625" cy="2886075"/>
             <wp:effectExtent l="0" t="0" r="0" b="0"/>
             <wp:docPr id="4" name="fig3_accuracy_vs_n.png" descr="Figure 4. Balanced accuracy on the DS2 test set by window size. The final adapter (r4) stays at 0.80–0.84 for every N and sits above the previous recipe (r3) at every N; default text falls sharply from N = 5; text with a calibrated threshold recovers part of the gap." title="fig3_accuracy_vs_n.png"/>
@@ -7359,7 +7600,7 @@
           <w:left w:w="10" w:type="dxa"/>
           <w:right w:w="10" w:type="dxa"/>
         </w:tblCellMar>
-        <w:tblLook w:val="04A0" w:firstRow="1" w:lastRow="0" w:firstColumn="1" w:lastColumn="0" w:noHBand="0" w:noVBand="1"/>
+        <w:tblLook w:val="0000" w:firstRow="0" w:lastRow="0" w:firstColumn="0" w:lastColumn="0" w:noHBand="0" w:noVBand="0"/>
       </w:tblPr>
       <w:tblGrid>
         <w:gridCol w:w="700"/>
@@ -8556,7 +8797,7 @@
         <w:keepNext/>
         <w:keepLines/>
       </w:pPr>
-      <w:bookmarkStart w:id="13" w:name="_Toc241873296"/>
+      <w:bookmarkStart w:id="13" w:name="_Toc242030836"/>
       <w:r>
         <w:t>7.2 Primary comparison against default and calibrated text</w:t>
       </w:r>
@@ -8585,7 +8826,7 @@
           <w:left w:w="10" w:type="dxa"/>
           <w:right w:w="10" w:type="dxa"/>
         </w:tblCellMar>
-        <w:tblLook w:val="04A0" w:firstRow="1" w:lastRow="0" w:firstColumn="1" w:lastColumn="0" w:noHBand="0" w:noVBand="1"/>
+        <w:tblLook w:val="0000" w:firstRow="0" w:lastRow="0" w:firstColumn="0" w:lastColumn="0" w:noHBand="0" w:noVBand="0"/>
       </w:tblPr>
       <w:tblGrid>
         <w:gridCol w:w="700"/>
@@ -9442,7 +9683,7 @@
           <w:noProof/>
         </w:rPr>
         <w:drawing>
-          <wp:inline distT="0" distB="0" distL="0" distR="0" wp14:anchorId="0A774DAA" wp14:editId="1DEB3020">
+          <wp:inline distT="0" distB="0" distL="0" distR="0" wp14:anchorId="43478AE0" wp14:editId="2AA79289">
             <wp:extent cx="5762625" cy="2886075"/>
             <wp:effectExtent l="0" t="0" r="0" b="0"/>
             <wp:docPr id="5" name="fig4_forest.png" descr="Figure 5. The comparisons of Table 7. Dotted red line: non-inferiority margin. Hollow markers show the previous recipe (r3) against calibrated text." title="fig4_forest.png"/>
@@ -9502,7 +9743,7 @@
         <w:keepNext/>
         <w:keepLines/>
       </w:pPr>
-      <w:bookmarkStart w:id="14" w:name="_Toc241873297"/>
+      <w:bookmarkStart w:id="14" w:name="_Toc242030837"/>
       <w:r>
         <w:t>7.3 Why text fails with many events</w:t>
       </w:r>
@@ -9519,7 +9760,7 @@
           <w:noProof/>
         </w:rPr>
         <w:drawing>
-          <wp:inline distT="0" distB="0" distL="0" distR="0" wp14:anchorId="62A20C65" wp14:editId="7DC2778C">
+          <wp:inline distT="0" distB="0" distL="0" distR="0" wp14:anchorId="79AD5F78" wp14:editId="0B34664C">
             <wp:extent cx="5762625" cy="1971675"/>
             <wp:effectExtent l="0" t="0" r="0" b="0"/>
             <wp:docPr id="6" name="fig5_why_text_fails.png" descr="Figure 6. Left: text misses urgent windows caused by a single high-confidence V/F beat (a numeric threshold, 0.85, buried in a long list) far more than runs of abnormal beats. Right: text is worst when the key beat is in the middle of the list, the 'lost in the middle' effect; the adapter (r4, 3 seeds) shows no position effect." title="fig5_why_text_fails.png"/>
@@ -9600,7 +9841,7 @@
           <w:noProof/>
         </w:rPr>
         <w:drawing>
-          <wp:inline distT="0" distB="0" distL="0" distR="0" wp14:anchorId="2871358A" wp14:editId="1A1FB664">
+          <wp:inline distT="0" distB="0" distL="0" distR="0" wp14:anchorId="74453411" wp14:editId="1DEB74CD">
             <wp:extent cx="5762625" cy="2667000"/>
             <wp:effectExtent l="0" t="0" r="0" b="0"/>
             <wp:docPr id="7" name="fig6_confusion_n50.png" descr="Figure 7. Confusion at N = 50. Text under-escalates (priority → routine, urgent → priority) and never raises a false alarm; the r4 adapter never calls an urgent window routine and escalates 3% of routine windows." title="fig6_confusion_n50.png"/>
@@ -9660,7 +9901,7 @@
         <w:keepNext/>
         <w:keepLines/>
       </w:pPr>
-      <w:bookmarkStart w:id="15" w:name="_Toc241873298"/>
+      <w:bookmarkStart w:id="15" w:name="_Toc242030838"/>
       <w:r>
         <w:t>7.4 False alarms: identified in r3, reduced in r4</w:t>
       </w:r>
@@ -9671,7 +9912,10 @@
         <w:spacing w:after="120"/>
       </w:pPr>
       <w:r>
-        <w:t>With r3, the adapter escalated about 11% of routine windows (text: 0%). They sat on windows containing a normal beat classified with low confidence (median lowest confidence 0.56 vs 0.99; an abnormal class as strong second choice), and only 12% of them contained a truly abnormal beat. Threshold calibration could not target them because the validation set had almost no such windows. Training on such windows as hard negatives (r4) cut the rate by two thirds, at every seed.</w:t>
+        <w:t>With r3, the adapter escalated about 11% of routine windows (text: 0%). They sat on windows containing a normal beat classified with low confidence (median lowest confidence 0.56 vs 0.99; an abnormal class as strong second choice), and only 12% of them contained a truly abnormal beat. Threshold calibration could not target them because the validation set had almost no such windows. Recipe r4 cut the rate by two thirds, at every seed. The ablation in Section 10 shows that most of this reduction comes from th</w:t>
+      </w:r>
+      <w:r>
+        <w:t>e side inputs (heart rate, RR interval and run length), which give the receiver the context to tell a low-confidence normal beat from a real event; the hard negatives alone reduced it only from 10.6% to 8.6%.</w:t>
       </w:r>
     </w:p>
     <w:p>
@@ -9685,7 +9929,7 @@
           <w:noProof/>
         </w:rPr>
         <w:drawing>
-          <wp:inline distT="0" distB="0" distL="0" distR="0" wp14:anchorId="4DA4EA34" wp14:editId="4AB9987E">
+          <wp:inline distT="0" distB="0" distL="0" distR="0" wp14:anchorId="6CECA36D" wp14:editId="4D468D53">
             <wp:extent cx="5762625" cy="2533650"/>
             <wp:effectExtent l="0" t="0" r="0" b="0"/>
             <wp:docPr id="8" name="fig9_false_alarms.png" descr="Figure 8. Routine windows escalated to priority or urgent (bars: mean of 3 seeds; lines: seed range). Text never escalates a routine window." title="fig9_false_alarms.png"/>
@@ -9754,7 +9998,7 @@
           <w:left w:w="10" w:type="dxa"/>
           <w:right w:w="10" w:type="dxa"/>
         </w:tblCellMar>
-        <w:tblLook w:val="04A0" w:firstRow="1" w:lastRow="0" w:firstColumn="1" w:lastColumn="0" w:noHBand="0" w:noVBand="1"/>
+        <w:tblLook w:val="0000" w:firstRow="0" w:lastRow="0" w:firstColumn="0" w:lastColumn="0" w:noHBand="0" w:noVBand="0"/>
       </w:tblPr>
       <w:tblGrid>
         <w:gridCol w:w="700"/>
@@ -10760,7 +11004,7 @@
         <w:keepNext/>
         <w:keepLines/>
       </w:pPr>
-      <w:bookmarkStart w:id="16" w:name="_Toc241873299"/>
+      <w:bookmarkStart w:id="16" w:name="_Toc242030839"/>
       <w:r>
         <w:t>7.5 Against true annotations</w:t>
       </w:r>
@@ -10780,7 +11024,7 @@
         <w:keepNext/>
         <w:keepLines/>
       </w:pPr>
-      <w:bookmarkStart w:id="17" w:name="_Toc241873300"/>
+      <w:bookmarkStart w:id="17" w:name="_Toc242030840"/>
       <w:r>
         <w:t>7.6 Filtered text baseline (Deviation 20)</w:t>
       </w:r>
@@ -10809,7 +11053,7 @@
           <w:left w:w="10" w:type="dxa"/>
           <w:right w:w="10" w:type="dxa"/>
         </w:tblCellMar>
-        <w:tblLook w:val="04A0" w:firstRow="1" w:lastRow="0" w:firstColumn="1" w:lastColumn="0" w:noHBand="0" w:noVBand="1"/>
+        <w:tblLook w:val="0000" w:firstRow="0" w:lastRow="0" w:firstColumn="0" w:lastColumn="0" w:noHBand="0" w:noVBand="0"/>
       </w:tblPr>
       <w:tblGrid>
         <w:gridCol w:w="600"/>
@@ -11923,7 +12167,7 @@
         <w:keepNext/>
         <w:keepLines/>
       </w:pPr>
-      <w:bookmarkStart w:id="18" w:name="_Toc241873301"/>
+      <w:bookmarkStart w:id="18" w:name="_Toc242030841"/>
       <w:r>
         <w:t>8. Auditability</w:t>
       </w:r>
@@ -12040,7 +12284,7 @@
           <w:noProof/>
         </w:rPr>
         <w:drawing>
-          <wp:inline distT="0" distB="0" distL="0" distR="0" wp14:anchorId="4D1BFE2D" wp14:editId="45F2ED79">
+          <wp:inline distT="0" distB="0" distL="0" distR="0" wp14:anchorId="26A88564" wp14:editId="2A1217CF">
             <wp:extent cx="5762625" cy="2371725"/>
             <wp:effectExtent l="0" t="0" r="0" b="0"/>
             <wp:docPr id="9" name="fig8_auditability.png" descr="Figure 9. Balanced accuracy of decoding each event's fields from its virtual-token slot (recipe r3, mean of 3 seeds) versus from the encoder's 32-d vector." title="fig8_auditability.png"/>
@@ -12105,7 +12349,7 @@
           <w:noProof/>
         </w:rPr>
         <w:drawing>
-          <wp:inline distT="0" distB="0" distL="0" distR="0" wp14:anchorId="138D0EBB" wp14:editId="257AD242">
+          <wp:inline distT="0" distB="0" distL="0" distR="0" wp14:anchorId="132828CF" wp14:editId="06B2410E">
             <wp:extent cx="5762625" cy="2009775"/>
             <wp:effectExtent l="0" t="0" r="0" b="0"/>
             <wp:docPr id="10" name="fig10_side_info.png" descr="Figure 10. Facts carried per event after the r4 change, decoded from slots 0 and 49 of each seed (bars: mean; lines: range). Left: heart rate and RR interval (R²). Right: presence of a run of ≥ 3 abnormal beats (balanced accuracy; Deviation 18b, a pre-registered replacement for an R² metric that proved ill-posed on this split)." title="fig10_side_info.png"/>
@@ -12165,7 +12409,7 @@
         <w:keepNext/>
         <w:keepLines/>
       </w:pPr>
-      <w:bookmarkStart w:id="19" w:name="_Toc241873302"/>
+      <w:bookmarkStart w:id="19" w:name="_Toc242030842"/>
       <w:r>
         <w:t>9. Replication on a second sender (Deviation 22)</w:t>
       </w:r>
@@ -12197,7 +12441,7 @@
           <w:left w:w="10" w:type="dxa"/>
           <w:right w:w="10" w:type="dxa"/>
         </w:tblCellMar>
-        <w:tblLook w:val="04A0" w:firstRow="1" w:lastRow="0" w:firstColumn="1" w:lastColumn="0" w:noHBand="0" w:noVBand="1"/>
+        <w:tblLook w:val="0000" w:firstRow="0" w:lastRow="0" w:firstColumn="0" w:lastColumn="0" w:noHBand="0" w:noVBand="0"/>
       </w:tblPr>
       <w:tblGrid>
         <w:gridCol w:w="500"/>
@@ -13618,7 +13862,7 @@
           <w:noProof/>
         </w:rPr>
         <w:drawing>
-          <wp:inline distT="0" distB="0" distL="0" distR="0" wp14:anchorId="73E0FBE6" wp14:editId="192CA32A">
+          <wp:inline distT="0" distB="0" distL="0" distR="0" wp14:anchorId="7F765DDF" wp14:editId="7AFC1F28">
             <wp:extent cx="5762625" cy="2524125"/>
             <wp:effectExtent l="0" t="0" r="0" b="0"/>
             <wp:docPr id="11" name="fig11_two_senders.png" descr="Figure 11. Both senders side by side. The pattern replicates: text with every event listed falls as N grows, the adapter stays roughly flat, and filtered text is the most accurate arm, except at N = 50 on the second sender." title="fig11_two_senders.png"/>
@@ -13761,11 +14005,31 @@
         <w:keepNext/>
         <w:keepLines/>
       </w:pPr>
-      <w:bookmarkStart w:id="20" w:name="_Toc241873303"/>
-      <w:r>
-        <w:t>10. Status of the research questions</w:t>
+      <w:bookmarkStart w:id="20" w:name="_Toc242030843"/>
+      <w:r>
+        <w:t>10. What the channel needs: ablation and compression (Deviations 24, 26, 27)</w:t>
       </w:r>
       <w:bookmarkEnd w:id="20"/>
+    </w:p>
+    <w:p>
+      <w:pPr>
+        <w:pStyle w:val="Heading2"/>
+        <w:keepNext/>
+        <w:keepLines/>
+      </w:pPr>
+      <w:bookmarkStart w:id="21" w:name="_Toc242030844"/>
+      <w:r>
+        <w:t>10.1 Ablation of recipe r4</w:t>
+      </w:r>
+      <w:bookmarkEnd w:id="21"/>
+    </w:p>
+    <w:p>
+      <w:pPr>
+        <w:spacing w:after="120"/>
+      </w:pPr>
+      <w:r>
+        <w:t>Recipe r4 made two changes at once. To separate them, r4 was retrained without the side inputs (hard negatives only, 'r4hn'), three seeds, everything else identical, and compared with r3 (neither change) and r4 (both).</w:t>
+      </w:r>
     </w:p>
     <w:tbl>
       <w:tblPr>
@@ -13782,7 +14046,2415 @@
           <w:left w:w="10" w:type="dxa"/>
           <w:right w:w="10" w:type="dxa"/>
         </w:tblCellMar>
-        <w:tblLook w:val="04A0" w:firstRow="1" w:lastRow="0" w:firstColumn="1" w:lastColumn="0" w:noHBand="0" w:noVBand="1"/>
+        <w:tblLook w:val="0000" w:firstRow="0" w:lastRow="0" w:firstColumn="0" w:lastColumn="0" w:noHBand="0" w:noVBand="0"/>
+      </w:tblPr>
+      <w:tblGrid>
+        <w:gridCol w:w="2000"/>
+        <w:gridCol w:w="900"/>
+        <w:gridCol w:w="900"/>
+        <w:gridCol w:w="900"/>
+        <w:gridCol w:w="900"/>
+        <w:gridCol w:w="900"/>
+        <w:gridCol w:w="1300"/>
+        <w:gridCol w:w="1226"/>
+      </w:tblGrid>
+      <w:tr>
+        <w:tblPrEx>
+          <w:tblCellMar>
+            <w:top w:w="0" w:type="dxa"/>
+            <w:bottom w:w="0" w:type="dxa"/>
+          </w:tblCellMar>
+        </w:tblPrEx>
+        <w:trPr>
+          <w:cantSplit/>
+          <w:tblHeader/>
+        </w:trPr>
+        <w:tc>
+          <w:tcPr>
+            <w:tcW w:w="2000" w:type="dxa"/>
+            <w:tcBorders>
+              <w:top w:val="single" w:sz="4" w:space="0" w:color="BFBFBF"/>
+              <w:left w:val="single" w:sz="4" w:space="0" w:color="BFBFBF"/>
+              <w:bottom w:val="single" w:sz="4" w:space="0" w:color="BFBFBF"/>
+              <w:right w:val="single" w:sz="4" w:space="0" w:color="BFBFBF"/>
+            </w:tcBorders>
+            <w:shd w:val="clear" w:color="auto" w:fill="E8EEF7"/>
+            <w:tcMar>
+              <w:top w:w="60" w:type="dxa"/>
+              <w:left w:w="100" w:type="dxa"/>
+              <w:bottom w:w="60" w:type="dxa"/>
+              <w:right w:w="100" w:type="dxa"/>
+            </w:tcMar>
+          </w:tcPr>
+          <w:p>
+            <w:pPr>
+              <w:keepNext/>
+              <w:keepLines/>
+            </w:pPr>
+            <w:r>
+              <w:rPr>
+                <w:b/>
+                <w:bCs/>
+                <w:sz w:val="19"/>
+                <w:szCs w:val="19"/>
+              </w:rPr>
+              <w:t>Recipe</w:t>
+            </w:r>
+          </w:p>
+        </w:tc>
+        <w:tc>
+          <w:tcPr>
+            <w:tcW w:w="900" w:type="dxa"/>
+            <w:tcBorders>
+              <w:top w:val="single" w:sz="4" w:space="0" w:color="BFBFBF"/>
+              <w:left w:val="single" w:sz="4" w:space="0" w:color="BFBFBF"/>
+              <w:bottom w:val="single" w:sz="4" w:space="0" w:color="BFBFBF"/>
+              <w:right w:val="single" w:sz="4" w:space="0" w:color="BFBFBF"/>
+            </w:tcBorders>
+            <w:shd w:val="clear" w:color="auto" w:fill="E8EEF7"/>
+            <w:tcMar>
+              <w:top w:w="60" w:type="dxa"/>
+              <w:left w:w="100" w:type="dxa"/>
+              <w:bottom w:w="60" w:type="dxa"/>
+              <w:right w:w="100" w:type="dxa"/>
+            </w:tcMar>
+          </w:tcPr>
+          <w:p>
+            <w:pPr>
+              <w:keepNext/>
+              <w:keepLines/>
+            </w:pPr>
+            <w:r>
+              <w:rPr>
+                <w:b/>
+                <w:bCs/>
+                <w:sz w:val="19"/>
+                <w:szCs w:val="19"/>
+              </w:rPr>
+              <w:t>N = 5</w:t>
+            </w:r>
+          </w:p>
+        </w:tc>
+        <w:tc>
+          <w:tcPr>
+            <w:tcW w:w="900" w:type="dxa"/>
+            <w:tcBorders>
+              <w:top w:val="single" w:sz="4" w:space="0" w:color="BFBFBF"/>
+              <w:left w:val="single" w:sz="4" w:space="0" w:color="BFBFBF"/>
+              <w:bottom w:val="single" w:sz="4" w:space="0" w:color="BFBFBF"/>
+              <w:right w:val="single" w:sz="4" w:space="0" w:color="BFBFBF"/>
+            </w:tcBorders>
+            <w:shd w:val="clear" w:color="auto" w:fill="E8EEF7"/>
+            <w:tcMar>
+              <w:top w:w="60" w:type="dxa"/>
+              <w:left w:w="100" w:type="dxa"/>
+              <w:bottom w:w="60" w:type="dxa"/>
+              <w:right w:w="100" w:type="dxa"/>
+            </w:tcMar>
+          </w:tcPr>
+          <w:p>
+            <w:pPr>
+              <w:keepNext/>
+              <w:keepLines/>
+            </w:pPr>
+            <w:r>
+              <w:rPr>
+                <w:b/>
+                <w:bCs/>
+                <w:sz w:val="19"/>
+                <w:szCs w:val="19"/>
+              </w:rPr>
+              <w:t>N = 10</w:t>
+            </w:r>
+          </w:p>
+        </w:tc>
+        <w:tc>
+          <w:tcPr>
+            <w:tcW w:w="900" w:type="dxa"/>
+            <w:tcBorders>
+              <w:top w:val="single" w:sz="4" w:space="0" w:color="BFBFBF"/>
+              <w:left w:val="single" w:sz="4" w:space="0" w:color="BFBFBF"/>
+              <w:bottom w:val="single" w:sz="4" w:space="0" w:color="BFBFBF"/>
+              <w:right w:val="single" w:sz="4" w:space="0" w:color="BFBFBF"/>
+            </w:tcBorders>
+            <w:shd w:val="clear" w:color="auto" w:fill="E8EEF7"/>
+            <w:tcMar>
+              <w:top w:w="60" w:type="dxa"/>
+              <w:left w:w="100" w:type="dxa"/>
+              <w:bottom w:w="60" w:type="dxa"/>
+              <w:right w:w="100" w:type="dxa"/>
+            </w:tcMar>
+          </w:tcPr>
+          <w:p>
+            <w:pPr>
+              <w:keepNext/>
+              <w:keepLines/>
+            </w:pPr>
+            <w:r>
+              <w:rPr>
+                <w:b/>
+                <w:bCs/>
+                <w:sz w:val="19"/>
+                <w:szCs w:val="19"/>
+              </w:rPr>
+              <w:t>N = 20</w:t>
+            </w:r>
+          </w:p>
+        </w:tc>
+        <w:tc>
+          <w:tcPr>
+            <w:tcW w:w="900" w:type="dxa"/>
+            <w:tcBorders>
+              <w:top w:val="single" w:sz="4" w:space="0" w:color="BFBFBF"/>
+              <w:left w:val="single" w:sz="4" w:space="0" w:color="BFBFBF"/>
+              <w:bottom w:val="single" w:sz="4" w:space="0" w:color="BFBFBF"/>
+              <w:right w:val="single" w:sz="4" w:space="0" w:color="BFBFBF"/>
+            </w:tcBorders>
+            <w:shd w:val="clear" w:color="auto" w:fill="E8EEF7"/>
+            <w:tcMar>
+              <w:top w:w="60" w:type="dxa"/>
+              <w:left w:w="100" w:type="dxa"/>
+              <w:bottom w:w="60" w:type="dxa"/>
+              <w:right w:w="100" w:type="dxa"/>
+            </w:tcMar>
+          </w:tcPr>
+          <w:p>
+            <w:pPr>
+              <w:keepNext/>
+              <w:keepLines/>
+            </w:pPr>
+            <w:r>
+              <w:rPr>
+                <w:b/>
+                <w:bCs/>
+                <w:sz w:val="19"/>
+                <w:szCs w:val="19"/>
+              </w:rPr>
+              <w:t>N = 50</w:t>
+            </w:r>
+          </w:p>
+        </w:tc>
+        <w:tc>
+          <w:tcPr>
+            <w:tcW w:w="900" w:type="dxa"/>
+            <w:tcBorders>
+              <w:top w:val="single" w:sz="4" w:space="0" w:color="BFBFBF"/>
+              <w:left w:val="single" w:sz="4" w:space="0" w:color="BFBFBF"/>
+              <w:bottom w:val="single" w:sz="4" w:space="0" w:color="BFBFBF"/>
+              <w:right w:val="single" w:sz="4" w:space="0" w:color="BFBFBF"/>
+            </w:tcBorders>
+            <w:shd w:val="clear" w:color="auto" w:fill="E8EEF7"/>
+            <w:tcMar>
+              <w:top w:w="60" w:type="dxa"/>
+              <w:left w:w="100" w:type="dxa"/>
+              <w:bottom w:w="60" w:type="dxa"/>
+              <w:right w:w="100" w:type="dxa"/>
+            </w:tcMar>
+          </w:tcPr>
+          <w:p>
+            <w:pPr>
+              <w:keepNext/>
+              <w:keepLines/>
+            </w:pPr>
+            <w:r>
+              <w:rPr>
+                <w:b/>
+                <w:bCs/>
+                <w:sz w:val="19"/>
+                <w:szCs w:val="19"/>
+              </w:rPr>
+              <w:t>False alarms</w:t>
+            </w:r>
+          </w:p>
+        </w:tc>
+        <w:tc>
+          <w:tcPr>
+            <w:tcW w:w="1300" w:type="dxa"/>
+            <w:tcBorders>
+              <w:top w:val="single" w:sz="4" w:space="0" w:color="BFBFBF"/>
+              <w:left w:val="single" w:sz="4" w:space="0" w:color="BFBFBF"/>
+              <w:bottom w:val="single" w:sz="4" w:space="0" w:color="BFBFBF"/>
+              <w:right w:val="single" w:sz="4" w:space="0" w:color="BFBFBF"/>
+            </w:tcBorders>
+            <w:shd w:val="clear" w:color="auto" w:fill="E8EEF7"/>
+            <w:tcMar>
+              <w:top w:w="60" w:type="dxa"/>
+              <w:left w:w="100" w:type="dxa"/>
+              <w:bottom w:w="60" w:type="dxa"/>
+              <w:right w:w="100" w:type="dxa"/>
+            </w:tcMar>
+          </w:tcPr>
+          <w:p>
+            <w:pPr>
+              <w:keepNext/>
+              <w:keepLines/>
+            </w:pPr>
+            <w:r>
+              <w:rPr>
+                <w:b/>
+                <w:bCs/>
+                <w:sz w:val="19"/>
+                <w:szCs w:val="19"/>
+              </w:rPr>
+              <w:t>Heart rate / RR from tokens (R²)</w:t>
+            </w:r>
+          </w:p>
+        </w:tc>
+        <w:tc>
+          <w:tcPr>
+            <w:tcW w:w="1226" w:type="dxa"/>
+            <w:tcBorders>
+              <w:top w:val="single" w:sz="4" w:space="0" w:color="BFBFBF"/>
+              <w:left w:val="single" w:sz="4" w:space="0" w:color="BFBFBF"/>
+              <w:bottom w:val="single" w:sz="4" w:space="0" w:color="BFBFBF"/>
+              <w:right w:val="single" w:sz="4" w:space="0" w:color="BFBFBF"/>
+            </w:tcBorders>
+            <w:shd w:val="clear" w:color="auto" w:fill="E8EEF7"/>
+            <w:tcMar>
+              <w:top w:w="60" w:type="dxa"/>
+              <w:left w:w="100" w:type="dxa"/>
+              <w:bottom w:w="60" w:type="dxa"/>
+              <w:right w:w="100" w:type="dxa"/>
+            </w:tcMar>
+          </w:tcPr>
+          <w:p>
+            <w:pPr>
+              <w:keepNext/>
+              <w:keepLines/>
+            </w:pPr>
+            <w:r>
+              <w:rPr>
+                <w:b/>
+                <w:bCs/>
+                <w:sz w:val="19"/>
+                <w:szCs w:val="19"/>
+              </w:rPr>
+              <w:t>Run ≥ 3 from tokens</w:t>
+            </w:r>
+          </w:p>
+        </w:tc>
+      </w:tr>
+      <w:tr>
+        <w:tblPrEx>
+          <w:tblCellMar>
+            <w:top w:w="0" w:type="dxa"/>
+            <w:bottom w:w="0" w:type="dxa"/>
+          </w:tblCellMar>
+        </w:tblPrEx>
+        <w:trPr>
+          <w:cantSplit/>
+        </w:trPr>
+        <w:tc>
+          <w:tcPr>
+            <w:tcW w:w="2000" w:type="dxa"/>
+            <w:tcBorders>
+              <w:top w:val="single" w:sz="4" w:space="0" w:color="BFBFBF"/>
+              <w:left w:val="single" w:sz="4" w:space="0" w:color="BFBFBF"/>
+              <w:bottom w:val="single" w:sz="4" w:space="0" w:color="BFBFBF"/>
+              <w:right w:val="single" w:sz="4" w:space="0" w:color="BFBFBF"/>
+            </w:tcBorders>
+            <w:tcMar>
+              <w:top w:w="60" w:type="dxa"/>
+              <w:left w:w="100" w:type="dxa"/>
+              <w:bottom w:w="60" w:type="dxa"/>
+              <w:right w:w="100" w:type="dxa"/>
+            </w:tcMar>
+          </w:tcPr>
+          <w:p>
+            <w:pPr>
+              <w:keepNext/>
+              <w:keepLines/>
+            </w:pPr>
+            <w:r>
+              <w:rPr>
+                <w:sz w:val="19"/>
+                <w:szCs w:val="19"/>
+              </w:rPr>
+              <w:t>r3: neither change</w:t>
+            </w:r>
+          </w:p>
+        </w:tc>
+        <w:tc>
+          <w:tcPr>
+            <w:tcW w:w="900" w:type="dxa"/>
+            <w:tcBorders>
+              <w:top w:val="single" w:sz="4" w:space="0" w:color="BFBFBF"/>
+              <w:left w:val="single" w:sz="4" w:space="0" w:color="BFBFBF"/>
+              <w:bottom w:val="single" w:sz="4" w:space="0" w:color="BFBFBF"/>
+              <w:right w:val="single" w:sz="4" w:space="0" w:color="BFBFBF"/>
+            </w:tcBorders>
+            <w:tcMar>
+              <w:top w:w="60" w:type="dxa"/>
+              <w:left w:w="100" w:type="dxa"/>
+              <w:bottom w:w="60" w:type="dxa"/>
+              <w:right w:w="100" w:type="dxa"/>
+            </w:tcMar>
+          </w:tcPr>
+          <w:p>
+            <w:pPr>
+              <w:keepNext/>
+              <w:keepLines/>
+            </w:pPr>
+            <w:r>
+              <w:rPr>
+                <w:sz w:val="19"/>
+                <w:szCs w:val="19"/>
+              </w:rPr>
+              <w:t>0.794</w:t>
+            </w:r>
+          </w:p>
+        </w:tc>
+        <w:tc>
+          <w:tcPr>
+            <w:tcW w:w="900" w:type="dxa"/>
+            <w:tcBorders>
+              <w:top w:val="single" w:sz="4" w:space="0" w:color="BFBFBF"/>
+              <w:left w:val="single" w:sz="4" w:space="0" w:color="BFBFBF"/>
+              <w:bottom w:val="single" w:sz="4" w:space="0" w:color="BFBFBF"/>
+              <w:right w:val="single" w:sz="4" w:space="0" w:color="BFBFBF"/>
+            </w:tcBorders>
+            <w:tcMar>
+              <w:top w:w="60" w:type="dxa"/>
+              <w:left w:w="100" w:type="dxa"/>
+              <w:bottom w:w="60" w:type="dxa"/>
+              <w:right w:w="100" w:type="dxa"/>
+            </w:tcMar>
+          </w:tcPr>
+          <w:p>
+            <w:pPr>
+              <w:keepNext/>
+              <w:keepLines/>
+            </w:pPr>
+            <w:r>
+              <w:rPr>
+                <w:sz w:val="19"/>
+                <w:szCs w:val="19"/>
+              </w:rPr>
+              <w:t>0.772</w:t>
+            </w:r>
+          </w:p>
+        </w:tc>
+        <w:tc>
+          <w:tcPr>
+            <w:tcW w:w="900" w:type="dxa"/>
+            <w:tcBorders>
+              <w:top w:val="single" w:sz="4" w:space="0" w:color="BFBFBF"/>
+              <w:left w:val="single" w:sz="4" w:space="0" w:color="BFBFBF"/>
+              <w:bottom w:val="single" w:sz="4" w:space="0" w:color="BFBFBF"/>
+              <w:right w:val="single" w:sz="4" w:space="0" w:color="BFBFBF"/>
+            </w:tcBorders>
+            <w:tcMar>
+              <w:top w:w="60" w:type="dxa"/>
+              <w:left w:w="100" w:type="dxa"/>
+              <w:bottom w:w="60" w:type="dxa"/>
+              <w:right w:w="100" w:type="dxa"/>
+            </w:tcMar>
+          </w:tcPr>
+          <w:p>
+            <w:pPr>
+              <w:keepNext/>
+              <w:keepLines/>
+            </w:pPr>
+            <w:r>
+              <w:rPr>
+                <w:sz w:val="19"/>
+                <w:szCs w:val="19"/>
+              </w:rPr>
+              <w:t>0.795</w:t>
+            </w:r>
+          </w:p>
+        </w:tc>
+        <w:tc>
+          <w:tcPr>
+            <w:tcW w:w="900" w:type="dxa"/>
+            <w:tcBorders>
+              <w:top w:val="single" w:sz="4" w:space="0" w:color="BFBFBF"/>
+              <w:left w:val="single" w:sz="4" w:space="0" w:color="BFBFBF"/>
+              <w:bottom w:val="single" w:sz="4" w:space="0" w:color="BFBFBF"/>
+              <w:right w:val="single" w:sz="4" w:space="0" w:color="BFBFBF"/>
+            </w:tcBorders>
+            <w:tcMar>
+              <w:top w:w="60" w:type="dxa"/>
+              <w:left w:w="100" w:type="dxa"/>
+              <w:bottom w:w="60" w:type="dxa"/>
+              <w:right w:w="100" w:type="dxa"/>
+            </w:tcMar>
+          </w:tcPr>
+          <w:p>
+            <w:pPr>
+              <w:keepNext/>
+              <w:keepLines/>
+            </w:pPr>
+            <w:r>
+              <w:rPr>
+                <w:sz w:val="19"/>
+                <w:szCs w:val="19"/>
+              </w:rPr>
+              <w:t>0.770</w:t>
+            </w:r>
+          </w:p>
+        </w:tc>
+        <w:tc>
+          <w:tcPr>
+            <w:tcW w:w="900" w:type="dxa"/>
+            <w:tcBorders>
+              <w:top w:val="single" w:sz="4" w:space="0" w:color="BFBFBF"/>
+              <w:left w:val="single" w:sz="4" w:space="0" w:color="BFBFBF"/>
+              <w:bottom w:val="single" w:sz="4" w:space="0" w:color="BFBFBF"/>
+              <w:right w:val="single" w:sz="4" w:space="0" w:color="BFBFBF"/>
+            </w:tcBorders>
+            <w:tcMar>
+              <w:top w:w="60" w:type="dxa"/>
+              <w:left w:w="100" w:type="dxa"/>
+              <w:bottom w:w="60" w:type="dxa"/>
+              <w:right w:w="100" w:type="dxa"/>
+            </w:tcMar>
+          </w:tcPr>
+          <w:p>
+            <w:pPr>
+              <w:keepNext/>
+              <w:keepLines/>
+            </w:pPr>
+            <w:r>
+              <w:rPr>
+                <w:sz w:val="19"/>
+                <w:szCs w:val="19"/>
+              </w:rPr>
+              <w:t>10.6%</w:t>
+            </w:r>
+          </w:p>
+        </w:tc>
+        <w:tc>
+          <w:tcPr>
+            <w:tcW w:w="1300" w:type="dxa"/>
+            <w:tcBorders>
+              <w:top w:val="single" w:sz="4" w:space="0" w:color="BFBFBF"/>
+              <w:left w:val="single" w:sz="4" w:space="0" w:color="BFBFBF"/>
+              <w:bottom w:val="single" w:sz="4" w:space="0" w:color="BFBFBF"/>
+              <w:right w:val="single" w:sz="4" w:space="0" w:color="BFBFBF"/>
+            </w:tcBorders>
+            <w:tcMar>
+              <w:top w:w="60" w:type="dxa"/>
+              <w:left w:w="100" w:type="dxa"/>
+              <w:bottom w:w="60" w:type="dxa"/>
+              <w:right w:w="100" w:type="dxa"/>
+            </w:tcMar>
+          </w:tcPr>
+          <w:p>
+            <w:pPr>
+              <w:keepNext/>
+              <w:keepLines/>
+            </w:pPr>
+            <w:r>
+              <w:rPr>
+                <w:sz w:val="19"/>
+                <w:szCs w:val="19"/>
+              </w:rPr>
+              <w:t>below 0</w:t>
+            </w:r>
+          </w:p>
+        </w:tc>
+        <w:tc>
+          <w:tcPr>
+            <w:tcW w:w="1226" w:type="dxa"/>
+            <w:tcBorders>
+              <w:top w:val="single" w:sz="4" w:space="0" w:color="BFBFBF"/>
+              <w:left w:val="single" w:sz="4" w:space="0" w:color="BFBFBF"/>
+              <w:bottom w:val="single" w:sz="4" w:space="0" w:color="BFBFBF"/>
+              <w:right w:val="single" w:sz="4" w:space="0" w:color="BFBFBF"/>
+            </w:tcBorders>
+            <w:tcMar>
+              <w:top w:w="60" w:type="dxa"/>
+              <w:left w:w="100" w:type="dxa"/>
+              <w:bottom w:w="60" w:type="dxa"/>
+              <w:right w:w="100" w:type="dxa"/>
+            </w:tcMar>
+          </w:tcPr>
+          <w:p>
+            <w:pPr>
+              <w:keepNext/>
+              <w:keepLines/>
+            </w:pPr>
+            <w:r>
+              <w:rPr>
+                <w:sz w:val="19"/>
+                <w:szCs w:val="19"/>
+              </w:rPr>
+              <w:t>0.56</w:t>
+            </w:r>
+          </w:p>
+        </w:tc>
+      </w:tr>
+      <w:tr>
+        <w:tblPrEx>
+          <w:tblCellMar>
+            <w:top w:w="0" w:type="dxa"/>
+            <w:bottom w:w="0" w:type="dxa"/>
+          </w:tblCellMar>
+        </w:tblPrEx>
+        <w:trPr>
+          <w:cantSplit/>
+        </w:trPr>
+        <w:tc>
+          <w:tcPr>
+            <w:tcW w:w="2000" w:type="dxa"/>
+            <w:tcBorders>
+              <w:top w:val="single" w:sz="4" w:space="0" w:color="BFBFBF"/>
+              <w:left w:val="single" w:sz="4" w:space="0" w:color="BFBFBF"/>
+              <w:bottom w:val="single" w:sz="4" w:space="0" w:color="BFBFBF"/>
+              <w:right w:val="single" w:sz="4" w:space="0" w:color="BFBFBF"/>
+            </w:tcBorders>
+            <w:tcMar>
+              <w:top w:w="60" w:type="dxa"/>
+              <w:left w:w="100" w:type="dxa"/>
+              <w:bottom w:w="60" w:type="dxa"/>
+              <w:right w:w="100" w:type="dxa"/>
+            </w:tcMar>
+          </w:tcPr>
+          <w:p>
+            <w:pPr>
+              <w:keepNext/>
+              <w:keepLines/>
+            </w:pPr>
+            <w:r>
+              <w:rPr>
+                <w:sz w:val="19"/>
+                <w:szCs w:val="19"/>
+              </w:rPr>
+              <w:t>r4hn: hard negatives only</w:t>
+            </w:r>
+          </w:p>
+        </w:tc>
+        <w:tc>
+          <w:tcPr>
+            <w:tcW w:w="900" w:type="dxa"/>
+            <w:tcBorders>
+              <w:top w:val="single" w:sz="4" w:space="0" w:color="BFBFBF"/>
+              <w:left w:val="single" w:sz="4" w:space="0" w:color="BFBFBF"/>
+              <w:bottom w:val="single" w:sz="4" w:space="0" w:color="BFBFBF"/>
+              <w:right w:val="single" w:sz="4" w:space="0" w:color="BFBFBF"/>
+            </w:tcBorders>
+            <w:tcMar>
+              <w:top w:w="60" w:type="dxa"/>
+              <w:left w:w="100" w:type="dxa"/>
+              <w:bottom w:w="60" w:type="dxa"/>
+              <w:right w:w="100" w:type="dxa"/>
+            </w:tcMar>
+          </w:tcPr>
+          <w:p>
+            <w:pPr>
+              <w:keepNext/>
+              <w:keepLines/>
+            </w:pPr>
+            <w:r>
+              <w:rPr>
+                <w:sz w:val="19"/>
+                <w:szCs w:val="19"/>
+              </w:rPr>
+              <w:t>0.788</w:t>
+            </w:r>
+          </w:p>
+        </w:tc>
+        <w:tc>
+          <w:tcPr>
+            <w:tcW w:w="900" w:type="dxa"/>
+            <w:tcBorders>
+              <w:top w:val="single" w:sz="4" w:space="0" w:color="BFBFBF"/>
+              <w:left w:val="single" w:sz="4" w:space="0" w:color="BFBFBF"/>
+              <w:bottom w:val="single" w:sz="4" w:space="0" w:color="BFBFBF"/>
+              <w:right w:val="single" w:sz="4" w:space="0" w:color="BFBFBF"/>
+            </w:tcBorders>
+            <w:tcMar>
+              <w:top w:w="60" w:type="dxa"/>
+              <w:left w:w="100" w:type="dxa"/>
+              <w:bottom w:w="60" w:type="dxa"/>
+              <w:right w:w="100" w:type="dxa"/>
+            </w:tcMar>
+          </w:tcPr>
+          <w:p>
+            <w:pPr>
+              <w:keepNext/>
+              <w:keepLines/>
+            </w:pPr>
+            <w:r>
+              <w:rPr>
+                <w:sz w:val="19"/>
+                <w:szCs w:val="19"/>
+              </w:rPr>
+              <w:t>0.786</w:t>
+            </w:r>
+          </w:p>
+        </w:tc>
+        <w:tc>
+          <w:tcPr>
+            <w:tcW w:w="900" w:type="dxa"/>
+            <w:tcBorders>
+              <w:top w:val="single" w:sz="4" w:space="0" w:color="BFBFBF"/>
+              <w:left w:val="single" w:sz="4" w:space="0" w:color="BFBFBF"/>
+              <w:bottom w:val="single" w:sz="4" w:space="0" w:color="BFBFBF"/>
+              <w:right w:val="single" w:sz="4" w:space="0" w:color="BFBFBF"/>
+            </w:tcBorders>
+            <w:tcMar>
+              <w:top w:w="60" w:type="dxa"/>
+              <w:left w:w="100" w:type="dxa"/>
+              <w:bottom w:w="60" w:type="dxa"/>
+              <w:right w:w="100" w:type="dxa"/>
+            </w:tcMar>
+          </w:tcPr>
+          <w:p>
+            <w:pPr>
+              <w:keepNext/>
+              <w:keepLines/>
+            </w:pPr>
+            <w:r>
+              <w:rPr>
+                <w:sz w:val="19"/>
+                <w:szCs w:val="19"/>
+              </w:rPr>
+              <w:t>0.802</w:t>
+            </w:r>
+          </w:p>
+        </w:tc>
+        <w:tc>
+          <w:tcPr>
+            <w:tcW w:w="900" w:type="dxa"/>
+            <w:tcBorders>
+              <w:top w:val="single" w:sz="4" w:space="0" w:color="BFBFBF"/>
+              <w:left w:val="single" w:sz="4" w:space="0" w:color="BFBFBF"/>
+              <w:bottom w:val="single" w:sz="4" w:space="0" w:color="BFBFBF"/>
+              <w:right w:val="single" w:sz="4" w:space="0" w:color="BFBFBF"/>
+            </w:tcBorders>
+            <w:tcMar>
+              <w:top w:w="60" w:type="dxa"/>
+              <w:left w:w="100" w:type="dxa"/>
+              <w:bottom w:w="60" w:type="dxa"/>
+              <w:right w:w="100" w:type="dxa"/>
+            </w:tcMar>
+          </w:tcPr>
+          <w:p>
+            <w:pPr>
+              <w:keepNext/>
+              <w:keepLines/>
+            </w:pPr>
+            <w:r>
+              <w:rPr>
+                <w:sz w:val="19"/>
+                <w:szCs w:val="19"/>
+              </w:rPr>
+              <w:t>0.781</w:t>
+            </w:r>
+          </w:p>
+        </w:tc>
+        <w:tc>
+          <w:tcPr>
+            <w:tcW w:w="900" w:type="dxa"/>
+            <w:tcBorders>
+              <w:top w:val="single" w:sz="4" w:space="0" w:color="BFBFBF"/>
+              <w:left w:val="single" w:sz="4" w:space="0" w:color="BFBFBF"/>
+              <w:bottom w:val="single" w:sz="4" w:space="0" w:color="BFBFBF"/>
+              <w:right w:val="single" w:sz="4" w:space="0" w:color="BFBFBF"/>
+            </w:tcBorders>
+            <w:tcMar>
+              <w:top w:w="60" w:type="dxa"/>
+              <w:left w:w="100" w:type="dxa"/>
+              <w:bottom w:w="60" w:type="dxa"/>
+              <w:right w:w="100" w:type="dxa"/>
+            </w:tcMar>
+          </w:tcPr>
+          <w:p>
+            <w:pPr>
+              <w:keepNext/>
+              <w:keepLines/>
+            </w:pPr>
+            <w:r>
+              <w:rPr>
+                <w:sz w:val="19"/>
+                <w:szCs w:val="19"/>
+              </w:rPr>
+              <w:t>8.6%</w:t>
+            </w:r>
+          </w:p>
+        </w:tc>
+        <w:tc>
+          <w:tcPr>
+            <w:tcW w:w="1300" w:type="dxa"/>
+            <w:tcBorders>
+              <w:top w:val="single" w:sz="4" w:space="0" w:color="BFBFBF"/>
+              <w:left w:val="single" w:sz="4" w:space="0" w:color="BFBFBF"/>
+              <w:bottom w:val="single" w:sz="4" w:space="0" w:color="BFBFBF"/>
+              <w:right w:val="single" w:sz="4" w:space="0" w:color="BFBFBF"/>
+            </w:tcBorders>
+            <w:tcMar>
+              <w:top w:w="60" w:type="dxa"/>
+              <w:left w:w="100" w:type="dxa"/>
+              <w:bottom w:w="60" w:type="dxa"/>
+              <w:right w:w="100" w:type="dxa"/>
+            </w:tcMar>
+          </w:tcPr>
+          <w:p>
+            <w:pPr>
+              <w:keepNext/>
+              <w:keepLines/>
+            </w:pPr>
+            <w:r>
+              <w:rPr>
+                <w:sz w:val="19"/>
+                <w:szCs w:val="19"/>
+              </w:rPr>
+              <w:t>below 0</w:t>
+            </w:r>
+          </w:p>
+        </w:tc>
+        <w:tc>
+          <w:tcPr>
+            <w:tcW w:w="1226" w:type="dxa"/>
+            <w:tcBorders>
+              <w:top w:val="single" w:sz="4" w:space="0" w:color="BFBFBF"/>
+              <w:left w:val="single" w:sz="4" w:space="0" w:color="BFBFBF"/>
+              <w:bottom w:val="single" w:sz="4" w:space="0" w:color="BFBFBF"/>
+              <w:right w:val="single" w:sz="4" w:space="0" w:color="BFBFBF"/>
+            </w:tcBorders>
+            <w:tcMar>
+              <w:top w:w="60" w:type="dxa"/>
+              <w:left w:w="100" w:type="dxa"/>
+              <w:bottom w:w="60" w:type="dxa"/>
+              <w:right w:w="100" w:type="dxa"/>
+            </w:tcMar>
+          </w:tcPr>
+          <w:p>
+            <w:pPr>
+              <w:keepNext/>
+              <w:keepLines/>
+            </w:pPr>
+            <w:r>
+              <w:rPr>
+                <w:sz w:val="19"/>
+                <w:szCs w:val="19"/>
+              </w:rPr>
+              <w:t>0.55</w:t>
+            </w:r>
+          </w:p>
+        </w:tc>
+      </w:tr>
+      <w:tr>
+        <w:tblPrEx>
+          <w:tblCellMar>
+            <w:top w:w="0" w:type="dxa"/>
+            <w:bottom w:w="0" w:type="dxa"/>
+          </w:tblCellMar>
+        </w:tblPrEx>
+        <w:trPr>
+          <w:cantSplit/>
+        </w:trPr>
+        <w:tc>
+          <w:tcPr>
+            <w:tcW w:w="2000" w:type="dxa"/>
+            <w:tcBorders>
+              <w:top w:val="single" w:sz="4" w:space="0" w:color="BFBFBF"/>
+              <w:left w:val="single" w:sz="4" w:space="0" w:color="BFBFBF"/>
+              <w:bottom w:val="single" w:sz="4" w:space="0" w:color="BFBFBF"/>
+              <w:right w:val="single" w:sz="4" w:space="0" w:color="BFBFBF"/>
+            </w:tcBorders>
+            <w:tcMar>
+              <w:top w:w="60" w:type="dxa"/>
+              <w:left w:w="100" w:type="dxa"/>
+              <w:bottom w:w="60" w:type="dxa"/>
+              <w:right w:w="100" w:type="dxa"/>
+            </w:tcMar>
+          </w:tcPr>
+          <w:p>
+            <w:pPr>
+              <w:keepNext/>
+              <w:keepLines/>
+            </w:pPr>
+            <w:r>
+              <w:rPr>
+                <w:sz w:val="19"/>
+                <w:szCs w:val="19"/>
+              </w:rPr>
+              <w:t>r4: hard negatives + side inputs</w:t>
+            </w:r>
+          </w:p>
+        </w:tc>
+        <w:tc>
+          <w:tcPr>
+            <w:tcW w:w="900" w:type="dxa"/>
+            <w:tcBorders>
+              <w:top w:val="single" w:sz="4" w:space="0" w:color="BFBFBF"/>
+              <w:left w:val="single" w:sz="4" w:space="0" w:color="BFBFBF"/>
+              <w:bottom w:val="single" w:sz="4" w:space="0" w:color="BFBFBF"/>
+              <w:right w:val="single" w:sz="4" w:space="0" w:color="BFBFBF"/>
+            </w:tcBorders>
+            <w:tcMar>
+              <w:top w:w="60" w:type="dxa"/>
+              <w:left w:w="100" w:type="dxa"/>
+              <w:bottom w:w="60" w:type="dxa"/>
+              <w:right w:w="100" w:type="dxa"/>
+            </w:tcMar>
+          </w:tcPr>
+          <w:p>
+            <w:pPr>
+              <w:keepNext/>
+              <w:keepLines/>
+            </w:pPr>
+            <w:r>
+              <w:rPr>
+                <w:sz w:val="19"/>
+                <w:szCs w:val="19"/>
+              </w:rPr>
+              <w:t>0.814</w:t>
+            </w:r>
+          </w:p>
+        </w:tc>
+        <w:tc>
+          <w:tcPr>
+            <w:tcW w:w="900" w:type="dxa"/>
+            <w:tcBorders>
+              <w:top w:val="single" w:sz="4" w:space="0" w:color="BFBFBF"/>
+              <w:left w:val="single" w:sz="4" w:space="0" w:color="BFBFBF"/>
+              <w:bottom w:val="single" w:sz="4" w:space="0" w:color="BFBFBF"/>
+              <w:right w:val="single" w:sz="4" w:space="0" w:color="BFBFBF"/>
+            </w:tcBorders>
+            <w:tcMar>
+              <w:top w:w="60" w:type="dxa"/>
+              <w:left w:w="100" w:type="dxa"/>
+              <w:bottom w:w="60" w:type="dxa"/>
+              <w:right w:w="100" w:type="dxa"/>
+            </w:tcMar>
+          </w:tcPr>
+          <w:p>
+            <w:pPr>
+              <w:keepNext/>
+              <w:keepLines/>
+            </w:pPr>
+            <w:r>
+              <w:rPr>
+                <w:sz w:val="19"/>
+                <w:szCs w:val="19"/>
+              </w:rPr>
+              <w:t>0.830</w:t>
+            </w:r>
+          </w:p>
+        </w:tc>
+        <w:tc>
+          <w:tcPr>
+            <w:tcW w:w="900" w:type="dxa"/>
+            <w:tcBorders>
+              <w:top w:val="single" w:sz="4" w:space="0" w:color="BFBFBF"/>
+              <w:left w:val="single" w:sz="4" w:space="0" w:color="BFBFBF"/>
+              <w:bottom w:val="single" w:sz="4" w:space="0" w:color="BFBFBF"/>
+              <w:right w:val="single" w:sz="4" w:space="0" w:color="BFBFBF"/>
+            </w:tcBorders>
+            <w:tcMar>
+              <w:top w:w="60" w:type="dxa"/>
+              <w:left w:w="100" w:type="dxa"/>
+              <w:bottom w:w="60" w:type="dxa"/>
+              <w:right w:w="100" w:type="dxa"/>
+            </w:tcMar>
+          </w:tcPr>
+          <w:p>
+            <w:pPr>
+              <w:keepNext/>
+              <w:keepLines/>
+            </w:pPr>
+            <w:r>
+              <w:rPr>
+                <w:sz w:val="19"/>
+                <w:szCs w:val="19"/>
+              </w:rPr>
+              <w:t>0.830</w:t>
+            </w:r>
+          </w:p>
+        </w:tc>
+        <w:tc>
+          <w:tcPr>
+            <w:tcW w:w="900" w:type="dxa"/>
+            <w:tcBorders>
+              <w:top w:val="single" w:sz="4" w:space="0" w:color="BFBFBF"/>
+              <w:left w:val="single" w:sz="4" w:space="0" w:color="BFBFBF"/>
+              <w:bottom w:val="single" w:sz="4" w:space="0" w:color="BFBFBF"/>
+              <w:right w:val="single" w:sz="4" w:space="0" w:color="BFBFBF"/>
+            </w:tcBorders>
+            <w:tcMar>
+              <w:top w:w="60" w:type="dxa"/>
+              <w:left w:w="100" w:type="dxa"/>
+              <w:bottom w:w="60" w:type="dxa"/>
+              <w:right w:w="100" w:type="dxa"/>
+            </w:tcMar>
+          </w:tcPr>
+          <w:p>
+            <w:pPr>
+              <w:keepNext/>
+              <w:keepLines/>
+            </w:pPr>
+            <w:r>
+              <w:rPr>
+                <w:sz w:val="19"/>
+                <w:szCs w:val="19"/>
+              </w:rPr>
+              <w:t>0.836</w:t>
+            </w:r>
+          </w:p>
+        </w:tc>
+        <w:tc>
+          <w:tcPr>
+            <w:tcW w:w="900" w:type="dxa"/>
+            <w:tcBorders>
+              <w:top w:val="single" w:sz="4" w:space="0" w:color="BFBFBF"/>
+              <w:left w:val="single" w:sz="4" w:space="0" w:color="BFBFBF"/>
+              <w:bottom w:val="single" w:sz="4" w:space="0" w:color="BFBFBF"/>
+              <w:right w:val="single" w:sz="4" w:space="0" w:color="BFBFBF"/>
+            </w:tcBorders>
+            <w:tcMar>
+              <w:top w:w="60" w:type="dxa"/>
+              <w:left w:w="100" w:type="dxa"/>
+              <w:bottom w:w="60" w:type="dxa"/>
+              <w:right w:w="100" w:type="dxa"/>
+            </w:tcMar>
+          </w:tcPr>
+          <w:p>
+            <w:pPr>
+              <w:keepNext/>
+              <w:keepLines/>
+            </w:pPr>
+            <w:r>
+              <w:rPr>
+                <w:sz w:val="19"/>
+                <w:szCs w:val="19"/>
+              </w:rPr>
+              <w:t>3.6%</w:t>
+            </w:r>
+          </w:p>
+        </w:tc>
+        <w:tc>
+          <w:tcPr>
+            <w:tcW w:w="1300" w:type="dxa"/>
+            <w:tcBorders>
+              <w:top w:val="single" w:sz="4" w:space="0" w:color="BFBFBF"/>
+              <w:left w:val="single" w:sz="4" w:space="0" w:color="BFBFBF"/>
+              <w:bottom w:val="single" w:sz="4" w:space="0" w:color="BFBFBF"/>
+              <w:right w:val="single" w:sz="4" w:space="0" w:color="BFBFBF"/>
+            </w:tcBorders>
+            <w:tcMar>
+              <w:top w:w="60" w:type="dxa"/>
+              <w:left w:w="100" w:type="dxa"/>
+              <w:bottom w:w="60" w:type="dxa"/>
+              <w:right w:w="100" w:type="dxa"/>
+            </w:tcMar>
+          </w:tcPr>
+          <w:p>
+            <w:pPr>
+              <w:keepNext/>
+              <w:keepLines/>
+            </w:pPr>
+            <w:r>
+              <w:rPr>
+                <w:sz w:val="19"/>
+                <w:szCs w:val="19"/>
+              </w:rPr>
+              <w:t>0.70 / 0.72</w:t>
+            </w:r>
+          </w:p>
+        </w:tc>
+        <w:tc>
+          <w:tcPr>
+            <w:tcW w:w="1226" w:type="dxa"/>
+            <w:tcBorders>
+              <w:top w:val="single" w:sz="4" w:space="0" w:color="BFBFBF"/>
+              <w:left w:val="single" w:sz="4" w:space="0" w:color="BFBFBF"/>
+              <w:bottom w:val="single" w:sz="4" w:space="0" w:color="BFBFBF"/>
+              <w:right w:val="single" w:sz="4" w:space="0" w:color="BFBFBF"/>
+            </w:tcBorders>
+            <w:tcMar>
+              <w:top w:w="60" w:type="dxa"/>
+              <w:left w:w="100" w:type="dxa"/>
+              <w:bottom w:w="60" w:type="dxa"/>
+              <w:right w:w="100" w:type="dxa"/>
+            </w:tcMar>
+          </w:tcPr>
+          <w:p>
+            <w:pPr>
+              <w:keepNext/>
+              <w:keepLines/>
+            </w:pPr>
+            <w:r>
+              <w:rPr>
+                <w:sz w:val="19"/>
+                <w:szCs w:val="19"/>
+              </w:rPr>
+              <w:t>0.96</w:t>
+            </w:r>
+          </w:p>
+        </w:tc>
+      </w:tr>
+      <w:tr>
+        <w:tblPrEx>
+          <w:tblCellMar>
+            <w:top w:w="0" w:type="dxa"/>
+            <w:bottom w:w="0" w:type="dxa"/>
+          </w:tblCellMar>
+        </w:tblPrEx>
+        <w:trPr>
+          <w:cantSplit/>
+        </w:trPr>
+        <w:tc>
+          <w:tcPr>
+            <w:tcW w:w="2000" w:type="dxa"/>
+            <w:tcBorders>
+              <w:top w:val="single" w:sz="4" w:space="0" w:color="BFBFBF"/>
+              <w:left w:val="single" w:sz="4" w:space="0" w:color="BFBFBF"/>
+              <w:bottom w:val="single" w:sz="4" w:space="0" w:color="BFBFBF"/>
+              <w:right w:val="single" w:sz="4" w:space="0" w:color="BFBFBF"/>
+            </w:tcBorders>
+            <w:tcMar>
+              <w:top w:w="60" w:type="dxa"/>
+              <w:left w:w="100" w:type="dxa"/>
+              <w:bottom w:w="60" w:type="dxa"/>
+              <w:right w:w="100" w:type="dxa"/>
+            </w:tcMar>
+          </w:tcPr>
+          <w:p>
+            <w:pPr>
+              <w:keepNext/>
+              <w:keepLines/>
+            </w:pPr>
+            <w:r>
+              <w:rPr>
+                <w:sz w:val="19"/>
+                <w:szCs w:val="19"/>
+              </w:rPr>
+              <w:t>Side inputs (r4 − r4hn), 95% CI</w:t>
+            </w:r>
+          </w:p>
+        </w:tc>
+        <w:tc>
+          <w:tcPr>
+            <w:tcW w:w="900" w:type="dxa"/>
+            <w:tcBorders>
+              <w:top w:val="single" w:sz="4" w:space="0" w:color="BFBFBF"/>
+              <w:left w:val="single" w:sz="4" w:space="0" w:color="BFBFBF"/>
+              <w:bottom w:val="single" w:sz="4" w:space="0" w:color="BFBFBF"/>
+              <w:right w:val="single" w:sz="4" w:space="0" w:color="BFBFBF"/>
+            </w:tcBorders>
+            <w:tcMar>
+              <w:top w:w="60" w:type="dxa"/>
+              <w:left w:w="100" w:type="dxa"/>
+              <w:bottom w:w="60" w:type="dxa"/>
+              <w:right w:w="100" w:type="dxa"/>
+            </w:tcMar>
+          </w:tcPr>
+          <w:p>
+            <w:pPr>
+              <w:keepNext/>
+              <w:keepLines/>
+            </w:pPr>
+            <w:r>
+              <w:rPr>
+                <w:sz w:val="19"/>
+                <w:szCs w:val="19"/>
+              </w:rPr>
+              <w:t>+0.03 [−0.02, +0.06]</w:t>
+            </w:r>
+          </w:p>
+        </w:tc>
+        <w:tc>
+          <w:tcPr>
+            <w:tcW w:w="900" w:type="dxa"/>
+            <w:tcBorders>
+              <w:top w:val="single" w:sz="4" w:space="0" w:color="BFBFBF"/>
+              <w:left w:val="single" w:sz="4" w:space="0" w:color="BFBFBF"/>
+              <w:bottom w:val="single" w:sz="4" w:space="0" w:color="BFBFBF"/>
+              <w:right w:val="single" w:sz="4" w:space="0" w:color="BFBFBF"/>
+            </w:tcBorders>
+            <w:tcMar>
+              <w:top w:w="60" w:type="dxa"/>
+              <w:left w:w="100" w:type="dxa"/>
+              <w:bottom w:w="60" w:type="dxa"/>
+              <w:right w:w="100" w:type="dxa"/>
+            </w:tcMar>
+          </w:tcPr>
+          <w:p>
+            <w:pPr>
+              <w:keepNext/>
+              <w:keepLines/>
+            </w:pPr>
+            <w:r>
+              <w:rPr>
+                <w:sz w:val="19"/>
+                <w:szCs w:val="19"/>
+              </w:rPr>
+              <w:t>+0.04 [−0.01, +0.11]</w:t>
+            </w:r>
+          </w:p>
+        </w:tc>
+        <w:tc>
+          <w:tcPr>
+            <w:tcW w:w="900" w:type="dxa"/>
+            <w:tcBorders>
+              <w:top w:val="single" w:sz="4" w:space="0" w:color="BFBFBF"/>
+              <w:left w:val="single" w:sz="4" w:space="0" w:color="BFBFBF"/>
+              <w:bottom w:val="single" w:sz="4" w:space="0" w:color="BFBFBF"/>
+              <w:right w:val="single" w:sz="4" w:space="0" w:color="BFBFBF"/>
+            </w:tcBorders>
+            <w:tcMar>
+              <w:top w:w="60" w:type="dxa"/>
+              <w:left w:w="100" w:type="dxa"/>
+              <w:bottom w:w="60" w:type="dxa"/>
+              <w:right w:w="100" w:type="dxa"/>
+            </w:tcMar>
+          </w:tcPr>
+          <w:p>
+            <w:pPr>
+              <w:keepNext/>
+              <w:keepLines/>
+            </w:pPr>
+            <w:r>
+              <w:rPr>
+                <w:sz w:val="19"/>
+                <w:szCs w:val="19"/>
+              </w:rPr>
+              <w:t>+0.03 [−0.01, +0.07]</w:t>
+            </w:r>
+          </w:p>
+        </w:tc>
+        <w:tc>
+          <w:tcPr>
+            <w:tcW w:w="900" w:type="dxa"/>
+            <w:tcBorders>
+              <w:top w:val="single" w:sz="4" w:space="0" w:color="BFBFBF"/>
+              <w:left w:val="single" w:sz="4" w:space="0" w:color="BFBFBF"/>
+              <w:bottom w:val="single" w:sz="4" w:space="0" w:color="BFBFBF"/>
+              <w:right w:val="single" w:sz="4" w:space="0" w:color="BFBFBF"/>
+            </w:tcBorders>
+            <w:tcMar>
+              <w:top w:w="60" w:type="dxa"/>
+              <w:left w:w="100" w:type="dxa"/>
+              <w:bottom w:w="60" w:type="dxa"/>
+              <w:right w:w="100" w:type="dxa"/>
+            </w:tcMar>
+          </w:tcPr>
+          <w:p>
+            <w:pPr>
+              <w:keepNext/>
+              <w:keepLines/>
+            </w:pPr>
+            <w:r>
+              <w:rPr>
+                <w:sz w:val="19"/>
+                <w:szCs w:val="19"/>
+              </w:rPr>
+              <w:t>+0.05 [+0.01, +0.11]</w:t>
+            </w:r>
+          </w:p>
+        </w:tc>
+        <w:tc>
+          <w:tcPr>
+            <w:tcW w:w="900" w:type="dxa"/>
+            <w:tcBorders>
+              <w:top w:val="single" w:sz="4" w:space="0" w:color="BFBFBF"/>
+              <w:left w:val="single" w:sz="4" w:space="0" w:color="BFBFBF"/>
+              <w:bottom w:val="single" w:sz="4" w:space="0" w:color="BFBFBF"/>
+              <w:right w:val="single" w:sz="4" w:space="0" w:color="BFBFBF"/>
+            </w:tcBorders>
+            <w:tcMar>
+              <w:top w:w="60" w:type="dxa"/>
+              <w:left w:w="100" w:type="dxa"/>
+              <w:bottom w:w="60" w:type="dxa"/>
+              <w:right w:w="100" w:type="dxa"/>
+            </w:tcMar>
+          </w:tcPr>
+          <w:p>
+            <w:pPr>
+              <w:keepNext/>
+              <w:keepLines/>
+            </w:pPr>
+            <w:r>
+              <w:rPr>
+                <w:sz w:val="19"/>
+                <w:szCs w:val="19"/>
+              </w:rPr>
+              <w:t>−</w:t>
+            </w:r>
+            <w:r>
+              <w:rPr>
+                <w:sz w:val="19"/>
+                <w:szCs w:val="19"/>
+              </w:rPr>
+              <w:t>5.0 points</w:t>
+            </w:r>
+          </w:p>
+        </w:tc>
+        <w:tc>
+          <w:tcPr>
+            <w:tcW w:w="1300" w:type="dxa"/>
+            <w:tcBorders>
+              <w:top w:val="single" w:sz="4" w:space="0" w:color="BFBFBF"/>
+              <w:left w:val="single" w:sz="4" w:space="0" w:color="BFBFBF"/>
+              <w:bottom w:val="single" w:sz="4" w:space="0" w:color="BFBFBF"/>
+              <w:right w:val="single" w:sz="4" w:space="0" w:color="BFBFBF"/>
+            </w:tcBorders>
+            <w:tcMar>
+              <w:top w:w="60" w:type="dxa"/>
+              <w:left w:w="100" w:type="dxa"/>
+              <w:bottom w:w="60" w:type="dxa"/>
+              <w:right w:w="100" w:type="dxa"/>
+            </w:tcMar>
+          </w:tcPr>
+          <w:p>
+            <w:pPr>
+              <w:keepNext/>
+              <w:keepLines/>
+            </w:pPr>
+          </w:p>
+        </w:tc>
+        <w:tc>
+          <w:tcPr>
+            <w:tcW w:w="1226" w:type="dxa"/>
+            <w:tcBorders>
+              <w:top w:val="single" w:sz="4" w:space="0" w:color="BFBFBF"/>
+              <w:left w:val="single" w:sz="4" w:space="0" w:color="BFBFBF"/>
+              <w:bottom w:val="single" w:sz="4" w:space="0" w:color="BFBFBF"/>
+              <w:right w:val="single" w:sz="4" w:space="0" w:color="BFBFBF"/>
+            </w:tcBorders>
+            <w:tcMar>
+              <w:top w:w="60" w:type="dxa"/>
+              <w:left w:w="100" w:type="dxa"/>
+              <w:bottom w:w="60" w:type="dxa"/>
+              <w:right w:w="100" w:type="dxa"/>
+            </w:tcMar>
+          </w:tcPr>
+          <w:p>
+            <w:pPr>
+              <w:keepNext/>
+              <w:keepLines/>
+            </w:pPr>
+          </w:p>
+        </w:tc>
+      </w:tr>
+    </w:tbl>
+    <w:p>
+      <w:pPr>
+        <w:spacing w:before="60" w:after="240"/>
+      </w:pPr>
+      <w:r>
+        <w:rPr>
+          <w:i/>
+          <w:iCs/>
+          <w:color w:val="52514E"/>
+          <w:sz w:val="18"/>
+          <w:szCs w:val="18"/>
+        </w:rPr>
+        <w:t>Table 11. r4 ablation: balanced accuracy on DS2 (3-seed means; record-cluster bootstrap CIs), false alarms on routine windows, and recoverability of each event's facts from its tokens (slots 0 and 49).</w:t>
+      </w:r>
+    </w:p>
+    <w:p>
+      <w:pPr>
+        <w:pStyle w:val="ListParagraph"/>
+        <w:numPr>
+          <w:ilvl w:val="0"/>
+          <w:numId w:val="2"/>
+        </w:numPr>
+        <w:spacing w:after="60"/>
+      </w:pPr>
+      <w:r>
+        <w:rPr>
+          <w:b/>
+          <w:bCs/>
+        </w:rPr>
+        <w:t>The side inputs drive the improvement.</w:t>
+      </w:r>
+      <w:r>
+        <w:t xml:space="preserve"> Accuracy is higher at every N (significantly at N = 50) and false alarms fall from 8.6% to 3.6% in every seed. Without them, heart rate, RR and run length cannot be recovered from the tokens at all.</w:t>
+      </w:r>
+    </w:p>
+    <w:p>
+      <w:pPr>
+        <w:pStyle w:val="ListParagraph"/>
+        <w:numPr>
+          <w:ilvl w:val="0"/>
+          <w:numId w:val="2"/>
+        </w:numPr>
+        <w:spacing w:after="60"/>
+      </w:pPr>
+      <w:r>
+        <w:rPr>
+          <w:b/>
+          <w:bCs/>
+        </w:rPr>
+        <w:t>Hard negatives alone change little:</w:t>
+      </w:r>
+      <w:r>
+        <w:t xml:space="preserve"> accuracy within about 0.01 of r3 and false alarms 10.6% to 8.6%. The earlier interpretation, that the hard negatives cut the false alarms, is corrected here.</w:t>
+      </w:r>
+    </w:p>
+    <w:p>
+      <w:pPr>
+        <w:pStyle w:val="ListParagraph"/>
+        <w:numPr>
+          <w:ilvl w:val="0"/>
+          <w:numId w:val="2"/>
+        </w:numPr>
+        <w:spacing w:after="60"/>
+      </w:pPr>
+      <w:r>
+        <w:rPr>
+          <w:b/>
+          <w:bCs/>
+        </w:rPr>
+        <w:t>Link between RQ2 and RQ3:</w:t>
+      </w:r>
+      <w:r>
+        <w:t xml:space="preserve"> the information the channel makes recoverable is the information the receiver uses for its decision.</w:t>
+      </w:r>
+    </w:p>
+    <w:p>
+      <w:pPr>
+        <w:pStyle w:val="Heading2"/>
+        <w:keepNext/>
+        <w:keepLines/>
+      </w:pPr>
+      <w:bookmarkStart w:id="22" w:name="_Toc242030845"/>
+      <w:r>
+        <w:t>10.2 How many tokens per event?</w:t>
+      </w:r>
+      <w:bookmarkEnd w:id="22"/>
+    </w:p>
+    <w:p>
+      <w:pPr>
+        <w:spacing w:after="120"/>
+      </w:pPr>
+      <w:r>
+        <w:t>The adapter gives each event 4 virtual tokens. The same recipe was retrained with 1, 2 and 8 tokens per event; after a single-run sweep suggested that 1 token might be enough, 1 and 2 tokens were repeated with three seeds each (pre-registered before training, with the rule that a setting is called free of accuracy cost only if it is non-inferior to 4 tokens at every N).</w:t>
+      </w:r>
+    </w:p>
+    <w:tbl>
+      <w:tblPr>
+        <w:tblW w:w="9026" w:type="dxa"/>
+        <w:tblBorders>
+          <w:top w:val="single" w:sz="4" w:space="0" w:color="auto"/>
+          <w:left w:val="single" w:sz="4" w:space="0" w:color="auto"/>
+          <w:bottom w:val="single" w:sz="4" w:space="0" w:color="auto"/>
+          <w:right w:val="single" w:sz="4" w:space="0" w:color="auto"/>
+          <w:insideH w:val="single" w:sz="4" w:space="0" w:color="auto"/>
+          <w:insideV w:val="single" w:sz="4" w:space="0" w:color="auto"/>
+        </w:tblBorders>
+        <w:tblCellMar>
+          <w:left w:w="10" w:type="dxa"/>
+          <w:right w:w="10" w:type="dxa"/>
+        </w:tblCellMar>
+        <w:tblLook w:val="0000" w:firstRow="0" w:lastRow="0" w:firstColumn="0" w:lastColumn="0" w:noHBand="0" w:noVBand="0"/>
+      </w:tblPr>
+      <w:tblGrid>
+        <w:gridCol w:w="2100"/>
+        <w:gridCol w:w="2200"/>
+        <w:gridCol w:w="2000"/>
+        <w:gridCol w:w="1300"/>
+        <w:gridCol w:w="1426"/>
+      </w:tblGrid>
+      <w:tr>
+        <w:tblPrEx>
+          <w:tblCellMar>
+            <w:top w:w="0" w:type="dxa"/>
+            <w:bottom w:w="0" w:type="dxa"/>
+          </w:tblCellMar>
+        </w:tblPrEx>
+        <w:trPr>
+          <w:cantSplit/>
+          <w:tblHeader/>
+        </w:trPr>
+        <w:tc>
+          <w:tcPr>
+            <w:tcW w:w="2100" w:type="dxa"/>
+            <w:tcBorders>
+              <w:top w:val="single" w:sz="4" w:space="0" w:color="BFBFBF"/>
+              <w:left w:val="single" w:sz="4" w:space="0" w:color="BFBFBF"/>
+              <w:bottom w:val="single" w:sz="4" w:space="0" w:color="BFBFBF"/>
+              <w:right w:val="single" w:sz="4" w:space="0" w:color="BFBFBF"/>
+            </w:tcBorders>
+            <w:shd w:val="clear" w:color="auto" w:fill="E8EEF7"/>
+            <w:tcMar>
+              <w:top w:w="60" w:type="dxa"/>
+              <w:left w:w="100" w:type="dxa"/>
+              <w:bottom w:w="60" w:type="dxa"/>
+              <w:right w:w="100" w:type="dxa"/>
+            </w:tcMar>
+          </w:tcPr>
+          <w:p>
+            <w:pPr>
+              <w:keepNext/>
+              <w:keepLines/>
+            </w:pPr>
+            <w:r>
+              <w:rPr>
+                <w:b/>
+                <w:bCs/>
+                <w:sz w:val="19"/>
+                <w:szCs w:val="19"/>
+              </w:rPr>
+              <w:t>Tokens per event (prompt at N = 50)</w:t>
+            </w:r>
+          </w:p>
+        </w:tc>
+        <w:tc>
+          <w:tcPr>
+            <w:tcW w:w="2200" w:type="dxa"/>
+            <w:tcBorders>
+              <w:top w:val="single" w:sz="4" w:space="0" w:color="BFBFBF"/>
+              <w:left w:val="single" w:sz="4" w:space="0" w:color="BFBFBF"/>
+              <w:bottom w:val="single" w:sz="4" w:space="0" w:color="BFBFBF"/>
+              <w:right w:val="single" w:sz="4" w:space="0" w:color="BFBFBF"/>
+            </w:tcBorders>
+            <w:shd w:val="clear" w:color="auto" w:fill="E8EEF7"/>
+            <w:tcMar>
+              <w:top w:w="60" w:type="dxa"/>
+              <w:left w:w="100" w:type="dxa"/>
+              <w:bottom w:w="60" w:type="dxa"/>
+              <w:right w:w="100" w:type="dxa"/>
+            </w:tcMar>
+          </w:tcPr>
+          <w:p>
+            <w:pPr>
+              <w:keepNext/>
+              <w:keepLines/>
+            </w:pPr>
+            <w:r>
+              <w:rPr>
+                <w:b/>
+                <w:bCs/>
+                <w:sz w:val="19"/>
+                <w:szCs w:val="19"/>
+              </w:rPr>
+              <w:t>Balanced accuracy, N = 5 / 10 / 20 / 50</w:t>
+            </w:r>
+          </w:p>
+        </w:tc>
+        <w:tc>
+          <w:tcPr>
+            <w:tcW w:w="2000" w:type="dxa"/>
+            <w:tcBorders>
+              <w:top w:val="single" w:sz="4" w:space="0" w:color="BFBFBF"/>
+              <w:left w:val="single" w:sz="4" w:space="0" w:color="BFBFBF"/>
+              <w:bottom w:val="single" w:sz="4" w:space="0" w:color="BFBFBF"/>
+              <w:right w:val="single" w:sz="4" w:space="0" w:color="BFBFBF"/>
+            </w:tcBorders>
+            <w:shd w:val="clear" w:color="auto" w:fill="E8EEF7"/>
+            <w:tcMar>
+              <w:top w:w="60" w:type="dxa"/>
+              <w:left w:w="100" w:type="dxa"/>
+              <w:bottom w:w="60" w:type="dxa"/>
+              <w:right w:w="100" w:type="dxa"/>
+            </w:tcMar>
+          </w:tcPr>
+          <w:p>
+            <w:pPr>
+              <w:keepNext/>
+              <w:keepLines/>
+            </w:pPr>
+            <w:r>
+              <w:rPr>
+                <w:b/>
+                <w:bCs/>
+                <w:sz w:val="19"/>
+                <w:szCs w:val="19"/>
+              </w:rPr>
+              <w:t>Difference from 4 tokens, worst N [95% CI]</w:t>
+            </w:r>
+          </w:p>
+        </w:tc>
+        <w:tc>
+          <w:tcPr>
+            <w:tcW w:w="1300" w:type="dxa"/>
+            <w:tcBorders>
+              <w:top w:val="single" w:sz="4" w:space="0" w:color="BFBFBF"/>
+              <w:left w:val="single" w:sz="4" w:space="0" w:color="BFBFBF"/>
+              <w:bottom w:val="single" w:sz="4" w:space="0" w:color="BFBFBF"/>
+              <w:right w:val="single" w:sz="4" w:space="0" w:color="BFBFBF"/>
+            </w:tcBorders>
+            <w:shd w:val="clear" w:color="auto" w:fill="E8EEF7"/>
+            <w:tcMar>
+              <w:top w:w="60" w:type="dxa"/>
+              <w:left w:w="100" w:type="dxa"/>
+              <w:bottom w:w="60" w:type="dxa"/>
+              <w:right w:w="100" w:type="dxa"/>
+            </w:tcMar>
+          </w:tcPr>
+          <w:p>
+            <w:pPr>
+              <w:keepNext/>
+              <w:keepLines/>
+            </w:pPr>
+            <w:r>
+              <w:rPr>
+                <w:b/>
+                <w:bCs/>
+                <w:sz w:val="19"/>
+                <w:szCs w:val="19"/>
+              </w:rPr>
+              <w:t>False alarms</w:t>
+            </w:r>
+          </w:p>
+        </w:tc>
+        <w:tc>
+          <w:tcPr>
+            <w:tcW w:w="1426" w:type="dxa"/>
+            <w:tcBorders>
+              <w:top w:val="single" w:sz="4" w:space="0" w:color="BFBFBF"/>
+              <w:left w:val="single" w:sz="4" w:space="0" w:color="BFBFBF"/>
+              <w:bottom w:val="single" w:sz="4" w:space="0" w:color="BFBFBF"/>
+              <w:right w:val="single" w:sz="4" w:space="0" w:color="BFBFBF"/>
+            </w:tcBorders>
+            <w:shd w:val="clear" w:color="auto" w:fill="E8EEF7"/>
+            <w:tcMar>
+              <w:top w:w="60" w:type="dxa"/>
+              <w:left w:w="100" w:type="dxa"/>
+              <w:bottom w:w="60" w:type="dxa"/>
+              <w:right w:w="100" w:type="dxa"/>
+            </w:tcMar>
+          </w:tcPr>
+          <w:p>
+            <w:pPr>
+              <w:keepNext/>
+              <w:keepLines/>
+            </w:pPr>
+            <w:r>
+              <w:rPr>
+                <w:b/>
+                <w:bCs/>
+                <w:sz w:val="19"/>
+                <w:szCs w:val="19"/>
+              </w:rPr>
+              <w:t>Facts recoverable from tokens</w:t>
+            </w:r>
+          </w:p>
+        </w:tc>
+      </w:tr>
+      <w:tr>
+        <w:tblPrEx>
+          <w:tblCellMar>
+            <w:top w:w="0" w:type="dxa"/>
+            <w:bottom w:w="0" w:type="dxa"/>
+          </w:tblCellMar>
+        </w:tblPrEx>
+        <w:trPr>
+          <w:cantSplit/>
+        </w:trPr>
+        <w:tc>
+          <w:tcPr>
+            <w:tcW w:w="2100" w:type="dxa"/>
+            <w:tcBorders>
+              <w:top w:val="single" w:sz="4" w:space="0" w:color="BFBFBF"/>
+              <w:left w:val="single" w:sz="4" w:space="0" w:color="BFBFBF"/>
+              <w:bottom w:val="single" w:sz="4" w:space="0" w:color="BFBFBF"/>
+              <w:right w:val="single" w:sz="4" w:space="0" w:color="BFBFBF"/>
+            </w:tcBorders>
+            <w:tcMar>
+              <w:top w:w="60" w:type="dxa"/>
+              <w:left w:w="100" w:type="dxa"/>
+              <w:bottom w:w="60" w:type="dxa"/>
+              <w:right w:w="100" w:type="dxa"/>
+            </w:tcMar>
+          </w:tcPr>
+          <w:p>
+            <w:pPr>
+              <w:keepNext/>
+              <w:keepLines/>
+            </w:pPr>
+            <w:r>
+              <w:rPr>
+                <w:sz w:val="19"/>
+                <w:szCs w:val="19"/>
+              </w:rPr>
+              <w:t>1 (563 tokens), 3 seeds</w:t>
+            </w:r>
+          </w:p>
+        </w:tc>
+        <w:tc>
+          <w:tcPr>
+            <w:tcW w:w="2200" w:type="dxa"/>
+            <w:tcBorders>
+              <w:top w:val="single" w:sz="4" w:space="0" w:color="BFBFBF"/>
+              <w:left w:val="single" w:sz="4" w:space="0" w:color="BFBFBF"/>
+              <w:bottom w:val="single" w:sz="4" w:space="0" w:color="BFBFBF"/>
+              <w:right w:val="single" w:sz="4" w:space="0" w:color="BFBFBF"/>
+            </w:tcBorders>
+            <w:tcMar>
+              <w:top w:w="60" w:type="dxa"/>
+              <w:left w:w="100" w:type="dxa"/>
+              <w:bottom w:w="60" w:type="dxa"/>
+              <w:right w:w="100" w:type="dxa"/>
+            </w:tcMar>
+          </w:tcPr>
+          <w:p>
+            <w:pPr>
+              <w:keepNext/>
+              <w:keepLines/>
+            </w:pPr>
+            <w:r>
+              <w:rPr>
+                <w:sz w:val="19"/>
+                <w:szCs w:val="19"/>
+              </w:rPr>
+              <w:t>0.70 / 0.72 / 0.75 / 0.73</w:t>
+            </w:r>
+          </w:p>
+        </w:tc>
+        <w:tc>
+          <w:tcPr>
+            <w:tcW w:w="2000" w:type="dxa"/>
+            <w:tcBorders>
+              <w:top w:val="single" w:sz="4" w:space="0" w:color="BFBFBF"/>
+              <w:left w:val="single" w:sz="4" w:space="0" w:color="BFBFBF"/>
+              <w:bottom w:val="single" w:sz="4" w:space="0" w:color="BFBFBF"/>
+              <w:right w:val="single" w:sz="4" w:space="0" w:color="BFBFBF"/>
+            </w:tcBorders>
+            <w:tcMar>
+              <w:top w:w="60" w:type="dxa"/>
+              <w:left w:w="100" w:type="dxa"/>
+              <w:bottom w:w="60" w:type="dxa"/>
+              <w:right w:w="100" w:type="dxa"/>
+            </w:tcMar>
+          </w:tcPr>
+          <w:p>
+            <w:pPr>
+              <w:keepNext/>
+              <w:keepLines/>
+            </w:pPr>
+            <w:r>
+              <w:rPr>
+                <w:sz w:val="19"/>
+                <w:szCs w:val="19"/>
+              </w:rPr>
+              <w:t>−</w:t>
+            </w:r>
+            <w:r>
+              <w:rPr>
+                <w:sz w:val="19"/>
+                <w:szCs w:val="19"/>
+              </w:rPr>
+              <w:t>0.11 [−0.16, −0.07]</w:t>
+            </w:r>
+          </w:p>
+        </w:tc>
+        <w:tc>
+          <w:tcPr>
+            <w:tcW w:w="1300" w:type="dxa"/>
+            <w:tcBorders>
+              <w:top w:val="single" w:sz="4" w:space="0" w:color="BFBFBF"/>
+              <w:left w:val="single" w:sz="4" w:space="0" w:color="BFBFBF"/>
+              <w:bottom w:val="single" w:sz="4" w:space="0" w:color="BFBFBF"/>
+              <w:right w:val="single" w:sz="4" w:space="0" w:color="BFBFBF"/>
+            </w:tcBorders>
+            <w:tcMar>
+              <w:top w:w="60" w:type="dxa"/>
+              <w:left w:w="100" w:type="dxa"/>
+              <w:bottom w:w="60" w:type="dxa"/>
+              <w:right w:w="100" w:type="dxa"/>
+            </w:tcMar>
+          </w:tcPr>
+          <w:p>
+            <w:pPr>
+              <w:keepNext/>
+              <w:keepLines/>
+            </w:pPr>
+            <w:r>
+              <w:rPr>
+                <w:sz w:val="19"/>
+                <w:szCs w:val="19"/>
+              </w:rPr>
+              <w:t>6.3% (2.7–10.0)</w:t>
+            </w:r>
+          </w:p>
+        </w:tc>
+        <w:tc>
+          <w:tcPr>
+            <w:tcW w:w="1426" w:type="dxa"/>
+            <w:tcBorders>
+              <w:top w:val="single" w:sz="4" w:space="0" w:color="BFBFBF"/>
+              <w:left w:val="single" w:sz="4" w:space="0" w:color="BFBFBF"/>
+              <w:bottom w:val="single" w:sz="4" w:space="0" w:color="BFBFBF"/>
+              <w:right w:val="single" w:sz="4" w:space="0" w:color="BFBFBF"/>
+            </w:tcBorders>
+            <w:tcMar>
+              <w:top w:w="60" w:type="dxa"/>
+              <w:left w:w="100" w:type="dxa"/>
+              <w:bottom w:w="60" w:type="dxa"/>
+              <w:right w:w="100" w:type="dxa"/>
+            </w:tcMar>
+          </w:tcPr>
+          <w:p>
+            <w:pPr>
+              <w:keepNext/>
+              <w:keepLines/>
+            </w:pPr>
+            <w:r>
+              <w:rPr>
+                <w:sz w:val="19"/>
+                <w:szCs w:val="19"/>
+              </w:rPr>
+              <w:t>yes (heart rate R² 0.87)</w:t>
+            </w:r>
+          </w:p>
+        </w:tc>
+      </w:tr>
+      <w:tr>
+        <w:tblPrEx>
+          <w:tblCellMar>
+            <w:top w:w="0" w:type="dxa"/>
+            <w:bottom w:w="0" w:type="dxa"/>
+          </w:tblCellMar>
+        </w:tblPrEx>
+        <w:trPr>
+          <w:cantSplit/>
+        </w:trPr>
+        <w:tc>
+          <w:tcPr>
+            <w:tcW w:w="2100" w:type="dxa"/>
+            <w:tcBorders>
+              <w:top w:val="single" w:sz="4" w:space="0" w:color="BFBFBF"/>
+              <w:left w:val="single" w:sz="4" w:space="0" w:color="BFBFBF"/>
+              <w:bottom w:val="single" w:sz="4" w:space="0" w:color="BFBFBF"/>
+              <w:right w:val="single" w:sz="4" w:space="0" w:color="BFBFBF"/>
+            </w:tcBorders>
+            <w:tcMar>
+              <w:top w:w="60" w:type="dxa"/>
+              <w:left w:w="100" w:type="dxa"/>
+              <w:bottom w:w="60" w:type="dxa"/>
+              <w:right w:w="100" w:type="dxa"/>
+            </w:tcMar>
+          </w:tcPr>
+          <w:p>
+            <w:pPr>
+              <w:keepNext/>
+              <w:keepLines/>
+            </w:pPr>
+            <w:r>
+              <w:rPr>
+                <w:sz w:val="19"/>
+                <w:szCs w:val="19"/>
+              </w:rPr>
+              <w:t>2 (613 tokens), 3 seeds</w:t>
+            </w:r>
+          </w:p>
+        </w:tc>
+        <w:tc>
+          <w:tcPr>
+            <w:tcW w:w="2200" w:type="dxa"/>
+            <w:tcBorders>
+              <w:top w:val="single" w:sz="4" w:space="0" w:color="BFBFBF"/>
+              <w:left w:val="single" w:sz="4" w:space="0" w:color="BFBFBF"/>
+              <w:bottom w:val="single" w:sz="4" w:space="0" w:color="BFBFBF"/>
+              <w:right w:val="single" w:sz="4" w:space="0" w:color="BFBFBF"/>
+            </w:tcBorders>
+            <w:tcMar>
+              <w:top w:w="60" w:type="dxa"/>
+              <w:left w:w="100" w:type="dxa"/>
+              <w:bottom w:w="60" w:type="dxa"/>
+              <w:right w:w="100" w:type="dxa"/>
+            </w:tcMar>
+          </w:tcPr>
+          <w:p>
+            <w:pPr>
+              <w:keepNext/>
+              <w:keepLines/>
+            </w:pPr>
+            <w:r>
+              <w:rPr>
+                <w:sz w:val="19"/>
+                <w:szCs w:val="19"/>
+              </w:rPr>
+              <w:t>0.80 / 0.82 / 0.83 / 0.80</w:t>
+            </w:r>
+          </w:p>
+        </w:tc>
+        <w:tc>
+          <w:tcPr>
+            <w:tcW w:w="2000" w:type="dxa"/>
+            <w:tcBorders>
+              <w:top w:val="single" w:sz="4" w:space="0" w:color="BFBFBF"/>
+              <w:left w:val="single" w:sz="4" w:space="0" w:color="BFBFBF"/>
+              <w:bottom w:val="single" w:sz="4" w:space="0" w:color="BFBFBF"/>
+              <w:right w:val="single" w:sz="4" w:space="0" w:color="BFBFBF"/>
+            </w:tcBorders>
+            <w:tcMar>
+              <w:top w:w="60" w:type="dxa"/>
+              <w:left w:w="100" w:type="dxa"/>
+              <w:bottom w:w="60" w:type="dxa"/>
+              <w:right w:w="100" w:type="dxa"/>
+            </w:tcMar>
+          </w:tcPr>
+          <w:p>
+            <w:pPr>
+              <w:keepNext/>
+              <w:keepLines/>
+            </w:pPr>
+            <w:r>
+              <w:rPr>
+                <w:sz w:val="19"/>
+                <w:szCs w:val="19"/>
+              </w:rPr>
+              <w:t>−</w:t>
+            </w:r>
+            <w:r>
+              <w:rPr>
+                <w:sz w:val="19"/>
+                <w:szCs w:val="19"/>
+              </w:rPr>
+              <w:t>0.04 [−0.13, +0.03]</w:t>
+            </w:r>
+          </w:p>
+        </w:tc>
+        <w:tc>
+          <w:tcPr>
+            <w:tcW w:w="1300" w:type="dxa"/>
+            <w:tcBorders>
+              <w:top w:val="single" w:sz="4" w:space="0" w:color="BFBFBF"/>
+              <w:left w:val="single" w:sz="4" w:space="0" w:color="BFBFBF"/>
+              <w:bottom w:val="single" w:sz="4" w:space="0" w:color="BFBFBF"/>
+              <w:right w:val="single" w:sz="4" w:space="0" w:color="BFBFBF"/>
+            </w:tcBorders>
+            <w:tcMar>
+              <w:top w:w="60" w:type="dxa"/>
+              <w:left w:w="100" w:type="dxa"/>
+              <w:bottom w:w="60" w:type="dxa"/>
+              <w:right w:w="100" w:type="dxa"/>
+            </w:tcMar>
+          </w:tcPr>
+          <w:p>
+            <w:pPr>
+              <w:keepNext/>
+              <w:keepLines/>
+            </w:pPr>
+            <w:r>
+              <w:rPr>
+                <w:sz w:val="19"/>
+                <w:szCs w:val="19"/>
+              </w:rPr>
+              <w:t>8.6% (7.3–10.0)</w:t>
+            </w:r>
+          </w:p>
+        </w:tc>
+        <w:tc>
+          <w:tcPr>
+            <w:tcW w:w="1426" w:type="dxa"/>
+            <w:tcBorders>
+              <w:top w:val="single" w:sz="4" w:space="0" w:color="BFBFBF"/>
+              <w:left w:val="single" w:sz="4" w:space="0" w:color="BFBFBF"/>
+              <w:bottom w:val="single" w:sz="4" w:space="0" w:color="BFBFBF"/>
+              <w:right w:val="single" w:sz="4" w:space="0" w:color="BFBFBF"/>
+            </w:tcBorders>
+            <w:tcMar>
+              <w:top w:w="60" w:type="dxa"/>
+              <w:left w:w="100" w:type="dxa"/>
+              <w:bottom w:w="60" w:type="dxa"/>
+              <w:right w:w="100" w:type="dxa"/>
+            </w:tcMar>
+          </w:tcPr>
+          <w:p>
+            <w:pPr>
+              <w:keepNext/>
+              <w:keepLines/>
+            </w:pPr>
+            <w:r>
+              <w:rPr>
+                <w:sz w:val="19"/>
+                <w:szCs w:val="19"/>
+              </w:rPr>
+              <w:t>yes (0.81)</w:t>
+            </w:r>
+          </w:p>
+        </w:tc>
+      </w:tr>
+      <w:tr>
+        <w:tblPrEx>
+          <w:tblCellMar>
+            <w:top w:w="0" w:type="dxa"/>
+            <w:bottom w:w="0" w:type="dxa"/>
+          </w:tblCellMar>
+        </w:tblPrEx>
+        <w:trPr>
+          <w:cantSplit/>
+        </w:trPr>
+        <w:tc>
+          <w:tcPr>
+            <w:tcW w:w="2100" w:type="dxa"/>
+            <w:tcBorders>
+              <w:top w:val="single" w:sz="4" w:space="0" w:color="BFBFBF"/>
+              <w:left w:val="single" w:sz="4" w:space="0" w:color="BFBFBF"/>
+              <w:bottom w:val="single" w:sz="4" w:space="0" w:color="BFBFBF"/>
+              <w:right w:val="single" w:sz="4" w:space="0" w:color="BFBFBF"/>
+            </w:tcBorders>
+            <w:tcMar>
+              <w:top w:w="60" w:type="dxa"/>
+              <w:left w:w="100" w:type="dxa"/>
+              <w:bottom w:w="60" w:type="dxa"/>
+              <w:right w:w="100" w:type="dxa"/>
+            </w:tcMar>
+          </w:tcPr>
+          <w:p>
+            <w:pPr>
+              <w:keepNext/>
+              <w:keepLines/>
+            </w:pPr>
+            <w:r>
+              <w:rPr>
+                <w:sz w:val="19"/>
+                <w:szCs w:val="19"/>
+              </w:rPr>
+              <w:t>4 (713 tokens, r4), 3 seeds</w:t>
+            </w:r>
+          </w:p>
+        </w:tc>
+        <w:tc>
+          <w:tcPr>
+            <w:tcW w:w="2200" w:type="dxa"/>
+            <w:tcBorders>
+              <w:top w:val="single" w:sz="4" w:space="0" w:color="BFBFBF"/>
+              <w:left w:val="single" w:sz="4" w:space="0" w:color="BFBFBF"/>
+              <w:bottom w:val="single" w:sz="4" w:space="0" w:color="BFBFBF"/>
+              <w:right w:val="single" w:sz="4" w:space="0" w:color="BFBFBF"/>
+            </w:tcBorders>
+            <w:tcMar>
+              <w:top w:w="60" w:type="dxa"/>
+              <w:left w:w="100" w:type="dxa"/>
+              <w:bottom w:w="60" w:type="dxa"/>
+              <w:right w:w="100" w:type="dxa"/>
+            </w:tcMar>
+          </w:tcPr>
+          <w:p>
+            <w:pPr>
+              <w:keepNext/>
+              <w:keepLines/>
+            </w:pPr>
+            <w:r>
+              <w:rPr>
+                <w:sz w:val="19"/>
+                <w:szCs w:val="19"/>
+              </w:rPr>
+              <w:t>0.81 / 0.83 / 0.83 / 0.84</w:t>
+            </w:r>
+          </w:p>
+        </w:tc>
+        <w:tc>
+          <w:tcPr>
+            <w:tcW w:w="2000" w:type="dxa"/>
+            <w:tcBorders>
+              <w:top w:val="single" w:sz="4" w:space="0" w:color="BFBFBF"/>
+              <w:left w:val="single" w:sz="4" w:space="0" w:color="BFBFBF"/>
+              <w:bottom w:val="single" w:sz="4" w:space="0" w:color="BFBFBF"/>
+              <w:right w:val="single" w:sz="4" w:space="0" w:color="BFBFBF"/>
+            </w:tcBorders>
+            <w:tcMar>
+              <w:top w:w="60" w:type="dxa"/>
+              <w:left w:w="100" w:type="dxa"/>
+              <w:bottom w:w="60" w:type="dxa"/>
+              <w:right w:w="100" w:type="dxa"/>
+            </w:tcMar>
+          </w:tcPr>
+          <w:p>
+            <w:pPr>
+              <w:keepNext/>
+              <w:keepLines/>
+            </w:pPr>
+            <w:r>
+              <w:rPr>
+                <w:sz w:val="19"/>
+                <w:szCs w:val="19"/>
+              </w:rPr>
+              <w:t>–</w:t>
+            </w:r>
+          </w:p>
+        </w:tc>
+        <w:tc>
+          <w:tcPr>
+            <w:tcW w:w="1300" w:type="dxa"/>
+            <w:tcBorders>
+              <w:top w:val="single" w:sz="4" w:space="0" w:color="BFBFBF"/>
+              <w:left w:val="single" w:sz="4" w:space="0" w:color="BFBFBF"/>
+              <w:bottom w:val="single" w:sz="4" w:space="0" w:color="BFBFBF"/>
+              <w:right w:val="single" w:sz="4" w:space="0" w:color="BFBFBF"/>
+            </w:tcBorders>
+            <w:tcMar>
+              <w:top w:w="60" w:type="dxa"/>
+              <w:left w:w="100" w:type="dxa"/>
+              <w:bottom w:w="60" w:type="dxa"/>
+              <w:right w:w="100" w:type="dxa"/>
+            </w:tcMar>
+          </w:tcPr>
+          <w:p>
+            <w:pPr>
+              <w:keepNext/>
+              <w:keepLines/>
+            </w:pPr>
+            <w:r>
+              <w:rPr>
+                <w:sz w:val="19"/>
+                <w:szCs w:val="19"/>
+              </w:rPr>
+              <w:t>3.6% (2.7–4.8)</w:t>
+            </w:r>
+          </w:p>
+        </w:tc>
+        <w:tc>
+          <w:tcPr>
+            <w:tcW w:w="1426" w:type="dxa"/>
+            <w:tcBorders>
+              <w:top w:val="single" w:sz="4" w:space="0" w:color="BFBFBF"/>
+              <w:left w:val="single" w:sz="4" w:space="0" w:color="BFBFBF"/>
+              <w:bottom w:val="single" w:sz="4" w:space="0" w:color="BFBFBF"/>
+              <w:right w:val="single" w:sz="4" w:space="0" w:color="BFBFBF"/>
+            </w:tcBorders>
+            <w:tcMar>
+              <w:top w:w="60" w:type="dxa"/>
+              <w:left w:w="100" w:type="dxa"/>
+              <w:bottom w:w="60" w:type="dxa"/>
+              <w:right w:w="100" w:type="dxa"/>
+            </w:tcMar>
+          </w:tcPr>
+          <w:p>
+            <w:pPr>
+              <w:keepNext/>
+              <w:keepLines/>
+            </w:pPr>
+            <w:r>
+              <w:rPr>
+                <w:sz w:val="19"/>
+                <w:szCs w:val="19"/>
+              </w:rPr>
+              <w:t>yes (0.71)</w:t>
+            </w:r>
+          </w:p>
+        </w:tc>
+      </w:tr>
+      <w:tr>
+        <w:tblPrEx>
+          <w:tblCellMar>
+            <w:top w:w="0" w:type="dxa"/>
+            <w:bottom w:w="0" w:type="dxa"/>
+          </w:tblCellMar>
+        </w:tblPrEx>
+        <w:trPr>
+          <w:cantSplit/>
+        </w:trPr>
+        <w:tc>
+          <w:tcPr>
+            <w:tcW w:w="2100" w:type="dxa"/>
+            <w:tcBorders>
+              <w:top w:val="single" w:sz="4" w:space="0" w:color="BFBFBF"/>
+              <w:left w:val="single" w:sz="4" w:space="0" w:color="BFBFBF"/>
+              <w:bottom w:val="single" w:sz="4" w:space="0" w:color="BFBFBF"/>
+              <w:right w:val="single" w:sz="4" w:space="0" w:color="BFBFBF"/>
+            </w:tcBorders>
+            <w:tcMar>
+              <w:top w:w="60" w:type="dxa"/>
+              <w:left w:w="100" w:type="dxa"/>
+              <w:bottom w:w="60" w:type="dxa"/>
+              <w:right w:w="100" w:type="dxa"/>
+            </w:tcMar>
+          </w:tcPr>
+          <w:p>
+            <w:pPr>
+              <w:keepNext/>
+              <w:keepLines/>
+            </w:pPr>
+            <w:r>
+              <w:rPr>
+                <w:sz w:val="19"/>
+                <w:szCs w:val="19"/>
+              </w:rPr>
+              <w:t>8 (913 tokens), 1 run</w:t>
+            </w:r>
+          </w:p>
+        </w:tc>
+        <w:tc>
+          <w:tcPr>
+            <w:tcW w:w="2200" w:type="dxa"/>
+            <w:tcBorders>
+              <w:top w:val="single" w:sz="4" w:space="0" w:color="BFBFBF"/>
+              <w:left w:val="single" w:sz="4" w:space="0" w:color="BFBFBF"/>
+              <w:bottom w:val="single" w:sz="4" w:space="0" w:color="BFBFBF"/>
+              <w:right w:val="single" w:sz="4" w:space="0" w:color="BFBFBF"/>
+            </w:tcBorders>
+            <w:tcMar>
+              <w:top w:w="60" w:type="dxa"/>
+              <w:left w:w="100" w:type="dxa"/>
+              <w:bottom w:w="60" w:type="dxa"/>
+              <w:right w:w="100" w:type="dxa"/>
+            </w:tcMar>
+          </w:tcPr>
+          <w:p>
+            <w:pPr>
+              <w:keepNext/>
+              <w:keepLines/>
+            </w:pPr>
+            <w:r>
+              <w:rPr>
+                <w:sz w:val="19"/>
+                <w:szCs w:val="19"/>
+              </w:rPr>
+              <w:t>0.77 / 0.80 / 0.78 / 0.80</w:t>
+            </w:r>
+          </w:p>
+        </w:tc>
+        <w:tc>
+          <w:tcPr>
+            <w:tcW w:w="2000" w:type="dxa"/>
+            <w:tcBorders>
+              <w:top w:val="single" w:sz="4" w:space="0" w:color="BFBFBF"/>
+              <w:left w:val="single" w:sz="4" w:space="0" w:color="BFBFBF"/>
+              <w:bottom w:val="single" w:sz="4" w:space="0" w:color="BFBFBF"/>
+              <w:right w:val="single" w:sz="4" w:space="0" w:color="BFBFBF"/>
+            </w:tcBorders>
+            <w:tcMar>
+              <w:top w:w="60" w:type="dxa"/>
+              <w:left w:w="100" w:type="dxa"/>
+              <w:bottom w:w="60" w:type="dxa"/>
+              <w:right w:w="100" w:type="dxa"/>
+            </w:tcMar>
+          </w:tcPr>
+          <w:p>
+            <w:pPr>
+              <w:keepNext/>
+              <w:keepLines/>
+            </w:pPr>
+            <w:r>
+              <w:rPr>
+                <w:sz w:val="19"/>
+                <w:szCs w:val="19"/>
+              </w:rPr>
+              <w:t>single run</w:t>
+            </w:r>
+          </w:p>
+        </w:tc>
+        <w:tc>
+          <w:tcPr>
+            <w:tcW w:w="1300" w:type="dxa"/>
+            <w:tcBorders>
+              <w:top w:val="single" w:sz="4" w:space="0" w:color="BFBFBF"/>
+              <w:left w:val="single" w:sz="4" w:space="0" w:color="BFBFBF"/>
+              <w:bottom w:val="single" w:sz="4" w:space="0" w:color="BFBFBF"/>
+              <w:right w:val="single" w:sz="4" w:space="0" w:color="BFBFBF"/>
+            </w:tcBorders>
+            <w:tcMar>
+              <w:top w:w="60" w:type="dxa"/>
+              <w:left w:w="100" w:type="dxa"/>
+              <w:bottom w:w="60" w:type="dxa"/>
+              <w:right w:w="100" w:type="dxa"/>
+            </w:tcMar>
+          </w:tcPr>
+          <w:p>
+            <w:pPr>
+              <w:keepNext/>
+              <w:keepLines/>
+            </w:pPr>
+            <w:r>
+              <w:rPr>
+                <w:sz w:val="19"/>
+                <w:szCs w:val="19"/>
+              </w:rPr>
+              <w:t>6.1%</w:t>
+            </w:r>
+          </w:p>
+        </w:tc>
+        <w:tc>
+          <w:tcPr>
+            <w:tcW w:w="1426" w:type="dxa"/>
+            <w:tcBorders>
+              <w:top w:val="single" w:sz="4" w:space="0" w:color="BFBFBF"/>
+              <w:left w:val="single" w:sz="4" w:space="0" w:color="BFBFBF"/>
+              <w:bottom w:val="single" w:sz="4" w:space="0" w:color="BFBFBF"/>
+              <w:right w:val="single" w:sz="4" w:space="0" w:color="BFBFBF"/>
+            </w:tcBorders>
+            <w:tcMar>
+              <w:top w:w="60" w:type="dxa"/>
+              <w:left w:w="100" w:type="dxa"/>
+              <w:bottom w:w="60" w:type="dxa"/>
+              <w:right w:w="100" w:type="dxa"/>
+            </w:tcMar>
+          </w:tcPr>
+          <w:p>
+            <w:pPr>
+              <w:keepNext/>
+              <w:keepLines/>
+            </w:pPr>
+            <w:r>
+              <w:rPr>
+                <w:sz w:val="19"/>
+                <w:szCs w:val="19"/>
+              </w:rPr>
+              <w:t>label, tier, run yes</w:t>
+            </w:r>
+          </w:p>
+        </w:tc>
+      </w:tr>
+    </w:tbl>
+    <w:p>
+      <w:pPr>
+        <w:spacing w:before="60" w:after="240"/>
+      </w:pPr>
+      <w:r>
+        <w:rPr>
+          <w:i/>
+          <w:iCs/>
+          <w:color w:val="52514E"/>
+          <w:sz w:val="18"/>
+          <w:szCs w:val="18"/>
+        </w:rPr>
+        <w:t>Table 12. Tokens per event: accuracy (3-seed means), the least favourable difference from 4 tokens across N, false alarms (mean and seed range) and recoverability (slot 0).</w:t>
+      </w:r>
+    </w:p>
+    <w:p>
+      <w:pPr>
+        <w:keepNext/>
+        <w:spacing w:before="120"/>
+        <w:jc w:val="center"/>
+      </w:pPr>
+      <w:r>
+        <w:rPr>
+          <w:noProof/>
+        </w:rPr>
+        <w:drawing>
+          <wp:inline distT="0" distB="0" distL="0" distR="0" wp14:anchorId="35443825" wp14:editId="152AAB9A">
+            <wp:extent cx="5762625" cy="2314575"/>
+            <wp:effectExtent l="0" t="0" r="0" b="0"/>
+            <wp:docPr id="12" name="fig12_compression.png" descr="Figure 12. Every training run at each setting. With 1 token one run in three failed; with 2 tokens accuracy is close to 4 tokens but false alarms are higher in every run; 4 tokens is the smallest setting at which all runs were reliable on both measures." title="fig12_compression.png"/>
+            <wp:cNvGraphicFramePr>
+              <a:graphicFrameLocks xmlns:a="http://schemas.openxmlformats.org/drawingml/2006/main" noChangeAspect="1"/>
+            </wp:cNvGraphicFramePr>
+            <a:graphic xmlns:a="http://schemas.openxmlformats.org/drawingml/2006/main">
+              <a:graphicData uri="http://schemas.openxmlformats.org/drawingml/2006/picture">
+                <pic:pic xmlns:pic="http://schemas.openxmlformats.org/drawingml/2006/picture">
+                  <pic:nvPicPr>
+                    <pic:cNvPr id="0" name=""/>
+                    <pic:cNvPicPr>
+                      <a:picLocks noChangeAspect="1" noChangeArrowheads="1"/>
+                    </pic:cNvPicPr>
+                  </pic:nvPicPr>
+                  <pic:blipFill>
+                    <a:blip r:embed="rId18"/>
+                    <a:srcRect/>
+                    <a:stretch>
+                      <a:fillRect/>
+                    </a:stretch>
+                  </pic:blipFill>
+                  <pic:spPr bwMode="auto">
+                    <a:xfrm>
+                      <a:off x="0" y="0"/>
+                      <a:ext cx="5762625" cy="2314575"/>
+                    </a:xfrm>
+                    <a:prstGeom prst="rect">
+                      <a:avLst/>
+                    </a:prstGeom>
+                  </pic:spPr>
+                </pic:pic>
+              </a:graphicData>
+            </a:graphic>
+          </wp:inline>
+        </w:drawing>
+      </w:r>
+    </w:p>
+    <w:p>
+      <w:pPr>
+        <w:spacing w:before="60" w:after="240"/>
+      </w:pPr>
+      <w:r>
+        <w:rPr>
+          <w:i/>
+          <w:iCs/>
+          <w:color w:val="52514E"/>
+          <w:sz w:val="18"/>
+          <w:szCs w:val="18"/>
+        </w:rPr>
+        <w:t>Figure 12. Every training run at each setting. With 1 token one run in three failed; with 2 tokens accuracy is close to 4 tokens but false alarms are higher in every run; 4 tokens is the smallest setting at which all runs were reliable on both measures.</w:t>
+      </w:r>
+    </w:p>
+    <w:p>
+      <w:pPr>
+        <w:pStyle w:val="ListParagraph"/>
+        <w:numPr>
+          <w:ilvl w:val="0"/>
+          <w:numId w:val="2"/>
+        </w:numPr>
+        <w:spacing w:after="60"/>
+      </w:pPr>
+      <w:r>
+        <w:rPr>
+          <w:b/>
+          <w:bCs/>
+        </w:rPr>
+        <w:t>Neither 1 nor 2 tokens per event passes the pre-registered rule.</w:t>
+      </w:r>
+      <w:r>
+        <w:t xml:space="preserve"> One of three 1-token runs failed to learn the task; 2 tokens is within about 0.01 of 4 tokens at N = 5–20 but not demonstrably non-inferior, and its false alarms are more than twice as high on average (8.6% vs 3.6%) and higher in every run.</w:t>
+      </w:r>
+    </w:p>
+    <w:p>
+      <w:pPr>
+        <w:pStyle w:val="ListParagraph"/>
+        <w:numPr>
+          <w:ilvl w:val="0"/>
+          <w:numId w:val="2"/>
+        </w:numPr>
+        <w:spacing w:after="60"/>
+      </w:pPr>
+      <w:r>
+        <w:rPr>
+          <w:b/>
+          <w:bCs/>
+        </w:rPr>
+        <w:t>The information survives compression even when performance does not.</w:t>
+      </w:r>
+      <w:r>
+        <w:t xml:space="preserve"> Each event's label, tier, run length, heart rate and RR interval are recoverable from a single token, including from the 1-token run that failed the task. Compression therefore limits how reliably the receiver uses the information, not whether the information is there: decodable is not the same as used.</w:t>
+      </w:r>
+    </w:p>
+    <w:p>
+      <w:pPr>
+        <w:pStyle w:val="ListParagraph"/>
+        <w:numPr>
+          <w:ilvl w:val="0"/>
+          <w:numId w:val="2"/>
+        </w:numPr>
+        <w:spacing w:after="60"/>
+      </w:pPr>
+      <w:r>
+        <w:rPr>
+          <w:b/>
+          <w:bCs/>
+        </w:rPr>
+        <w:t>4 tokens per event is kept as the operating point</w:t>
+      </w:r>
+      <w:r>
+        <w:t xml:space="preserve"> (unchanged for the confirmatory test). Using fewer tokens would save 14–21% of the prompt at 50 events, at a cost in reliability.</w:t>
+      </w:r>
+    </w:p>
+    <w:p>
+      <w:pPr>
+        <w:pStyle w:val="Heading1"/>
+        <w:keepNext/>
+        <w:keepLines/>
+      </w:pPr>
+      <w:bookmarkStart w:id="23" w:name="_Toc242030846"/>
+      <w:r>
+        <w:t>11. Status of the research questions</w:t>
+      </w:r>
+      <w:bookmarkEnd w:id="23"/>
+    </w:p>
+    <w:tbl>
+      <w:tblPr>
+        <w:tblW w:w="9026" w:type="dxa"/>
+        <w:tblBorders>
+          <w:top w:val="single" w:sz="4" w:space="0" w:color="auto"/>
+          <w:left w:val="single" w:sz="4" w:space="0" w:color="auto"/>
+          <w:bottom w:val="single" w:sz="4" w:space="0" w:color="auto"/>
+          <w:right w:val="single" w:sz="4" w:space="0" w:color="auto"/>
+          <w:insideH w:val="single" w:sz="4" w:space="0" w:color="auto"/>
+          <w:insideV w:val="single" w:sz="4" w:space="0" w:color="auto"/>
+        </w:tblBorders>
+        <w:tblCellMar>
+          <w:left w:w="10" w:type="dxa"/>
+          <w:right w:w="10" w:type="dxa"/>
+        </w:tblCellMar>
+        <w:tblLook w:val="0000" w:firstRow="0" w:lastRow="0" w:firstColumn="0" w:lastColumn="0" w:noHBand="0" w:noVBand="0"/>
       </w:tblPr>
       <w:tblGrid>
         <w:gridCol w:w="1700"/>
@@ -13996,7 +16668,7 @@
                 <w:sz w:val="19"/>
                 <w:szCs w:val="19"/>
               </w:rPr>
-              <w:t>Refined: the saving is a multi-event effect; 19–78% lower prefill and 4–36% faster decision at N = 10–50 vs compact text; replicated on a second sender. Against filtered text, single-request latency is similar; with batching the adapter has 10–30% higher throughput, 12–28% less energy per decision and a fixed memory footprint (Section 6.1)</w:t>
+              <w:t>Refined: the saving is a multi-event effect; 19–78% lower prefill and 4–36% faster decision at N = 10–50 vs compact text; replicated on a second sender. Against filtered text, single-request latency is similar; with batching the adapter has 10–30% higher throughput, 12–28% less energy per decision and a fixed memory footprint (Section 6.1); 4 tokens per event is the smallest reliable setting (Section 10.2)</w:t>
             </w:r>
           </w:p>
         </w:tc>
@@ -14198,7 +16870,7 @@
                 <w:sz w:val="19"/>
                 <w:szCs w:val="19"/>
               </w:rPr>
-              <w:t>Extended: cost located in the encoder; RR branch raises it to 81% ± 5 (10 seeds); per-event decoding holds at every slot; heart rate, RR and run length now carried in the tokens (r4); replicated on a second sender (heart rate and RR R² about 0.9); uncertainty check available</w:t>
+              <w:t>Extended: cost located in the encoder; RR branch raises it to 81% ± 5 (10 seeds); per-event decoding holds at every slot; heart rate, RR and run length now carried in the tokens (r4); replicated on a second sender (heart rate and RR R² about 0.9); facts are recoverable only when passed to the adapter, and remain recoverable at 1 token per event; recoverable is not the same as used (Section 10); uncertainty check available</w:t>
             </w:r>
           </w:p>
         </w:tc>
@@ -14216,7 +16888,7 @@
           <w:sz w:val="18"/>
           <w:szCs w:val="18"/>
         </w:rPr>
-        <w:t>Table 11. Research questions: dissertation answer and how Phase 1 refined or extended it.</w:t>
+        <w:t>Table 13. Research questions: dissertation answer and how Phase 1 refined or extended it.</w:t>
       </w:r>
     </w:p>
     <w:p>
@@ -14225,11 +16897,11 @@
         <w:keepNext/>
         <w:keepLines/>
       </w:pPr>
-      <w:bookmarkStart w:id="21" w:name="_Toc241873304"/>
-      <w:r>
-        <w:t>11. Limitations and threats to validity</w:t>
-      </w:r>
-      <w:bookmarkEnd w:id="21"/>
+      <w:bookmarkStart w:id="24" w:name="_Toc242030847"/>
+      <w:r>
+        <w:t>12. Limitations and threats to validity</w:t>
+      </w:r>
+      <w:bookmarkEnd w:id="24"/>
     </w:p>
     <w:p>
       <w:pPr>
@@ -14254,7 +16926,7 @@
         <w:spacing w:after="60"/>
       </w:pPr>
       <w:r>
-        <w:t>Recipe r4 changed two things at once (hard negatives and side inputs), so their separate contributions are not identified; an ablation is planned. One r4 seed was still improving at the epoch cap and was evaluated as pre-registered.</w:t>
+        <w:t>One r4 seed was still improving at the epoch cap and was evaluated as pre-registered. Training outcomes vary noticeably between seeds (validation 0.72–0.82 for r4; one failed run at 1 token per event), so every adapter result is reported over three seeds.</w:t>
       </w:r>
     </w:p>
     <w:p>
@@ -14364,11 +17036,11 @@
         <w:keepNext/>
         <w:keepLines/>
       </w:pPr>
-      <w:bookmarkStart w:id="22" w:name="_Toc241873305"/>
-      <w:r>
-        <w:t>12. Proposed next steps</w:t>
-      </w:r>
-      <w:bookmarkEnd w:id="22"/>
+      <w:bookmarkStart w:id="25" w:name="_Toc242030848"/>
+      <w:r>
+        <w:t>13. Proposed next steps</w:t>
+      </w:r>
+      <w:bookmarkEnd w:id="25"/>
     </w:p>
     <w:p>
       <w:pPr>
@@ -14404,10 +17076,10 @@
           <w:b/>
           <w:bCs/>
         </w:rPr>
-        <w:t>Compression curve:</w:t>
-      </w:r>
-      <w:r>
-        <w:t xml:space="preserve"> 1, 2, 4 and 8 tokens per event, measuring accuracy and recoverability against cost (Deviation 24).</w:t>
+        <w:t>A second receiving language model</w:t>
+      </w:r>
+      <w:r>
+        <w:t xml:space="preserve"> is left as future work.</w:t>
       </w:r>
     </w:p>
     <w:p>
@@ -14420,46 +17092,6 @@
         <w:spacing w:after="60"/>
       </w:pPr>
       <w:r>
-        <w:rPr>
-          <w:b/>
-          <w:bCs/>
-        </w:rPr>
-        <w:t>Ablation of recipe r4:</w:t>
-      </w:r>
-      <w:r>
-        <w:t xml:space="preserve"> train with hard negatives only, to separate their effect from the side inputs'.</w:t>
-      </w:r>
-    </w:p>
-    <w:p>
-      <w:pPr>
-        <w:pStyle w:val="ListParagraph"/>
-        <w:numPr>
-          <w:ilvl w:val="0"/>
-          <w:numId w:val="3"/>
-        </w:numPr>
-        <w:spacing w:after="60"/>
-      </w:pPr>
-      <w:r>
-        <w:rPr>
-          <w:b/>
-          <w:bCs/>
-        </w:rPr>
-        <w:t>A second receiving language model</w:t>
-      </w:r>
-      <w:r>
-        <w:t xml:space="preserve"> is left as future work.</w:t>
-      </w:r>
-    </w:p>
-    <w:p>
-      <w:pPr>
-        <w:pStyle w:val="ListParagraph"/>
-        <w:numPr>
-          <w:ilvl w:val="0"/>
-          <w:numId w:val="3"/>
-        </w:numPr>
-        <w:spacing w:after="60"/>
-      </w:pPr>
-      <w:r>
         <w:t>Writing: present Phase 1 as a post-viva extension that strengthens the dissertation's evaluation (fair baselines, seeds, held-out patients) and carries the idea to multi-event reasoning; deviations summarised in one table.</w:t>
       </w:r>
     </w:p>
@@ -14477,11 +17109,11 @@
         <w:keepNext/>
         <w:keepLines/>
       </w:pPr>
-      <w:bookmarkStart w:id="23" w:name="_Toc241873306"/>
+      <w:bookmarkStart w:id="26" w:name="_Toc242030849"/>
       <w:r>
         <w:t>Appendix A. Pre-registered deviations</w:t>
       </w:r>
-      <w:bookmarkEnd w:id="23"/>
+      <w:bookmarkEnd w:id="26"/>
     </w:p>
     <w:tbl>
       <w:tblPr>
@@ -14498,7 +17130,7 @@
           <w:left w:w="10" w:type="dxa"/>
           <w:right w:w="10" w:type="dxa"/>
         </w:tblCellMar>
-        <w:tblLook w:val="04A0" w:firstRow="1" w:lastRow="0" w:firstColumn="1" w:lastColumn="0" w:noHBand="0" w:noVBand="1"/>
+        <w:tblLook w:val="0000" w:firstRow="0" w:lastRow="0" w:firstColumn="0" w:lastColumn="0" w:noHBand="0" w:noVBand="0"/>
       </w:tblPr>
       <w:tblGrid>
         <w:gridCol w:w="1000"/>
@@ -16601,7 +19233,7 @@
                 <w:sz w:val="19"/>
                 <w:szCs w:val="19"/>
               </w:rPr>
-              <w:t>Text generation stopped at the tier token, if verified on DS2 first</w:t>
+              <w:t>Text generation stopped at the tier token, if verified on DS2 first (verified: 2,390 of 2,390 identical)</w:t>
             </w:r>
           </w:p>
         </w:tc>
@@ -16632,6 +19264,208 @@
                 <w:szCs w:val="19"/>
               </w:rPr>
               <w:t>Compute for the confirmatory run</w:t>
+            </w:r>
+          </w:p>
+        </w:tc>
+      </w:tr>
+      <w:tr>
+        <w:tblPrEx>
+          <w:tblCellMar>
+            <w:top w:w="0" w:type="dxa"/>
+            <w:bottom w:w="0" w:type="dxa"/>
+          </w:tblCellMar>
+        </w:tblPrEx>
+        <w:trPr>
+          <w:cantSplit/>
+        </w:trPr>
+        <w:tc>
+          <w:tcPr>
+            <w:tcW w:w="1000" w:type="dxa"/>
+            <w:tcBorders>
+              <w:top w:val="single" w:sz="4" w:space="0" w:color="BFBFBF"/>
+              <w:left w:val="single" w:sz="4" w:space="0" w:color="BFBFBF"/>
+              <w:bottom w:val="single" w:sz="4" w:space="0" w:color="BFBFBF"/>
+              <w:right w:val="single" w:sz="4" w:space="0" w:color="BFBFBF"/>
+            </w:tcBorders>
+            <w:tcMar>
+              <w:top w:w="60" w:type="dxa"/>
+              <w:left w:w="100" w:type="dxa"/>
+              <w:bottom w:w="60" w:type="dxa"/>
+              <w:right w:w="100" w:type="dxa"/>
+            </w:tcMar>
+          </w:tcPr>
+          <w:p>
+            <w:pPr>
+              <w:keepNext/>
+              <w:keepLines/>
+            </w:pPr>
+            <w:r>
+              <w:rPr>
+                <w:sz w:val="19"/>
+                <w:szCs w:val="19"/>
+              </w:rPr>
+              <w:t>26</w:t>
+            </w:r>
+          </w:p>
+        </w:tc>
+        <w:tc>
+          <w:tcPr>
+            <w:tcW w:w="4600" w:type="dxa"/>
+            <w:tcBorders>
+              <w:top w:val="single" w:sz="4" w:space="0" w:color="BFBFBF"/>
+              <w:left w:val="single" w:sz="4" w:space="0" w:color="BFBFBF"/>
+              <w:bottom w:val="single" w:sz="4" w:space="0" w:color="BFBFBF"/>
+              <w:right w:val="single" w:sz="4" w:space="0" w:color="BFBFBF"/>
+            </w:tcBorders>
+            <w:tcMar>
+              <w:top w:w="60" w:type="dxa"/>
+              <w:left w:w="100" w:type="dxa"/>
+              <w:bottom w:w="60" w:type="dxa"/>
+              <w:right w:w="100" w:type="dxa"/>
+            </w:tcMar>
+          </w:tcPr>
+          <w:p>
+            <w:pPr>
+              <w:keepNext/>
+              <w:keepLines/>
+            </w:pPr>
+            <w:r>
+              <w:rPr>
+                <w:sz w:val="19"/>
+                <w:szCs w:val="19"/>
+              </w:rPr>
+              <w:t>Ablation of r4: hard negatives only (no side inputs), 3 seeds</w:t>
+            </w:r>
+          </w:p>
+        </w:tc>
+        <w:tc>
+          <w:tcPr>
+            <w:tcW w:w="3426" w:type="dxa"/>
+            <w:tcBorders>
+              <w:top w:val="single" w:sz="4" w:space="0" w:color="BFBFBF"/>
+              <w:left w:val="single" w:sz="4" w:space="0" w:color="BFBFBF"/>
+              <w:bottom w:val="single" w:sz="4" w:space="0" w:color="BFBFBF"/>
+              <w:right w:val="single" w:sz="4" w:space="0" w:color="BFBFBF"/>
+            </w:tcBorders>
+            <w:tcMar>
+              <w:top w:w="60" w:type="dxa"/>
+              <w:left w:w="100" w:type="dxa"/>
+              <w:bottom w:w="60" w:type="dxa"/>
+              <w:right w:w="100" w:type="dxa"/>
+            </w:tcMar>
+          </w:tcPr>
+          <w:p>
+            <w:pPr>
+              <w:keepNext/>
+              <w:keepLines/>
+            </w:pPr>
+            <w:r>
+              <w:rPr>
+                <w:sz w:val="19"/>
+                <w:szCs w:val="19"/>
+              </w:rPr>
+              <w:t>Separate the two r4 changes</w:t>
+            </w:r>
+          </w:p>
+        </w:tc>
+      </w:tr>
+      <w:tr>
+        <w:tblPrEx>
+          <w:tblCellMar>
+            <w:top w:w="0" w:type="dxa"/>
+            <w:bottom w:w="0" w:type="dxa"/>
+          </w:tblCellMar>
+        </w:tblPrEx>
+        <w:trPr>
+          <w:cantSplit/>
+        </w:trPr>
+        <w:tc>
+          <w:tcPr>
+            <w:tcW w:w="1000" w:type="dxa"/>
+            <w:tcBorders>
+              <w:top w:val="single" w:sz="4" w:space="0" w:color="BFBFBF"/>
+              <w:left w:val="single" w:sz="4" w:space="0" w:color="BFBFBF"/>
+              <w:bottom w:val="single" w:sz="4" w:space="0" w:color="BFBFBF"/>
+              <w:right w:val="single" w:sz="4" w:space="0" w:color="BFBFBF"/>
+            </w:tcBorders>
+            <w:tcMar>
+              <w:top w:w="60" w:type="dxa"/>
+              <w:left w:w="100" w:type="dxa"/>
+              <w:bottom w:w="60" w:type="dxa"/>
+              <w:right w:w="100" w:type="dxa"/>
+            </w:tcMar>
+          </w:tcPr>
+          <w:p>
+            <w:pPr>
+              <w:keepNext/>
+              <w:keepLines/>
+            </w:pPr>
+            <w:r>
+              <w:rPr>
+                <w:sz w:val="19"/>
+                <w:szCs w:val="19"/>
+              </w:rPr>
+              <w:t>27</w:t>
+            </w:r>
+          </w:p>
+        </w:tc>
+        <w:tc>
+          <w:tcPr>
+            <w:tcW w:w="4600" w:type="dxa"/>
+            <w:tcBorders>
+              <w:top w:val="single" w:sz="4" w:space="0" w:color="BFBFBF"/>
+              <w:left w:val="single" w:sz="4" w:space="0" w:color="BFBFBF"/>
+              <w:bottom w:val="single" w:sz="4" w:space="0" w:color="BFBFBF"/>
+              <w:right w:val="single" w:sz="4" w:space="0" w:color="BFBFBF"/>
+            </w:tcBorders>
+            <w:tcMar>
+              <w:top w:w="60" w:type="dxa"/>
+              <w:left w:w="100" w:type="dxa"/>
+              <w:bottom w:w="60" w:type="dxa"/>
+              <w:right w:w="100" w:type="dxa"/>
+            </w:tcMar>
+          </w:tcPr>
+          <w:p>
+            <w:pPr>
+              <w:keepNext/>
+              <w:keepLines/>
+            </w:pPr>
+            <w:r>
+              <w:rPr>
+                <w:sz w:val="19"/>
+                <w:szCs w:val="19"/>
+              </w:rPr>
+              <w:t>1 and 2 tokens per event repeated with 3 seeds</w:t>
+            </w:r>
+          </w:p>
+        </w:tc>
+        <w:tc>
+          <w:tcPr>
+            <w:tcW w:w="3426" w:type="dxa"/>
+            <w:tcBorders>
+              <w:top w:val="single" w:sz="4" w:space="0" w:color="BFBFBF"/>
+              <w:left w:val="single" w:sz="4" w:space="0" w:color="BFBFBF"/>
+              <w:bottom w:val="single" w:sz="4" w:space="0" w:color="BFBFBF"/>
+              <w:right w:val="single" w:sz="4" w:space="0" w:color="BFBFBF"/>
+            </w:tcBorders>
+            <w:tcMar>
+              <w:top w:w="60" w:type="dxa"/>
+              <w:left w:w="100" w:type="dxa"/>
+              <w:bottom w:w="60" w:type="dxa"/>
+              <w:right w:w="100" w:type="dxa"/>
+            </w:tcMar>
+          </w:tcPr>
+          <w:p>
+            <w:pPr>
+              <w:keepNext/>
+              <w:keepLines/>
+            </w:pPr>
+            <w:r>
+              <w:rPr>
+                <w:sz w:val="19"/>
+                <w:szCs w:val="19"/>
+              </w:rPr>
+              <w:t>A single-run sweep cannot separate the setting from training variance</w:t>
             </w:r>
           </w:p>
         </w:tc>
@@ -16649,11 +19483,11 @@
           <w:sz w:val="18"/>
           <w:szCs w:val="18"/>
         </w:rPr>
-        <w:t>Table 12. Deviations 1–25 (full text in the analysis plan).</w:t>
+        <w:t>Table 14. Deviations 1–27 (full text in the analysis plan).</w:t>
       </w:r>
     </w:p>
     <w:sectPr>
-      <w:footerReference w:type="default" r:id="rId18"/>
+      <w:footerReference w:type="default" r:id="rId19"/>
       <w:pgSz w:w="11906" w:h="16838"/>
       <w:pgMar w:top="1440" w:right="1440" w:bottom="1440" w:left="1440" w:header="708" w:footer="708" w:gutter="0"/>
       <w:cols w:space="720"/>
@@ -16763,118 +19597,10 @@
 <file path=word/numbering.xml><?xml version="1.0" encoding="utf-8"?>
 <w:numbering xmlns:wpc="http://schemas.microsoft.com/office/word/2010/wordprocessingCanvas" xmlns:cx="http://schemas.microsoft.com/office/drawing/2014/chartex" xmlns:cx1="http://schemas.microsoft.com/office/drawing/2015/9/8/chartex" xmlns:cx2="http://schemas.microsoft.com/office/drawing/2015/10/21/chartex" xmlns:cx3="http://schemas.microsoft.com/office/drawing/2016/5/9/chartex" xmlns:cx4="http://schemas.microsoft.com/office/drawing/2016/5/10/chartex" xmlns:cx5="http://schemas.microsoft.com/office/drawing/2016/5/11/chartex" xmlns:cx6="http://schemas.microsoft.com/office/drawing/2016/5/12/chartex" xmlns:cx7="http://schemas.microsoft.com/office/drawing/2016/5/13/chartex" xmlns:cx8="http://schemas.microsoft.com/office/drawing/2016/5/14/chartex" xmlns:mc="http://schemas.openxmlformats.org/markup-compatibility/2006" xmlns:aink="http://schemas.microsoft.com/office/drawing/2016/ink" xmlns:am3d="http://schemas.microsoft.com/office/drawing/2017/model3d" xmlns:o="urn:schemas-microsoft-com:office:office" xmlns:oel="http://schemas.microsoft.com/office/2019/extlst" xmlns:r="http://schemas.openxmlformats.org/officeDocument/2006/relationships" xmlns:m="http://schemas.openxmlformats.org/officeDocument/2006/math" xmlns:v="urn:schemas-microsoft-com:vml" xmlns:wp14="http://schemas.microsoft.com/office/word/2010/wordprocessingDrawing" xmlns:wp="http://schemas.openxmlformats.org/drawingml/2006/wordprocessingDrawing" xmlns:w10="urn:schemas-microsoft-com:office:word" xmlns:w="http://schemas.openxmlformats.org/wordprocessingml/2006/main" xmlns:w14="http://schemas.microsoft.com/office/word/2010/wordml" xmlns:w15="http://schemas.microsoft.com/office/word/2012/wordml" xmlns:w16cex="http://schemas.microsoft.com/office/word/2018/wordml/cex" xmlns:w16cid="http://schemas.microsoft.com/office/word/2016/wordml/cid" xmlns:w16="http://schemas.microsoft.com/office/word/2018/wordml" xmlns:w16du="http://schemas.microsoft.com/office/word/2023/wordml/word16du" xmlns:w16sdtdh="http://schemas.microsoft.com/office/word/2020/wordml/sdtdatahash" xmlns:w16sdtfl="http://schemas.microsoft.com/office/word/2024/wordml/sdtformatlock" xmlns:w16se="http://schemas.microsoft.com/office/word/2015/wordml/symex" xmlns:wpg="http://schemas.microsoft.com/office/word/2010/wordprocessingGroup" xmlns:wpi="http://schemas.microsoft.com/office/word/2010/wordprocessingInk" xmlns:wne="http://schemas.microsoft.com/office/word/2006/wordml" xmlns:wps="http://schemas.microsoft.com/office/word/2010/wordprocessingShape" mc:Ignorable="w14 w15 w16se w16cid w16 w16cex w16sdtdh w16sdtfl w16du wp14">
   <w:abstractNum w:abstractNumId="0" w15:restartNumberingAfterBreak="0">
-    <w:nsid w:val="25D93E20"/>
+    <w:nsid w:val="11800578"/>
     <w:multiLevelType w:val="hybridMultilevel"/>
-    <w:tmpl w:val="43769BB6"/>
-    <w:lvl w:ilvl="0" w:tplc="20CEF748">
-      <w:start w:val="1"/>
-      <w:numFmt w:val="decimal"/>
-      <w:lvlText w:val="%1."/>
-      <w:lvlJc w:val="left"/>
-      <w:pPr>
-        <w:ind w:left="540" w:hanging="300"/>
-      </w:pPr>
-    </w:lvl>
-    <w:lvl w:ilvl="1" w:tplc="3EF472F2">
-      <w:numFmt w:val="decimal"/>
-      <w:lvlText w:val=""/>
-      <w:lvlJc w:val="left"/>
-    </w:lvl>
-    <w:lvl w:ilvl="2" w:tplc="45E6FB8C">
-      <w:numFmt w:val="decimal"/>
-      <w:lvlText w:val=""/>
-      <w:lvlJc w:val="left"/>
-    </w:lvl>
-    <w:lvl w:ilvl="3" w:tplc="C944BF26">
-      <w:numFmt w:val="decimal"/>
-      <w:lvlText w:val=""/>
-      <w:lvlJc w:val="left"/>
-    </w:lvl>
-    <w:lvl w:ilvl="4" w:tplc="91A4CB56">
-      <w:numFmt w:val="decimal"/>
-      <w:lvlText w:val=""/>
-      <w:lvlJc w:val="left"/>
-    </w:lvl>
-    <w:lvl w:ilvl="5" w:tplc="323ECD8C">
-      <w:numFmt w:val="decimal"/>
-      <w:lvlText w:val=""/>
-      <w:lvlJc w:val="left"/>
-    </w:lvl>
-    <w:lvl w:ilvl="6" w:tplc="0408211A">
-      <w:numFmt w:val="decimal"/>
-      <w:lvlText w:val=""/>
-      <w:lvlJc w:val="left"/>
-    </w:lvl>
-    <w:lvl w:ilvl="7" w:tplc="285A72F6">
-      <w:numFmt w:val="decimal"/>
-      <w:lvlText w:val=""/>
-      <w:lvlJc w:val="left"/>
-    </w:lvl>
-    <w:lvl w:ilvl="8" w:tplc="AD7855B2">
-      <w:numFmt w:val="decimal"/>
-      <w:lvlText w:val=""/>
-      <w:lvlJc w:val="left"/>
-    </w:lvl>
-  </w:abstractNum>
-  <w:abstractNum w:abstractNumId="1" w15:restartNumberingAfterBreak="0">
-    <w:nsid w:val="6BCF407D"/>
-    <w:multiLevelType w:val="hybridMultilevel"/>
-    <w:tmpl w:val="8C18EDE4"/>
-    <w:lvl w:ilvl="0" w:tplc="026AE59C">
-      <w:start w:val="1"/>
-      <w:numFmt w:val="bullet"/>
-      <w:lvlText w:val="•"/>
-      <w:lvlJc w:val="left"/>
-      <w:pPr>
-        <w:ind w:left="540" w:hanging="270"/>
-      </w:pPr>
-    </w:lvl>
-    <w:lvl w:ilvl="1" w:tplc="3E7EB68A">
-      <w:numFmt w:val="decimal"/>
-      <w:lvlText w:val=""/>
-      <w:lvlJc w:val="left"/>
-    </w:lvl>
-    <w:lvl w:ilvl="2" w:tplc="758E28FE">
-      <w:numFmt w:val="decimal"/>
-      <w:lvlText w:val=""/>
-      <w:lvlJc w:val="left"/>
-    </w:lvl>
-    <w:lvl w:ilvl="3" w:tplc="EAB47B34">
-      <w:numFmt w:val="decimal"/>
-      <w:lvlText w:val=""/>
-      <w:lvlJc w:val="left"/>
-    </w:lvl>
-    <w:lvl w:ilvl="4" w:tplc="1924D526">
-      <w:numFmt w:val="decimal"/>
-      <w:lvlText w:val=""/>
-      <w:lvlJc w:val="left"/>
-    </w:lvl>
-    <w:lvl w:ilvl="5" w:tplc="9E12BAF8">
-      <w:numFmt w:val="decimal"/>
-      <w:lvlText w:val=""/>
-      <w:lvlJc w:val="left"/>
-    </w:lvl>
-    <w:lvl w:ilvl="6" w:tplc="59D6C39A">
-      <w:numFmt w:val="decimal"/>
-      <w:lvlText w:val=""/>
-      <w:lvlJc w:val="left"/>
-    </w:lvl>
-    <w:lvl w:ilvl="7" w:tplc="A2783E9C">
-      <w:numFmt w:val="decimal"/>
-      <w:lvlText w:val=""/>
-      <w:lvlJc w:val="left"/>
-    </w:lvl>
-    <w:lvl w:ilvl="8" w:tplc="39DAE4B6">
-      <w:numFmt w:val="decimal"/>
-      <w:lvlText w:val=""/>
-      <w:lvlJc w:val="left"/>
-    </w:lvl>
-  </w:abstractNum>
-  <w:abstractNum w:abstractNumId="2" w15:restartNumberingAfterBreak="0">
-    <w:nsid w:val="7D68583E"/>
-    <w:multiLevelType w:val="hybridMultilevel"/>
-    <w:tmpl w:val="A078998E"/>
-    <w:lvl w:ilvl="0" w:tplc="798C79E2" w:tentative="1">
+    <w:tmpl w:val="0E925F7A"/>
+    <w:lvl w:ilvl="0" w:tplc="5EEAD098" w:tentative="1">
       <w:start w:val="1"/>
       <w:numFmt w:val="bullet"/>
       <w:lvlText w:val="●"/>
@@ -16883,7 +19609,7 @@
         <w:ind w:left="720" w:hanging="360"/>
       </w:pPr>
     </w:lvl>
-    <w:lvl w:ilvl="1" w:tplc="7444C926" w:tentative="1">
+    <w:lvl w:ilvl="1" w:tplc="D1820828" w:tentative="1">
       <w:start w:val="1"/>
       <w:numFmt w:val="bullet"/>
       <w:lvlText w:val="○"/>
@@ -16892,7 +19618,7 @@
         <w:ind w:left="1440" w:hanging="360"/>
       </w:pPr>
     </w:lvl>
-    <w:lvl w:ilvl="2" w:tplc="3D1EFA0E" w:tentative="1">
+    <w:lvl w:ilvl="2" w:tplc="68F849CC" w:tentative="1">
       <w:start w:val="1"/>
       <w:numFmt w:val="bullet"/>
       <w:lvlText w:val="■"/>
@@ -16901,7 +19627,7 @@
         <w:ind w:left="2160" w:hanging="360"/>
       </w:pPr>
     </w:lvl>
-    <w:lvl w:ilvl="3" w:tplc="AC40A448" w:tentative="1">
+    <w:lvl w:ilvl="3" w:tplc="A5F2A376" w:tentative="1">
       <w:start w:val="1"/>
       <w:numFmt w:val="bullet"/>
       <w:lvlText w:val="●"/>
@@ -16910,7 +19636,7 @@
         <w:ind w:left="2880" w:hanging="360"/>
       </w:pPr>
     </w:lvl>
-    <w:lvl w:ilvl="4" w:tplc="F2484194" w:tentative="1">
+    <w:lvl w:ilvl="4" w:tplc="7AF68E7E" w:tentative="1">
       <w:start w:val="1"/>
       <w:numFmt w:val="bullet"/>
       <w:lvlText w:val="○"/>
@@ -16919,7 +19645,7 @@
         <w:ind w:left="3600" w:hanging="360"/>
       </w:pPr>
     </w:lvl>
-    <w:lvl w:ilvl="5" w:tplc="21146736" w:tentative="1">
+    <w:lvl w:ilvl="5" w:tplc="EC3C46DC" w:tentative="1">
       <w:start w:val="1"/>
       <w:numFmt w:val="bullet"/>
       <w:lvlText w:val="■"/>
@@ -16928,7 +19654,7 @@
         <w:ind w:left="4320" w:hanging="360"/>
       </w:pPr>
     </w:lvl>
-    <w:lvl w:ilvl="6" w:tplc="FD66F30A" w:tentative="1">
+    <w:lvl w:ilvl="6" w:tplc="E9A63CE0" w:tentative="1">
       <w:start w:val="1"/>
       <w:numFmt w:val="bullet"/>
       <w:lvlText w:val="●"/>
@@ -16937,7 +19663,7 @@
         <w:ind w:left="5040" w:hanging="360"/>
       </w:pPr>
     </w:lvl>
-    <w:lvl w:ilvl="7" w:tplc="840ADD96" w:tentative="1">
+    <w:lvl w:ilvl="7" w:tplc="F05EC576" w:tentative="1">
       <w:start w:val="1"/>
       <w:numFmt w:val="bullet"/>
       <w:lvlText w:val="●"/>
@@ -16946,7 +19672,7 @@
         <w:ind w:left="5760" w:hanging="360"/>
       </w:pPr>
     </w:lvl>
-    <w:lvl w:ilvl="8" w:tplc="413AD64A" w:tentative="1">
+    <w:lvl w:ilvl="8" w:tplc="DFF41A74" w:tentative="1">
       <w:start w:val="1"/>
       <w:numFmt w:val="bullet"/>
       <w:lvlText w:val="●"/>
@@ -16956,20 +19682,128 @@
       </w:pPr>
     </w:lvl>
   </w:abstractNum>
-  <w:num w:numId="1" w16cid:durableId="1386680904">
+  <w:abstractNum w:abstractNumId="1" w15:restartNumberingAfterBreak="0">
+    <w:nsid w:val="503A0AEA"/>
+    <w:multiLevelType w:val="hybridMultilevel"/>
+    <w:tmpl w:val="ED346DAC"/>
+    <w:lvl w:ilvl="0" w:tplc="F57AD184">
+      <w:start w:val="1"/>
+      <w:numFmt w:val="decimal"/>
+      <w:lvlText w:val="%1."/>
+      <w:lvlJc w:val="left"/>
+      <w:pPr>
+        <w:ind w:left="540" w:hanging="300"/>
+      </w:pPr>
+    </w:lvl>
+    <w:lvl w:ilvl="1" w:tplc="433E10CC">
+      <w:numFmt w:val="decimal"/>
+      <w:lvlText w:val=""/>
+      <w:lvlJc w:val="left"/>
+    </w:lvl>
+    <w:lvl w:ilvl="2" w:tplc="AE94DEFA">
+      <w:numFmt w:val="decimal"/>
+      <w:lvlText w:val=""/>
+      <w:lvlJc w:val="left"/>
+    </w:lvl>
+    <w:lvl w:ilvl="3" w:tplc="B56222DA">
+      <w:numFmt w:val="decimal"/>
+      <w:lvlText w:val=""/>
+      <w:lvlJc w:val="left"/>
+    </w:lvl>
+    <w:lvl w:ilvl="4" w:tplc="696E132A">
+      <w:numFmt w:val="decimal"/>
+      <w:lvlText w:val=""/>
+      <w:lvlJc w:val="left"/>
+    </w:lvl>
+    <w:lvl w:ilvl="5" w:tplc="AC220478">
+      <w:numFmt w:val="decimal"/>
+      <w:lvlText w:val=""/>
+      <w:lvlJc w:val="left"/>
+    </w:lvl>
+    <w:lvl w:ilvl="6" w:tplc="D958BE3A">
+      <w:numFmt w:val="decimal"/>
+      <w:lvlText w:val=""/>
+      <w:lvlJc w:val="left"/>
+    </w:lvl>
+    <w:lvl w:ilvl="7" w:tplc="4BB6F9DC">
+      <w:numFmt w:val="decimal"/>
+      <w:lvlText w:val=""/>
+      <w:lvlJc w:val="left"/>
+    </w:lvl>
+    <w:lvl w:ilvl="8" w:tplc="1110DAB4">
+      <w:numFmt w:val="decimal"/>
+      <w:lvlText w:val=""/>
+      <w:lvlJc w:val="left"/>
+    </w:lvl>
+  </w:abstractNum>
+  <w:abstractNum w:abstractNumId="2" w15:restartNumberingAfterBreak="0">
+    <w:nsid w:val="7B4C732D"/>
+    <w:multiLevelType w:val="hybridMultilevel"/>
+    <w:tmpl w:val="8736AC6C"/>
+    <w:lvl w:ilvl="0" w:tplc="47B42090">
+      <w:start w:val="1"/>
+      <w:numFmt w:val="bullet"/>
+      <w:lvlText w:val="•"/>
+      <w:lvlJc w:val="left"/>
+      <w:pPr>
+        <w:ind w:left="540" w:hanging="270"/>
+      </w:pPr>
+    </w:lvl>
+    <w:lvl w:ilvl="1" w:tplc="770EC7CE">
+      <w:numFmt w:val="decimal"/>
+      <w:lvlText w:val=""/>
+      <w:lvlJc w:val="left"/>
+    </w:lvl>
+    <w:lvl w:ilvl="2" w:tplc="CE8096B4">
+      <w:numFmt w:val="decimal"/>
+      <w:lvlText w:val=""/>
+      <w:lvlJc w:val="left"/>
+    </w:lvl>
+    <w:lvl w:ilvl="3" w:tplc="F104AFCA">
+      <w:numFmt w:val="decimal"/>
+      <w:lvlText w:val=""/>
+      <w:lvlJc w:val="left"/>
+    </w:lvl>
+    <w:lvl w:ilvl="4" w:tplc="751E8690">
+      <w:numFmt w:val="decimal"/>
+      <w:lvlText w:val=""/>
+      <w:lvlJc w:val="left"/>
+    </w:lvl>
+    <w:lvl w:ilvl="5" w:tplc="E3D040DA">
+      <w:numFmt w:val="decimal"/>
+      <w:lvlText w:val=""/>
+      <w:lvlJc w:val="left"/>
+    </w:lvl>
+    <w:lvl w:ilvl="6" w:tplc="5BB6C89A">
+      <w:numFmt w:val="decimal"/>
+      <w:lvlText w:val=""/>
+      <w:lvlJc w:val="left"/>
+    </w:lvl>
+    <w:lvl w:ilvl="7" w:tplc="626E9DB8">
+      <w:numFmt w:val="decimal"/>
+      <w:lvlText w:val=""/>
+      <w:lvlJc w:val="left"/>
+    </w:lvl>
+    <w:lvl w:ilvl="8" w:tplc="4B683CF0">
+      <w:numFmt w:val="decimal"/>
+      <w:lvlText w:val=""/>
+      <w:lvlJc w:val="left"/>
+    </w:lvl>
+  </w:abstractNum>
+  <w:num w:numId="1" w16cid:durableId="1913809142">
+    <w:abstractNumId w:val="0"/>
+    <w:lvlOverride w:ilvl="0">
+      <w:startOverride w:val="1"/>
+    </w:lvlOverride>
+  </w:num>
+  <w:num w:numId="2" w16cid:durableId="1362239183">
     <w:abstractNumId w:val="2"/>
     <w:lvlOverride w:ilvl="0">
       <w:startOverride w:val="1"/>
     </w:lvlOverride>
   </w:num>
-  <w:num w:numId="2" w16cid:durableId="2128699132">
+  <w:num w:numId="3" w16cid:durableId="52118680">
     <w:abstractNumId w:val="1"/>
-    <w:lvlOverride w:ilvl="0">
-      <w:startOverride w:val="1"/>
-    </w:lvlOverride>
-  </w:num>
-  <w:num w:numId="3" w16cid:durableId="1118648276">
-    <w:abstractNumId w:val="0"/>
     <w:lvlOverride w:ilvl="0">
       <w:startOverride w:val="1"/>
     </w:lvlOverride>
@@ -17606,7 +20440,7 @@
     <w:autoRedefine/>
     <w:uiPriority w:val="39"/>
     <w:unhideWhenUsed/>
-    <w:rsid w:val="004C5131"/>
+    <w:rsid w:val="005371CD"/>
     <w:pPr>
       <w:spacing w:after="100"/>
     </w:pPr>
@@ -17618,7 +20452,7 @@
     <w:autoRedefine/>
     <w:uiPriority w:val="39"/>
     <w:unhideWhenUsed/>
-    <w:rsid w:val="004C5131"/>
+    <w:rsid w:val="005371CD"/>
     <w:pPr>
       <w:spacing w:after="100"/>
       <w:ind w:left="210"/>

</xml_diff>

<commit_message>
Report and ledger: k=1 CI upper bound -0.06 (was hand-rounded to -0.07)
Co-Authored-By: Claude Opus 5.5 <noreply@anthropic.com>
</commit_message>
<xml_diff>
--- a/reports/Phase1_Technical_Report.docx
+++ b/reports/Phase1_Technical_Report.docx
@@ -82,7 +82,7 @@
     <w:sdt>
       <w:sdtPr>
         <w:alias w:val="Contents"/>
-        <w:id w:val="437723479"/>
+        <w:id w:val="-1893489866"/>
       </w:sdtPr>
       <w:sdtEndPr/>
       <w:sdtContent>
@@ -110,7 +110,7 @@
           <w:r>
             <w:fldChar w:fldCharType="separate"/>
           </w:r>
-          <w:hyperlink w:anchor="_Toc242030823" w:history="1">
+          <w:hyperlink w:anchor="_Toc242032958" w:history="1">
             <w:r>
               <w:rPr>
                 <w:rStyle w:val="Hyperlink"/>
@@ -134,7 +134,7 @@
               <w:rPr>
                 <w:noProof/>
               </w:rPr>
-              <w:instrText xml:space="preserve"> PAGEREF _Toc242030823 \h </w:instrText>
+              <w:instrText xml:space="preserve"> PAGEREF _Toc242032958 \h </w:instrText>
             </w:r>
             <w:r>
               <w:rPr>
@@ -176,7 +176,7 @@
               <w14:ligatures w14:val="standardContextual"/>
             </w:rPr>
           </w:pPr>
-          <w:hyperlink w:anchor="_Toc242030824" w:history="1">
+          <w:hyperlink w:anchor="_Toc242032959" w:history="1">
             <w:r>
               <w:rPr>
                 <w:rStyle w:val="Hyperlink"/>
@@ -200,7 +200,7 @@
               <w:rPr>
                 <w:noProof/>
               </w:rPr>
-              <w:instrText xml:space="preserve"> PAGEREF _Toc242030824 \h </w:instrText>
+              <w:instrText xml:space="preserve"> PAGEREF _Toc242032959 \h </w:instrText>
             </w:r>
             <w:r>
               <w:rPr>
@@ -242,7 +242,7 @@
               <w14:ligatures w14:val="standardContextual"/>
             </w:rPr>
           </w:pPr>
-          <w:hyperlink w:anchor="_Toc242030825" w:history="1">
+          <w:hyperlink w:anchor="_Toc242032960" w:history="1">
             <w:r>
               <w:rPr>
                 <w:rStyle w:val="Hyperlink"/>
@@ -266,7 +266,7 @@
               <w:rPr>
                 <w:noProof/>
               </w:rPr>
-              <w:instrText xml:space="preserve"> PAGEREF _Toc242030825 \h </w:instrText>
+              <w:instrText xml:space="preserve"> PAGEREF _Toc242032960 \h </w:instrText>
             </w:r>
             <w:r>
               <w:rPr>
@@ -308,7 +308,7 @@
               <w14:ligatures w14:val="standardContextual"/>
             </w:rPr>
           </w:pPr>
-          <w:hyperlink w:anchor="_Toc242030826" w:history="1">
+          <w:hyperlink w:anchor="_Toc242032961" w:history="1">
             <w:r>
               <w:rPr>
                 <w:rStyle w:val="Hyperlink"/>
@@ -332,7 +332,7 @@
               <w:rPr>
                 <w:noProof/>
               </w:rPr>
-              <w:instrText xml:space="preserve"> PAGEREF _Toc242030826 \h </w:instrText>
+              <w:instrText xml:space="preserve"> PAGEREF _Toc242032961 \h </w:instrText>
             </w:r>
             <w:r>
               <w:rPr>
@@ -374,7 +374,7 @@
               <w14:ligatures w14:val="standardContextual"/>
             </w:rPr>
           </w:pPr>
-          <w:hyperlink w:anchor="_Toc242030827" w:history="1">
+          <w:hyperlink w:anchor="_Toc242032962" w:history="1">
             <w:r>
               <w:rPr>
                 <w:rStyle w:val="Hyperlink"/>
@@ -398,7 +398,7 @@
               <w:rPr>
                 <w:noProof/>
               </w:rPr>
-              <w:instrText xml:space="preserve"> PAGEREF _Toc242030827 \h </w:instrText>
+              <w:instrText xml:space="preserve"> PAGEREF _Toc242032962 \h </w:instrText>
             </w:r>
             <w:r>
               <w:rPr>
@@ -440,7 +440,7 @@
               <w14:ligatures w14:val="standardContextual"/>
             </w:rPr>
           </w:pPr>
-          <w:hyperlink w:anchor="_Toc242030828" w:history="1">
+          <w:hyperlink w:anchor="_Toc242032963" w:history="1">
             <w:r>
               <w:rPr>
                 <w:rStyle w:val="Hyperlink"/>
@@ -464,7 +464,7 @@
               <w:rPr>
                 <w:noProof/>
               </w:rPr>
-              <w:instrText xml:space="preserve"> PAGEREF _Toc242030828 \h </w:instrText>
+              <w:instrText xml:space="preserve"> PAGEREF _Toc242032963 \h </w:instrText>
             </w:r>
             <w:r>
               <w:rPr>
@@ -506,7 +506,7 @@
               <w14:ligatures w14:val="standardContextual"/>
             </w:rPr>
           </w:pPr>
-          <w:hyperlink w:anchor="_Toc242030829" w:history="1">
+          <w:hyperlink w:anchor="_Toc242032964" w:history="1">
             <w:r>
               <w:rPr>
                 <w:rStyle w:val="Hyperlink"/>
@@ -530,7 +530,7 @@
               <w:rPr>
                 <w:noProof/>
               </w:rPr>
-              <w:instrText xml:space="preserve"> PAGEREF _Toc242030829 \h </w:instrText>
+              <w:instrText xml:space="preserve"> PAGEREF _Toc242032964 \h </w:instrText>
             </w:r>
             <w:r>
               <w:rPr>
@@ -572,7 +572,7 @@
               <w14:ligatures w14:val="standardContextual"/>
             </w:rPr>
           </w:pPr>
-          <w:hyperlink w:anchor="_Toc242030830" w:history="1">
+          <w:hyperlink w:anchor="_Toc242032965" w:history="1">
             <w:r>
               <w:rPr>
                 <w:rStyle w:val="Hyperlink"/>
@@ -596,7 +596,7 @@
               <w:rPr>
                 <w:noProof/>
               </w:rPr>
-              <w:instrText xml:space="preserve"> PAGEREF _Toc242030830 \h </w:instrText>
+              <w:instrText xml:space="preserve"> PAGEREF _Toc242032965 \h </w:instrText>
             </w:r>
             <w:r>
               <w:rPr>
@@ -638,7 +638,7 @@
               <w14:ligatures w14:val="standardContextual"/>
             </w:rPr>
           </w:pPr>
-          <w:hyperlink w:anchor="_Toc242030831" w:history="1">
+          <w:hyperlink w:anchor="_Toc242032966" w:history="1">
             <w:r>
               <w:rPr>
                 <w:rStyle w:val="Hyperlink"/>
@@ -662,7 +662,7 @@
               <w:rPr>
                 <w:noProof/>
               </w:rPr>
-              <w:instrText xml:space="preserve"> PAGEREF _Toc242030831 \h </w:instrText>
+              <w:instrText xml:space="preserve"> PAGEREF _Toc242032966 \h </w:instrText>
             </w:r>
             <w:r>
               <w:rPr>
@@ -704,7 +704,7 @@
               <w14:ligatures w14:val="standardContextual"/>
             </w:rPr>
           </w:pPr>
-          <w:hyperlink w:anchor="_Toc242030832" w:history="1">
+          <w:hyperlink w:anchor="_Toc242032967" w:history="1">
             <w:r>
               <w:rPr>
                 <w:rStyle w:val="Hyperlink"/>
@@ -728,7 +728,7 @@
               <w:rPr>
                 <w:noProof/>
               </w:rPr>
-              <w:instrText xml:space="preserve"> PAGEREF _Toc242030832 \h </w:instrText>
+              <w:instrText xml:space="preserve"> PAGEREF _Toc242032967 \h </w:instrText>
             </w:r>
             <w:r>
               <w:rPr>
@@ -770,7 +770,7 @@
               <w14:ligatures w14:val="standardContextual"/>
             </w:rPr>
           </w:pPr>
-          <w:hyperlink w:anchor="_Toc242030833" w:history="1">
+          <w:hyperlink w:anchor="_Toc242032968" w:history="1">
             <w:r>
               <w:rPr>
                 <w:rStyle w:val="Hyperlink"/>
@@ -794,7 +794,7 @@
               <w:rPr>
                 <w:noProof/>
               </w:rPr>
-              <w:instrText xml:space="preserve"> PAGEREF _Toc242030833 \h </w:instrText>
+              <w:instrText xml:space="preserve"> PAGEREF _Toc242032968 \h </w:instrText>
             </w:r>
             <w:r>
               <w:rPr>
@@ -836,7 +836,7 @@
               <w14:ligatures w14:val="standardContextual"/>
             </w:rPr>
           </w:pPr>
-          <w:hyperlink w:anchor="_Toc242030834" w:history="1">
+          <w:hyperlink w:anchor="_Toc242032969" w:history="1">
             <w:r>
               <w:rPr>
                 <w:rStyle w:val="Hyperlink"/>
@@ -860,7 +860,7 @@
               <w:rPr>
                 <w:noProof/>
               </w:rPr>
-              <w:instrText xml:space="preserve"> PAGEREF _Toc242030834 \h </w:instrText>
+              <w:instrText xml:space="preserve"> PAGEREF _Toc242032969 \h </w:instrText>
             </w:r>
             <w:r>
               <w:rPr>
@@ -902,7 +902,7 @@
               <w14:ligatures w14:val="standardContextual"/>
             </w:rPr>
           </w:pPr>
-          <w:hyperlink w:anchor="_Toc242030835" w:history="1">
+          <w:hyperlink w:anchor="_Toc242032970" w:history="1">
             <w:r>
               <w:rPr>
                 <w:rStyle w:val="Hyperlink"/>
@@ -926,7 +926,7 @@
               <w:rPr>
                 <w:noProof/>
               </w:rPr>
-              <w:instrText xml:space="preserve"> PAGEREF _Toc242030835 \h </w:instrText>
+              <w:instrText xml:space="preserve"> PAGEREF _Toc242032970 \h </w:instrText>
             </w:r>
             <w:r>
               <w:rPr>
@@ -968,7 +968,7 @@
               <w14:ligatures w14:val="standardContextual"/>
             </w:rPr>
           </w:pPr>
-          <w:hyperlink w:anchor="_Toc242030836" w:history="1">
+          <w:hyperlink w:anchor="_Toc242032971" w:history="1">
             <w:r>
               <w:rPr>
                 <w:rStyle w:val="Hyperlink"/>
@@ -992,7 +992,7 @@
               <w:rPr>
                 <w:noProof/>
               </w:rPr>
-              <w:instrText xml:space="preserve"> PAGEREF _Toc242030836 \h </w:instrText>
+              <w:instrText xml:space="preserve"> PAGEREF _Toc242032971 \h </w:instrText>
             </w:r>
             <w:r>
               <w:rPr>
@@ -1034,7 +1034,7 @@
               <w14:ligatures w14:val="standardContextual"/>
             </w:rPr>
           </w:pPr>
-          <w:hyperlink w:anchor="_Toc242030837" w:history="1">
+          <w:hyperlink w:anchor="_Toc242032972" w:history="1">
             <w:r>
               <w:rPr>
                 <w:rStyle w:val="Hyperlink"/>
@@ -1058,7 +1058,7 @@
               <w:rPr>
                 <w:noProof/>
               </w:rPr>
-              <w:instrText xml:space="preserve"> PAGEREF _Toc242030837 \h </w:instrText>
+              <w:instrText xml:space="preserve"> PAGEREF _Toc242032972 \h </w:instrText>
             </w:r>
             <w:r>
               <w:rPr>
@@ -1100,7 +1100,7 @@
               <w14:ligatures w14:val="standardContextual"/>
             </w:rPr>
           </w:pPr>
-          <w:hyperlink w:anchor="_Toc242030838" w:history="1">
+          <w:hyperlink w:anchor="_Toc242032973" w:history="1">
             <w:r>
               <w:rPr>
                 <w:rStyle w:val="Hyperlink"/>
@@ -1124,7 +1124,7 @@
               <w:rPr>
                 <w:noProof/>
               </w:rPr>
-              <w:instrText xml:space="preserve"> PAGEREF _Toc242030838 \h </w:instrText>
+              <w:instrText xml:space="preserve"> PAGEREF _Toc242032973 \h </w:instrText>
             </w:r>
             <w:r>
               <w:rPr>
@@ -1166,7 +1166,7 @@
               <w14:ligatures w14:val="standardContextual"/>
             </w:rPr>
           </w:pPr>
-          <w:hyperlink w:anchor="_Toc242030839" w:history="1">
+          <w:hyperlink w:anchor="_Toc242032974" w:history="1">
             <w:r>
               <w:rPr>
                 <w:rStyle w:val="Hyperlink"/>
@@ -1190,7 +1190,7 @@
               <w:rPr>
                 <w:noProof/>
               </w:rPr>
-              <w:instrText xml:space="preserve"> PAGEREF _Toc242030839 \h </w:instrText>
+              <w:instrText xml:space="preserve"> PAGEREF _Toc242032974 \h </w:instrText>
             </w:r>
             <w:r>
               <w:rPr>
@@ -1232,7 +1232,7 @@
               <w14:ligatures w14:val="standardContextual"/>
             </w:rPr>
           </w:pPr>
-          <w:hyperlink w:anchor="_Toc242030840" w:history="1">
+          <w:hyperlink w:anchor="_Toc242032975" w:history="1">
             <w:r>
               <w:rPr>
                 <w:rStyle w:val="Hyperlink"/>
@@ -1256,7 +1256,7 @@
               <w:rPr>
                 <w:noProof/>
               </w:rPr>
-              <w:instrText xml:space="preserve"> PAGEREF _Toc242030840 \h </w:instrText>
+              <w:instrText xml:space="preserve"> PAGEREF _Toc242032975 \h </w:instrText>
             </w:r>
             <w:r>
               <w:rPr>
@@ -1298,7 +1298,7 @@
               <w14:ligatures w14:val="standardContextual"/>
             </w:rPr>
           </w:pPr>
-          <w:hyperlink w:anchor="_Toc242030841" w:history="1">
+          <w:hyperlink w:anchor="_Toc242032976" w:history="1">
             <w:r>
               <w:rPr>
                 <w:rStyle w:val="Hyperlink"/>
@@ -1322,7 +1322,7 @@
               <w:rPr>
                 <w:noProof/>
               </w:rPr>
-              <w:instrText xml:space="preserve"> PAGEREF _Toc242030841 \h </w:instrText>
+              <w:instrText xml:space="preserve"> PAGEREF _Toc242032976 \h </w:instrText>
             </w:r>
             <w:r>
               <w:rPr>
@@ -1364,7 +1364,7 @@
               <w14:ligatures w14:val="standardContextual"/>
             </w:rPr>
           </w:pPr>
-          <w:hyperlink w:anchor="_Toc242030842" w:history="1">
+          <w:hyperlink w:anchor="_Toc242032977" w:history="1">
             <w:r>
               <w:rPr>
                 <w:rStyle w:val="Hyperlink"/>
@@ -1388,7 +1388,7 @@
               <w:rPr>
                 <w:noProof/>
               </w:rPr>
-              <w:instrText xml:space="preserve"> PAGEREF _Toc242030842 \h </w:instrText>
+              <w:instrText xml:space="preserve"> PAGEREF _Toc242032977 \h </w:instrText>
             </w:r>
             <w:r>
               <w:rPr>
@@ -1430,7 +1430,7 @@
               <w14:ligatures w14:val="standardContextual"/>
             </w:rPr>
           </w:pPr>
-          <w:hyperlink w:anchor="_Toc242030843" w:history="1">
+          <w:hyperlink w:anchor="_Toc242032978" w:history="1">
             <w:r>
               <w:rPr>
                 <w:rStyle w:val="Hyperlink"/>
@@ -1454,7 +1454,7 @@
               <w:rPr>
                 <w:noProof/>
               </w:rPr>
-              <w:instrText xml:space="preserve"> PAGEREF _Toc242030843 \h </w:instrText>
+              <w:instrText xml:space="preserve"> PAGEREF _Toc242032978 \h </w:instrText>
             </w:r>
             <w:r>
               <w:rPr>
@@ -1496,7 +1496,7 @@
               <w14:ligatures w14:val="standardContextual"/>
             </w:rPr>
           </w:pPr>
-          <w:hyperlink w:anchor="_Toc242030844" w:history="1">
+          <w:hyperlink w:anchor="_Toc242032979" w:history="1">
             <w:r>
               <w:rPr>
                 <w:rStyle w:val="Hyperlink"/>
@@ -1520,7 +1520,7 @@
               <w:rPr>
                 <w:noProof/>
               </w:rPr>
-              <w:instrText xml:space="preserve"> PAGEREF _Toc242030844 \h </w:instrText>
+              <w:instrText xml:space="preserve"> PAGEREF _Toc242032979 \h </w:instrText>
             </w:r>
             <w:r>
               <w:rPr>
@@ -1562,7 +1562,7 @@
               <w14:ligatures w14:val="standardContextual"/>
             </w:rPr>
           </w:pPr>
-          <w:hyperlink w:anchor="_Toc242030845" w:history="1">
+          <w:hyperlink w:anchor="_Toc242032980" w:history="1">
             <w:r>
               <w:rPr>
                 <w:rStyle w:val="Hyperlink"/>
@@ -1586,7 +1586,7 @@
               <w:rPr>
                 <w:noProof/>
               </w:rPr>
-              <w:instrText xml:space="preserve"> PAGEREF _Toc242030845 \h </w:instrText>
+              <w:instrText xml:space="preserve"> PAGEREF _Toc242032980 \h </w:instrText>
             </w:r>
             <w:r>
               <w:rPr>
@@ -1628,7 +1628,7 @@
               <w14:ligatures w14:val="standardContextual"/>
             </w:rPr>
           </w:pPr>
-          <w:hyperlink w:anchor="_Toc242030846" w:history="1">
+          <w:hyperlink w:anchor="_Toc242032981" w:history="1">
             <w:r>
               <w:rPr>
                 <w:rStyle w:val="Hyperlink"/>
@@ -1652,7 +1652,7 @@
               <w:rPr>
                 <w:noProof/>
               </w:rPr>
-              <w:instrText xml:space="preserve"> PAGEREF _Toc242030846 \h </w:instrText>
+              <w:instrText xml:space="preserve"> PAGEREF _Toc242032981 \h </w:instrText>
             </w:r>
             <w:r>
               <w:rPr>
@@ -1694,7 +1694,7 @@
               <w14:ligatures w14:val="standardContextual"/>
             </w:rPr>
           </w:pPr>
-          <w:hyperlink w:anchor="_Toc242030847" w:history="1">
+          <w:hyperlink w:anchor="_Toc242032982" w:history="1">
             <w:r>
               <w:rPr>
                 <w:rStyle w:val="Hyperlink"/>
@@ -1718,7 +1718,7 @@
               <w:rPr>
                 <w:noProof/>
               </w:rPr>
-              <w:instrText xml:space="preserve"> PAGEREF _Toc242030847 \h </w:instrText>
+              <w:instrText xml:space="preserve"> PAGEREF _Toc242032982 \h </w:instrText>
             </w:r>
             <w:r>
               <w:rPr>
@@ -1760,7 +1760,7 @@
               <w14:ligatures w14:val="standardContextual"/>
             </w:rPr>
           </w:pPr>
-          <w:hyperlink w:anchor="_Toc242030848" w:history="1">
+          <w:hyperlink w:anchor="_Toc242032983" w:history="1">
             <w:r>
               <w:rPr>
                 <w:rStyle w:val="Hyperlink"/>
@@ -1784,7 +1784,7 @@
               <w:rPr>
                 <w:noProof/>
               </w:rPr>
-              <w:instrText xml:space="preserve"> PAGEREF _Toc242030848 \h </w:instrText>
+              <w:instrText xml:space="preserve"> PAGEREF _Toc242032983 \h </w:instrText>
             </w:r>
             <w:r>
               <w:rPr>
@@ -1826,7 +1826,7 @@
               <w14:ligatures w14:val="standardContextual"/>
             </w:rPr>
           </w:pPr>
-          <w:hyperlink w:anchor="_Toc242030849" w:history="1">
+          <w:hyperlink w:anchor="_Toc242032984" w:history="1">
             <w:r>
               <w:rPr>
                 <w:rStyle w:val="Hyperlink"/>
@@ -1850,7 +1850,7 @@
               <w:rPr>
                 <w:noProof/>
               </w:rPr>
-              <w:instrText xml:space="preserve"> PAGEREF _Toc242030849 \h </w:instrText>
+              <w:instrText xml:space="preserve"> PAGEREF _Toc242032984 \h </w:instrText>
             </w:r>
             <w:r>
               <w:rPr>
@@ -1895,7 +1895,7 @@
         <w:keepNext/>
         <w:keepLines/>
       </w:pPr>
-      <w:bookmarkStart w:id="0" w:name="_Toc242030823"/>
+      <w:bookmarkStart w:id="0" w:name="_Toc242032958"/>
       <w:r>
         <w:t>1. Executive summary</w:t>
       </w:r>
@@ -2141,7 +2141,7 @@
         <w:keepNext/>
         <w:keepLines/>
       </w:pPr>
-      <w:bookmarkStart w:id="1" w:name="_Toc242030824"/>
+      <w:bookmarkStart w:id="1" w:name="_Toc242032959"/>
       <w:r>
         <w:t>2. Starting point: the dissertation</w:t>
       </w:r>
@@ -2170,7 +2170,7 @@
           <w:left w:w="10" w:type="dxa"/>
           <w:right w:w="10" w:type="dxa"/>
         </w:tblCellMar>
-        <w:tblLook w:val="0000" w:firstRow="0" w:lastRow="0" w:firstColumn="0" w:lastColumn="0" w:noHBand="0" w:noVBand="0"/>
+        <w:tblLook w:val="04A0" w:firstRow="1" w:lastRow="0" w:firstColumn="1" w:lastColumn="0" w:noHBand="0" w:noVBand="1"/>
       </w:tblPr>
       <w:tblGrid>
         <w:gridCol w:w="3400"/>
@@ -2722,7 +2722,7 @@
         <w:keepNext/>
         <w:keepLines/>
       </w:pPr>
-      <w:bookmarkStart w:id="2" w:name="_Toc242030825"/>
+      <w:bookmarkStart w:id="2" w:name="_Toc242032960"/>
       <w:r>
         <w:t>3. How Phase 1 was run</w:t>
       </w:r>
@@ -2834,7 +2834,7 @@
         <w:keepNext/>
         <w:keepLines/>
       </w:pPr>
-      <w:bookmarkStart w:id="3" w:name="_Toc242030826"/>
+      <w:bookmarkStart w:id="3" w:name="_Toc242032961"/>
       <w:r>
         <w:t>4. Weaknesses in the original evaluation and how Phase 1 addressed them</w:t>
       </w:r>
@@ -2863,7 +2863,7 @@
           <w:left w:w="10" w:type="dxa"/>
           <w:right w:w="10" w:type="dxa"/>
         </w:tblCellMar>
-        <w:tblLook w:val="0000" w:firstRow="0" w:lastRow="0" w:firstColumn="0" w:lastColumn="0" w:noHBand="0" w:noVBand="0"/>
+        <w:tblLook w:val="04A0" w:firstRow="1" w:lastRow="0" w:firstColumn="1" w:lastColumn="0" w:noHBand="0" w:noVBand="1"/>
       </w:tblPr>
       <w:tblGrid>
         <w:gridCol w:w="1900"/>
@@ -3700,7 +3700,7 @@
         <w:keepNext/>
         <w:keepLines/>
       </w:pPr>
-      <w:bookmarkStart w:id="4" w:name="_Toc242030827"/>
+      <w:bookmarkStart w:id="4" w:name="_Toc242032962"/>
       <w:r>
         <w:t>5. What changed in the system</w:t>
       </w:r>
@@ -3717,7 +3717,7 @@
           <w:noProof/>
         </w:rPr>
         <w:drawing>
-          <wp:inline distT="0" distB="0" distL="0" distR="0" wp14:anchorId="3B2B38FE" wp14:editId="0436299D">
+          <wp:inline distT="0" distB="0" distL="0" distR="0" wp14:anchorId="5EB93A95" wp14:editId="030942AB">
             <wp:extent cx="5762625" cy="2524125"/>
             <wp:effectExtent l="0" t="0" r="0" b="0"/>
             <wp:docPr id="1" name="fig1_pipeline.png" descr="Figure 1. Pipeline before (single event) and after Phase 1 (multi-event). The highlighted block is the component trained in this work." title="fig1_pipeline.png"/>
@@ -3777,7 +3777,7 @@
         <w:keepNext/>
         <w:keepLines/>
       </w:pPr>
-      <w:bookmarkStart w:id="5" w:name="_Toc242030828"/>
+      <w:bookmarkStart w:id="5" w:name="_Toc242032963"/>
       <w:r>
         <w:t>5.1 Perception: RR-timing branch</w:t>
       </w:r>
@@ -3806,7 +3806,7 @@
           <w:left w:w="10" w:type="dxa"/>
           <w:right w:w="10" w:type="dxa"/>
         </w:tblCellMar>
-        <w:tblLook w:val="0000" w:firstRow="0" w:lastRow="0" w:firstColumn="0" w:lastColumn="0" w:noHBand="0" w:noVBand="0"/>
+        <w:tblLook w:val="04A0" w:firstRow="1" w:lastRow="0" w:firstColumn="1" w:lastColumn="0" w:noHBand="0" w:noVBand="1"/>
       </w:tblPr>
       <w:tblGrid>
         <w:gridCol w:w="2500"/>
@@ -4635,7 +4635,7 @@
         <w:keepNext/>
         <w:keepLines/>
       </w:pPr>
-      <w:bookmarkStart w:id="6" w:name="_Toc242030829"/>
+      <w:bookmarkStart w:id="6" w:name="_Toc242032964"/>
       <w:r>
         <w:t>5.2 Multi-event adapter</w:t>
       </w:r>
@@ -4699,7 +4699,7 @@
         <w:keepNext/>
         <w:keepLines/>
       </w:pPr>
-      <w:bookmarkStart w:id="7" w:name="_Toc242030830"/>
+      <w:bookmarkStart w:id="7" w:name="_Toc242032965"/>
       <w:r>
         <w:t>5.3 Recipe r4: hard negatives and side inputs (final)</w:t>
       </w:r>
@@ -4817,7 +4817,7 @@
           <w:noProof/>
         </w:rPr>
         <w:drawing>
-          <wp:inline distT="0" distB="0" distL="0" distR="0" wp14:anchorId="2CE72E7F" wp14:editId="3BEF9C66">
+          <wp:inline distT="0" distB="0" distL="0" distR="0" wp14:anchorId="154F5A1D" wp14:editId="2040C2A9">
             <wp:extent cx="5762625" cy="2657475"/>
             <wp:effectExtent l="0" t="0" r="0" b="0"/>
             <wp:docPr id="2" name="fig7_training_r4.png" descr="Figure 2. Validation balanced accuracy during training, recipe r4, three seeds. The best checkpoint per seed is selected on validation only; seed 303 was still improving when it reached the 3-epoch cap and was evaluated as pre-registered." title="fig7_training_r4.png"/>
@@ -4877,7 +4877,7 @@
         <w:keepNext/>
         <w:keepLines/>
       </w:pPr>
-      <w:bookmarkStart w:id="8" w:name="_Toc242030831"/>
+      <w:bookmarkStart w:id="8" w:name="_Toc242032966"/>
       <w:r>
         <w:t>5.4 Schema-constrained decoding</w:t>
       </w:r>
@@ -4897,7 +4897,7 @@
         <w:keepNext/>
         <w:keepLines/>
       </w:pPr>
-      <w:bookmarkStart w:id="9" w:name="_Toc242030832"/>
+      <w:bookmarkStart w:id="9" w:name="_Toc242032967"/>
       <w:r>
         <w:t>6. Efficiency results</w:t>
       </w:r>
@@ -4914,7 +4914,7 @@
           <w:noProof/>
         </w:rPr>
         <w:drawing>
-          <wp:inline distT="0" distB="0" distL="0" distR="0" wp14:anchorId="724FBBDC" wp14:editId="77E6D9B5">
+          <wp:inline distT="0" distB="0" distL="0" distR="0" wp14:anchorId="6F7899BE" wp14:editId="00AF11C0">
             <wp:extent cx="5762625" cy="1962150"/>
             <wp:effectExtent l="0" t="0" r="0" b="0"/>
             <wp:docPr id="3" name="fig2_latency.png" descr="Figure 3. Median latency per request (batch 1, 21 DS2 windows per N). Left: time to first token. Right: time until the urgency tier is generated (token 7 of the constrained answer)." title="fig2_latency.png"/>
@@ -4983,7 +4983,7 @@
           <w:left w:w="10" w:type="dxa"/>
           <w:right w:w="10" w:type="dxa"/>
         </w:tblCellMar>
-        <w:tblLook w:val="0000" w:firstRow="0" w:lastRow="0" w:firstColumn="0" w:lastColumn="0" w:noHBand="0" w:noVBand="0"/>
+        <w:tblLook w:val="04A0" w:firstRow="1" w:lastRow="0" w:firstColumn="1" w:lastColumn="0" w:noHBand="0" w:noVBand="1"/>
       </w:tblPr>
       <w:tblGrid>
         <w:gridCol w:w="1900"/>
@@ -5889,7 +5889,7 @@
         <w:keepNext/>
         <w:keepLines/>
       </w:pPr>
-      <w:bookmarkStart w:id="10" w:name="_Toc242030833"/>
+      <w:bookmarkStart w:id="10" w:name="_Toc242032968"/>
       <w:r>
         <w:t>6.1 Serving conditions: batching and prefix caching (Deviation 23)</w:t>
       </w:r>
@@ -5918,7 +5918,7 @@
           <w:left w:w="10" w:type="dxa"/>
           <w:right w:w="10" w:type="dxa"/>
         </w:tblCellMar>
-        <w:tblLook w:val="0000" w:firstRow="0" w:lastRow="0" w:firstColumn="0" w:lastColumn="0" w:noHBand="0" w:noVBand="0"/>
+        <w:tblLook w:val="04A0" w:firstRow="1" w:lastRow="0" w:firstColumn="1" w:lastColumn="0" w:noHBand="0" w:noVBand="1"/>
       </w:tblPr>
       <w:tblGrid>
         <w:gridCol w:w="700"/>
@@ -7494,7 +7494,7 @@
         <w:keepNext/>
         <w:keepLines/>
       </w:pPr>
-      <w:bookmarkStart w:id="11" w:name="_Toc242030834"/>
+      <w:bookmarkStart w:id="11" w:name="_Toc242032969"/>
       <w:r>
         <w:t>7. Accuracy results</w:t>
       </w:r>
@@ -7506,7 +7506,7 @@
         <w:keepNext/>
         <w:keepLines/>
       </w:pPr>
-      <w:bookmarkStart w:id="12" w:name="_Toc242030835"/>
+      <w:bookmarkStart w:id="12" w:name="_Toc242032970"/>
       <w:r>
         <w:t>7.1 Primary test (pre-registered, Deviation 16)</w:t>
       </w:r>
@@ -7531,7 +7531,7 @@
           <w:noProof/>
         </w:rPr>
         <w:drawing>
-          <wp:inline distT="0" distB="0" distL="0" distR="0" wp14:anchorId="6E3AFF72" wp14:editId="68669AA5">
+          <wp:inline distT="0" distB="0" distL="0" distR="0" wp14:anchorId="5748B2D0" wp14:editId="1B00BB05">
             <wp:extent cx="5762625" cy="2886075"/>
             <wp:effectExtent l="0" t="0" r="0" b="0"/>
             <wp:docPr id="4" name="fig3_accuracy_vs_n.png" descr="Figure 4. Balanced accuracy on the DS2 test set by window size. The final adapter (r4) stays at 0.80–0.84 for every N and sits above the previous recipe (r3) at every N; default text falls sharply from N = 5; text with a calibrated threshold recovers part of the gap." title="fig3_accuracy_vs_n.png"/>
@@ -7600,7 +7600,7 @@
           <w:left w:w="10" w:type="dxa"/>
           <w:right w:w="10" w:type="dxa"/>
         </w:tblCellMar>
-        <w:tblLook w:val="0000" w:firstRow="0" w:lastRow="0" w:firstColumn="0" w:lastColumn="0" w:noHBand="0" w:noVBand="0"/>
+        <w:tblLook w:val="04A0" w:firstRow="1" w:lastRow="0" w:firstColumn="1" w:lastColumn="0" w:noHBand="0" w:noVBand="1"/>
       </w:tblPr>
       <w:tblGrid>
         <w:gridCol w:w="700"/>
@@ -8797,7 +8797,7 @@
         <w:keepNext/>
         <w:keepLines/>
       </w:pPr>
-      <w:bookmarkStart w:id="13" w:name="_Toc242030836"/>
+      <w:bookmarkStart w:id="13" w:name="_Toc242032971"/>
       <w:r>
         <w:t>7.2 Primary comparison against default and calibrated text</w:t>
       </w:r>
@@ -8826,7 +8826,7 @@
           <w:left w:w="10" w:type="dxa"/>
           <w:right w:w="10" w:type="dxa"/>
         </w:tblCellMar>
-        <w:tblLook w:val="0000" w:firstRow="0" w:lastRow="0" w:firstColumn="0" w:lastColumn="0" w:noHBand="0" w:noVBand="0"/>
+        <w:tblLook w:val="04A0" w:firstRow="1" w:lastRow="0" w:firstColumn="1" w:lastColumn="0" w:noHBand="0" w:noVBand="1"/>
       </w:tblPr>
       <w:tblGrid>
         <w:gridCol w:w="700"/>
@@ -9683,7 +9683,7 @@
           <w:noProof/>
         </w:rPr>
         <w:drawing>
-          <wp:inline distT="0" distB="0" distL="0" distR="0" wp14:anchorId="43478AE0" wp14:editId="2AA79289">
+          <wp:inline distT="0" distB="0" distL="0" distR="0" wp14:anchorId="06136B83" wp14:editId="32103903">
             <wp:extent cx="5762625" cy="2886075"/>
             <wp:effectExtent l="0" t="0" r="0" b="0"/>
             <wp:docPr id="5" name="fig4_forest.png" descr="Figure 5. The comparisons of Table 7. Dotted red line: non-inferiority margin. Hollow markers show the previous recipe (r3) against calibrated text." title="fig4_forest.png"/>
@@ -9743,7 +9743,7 @@
         <w:keepNext/>
         <w:keepLines/>
       </w:pPr>
-      <w:bookmarkStart w:id="14" w:name="_Toc242030837"/>
+      <w:bookmarkStart w:id="14" w:name="_Toc242032972"/>
       <w:r>
         <w:t>7.3 Why text fails with many events</w:t>
       </w:r>
@@ -9760,7 +9760,7 @@
           <w:noProof/>
         </w:rPr>
         <w:drawing>
-          <wp:inline distT="0" distB="0" distL="0" distR="0" wp14:anchorId="79AD5F78" wp14:editId="0B34664C">
+          <wp:inline distT="0" distB="0" distL="0" distR="0" wp14:anchorId="3367F950" wp14:editId="36D44802">
             <wp:extent cx="5762625" cy="1971675"/>
             <wp:effectExtent l="0" t="0" r="0" b="0"/>
             <wp:docPr id="6" name="fig5_why_text_fails.png" descr="Figure 6. Left: text misses urgent windows caused by a single high-confidence V/F beat (a numeric threshold, 0.85, buried in a long list) far more than runs of abnormal beats. Right: text is worst when the key beat is in the middle of the list, the 'lost in the middle' effect; the adapter (r4, 3 seeds) shows no position effect." title="fig5_why_text_fails.png"/>
@@ -9841,7 +9841,7 @@
           <w:noProof/>
         </w:rPr>
         <w:drawing>
-          <wp:inline distT="0" distB="0" distL="0" distR="0" wp14:anchorId="74453411" wp14:editId="1DEB74CD">
+          <wp:inline distT="0" distB="0" distL="0" distR="0" wp14:anchorId="08DB3552" wp14:editId="5C992DEE">
             <wp:extent cx="5762625" cy="2667000"/>
             <wp:effectExtent l="0" t="0" r="0" b="0"/>
             <wp:docPr id="7" name="fig6_confusion_n50.png" descr="Figure 7. Confusion at N = 50. Text under-escalates (priority → routine, urgent → priority) and never raises a false alarm; the r4 adapter never calls an urgent window routine and escalates 3% of routine windows." title="fig6_confusion_n50.png"/>
@@ -9901,7 +9901,7 @@
         <w:keepNext/>
         <w:keepLines/>
       </w:pPr>
-      <w:bookmarkStart w:id="15" w:name="_Toc242030838"/>
+      <w:bookmarkStart w:id="15" w:name="_Toc242032973"/>
       <w:r>
         <w:t>7.4 False alarms: identified in r3, reduced in r4</w:t>
       </w:r>
@@ -9929,7 +9929,7 @@
           <w:noProof/>
         </w:rPr>
         <w:drawing>
-          <wp:inline distT="0" distB="0" distL="0" distR="0" wp14:anchorId="6CECA36D" wp14:editId="4D468D53">
+          <wp:inline distT="0" distB="0" distL="0" distR="0" wp14:anchorId="7B83E491" wp14:editId="0DE4781A">
             <wp:extent cx="5762625" cy="2533650"/>
             <wp:effectExtent l="0" t="0" r="0" b="0"/>
             <wp:docPr id="8" name="fig9_false_alarms.png" descr="Figure 8. Routine windows escalated to priority or urgent (bars: mean of 3 seeds; lines: seed range). Text never escalates a routine window." title="fig9_false_alarms.png"/>
@@ -9998,7 +9998,7 @@
           <w:left w:w="10" w:type="dxa"/>
           <w:right w:w="10" w:type="dxa"/>
         </w:tblCellMar>
-        <w:tblLook w:val="0000" w:firstRow="0" w:lastRow="0" w:firstColumn="0" w:lastColumn="0" w:noHBand="0" w:noVBand="0"/>
+        <w:tblLook w:val="04A0" w:firstRow="1" w:lastRow="0" w:firstColumn="1" w:lastColumn="0" w:noHBand="0" w:noVBand="1"/>
       </w:tblPr>
       <w:tblGrid>
         <w:gridCol w:w="700"/>
@@ -11004,7 +11004,7 @@
         <w:keepNext/>
         <w:keepLines/>
       </w:pPr>
-      <w:bookmarkStart w:id="16" w:name="_Toc242030839"/>
+      <w:bookmarkStart w:id="16" w:name="_Toc242032974"/>
       <w:r>
         <w:t>7.5 Against true annotations</w:t>
       </w:r>
@@ -11024,7 +11024,7 @@
         <w:keepNext/>
         <w:keepLines/>
       </w:pPr>
-      <w:bookmarkStart w:id="17" w:name="_Toc242030840"/>
+      <w:bookmarkStart w:id="17" w:name="_Toc242032975"/>
       <w:r>
         <w:t>7.6 Filtered text baseline (Deviation 20)</w:t>
       </w:r>
@@ -11053,7 +11053,7 @@
           <w:left w:w="10" w:type="dxa"/>
           <w:right w:w="10" w:type="dxa"/>
         </w:tblCellMar>
-        <w:tblLook w:val="0000" w:firstRow="0" w:lastRow="0" w:firstColumn="0" w:lastColumn="0" w:noHBand="0" w:noVBand="0"/>
+        <w:tblLook w:val="04A0" w:firstRow="1" w:lastRow="0" w:firstColumn="1" w:lastColumn="0" w:noHBand="0" w:noVBand="1"/>
       </w:tblPr>
       <w:tblGrid>
         <w:gridCol w:w="600"/>
@@ -12167,7 +12167,7 @@
         <w:keepNext/>
         <w:keepLines/>
       </w:pPr>
-      <w:bookmarkStart w:id="18" w:name="_Toc242030841"/>
+      <w:bookmarkStart w:id="18" w:name="_Toc242032976"/>
       <w:r>
         <w:t>8. Auditability</w:t>
       </w:r>
@@ -12284,7 +12284,7 @@
           <w:noProof/>
         </w:rPr>
         <w:drawing>
-          <wp:inline distT="0" distB="0" distL="0" distR="0" wp14:anchorId="26A88564" wp14:editId="2A1217CF">
+          <wp:inline distT="0" distB="0" distL="0" distR="0" wp14:anchorId="10E046CE" wp14:editId="0708F9A6">
             <wp:extent cx="5762625" cy="2371725"/>
             <wp:effectExtent l="0" t="0" r="0" b="0"/>
             <wp:docPr id="9" name="fig8_auditability.png" descr="Figure 9. Balanced accuracy of decoding each event's fields from its virtual-token slot (recipe r3, mean of 3 seeds) versus from the encoder's 32-d vector." title="fig8_auditability.png"/>
@@ -12349,7 +12349,7 @@
           <w:noProof/>
         </w:rPr>
         <w:drawing>
-          <wp:inline distT="0" distB="0" distL="0" distR="0" wp14:anchorId="132828CF" wp14:editId="06B2410E">
+          <wp:inline distT="0" distB="0" distL="0" distR="0" wp14:anchorId="7E5DFA3E" wp14:editId="76560B6A">
             <wp:extent cx="5762625" cy="2009775"/>
             <wp:effectExtent l="0" t="0" r="0" b="0"/>
             <wp:docPr id="10" name="fig10_side_info.png" descr="Figure 10. Facts carried per event after the r4 change, decoded from slots 0 and 49 of each seed (bars: mean; lines: range). Left: heart rate and RR interval (R²). Right: presence of a run of ≥ 3 abnormal beats (balanced accuracy; Deviation 18b, a pre-registered replacement for an R² metric that proved ill-posed on this split)." title="fig10_side_info.png"/>
@@ -12409,7 +12409,7 @@
         <w:keepNext/>
         <w:keepLines/>
       </w:pPr>
-      <w:bookmarkStart w:id="19" w:name="_Toc242030842"/>
+      <w:bookmarkStart w:id="19" w:name="_Toc242032977"/>
       <w:r>
         <w:t>9. Replication on a second sender (Deviation 22)</w:t>
       </w:r>
@@ -12441,7 +12441,7 @@
           <w:left w:w="10" w:type="dxa"/>
           <w:right w:w="10" w:type="dxa"/>
         </w:tblCellMar>
-        <w:tblLook w:val="0000" w:firstRow="0" w:lastRow="0" w:firstColumn="0" w:lastColumn="0" w:noHBand="0" w:noVBand="0"/>
+        <w:tblLook w:val="04A0" w:firstRow="1" w:lastRow="0" w:firstColumn="1" w:lastColumn="0" w:noHBand="0" w:noVBand="1"/>
       </w:tblPr>
       <w:tblGrid>
         <w:gridCol w:w="500"/>
@@ -13862,7 +13862,7 @@
           <w:noProof/>
         </w:rPr>
         <w:drawing>
-          <wp:inline distT="0" distB="0" distL="0" distR="0" wp14:anchorId="7F765DDF" wp14:editId="7AFC1F28">
+          <wp:inline distT="0" distB="0" distL="0" distR="0" wp14:anchorId="5E00DB1D" wp14:editId="61E2E03E">
             <wp:extent cx="5762625" cy="2524125"/>
             <wp:effectExtent l="0" t="0" r="0" b="0"/>
             <wp:docPr id="11" name="fig11_two_senders.png" descr="Figure 11. Both senders side by side. The pattern replicates: text with every event listed falls as N grows, the adapter stays roughly flat, and filtered text is the most accurate arm, except at N = 50 on the second sender." title="fig11_two_senders.png"/>
@@ -14005,7 +14005,7 @@
         <w:keepNext/>
         <w:keepLines/>
       </w:pPr>
-      <w:bookmarkStart w:id="20" w:name="_Toc242030843"/>
+      <w:bookmarkStart w:id="20" w:name="_Toc242032978"/>
       <w:r>
         <w:t>10. What the channel needs: ablation and compression (Deviations 24, 26, 27)</w:t>
       </w:r>
@@ -14017,7 +14017,7 @@
         <w:keepNext/>
         <w:keepLines/>
       </w:pPr>
-      <w:bookmarkStart w:id="21" w:name="_Toc242030844"/>
+      <w:bookmarkStart w:id="21" w:name="_Toc242032979"/>
       <w:r>
         <w:t>10.1 Ablation of recipe r4</w:t>
       </w:r>
@@ -14046,7 +14046,7 @@
           <w:left w:w="10" w:type="dxa"/>
           <w:right w:w="10" w:type="dxa"/>
         </w:tblCellMar>
-        <w:tblLook w:val="0000" w:firstRow="0" w:lastRow="0" w:firstColumn="0" w:lastColumn="0" w:noHBand="0" w:noVBand="0"/>
+        <w:tblLook w:val="04A0" w:firstRow="1" w:lastRow="0" w:firstColumn="1" w:lastColumn="0" w:noHBand="0" w:noVBand="1"/>
       </w:tblPr>
       <w:tblGrid>
         <w:gridCol w:w="2000"/>
@@ -15413,7 +15413,7 @@
         <w:keepNext/>
         <w:keepLines/>
       </w:pPr>
-      <w:bookmarkStart w:id="22" w:name="_Toc242030845"/>
+      <w:bookmarkStart w:id="22" w:name="_Toc242032980"/>
       <w:r>
         <w:t>10.2 How many tokens per event?</w:t>
       </w:r>
@@ -15442,7 +15442,7 @@
           <w:left w:w="10" w:type="dxa"/>
           <w:right w:w="10" w:type="dxa"/>
         </w:tblCellMar>
-        <w:tblLook w:val="0000" w:firstRow="0" w:lastRow="0" w:firstColumn="0" w:lastColumn="0" w:noHBand="0" w:noVBand="0"/>
+        <w:tblLook w:val="04A0" w:firstRow="1" w:lastRow="0" w:firstColumn="1" w:lastColumn="0" w:noHBand="0" w:noVBand="1"/>
       </w:tblPr>
       <w:tblGrid>
         <w:gridCol w:w="2100"/>
@@ -15731,7 +15731,7 @@
                 <w:sz w:val="19"/>
                 <w:szCs w:val="19"/>
               </w:rPr>
-              <w:t>0.11 [−0.16, −0.07]</w:t>
+              <w:t>0.11 [−0.16, −0.06]</w:t>
             </w:r>
           </w:p>
         </w:tc>
@@ -16313,7 +16313,7 @@
           <w:noProof/>
         </w:rPr>
         <w:drawing>
-          <wp:inline distT="0" distB="0" distL="0" distR="0" wp14:anchorId="35443825" wp14:editId="152AAB9A">
+          <wp:inline distT="0" distB="0" distL="0" distR="0" wp14:anchorId="57C19C43" wp14:editId="3994AC34">
             <wp:extent cx="5762625" cy="2314575"/>
             <wp:effectExtent l="0" t="0" r="0" b="0"/>
             <wp:docPr id="12" name="fig12_compression.png" descr="Figure 12. Every training run at each setting. With 1 token one run in three failed; with 2 tokens accuracy is close to 4 tokens but false alarms are higher in every run; 4 tokens is the smallest setting at which all runs were reliable on both measures." title="fig12_compression.png"/>
@@ -16433,7 +16433,7 @@
         <w:keepNext/>
         <w:keepLines/>
       </w:pPr>
-      <w:bookmarkStart w:id="23" w:name="_Toc242030846"/>
+      <w:bookmarkStart w:id="23" w:name="_Toc242032981"/>
       <w:r>
         <w:t>11. Status of the research questions</w:t>
       </w:r>
@@ -16454,7 +16454,7 @@
           <w:left w:w="10" w:type="dxa"/>
           <w:right w:w="10" w:type="dxa"/>
         </w:tblCellMar>
-        <w:tblLook w:val="0000" w:firstRow="0" w:lastRow="0" w:firstColumn="0" w:lastColumn="0" w:noHBand="0" w:noVBand="0"/>
+        <w:tblLook w:val="04A0" w:firstRow="1" w:lastRow="0" w:firstColumn="1" w:lastColumn="0" w:noHBand="0" w:noVBand="1"/>
       </w:tblPr>
       <w:tblGrid>
         <w:gridCol w:w="1700"/>
@@ -16897,7 +16897,7 @@
         <w:keepNext/>
         <w:keepLines/>
       </w:pPr>
-      <w:bookmarkStart w:id="24" w:name="_Toc242030847"/>
+      <w:bookmarkStart w:id="24" w:name="_Toc242032982"/>
       <w:r>
         <w:t>12. Limitations and threats to validity</w:t>
       </w:r>
@@ -17036,7 +17036,7 @@
         <w:keepNext/>
         <w:keepLines/>
       </w:pPr>
-      <w:bookmarkStart w:id="25" w:name="_Toc242030848"/>
+      <w:bookmarkStart w:id="25" w:name="_Toc242032983"/>
       <w:r>
         <w:t>13. Proposed next steps</w:t>
       </w:r>
@@ -17109,7 +17109,7 @@
         <w:keepNext/>
         <w:keepLines/>
       </w:pPr>
-      <w:bookmarkStart w:id="26" w:name="_Toc242030849"/>
+      <w:bookmarkStart w:id="26" w:name="_Toc242032984"/>
       <w:r>
         <w:t>Appendix A. Pre-registered deviations</w:t>
       </w:r>
@@ -17130,7 +17130,7 @@
           <w:left w:w="10" w:type="dxa"/>
           <w:right w:w="10" w:type="dxa"/>
         </w:tblCellMar>
-        <w:tblLook w:val="0000" w:firstRow="0" w:lastRow="0" w:firstColumn="0" w:lastColumn="0" w:noHBand="0" w:noVBand="0"/>
+        <w:tblLook w:val="04A0" w:firstRow="1" w:lastRow="0" w:firstColumn="1" w:lastColumn="0" w:noHBand="0" w:noVBand="1"/>
       </w:tblPr>
       <w:tblGrid>
         <w:gridCol w:w="1000"/>
@@ -19597,10 +19597,64 @@
 <file path=word/numbering.xml><?xml version="1.0" encoding="utf-8"?>
 <w:numbering xmlns:wpc="http://schemas.microsoft.com/office/word/2010/wordprocessingCanvas" xmlns:cx="http://schemas.microsoft.com/office/drawing/2014/chartex" xmlns:cx1="http://schemas.microsoft.com/office/drawing/2015/9/8/chartex" xmlns:cx2="http://schemas.microsoft.com/office/drawing/2015/10/21/chartex" xmlns:cx3="http://schemas.microsoft.com/office/drawing/2016/5/9/chartex" xmlns:cx4="http://schemas.microsoft.com/office/drawing/2016/5/10/chartex" xmlns:cx5="http://schemas.microsoft.com/office/drawing/2016/5/11/chartex" xmlns:cx6="http://schemas.microsoft.com/office/drawing/2016/5/12/chartex" xmlns:cx7="http://schemas.microsoft.com/office/drawing/2016/5/13/chartex" xmlns:cx8="http://schemas.microsoft.com/office/drawing/2016/5/14/chartex" xmlns:mc="http://schemas.openxmlformats.org/markup-compatibility/2006" xmlns:aink="http://schemas.microsoft.com/office/drawing/2016/ink" xmlns:am3d="http://schemas.microsoft.com/office/drawing/2017/model3d" xmlns:o="urn:schemas-microsoft-com:office:office" xmlns:oel="http://schemas.microsoft.com/office/2019/extlst" xmlns:r="http://schemas.openxmlformats.org/officeDocument/2006/relationships" xmlns:m="http://schemas.openxmlformats.org/officeDocument/2006/math" xmlns:v="urn:schemas-microsoft-com:vml" xmlns:wp14="http://schemas.microsoft.com/office/word/2010/wordprocessingDrawing" xmlns:wp="http://schemas.openxmlformats.org/drawingml/2006/wordprocessingDrawing" xmlns:w10="urn:schemas-microsoft-com:office:word" xmlns:w="http://schemas.openxmlformats.org/wordprocessingml/2006/main" xmlns:w14="http://schemas.microsoft.com/office/word/2010/wordml" xmlns:w15="http://schemas.microsoft.com/office/word/2012/wordml" xmlns:w16cex="http://schemas.microsoft.com/office/word/2018/wordml/cex" xmlns:w16cid="http://schemas.microsoft.com/office/word/2016/wordml/cid" xmlns:w16="http://schemas.microsoft.com/office/word/2018/wordml" xmlns:w16du="http://schemas.microsoft.com/office/word/2023/wordml/word16du" xmlns:w16sdtdh="http://schemas.microsoft.com/office/word/2020/wordml/sdtdatahash" xmlns:w16sdtfl="http://schemas.microsoft.com/office/word/2024/wordml/sdtformatlock" xmlns:w16se="http://schemas.microsoft.com/office/word/2015/wordml/symex" xmlns:wpg="http://schemas.microsoft.com/office/word/2010/wordprocessingGroup" xmlns:wpi="http://schemas.microsoft.com/office/word/2010/wordprocessingInk" xmlns:wne="http://schemas.microsoft.com/office/word/2006/wordml" xmlns:wps="http://schemas.microsoft.com/office/word/2010/wordprocessingShape" mc:Ignorable="w14 w15 w16se w16cid w16 w16cex w16sdtdh w16sdtfl w16du wp14">
   <w:abstractNum w:abstractNumId="0" w15:restartNumberingAfterBreak="0">
-    <w:nsid w:val="11800578"/>
+    <w:nsid w:val="373C25A7"/>
     <w:multiLevelType w:val="hybridMultilevel"/>
-    <w:tmpl w:val="0E925F7A"/>
-    <w:lvl w:ilvl="0" w:tplc="5EEAD098" w:tentative="1">
+    <w:tmpl w:val="53A8AF72"/>
+    <w:lvl w:ilvl="0" w:tplc="4AB2F0EC">
+      <w:start w:val="1"/>
+      <w:numFmt w:val="bullet"/>
+      <w:lvlText w:val="•"/>
+      <w:lvlJc w:val="left"/>
+      <w:pPr>
+        <w:ind w:left="540" w:hanging="270"/>
+      </w:pPr>
+    </w:lvl>
+    <w:lvl w:ilvl="1" w:tplc="1B169058">
+      <w:numFmt w:val="decimal"/>
+      <w:lvlText w:val=""/>
+      <w:lvlJc w:val="left"/>
+    </w:lvl>
+    <w:lvl w:ilvl="2" w:tplc="21760B50">
+      <w:numFmt w:val="decimal"/>
+      <w:lvlText w:val=""/>
+      <w:lvlJc w:val="left"/>
+    </w:lvl>
+    <w:lvl w:ilvl="3" w:tplc="6DB41986">
+      <w:numFmt w:val="decimal"/>
+      <w:lvlText w:val=""/>
+      <w:lvlJc w:val="left"/>
+    </w:lvl>
+    <w:lvl w:ilvl="4" w:tplc="7AFCBCFC">
+      <w:numFmt w:val="decimal"/>
+      <w:lvlText w:val=""/>
+      <w:lvlJc w:val="left"/>
+    </w:lvl>
+    <w:lvl w:ilvl="5" w:tplc="A7449098">
+      <w:numFmt w:val="decimal"/>
+      <w:lvlText w:val=""/>
+      <w:lvlJc w:val="left"/>
+    </w:lvl>
+    <w:lvl w:ilvl="6" w:tplc="B2E6AFDC">
+      <w:numFmt w:val="decimal"/>
+      <w:lvlText w:val=""/>
+      <w:lvlJc w:val="left"/>
+    </w:lvl>
+    <w:lvl w:ilvl="7" w:tplc="0332E8F6">
+      <w:numFmt w:val="decimal"/>
+      <w:lvlText w:val=""/>
+      <w:lvlJc w:val="left"/>
+    </w:lvl>
+    <w:lvl w:ilvl="8" w:tplc="B2E0EF28">
+      <w:numFmt w:val="decimal"/>
+      <w:lvlText w:val=""/>
+      <w:lvlJc w:val="left"/>
+    </w:lvl>
+  </w:abstractNum>
+  <w:abstractNum w:abstractNumId="1" w15:restartNumberingAfterBreak="0">
+    <w:nsid w:val="5F0A511C"/>
+    <w:multiLevelType w:val="hybridMultilevel"/>
+    <w:tmpl w:val="0D0605E8"/>
+    <w:lvl w:ilvl="0" w:tplc="E6F4ACCA" w:tentative="1">
       <w:start w:val="1"/>
       <w:numFmt w:val="bullet"/>
       <w:lvlText w:val="●"/>
@@ -19609,7 +19663,7 @@
         <w:ind w:left="720" w:hanging="360"/>
       </w:pPr>
     </w:lvl>
-    <w:lvl w:ilvl="1" w:tplc="D1820828" w:tentative="1">
+    <w:lvl w:ilvl="1" w:tplc="41E08F96" w:tentative="1">
       <w:start w:val="1"/>
       <w:numFmt w:val="bullet"/>
       <w:lvlText w:val="○"/>
@@ -19618,7 +19672,7 @@
         <w:ind w:left="1440" w:hanging="360"/>
       </w:pPr>
     </w:lvl>
-    <w:lvl w:ilvl="2" w:tplc="68F849CC" w:tentative="1">
+    <w:lvl w:ilvl="2" w:tplc="1408CCF2" w:tentative="1">
       <w:start w:val="1"/>
       <w:numFmt w:val="bullet"/>
       <w:lvlText w:val="■"/>
@@ -19627,7 +19681,7 @@
         <w:ind w:left="2160" w:hanging="360"/>
       </w:pPr>
     </w:lvl>
-    <w:lvl w:ilvl="3" w:tplc="A5F2A376" w:tentative="1">
+    <w:lvl w:ilvl="3" w:tplc="D8BC435A" w:tentative="1">
       <w:start w:val="1"/>
       <w:numFmt w:val="bullet"/>
       <w:lvlText w:val="●"/>
@@ -19636,7 +19690,7 @@
         <w:ind w:left="2880" w:hanging="360"/>
       </w:pPr>
     </w:lvl>
-    <w:lvl w:ilvl="4" w:tplc="7AF68E7E" w:tentative="1">
+    <w:lvl w:ilvl="4" w:tplc="304C37CA" w:tentative="1">
       <w:start w:val="1"/>
       <w:numFmt w:val="bullet"/>
       <w:lvlText w:val="○"/>
@@ -19645,7 +19699,7 @@
         <w:ind w:left="3600" w:hanging="360"/>
       </w:pPr>
     </w:lvl>
-    <w:lvl w:ilvl="5" w:tplc="EC3C46DC" w:tentative="1">
+    <w:lvl w:ilvl="5" w:tplc="B954400C" w:tentative="1">
       <w:start w:val="1"/>
       <w:numFmt w:val="bullet"/>
       <w:lvlText w:val="■"/>
@@ -19654,7 +19708,7 @@
         <w:ind w:left="4320" w:hanging="360"/>
       </w:pPr>
     </w:lvl>
-    <w:lvl w:ilvl="6" w:tplc="E9A63CE0" w:tentative="1">
+    <w:lvl w:ilvl="6" w:tplc="5CBC18AC" w:tentative="1">
       <w:start w:val="1"/>
       <w:numFmt w:val="bullet"/>
       <w:lvlText w:val="●"/>
@@ -19663,7 +19717,7 @@
         <w:ind w:left="5040" w:hanging="360"/>
       </w:pPr>
     </w:lvl>
-    <w:lvl w:ilvl="7" w:tplc="F05EC576" w:tentative="1">
+    <w:lvl w:ilvl="7" w:tplc="FB241F94" w:tentative="1">
       <w:start w:val="1"/>
       <w:numFmt w:val="bullet"/>
       <w:lvlText w:val="●"/>
@@ -19672,7 +19726,7 @@
         <w:ind w:left="5760" w:hanging="360"/>
       </w:pPr>
     </w:lvl>
-    <w:lvl w:ilvl="8" w:tplc="DFF41A74" w:tentative="1">
+    <w:lvl w:ilvl="8" w:tplc="CB8AE138" w:tentative="1">
       <w:start w:val="1"/>
       <w:numFmt w:val="bullet"/>
       <w:lvlText w:val="●"/>
@@ -19682,11 +19736,11 @@
       </w:pPr>
     </w:lvl>
   </w:abstractNum>
-  <w:abstractNum w:abstractNumId="1" w15:restartNumberingAfterBreak="0">
-    <w:nsid w:val="503A0AEA"/>
+  <w:abstractNum w:abstractNumId="2" w15:restartNumberingAfterBreak="0">
+    <w:nsid w:val="5F823B95"/>
     <w:multiLevelType w:val="hybridMultilevel"/>
-    <w:tmpl w:val="ED346DAC"/>
-    <w:lvl w:ilvl="0" w:tplc="F57AD184">
+    <w:tmpl w:val="28B2A324"/>
+    <w:lvl w:ilvl="0" w:tplc="12D25546">
       <w:start w:val="1"/>
       <w:numFmt w:val="decimal"/>
       <w:lvlText w:val="%1."/>
@@ -19695,115 +19749,61 @@
         <w:ind w:left="540" w:hanging="300"/>
       </w:pPr>
     </w:lvl>
-    <w:lvl w:ilvl="1" w:tplc="433E10CC">
+    <w:lvl w:ilvl="1" w:tplc="CA720560">
       <w:numFmt w:val="decimal"/>
       <w:lvlText w:val=""/>
       <w:lvlJc w:val="left"/>
     </w:lvl>
-    <w:lvl w:ilvl="2" w:tplc="AE94DEFA">
+    <w:lvl w:ilvl="2" w:tplc="B060D49A">
       <w:numFmt w:val="decimal"/>
       <w:lvlText w:val=""/>
       <w:lvlJc w:val="left"/>
     </w:lvl>
-    <w:lvl w:ilvl="3" w:tplc="B56222DA">
+    <w:lvl w:ilvl="3" w:tplc="A1E0B25A">
       <w:numFmt w:val="decimal"/>
       <w:lvlText w:val=""/>
       <w:lvlJc w:val="left"/>
     </w:lvl>
-    <w:lvl w:ilvl="4" w:tplc="696E132A">
+    <w:lvl w:ilvl="4" w:tplc="935E0890">
       <w:numFmt w:val="decimal"/>
       <w:lvlText w:val=""/>
       <w:lvlJc w:val="left"/>
     </w:lvl>
-    <w:lvl w:ilvl="5" w:tplc="AC220478">
+    <w:lvl w:ilvl="5" w:tplc="F4E0C1B0">
       <w:numFmt w:val="decimal"/>
       <w:lvlText w:val=""/>
       <w:lvlJc w:val="left"/>
     </w:lvl>
-    <w:lvl w:ilvl="6" w:tplc="D958BE3A">
+    <w:lvl w:ilvl="6" w:tplc="302EDC82">
       <w:numFmt w:val="decimal"/>
       <w:lvlText w:val=""/>
       <w:lvlJc w:val="left"/>
     </w:lvl>
-    <w:lvl w:ilvl="7" w:tplc="4BB6F9DC">
+    <w:lvl w:ilvl="7" w:tplc="FFAC2918">
       <w:numFmt w:val="decimal"/>
       <w:lvlText w:val=""/>
       <w:lvlJc w:val="left"/>
     </w:lvl>
-    <w:lvl w:ilvl="8" w:tplc="1110DAB4">
+    <w:lvl w:ilvl="8" w:tplc="FBFC9B6C">
       <w:numFmt w:val="decimal"/>
       <w:lvlText w:val=""/>
       <w:lvlJc w:val="left"/>
     </w:lvl>
   </w:abstractNum>
-  <w:abstractNum w:abstractNumId="2" w15:restartNumberingAfterBreak="0">
-    <w:nsid w:val="7B4C732D"/>
-    <w:multiLevelType w:val="hybridMultilevel"/>
-    <w:tmpl w:val="8736AC6C"/>
-    <w:lvl w:ilvl="0" w:tplc="47B42090">
-      <w:start w:val="1"/>
-      <w:numFmt w:val="bullet"/>
-      <w:lvlText w:val="•"/>
-      <w:lvlJc w:val="left"/>
-      <w:pPr>
-        <w:ind w:left="540" w:hanging="270"/>
-      </w:pPr>
-    </w:lvl>
-    <w:lvl w:ilvl="1" w:tplc="770EC7CE">
-      <w:numFmt w:val="decimal"/>
-      <w:lvlText w:val=""/>
-      <w:lvlJc w:val="left"/>
-    </w:lvl>
-    <w:lvl w:ilvl="2" w:tplc="CE8096B4">
-      <w:numFmt w:val="decimal"/>
-      <w:lvlText w:val=""/>
-      <w:lvlJc w:val="left"/>
-    </w:lvl>
-    <w:lvl w:ilvl="3" w:tplc="F104AFCA">
-      <w:numFmt w:val="decimal"/>
-      <w:lvlText w:val=""/>
-      <w:lvlJc w:val="left"/>
-    </w:lvl>
-    <w:lvl w:ilvl="4" w:tplc="751E8690">
-      <w:numFmt w:val="decimal"/>
-      <w:lvlText w:val=""/>
-      <w:lvlJc w:val="left"/>
-    </w:lvl>
-    <w:lvl w:ilvl="5" w:tplc="E3D040DA">
-      <w:numFmt w:val="decimal"/>
-      <w:lvlText w:val=""/>
-      <w:lvlJc w:val="left"/>
-    </w:lvl>
-    <w:lvl w:ilvl="6" w:tplc="5BB6C89A">
-      <w:numFmt w:val="decimal"/>
-      <w:lvlText w:val=""/>
-      <w:lvlJc w:val="left"/>
-    </w:lvl>
-    <w:lvl w:ilvl="7" w:tplc="626E9DB8">
-      <w:numFmt w:val="decimal"/>
-      <w:lvlText w:val=""/>
-      <w:lvlJc w:val="left"/>
-    </w:lvl>
-    <w:lvl w:ilvl="8" w:tplc="4B683CF0">
-      <w:numFmt w:val="decimal"/>
-      <w:lvlText w:val=""/>
-      <w:lvlJc w:val="left"/>
-    </w:lvl>
-  </w:abstractNum>
-  <w:num w:numId="1" w16cid:durableId="1913809142">
+  <w:num w:numId="1" w16cid:durableId="562370846">
+    <w:abstractNumId w:val="1"/>
+    <w:lvlOverride w:ilvl="0">
+      <w:startOverride w:val="1"/>
+    </w:lvlOverride>
+  </w:num>
+  <w:num w:numId="2" w16cid:durableId="2126581823">
     <w:abstractNumId w:val="0"/>
     <w:lvlOverride w:ilvl="0">
       <w:startOverride w:val="1"/>
     </w:lvlOverride>
   </w:num>
-  <w:num w:numId="2" w16cid:durableId="1362239183">
+  <w:num w:numId="3" w16cid:durableId="351537759">
     <w:abstractNumId w:val="2"/>
-    <w:lvlOverride w:ilvl="0">
-      <w:startOverride w:val="1"/>
-    </w:lvlOverride>
-  </w:num>
-  <w:num w:numId="3" w16cid:durableId="52118680">
-    <w:abstractNumId w:val="1"/>
     <w:lvlOverride w:ilvl="0">
       <w:startOverride w:val="1"/>
     </w:lvlOverride>
@@ -20440,7 +20440,7 @@
     <w:autoRedefine/>
     <w:uiPriority w:val="39"/>
     <w:unhideWhenUsed/>
-    <w:rsid w:val="005371CD"/>
+    <w:rsid w:val="00A86867"/>
     <w:pPr>
       <w:spacing w:after="100"/>
     </w:pPr>
@@ -20452,7 +20452,7 @@
     <w:autoRedefine/>
     <w:uiPriority w:val="39"/>
     <w:unhideWhenUsed/>
-    <w:rsid w:val="005371CD"/>
+    <w:rsid w:val="00A86867"/>
     <w:pPr>
       <w:spacing w:after="100"/>
       <w:ind w:left="210"/>

</xml_diff>

<commit_message>
Supervisor report: Section 11 INCART confirmatory test (Tables 13-14), executive summary, RQ2, limitations, next steps (paper for Information Fusion), Deviation 21a; ledger refreshed (16 tables)
Co-Authored-By: Claude Opus 5.5 <noreply@anthropic.com>
</commit_message>
<xml_diff>
--- a/reports/Phase1_Technical_Report.docx
+++ b/reports/Phase1_Technical_Report.docx
@@ -56,7 +56,7 @@
         <w:t>Date:</w:t>
       </w:r>
       <w:r>
-        <w:t xml:space="preserve"> 4 October 2026 (updated with the filtered-text baseline, a second sender, serving measurements, the r4 ablation and the compression study)</w:t>
+        <w:t xml:space="preserve"> 4 October 2026 (updated with the filtered-text baseline, a second sender, serving measurements, the r4 ablation, the compression study and the external confirmatory test on INCART)</w:t>
       </w:r>
     </w:p>
     <w:p>
@@ -82,7 +82,7 @@
     <w:sdt>
       <w:sdtPr>
         <w:alias w:val="Contents"/>
-        <w:id w:val="-1893489866"/>
+        <w:id w:val="439966643"/>
       </w:sdtPr>
       <w:sdtEndPr/>
       <w:sdtContent>
@@ -110,7 +110,7 @@
           <w:r>
             <w:fldChar w:fldCharType="separate"/>
           </w:r>
-          <w:hyperlink w:anchor="_Toc242032958" w:history="1">
+          <w:hyperlink w:anchor="_Toc242050154" w:history="1">
             <w:r>
               <w:rPr>
                 <w:rStyle w:val="Hyperlink"/>
@@ -134,7 +134,7 @@
               <w:rPr>
                 <w:noProof/>
               </w:rPr>
-              <w:instrText xml:space="preserve"> PAGEREF _Toc242032958 \h </w:instrText>
+              <w:instrText xml:space="preserve"> PAGEREF _Toc242050154 \h </w:instrText>
             </w:r>
             <w:r>
               <w:rPr>
@@ -176,7 +176,7 @@
               <w14:ligatures w14:val="standardContextual"/>
             </w:rPr>
           </w:pPr>
-          <w:hyperlink w:anchor="_Toc242032959" w:history="1">
+          <w:hyperlink w:anchor="_Toc242050155" w:history="1">
             <w:r>
               <w:rPr>
                 <w:rStyle w:val="Hyperlink"/>
@@ -200,7 +200,7 @@
               <w:rPr>
                 <w:noProof/>
               </w:rPr>
-              <w:instrText xml:space="preserve"> PAGEREF _Toc242032959 \h </w:instrText>
+              <w:instrText xml:space="preserve"> PAGEREF _Toc242050155 \h </w:instrText>
             </w:r>
             <w:r>
               <w:rPr>
@@ -242,7 +242,7 @@
               <w14:ligatures w14:val="standardContextual"/>
             </w:rPr>
           </w:pPr>
-          <w:hyperlink w:anchor="_Toc242032960" w:history="1">
+          <w:hyperlink w:anchor="_Toc242050156" w:history="1">
             <w:r>
               <w:rPr>
                 <w:rStyle w:val="Hyperlink"/>
@@ -266,7 +266,7 @@
               <w:rPr>
                 <w:noProof/>
               </w:rPr>
-              <w:instrText xml:space="preserve"> PAGEREF _Toc242032960 \h </w:instrText>
+              <w:instrText xml:space="preserve"> PAGEREF _Toc242050156 \h </w:instrText>
             </w:r>
             <w:r>
               <w:rPr>
@@ -308,7 +308,7 @@
               <w14:ligatures w14:val="standardContextual"/>
             </w:rPr>
           </w:pPr>
-          <w:hyperlink w:anchor="_Toc242032961" w:history="1">
+          <w:hyperlink w:anchor="_Toc242050157" w:history="1">
             <w:r>
               <w:rPr>
                 <w:rStyle w:val="Hyperlink"/>
@@ -332,7 +332,7 @@
               <w:rPr>
                 <w:noProof/>
               </w:rPr>
-              <w:instrText xml:space="preserve"> PAGEREF _Toc242032961 \h </w:instrText>
+              <w:instrText xml:space="preserve"> PAGEREF _Toc242050157 \h </w:instrText>
             </w:r>
             <w:r>
               <w:rPr>
@@ -374,7 +374,7 @@
               <w14:ligatures w14:val="standardContextual"/>
             </w:rPr>
           </w:pPr>
-          <w:hyperlink w:anchor="_Toc242032962" w:history="1">
+          <w:hyperlink w:anchor="_Toc242050158" w:history="1">
             <w:r>
               <w:rPr>
                 <w:rStyle w:val="Hyperlink"/>
@@ -398,7 +398,7 @@
               <w:rPr>
                 <w:noProof/>
               </w:rPr>
-              <w:instrText xml:space="preserve"> PAGEREF _Toc242032962 \h </w:instrText>
+              <w:instrText xml:space="preserve"> PAGEREF _Toc242050158 \h </w:instrText>
             </w:r>
             <w:r>
               <w:rPr>
@@ -440,7 +440,7 @@
               <w14:ligatures w14:val="standardContextual"/>
             </w:rPr>
           </w:pPr>
-          <w:hyperlink w:anchor="_Toc242032963" w:history="1">
+          <w:hyperlink w:anchor="_Toc242050159" w:history="1">
             <w:r>
               <w:rPr>
                 <w:rStyle w:val="Hyperlink"/>
@@ -464,7 +464,7 @@
               <w:rPr>
                 <w:noProof/>
               </w:rPr>
-              <w:instrText xml:space="preserve"> PAGEREF _Toc242032963 \h </w:instrText>
+              <w:instrText xml:space="preserve"> PAGEREF _Toc242050159 \h </w:instrText>
             </w:r>
             <w:r>
               <w:rPr>
@@ -506,7 +506,7 @@
               <w14:ligatures w14:val="standardContextual"/>
             </w:rPr>
           </w:pPr>
-          <w:hyperlink w:anchor="_Toc242032964" w:history="1">
+          <w:hyperlink w:anchor="_Toc242050160" w:history="1">
             <w:r>
               <w:rPr>
                 <w:rStyle w:val="Hyperlink"/>
@@ -530,7 +530,7 @@
               <w:rPr>
                 <w:noProof/>
               </w:rPr>
-              <w:instrText xml:space="preserve"> PAGEREF _Toc242032964 \h </w:instrText>
+              <w:instrText xml:space="preserve"> PAGEREF _Toc242050160 \h </w:instrText>
             </w:r>
             <w:r>
               <w:rPr>
@@ -572,7 +572,7 @@
               <w14:ligatures w14:val="standardContextual"/>
             </w:rPr>
           </w:pPr>
-          <w:hyperlink w:anchor="_Toc242032965" w:history="1">
+          <w:hyperlink w:anchor="_Toc242050161" w:history="1">
             <w:r>
               <w:rPr>
                 <w:rStyle w:val="Hyperlink"/>
@@ -596,7 +596,7 @@
               <w:rPr>
                 <w:noProof/>
               </w:rPr>
-              <w:instrText xml:space="preserve"> PAGEREF _Toc242032965 \h </w:instrText>
+              <w:instrText xml:space="preserve"> PAGEREF _Toc242050161 \h </w:instrText>
             </w:r>
             <w:r>
               <w:rPr>
@@ -638,7 +638,7 @@
               <w14:ligatures w14:val="standardContextual"/>
             </w:rPr>
           </w:pPr>
-          <w:hyperlink w:anchor="_Toc242032966" w:history="1">
+          <w:hyperlink w:anchor="_Toc242050162" w:history="1">
             <w:r>
               <w:rPr>
                 <w:rStyle w:val="Hyperlink"/>
@@ -662,7 +662,7 @@
               <w:rPr>
                 <w:noProof/>
               </w:rPr>
-              <w:instrText xml:space="preserve"> PAGEREF _Toc242032966 \h </w:instrText>
+              <w:instrText xml:space="preserve"> PAGEREF _Toc242050162 \h </w:instrText>
             </w:r>
             <w:r>
               <w:rPr>
@@ -704,7 +704,7 @@
               <w14:ligatures w14:val="standardContextual"/>
             </w:rPr>
           </w:pPr>
-          <w:hyperlink w:anchor="_Toc242032967" w:history="1">
+          <w:hyperlink w:anchor="_Toc242050163" w:history="1">
             <w:r>
               <w:rPr>
                 <w:rStyle w:val="Hyperlink"/>
@@ -728,7 +728,7 @@
               <w:rPr>
                 <w:noProof/>
               </w:rPr>
-              <w:instrText xml:space="preserve"> PAGEREF _Toc242032967 \h </w:instrText>
+              <w:instrText xml:space="preserve"> PAGEREF _Toc242050163 \h </w:instrText>
             </w:r>
             <w:r>
               <w:rPr>
@@ -770,7 +770,7 @@
               <w14:ligatures w14:val="standardContextual"/>
             </w:rPr>
           </w:pPr>
-          <w:hyperlink w:anchor="_Toc242032968" w:history="1">
+          <w:hyperlink w:anchor="_Toc242050164" w:history="1">
             <w:r>
               <w:rPr>
                 <w:rStyle w:val="Hyperlink"/>
@@ -794,7 +794,7 @@
               <w:rPr>
                 <w:noProof/>
               </w:rPr>
-              <w:instrText xml:space="preserve"> PAGEREF _Toc242032968 \h </w:instrText>
+              <w:instrText xml:space="preserve"> PAGEREF _Toc242050164 \h </w:instrText>
             </w:r>
             <w:r>
               <w:rPr>
@@ -836,7 +836,7 @@
               <w14:ligatures w14:val="standardContextual"/>
             </w:rPr>
           </w:pPr>
-          <w:hyperlink w:anchor="_Toc242032969" w:history="1">
+          <w:hyperlink w:anchor="_Toc242050165" w:history="1">
             <w:r>
               <w:rPr>
                 <w:rStyle w:val="Hyperlink"/>
@@ -860,7 +860,7 @@
               <w:rPr>
                 <w:noProof/>
               </w:rPr>
-              <w:instrText xml:space="preserve"> PAGEREF _Toc242032969 \h </w:instrText>
+              <w:instrText xml:space="preserve"> PAGEREF _Toc242050165 \h </w:instrText>
             </w:r>
             <w:r>
               <w:rPr>
@@ -902,7 +902,7 @@
               <w14:ligatures w14:val="standardContextual"/>
             </w:rPr>
           </w:pPr>
-          <w:hyperlink w:anchor="_Toc242032970" w:history="1">
+          <w:hyperlink w:anchor="_Toc242050166" w:history="1">
             <w:r>
               <w:rPr>
                 <w:rStyle w:val="Hyperlink"/>
@@ -926,7 +926,7 @@
               <w:rPr>
                 <w:noProof/>
               </w:rPr>
-              <w:instrText xml:space="preserve"> PAGEREF _Toc242032970 \h </w:instrText>
+              <w:instrText xml:space="preserve"> PAGEREF _Toc242050166 \h </w:instrText>
             </w:r>
             <w:r>
               <w:rPr>
@@ -968,7 +968,7 @@
               <w14:ligatures w14:val="standardContextual"/>
             </w:rPr>
           </w:pPr>
-          <w:hyperlink w:anchor="_Toc242032971" w:history="1">
+          <w:hyperlink w:anchor="_Toc242050167" w:history="1">
             <w:r>
               <w:rPr>
                 <w:rStyle w:val="Hyperlink"/>
@@ -992,7 +992,7 @@
               <w:rPr>
                 <w:noProof/>
               </w:rPr>
-              <w:instrText xml:space="preserve"> PAGEREF _Toc242032971 \h </w:instrText>
+              <w:instrText xml:space="preserve"> PAGEREF _Toc242050167 \h </w:instrText>
             </w:r>
             <w:r>
               <w:rPr>
@@ -1034,7 +1034,7 @@
               <w14:ligatures w14:val="standardContextual"/>
             </w:rPr>
           </w:pPr>
-          <w:hyperlink w:anchor="_Toc242032972" w:history="1">
+          <w:hyperlink w:anchor="_Toc242050168" w:history="1">
             <w:r>
               <w:rPr>
                 <w:rStyle w:val="Hyperlink"/>
@@ -1058,7 +1058,7 @@
               <w:rPr>
                 <w:noProof/>
               </w:rPr>
-              <w:instrText xml:space="preserve"> PAGEREF _Toc242032972 \h </w:instrText>
+              <w:instrText xml:space="preserve"> PAGEREF _Toc242050168 \h </w:instrText>
             </w:r>
             <w:r>
               <w:rPr>
@@ -1100,7 +1100,7 @@
               <w14:ligatures w14:val="standardContextual"/>
             </w:rPr>
           </w:pPr>
-          <w:hyperlink w:anchor="_Toc242032973" w:history="1">
+          <w:hyperlink w:anchor="_Toc242050169" w:history="1">
             <w:r>
               <w:rPr>
                 <w:rStyle w:val="Hyperlink"/>
@@ -1124,7 +1124,7 @@
               <w:rPr>
                 <w:noProof/>
               </w:rPr>
-              <w:instrText xml:space="preserve"> PAGEREF _Toc242032973 \h </w:instrText>
+              <w:instrText xml:space="preserve"> PAGEREF _Toc242050169 \h </w:instrText>
             </w:r>
             <w:r>
               <w:rPr>
@@ -1166,7 +1166,7 @@
               <w14:ligatures w14:val="standardContextual"/>
             </w:rPr>
           </w:pPr>
-          <w:hyperlink w:anchor="_Toc242032974" w:history="1">
+          <w:hyperlink w:anchor="_Toc242050170" w:history="1">
             <w:r>
               <w:rPr>
                 <w:rStyle w:val="Hyperlink"/>
@@ -1190,7 +1190,7 @@
               <w:rPr>
                 <w:noProof/>
               </w:rPr>
-              <w:instrText xml:space="preserve"> PAGEREF _Toc242032974 \h </w:instrText>
+              <w:instrText xml:space="preserve"> PAGEREF _Toc242050170 \h </w:instrText>
             </w:r>
             <w:r>
               <w:rPr>
@@ -1232,7 +1232,7 @@
               <w14:ligatures w14:val="standardContextual"/>
             </w:rPr>
           </w:pPr>
-          <w:hyperlink w:anchor="_Toc242032975" w:history="1">
+          <w:hyperlink w:anchor="_Toc242050171" w:history="1">
             <w:r>
               <w:rPr>
                 <w:rStyle w:val="Hyperlink"/>
@@ -1256,7 +1256,7 @@
               <w:rPr>
                 <w:noProof/>
               </w:rPr>
-              <w:instrText xml:space="preserve"> PAGEREF _Toc242032975 \h </w:instrText>
+              <w:instrText xml:space="preserve"> PAGEREF _Toc242050171 \h </w:instrText>
             </w:r>
             <w:r>
               <w:rPr>
@@ -1298,7 +1298,7 @@
               <w14:ligatures w14:val="standardContextual"/>
             </w:rPr>
           </w:pPr>
-          <w:hyperlink w:anchor="_Toc242032976" w:history="1">
+          <w:hyperlink w:anchor="_Toc242050172" w:history="1">
             <w:r>
               <w:rPr>
                 <w:rStyle w:val="Hyperlink"/>
@@ -1322,7 +1322,7 @@
               <w:rPr>
                 <w:noProof/>
               </w:rPr>
-              <w:instrText xml:space="preserve"> PAGEREF _Toc242032976 \h </w:instrText>
+              <w:instrText xml:space="preserve"> PAGEREF _Toc242050172 \h </w:instrText>
             </w:r>
             <w:r>
               <w:rPr>
@@ -1364,7 +1364,7 @@
               <w14:ligatures w14:val="standardContextual"/>
             </w:rPr>
           </w:pPr>
-          <w:hyperlink w:anchor="_Toc242032977" w:history="1">
+          <w:hyperlink w:anchor="_Toc242050173" w:history="1">
             <w:r>
               <w:rPr>
                 <w:rStyle w:val="Hyperlink"/>
@@ -1388,7 +1388,7 @@
               <w:rPr>
                 <w:noProof/>
               </w:rPr>
-              <w:instrText xml:space="preserve"> PAGEREF _Toc242032977 \h </w:instrText>
+              <w:instrText xml:space="preserve"> PAGEREF _Toc242050173 \h </w:instrText>
             </w:r>
             <w:r>
               <w:rPr>
@@ -1430,7 +1430,7 @@
               <w14:ligatures w14:val="standardContextual"/>
             </w:rPr>
           </w:pPr>
-          <w:hyperlink w:anchor="_Toc242032978" w:history="1">
+          <w:hyperlink w:anchor="_Toc242050174" w:history="1">
             <w:r>
               <w:rPr>
                 <w:rStyle w:val="Hyperlink"/>
@@ -1454,7 +1454,7 @@
               <w:rPr>
                 <w:noProof/>
               </w:rPr>
-              <w:instrText xml:space="preserve"> PAGEREF _Toc242032978 \h </w:instrText>
+              <w:instrText xml:space="preserve"> PAGEREF _Toc242050174 \h </w:instrText>
             </w:r>
             <w:r>
               <w:rPr>
@@ -1496,7 +1496,7 @@
               <w14:ligatures w14:val="standardContextual"/>
             </w:rPr>
           </w:pPr>
-          <w:hyperlink w:anchor="_Toc242032979" w:history="1">
+          <w:hyperlink w:anchor="_Toc242050175" w:history="1">
             <w:r>
               <w:rPr>
                 <w:rStyle w:val="Hyperlink"/>
@@ -1520,7 +1520,7 @@
               <w:rPr>
                 <w:noProof/>
               </w:rPr>
-              <w:instrText xml:space="preserve"> PAGEREF _Toc242032979 \h </w:instrText>
+              <w:instrText xml:space="preserve"> PAGEREF _Toc242050175 \h </w:instrText>
             </w:r>
             <w:r>
               <w:rPr>
@@ -1562,7 +1562,7 @@
               <w14:ligatures w14:val="standardContextual"/>
             </w:rPr>
           </w:pPr>
-          <w:hyperlink w:anchor="_Toc242032980" w:history="1">
+          <w:hyperlink w:anchor="_Toc242050176" w:history="1">
             <w:r>
               <w:rPr>
                 <w:rStyle w:val="Hyperlink"/>
@@ -1586,7 +1586,7 @@
               <w:rPr>
                 <w:noProof/>
               </w:rPr>
-              <w:instrText xml:space="preserve"> PAGEREF _Toc242032980 \h </w:instrText>
+              <w:instrText xml:space="preserve"> PAGEREF _Toc242050176 \h </w:instrText>
             </w:r>
             <w:r>
               <w:rPr>
@@ -1628,13 +1628,13 @@
               <w14:ligatures w14:val="standardContextual"/>
             </w:rPr>
           </w:pPr>
-          <w:hyperlink w:anchor="_Toc242032981" w:history="1">
+          <w:hyperlink w:anchor="_Toc242050177" w:history="1">
             <w:r>
               <w:rPr>
                 <w:rStyle w:val="Hyperlink"/>
                 <w:noProof/>
               </w:rPr>
-              <w:t>11. Status of the research questions</w:t>
+              <w:t>11. External confirmatory test on INCART (Deviation 21)</w:t>
             </w:r>
             <w:r>
               <w:rPr>
@@ -1652,7 +1652,7 @@
               <w:rPr>
                 <w:noProof/>
               </w:rPr>
-              <w:instrText xml:space="preserve"> PAGEREF _Toc242032981 \h </w:instrText>
+              <w:instrText xml:space="preserve"> PAGEREF _Toc242050177 \h </w:instrText>
             </w:r>
             <w:r>
               <w:rPr>
@@ -1669,7 +1669,7 @@
               <w:rPr>
                 <w:noProof/>
               </w:rPr>
-              <w:t>17</w:t>
+              <w:t>16</w:t>
             </w:r>
             <w:r>
               <w:rPr>
@@ -1694,13 +1694,13 @@
               <w14:ligatures w14:val="standardContextual"/>
             </w:rPr>
           </w:pPr>
-          <w:hyperlink w:anchor="_Toc242032982" w:history="1">
+          <w:hyperlink w:anchor="_Toc242050178" w:history="1">
             <w:r>
               <w:rPr>
                 <w:rStyle w:val="Hyperlink"/>
                 <w:noProof/>
               </w:rPr>
-              <w:t>12. Limitations and threats to validity</w:t>
+              <w:t>12. Status of the research questions</w:t>
             </w:r>
             <w:r>
               <w:rPr>
@@ -1718,7 +1718,7 @@
               <w:rPr>
                 <w:noProof/>
               </w:rPr>
-              <w:instrText xml:space="preserve"> PAGEREF _Toc242032982 \h </w:instrText>
+              <w:instrText xml:space="preserve"> PAGEREF _Toc242050178 \h </w:instrText>
             </w:r>
             <w:r>
               <w:rPr>
@@ -1735,7 +1735,7 @@
               <w:rPr>
                 <w:noProof/>
               </w:rPr>
-              <w:t>17</w:t>
+              <w:t>18</w:t>
             </w:r>
             <w:r>
               <w:rPr>
@@ -1760,13 +1760,13 @@
               <w14:ligatures w14:val="standardContextual"/>
             </w:rPr>
           </w:pPr>
-          <w:hyperlink w:anchor="_Toc242032983" w:history="1">
+          <w:hyperlink w:anchor="_Toc242050179" w:history="1">
             <w:r>
               <w:rPr>
                 <w:rStyle w:val="Hyperlink"/>
                 <w:noProof/>
               </w:rPr>
-              <w:t>13. Proposed next steps</w:t>
+              <w:t>13. Limitations and threats to validity</w:t>
             </w:r>
             <w:r>
               <w:rPr>
@@ -1784,7 +1784,7 @@
               <w:rPr>
                 <w:noProof/>
               </w:rPr>
-              <w:instrText xml:space="preserve"> PAGEREF _Toc242032983 \h </w:instrText>
+              <w:instrText xml:space="preserve"> PAGEREF _Toc242050179 \h </w:instrText>
             </w:r>
             <w:r>
               <w:rPr>
@@ -1826,12 +1826,78 @@
               <w14:ligatures w14:val="standardContextual"/>
             </w:rPr>
           </w:pPr>
-          <w:hyperlink w:anchor="_Toc242032984" w:history="1">
+          <w:hyperlink w:anchor="_Toc242050180" w:history="1">
             <w:r>
               <w:rPr>
                 <w:rStyle w:val="Hyperlink"/>
                 <w:noProof/>
               </w:rPr>
+              <w:t>14. Proposed next steps</w:t>
+            </w:r>
+            <w:r>
+              <w:rPr>
+                <w:noProof/>
+              </w:rPr>
+              <w:tab/>
+            </w:r>
+            <w:r>
+              <w:rPr>
+                <w:noProof/>
+              </w:rPr>
+              <w:fldChar w:fldCharType="begin"/>
+            </w:r>
+            <w:r>
+              <w:rPr>
+                <w:noProof/>
+              </w:rPr>
+              <w:instrText xml:space="preserve"> PAGEREF _Toc242050180 \h </w:instrText>
+            </w:r>
+            <w:r>
+              <w:rPr>
+                <w:noProof/>
+              </w:rPr>
+            </w:r>
+            <w:r>
+              <w:rPr>
+                <w:noProof/>
+              </w:rPr>
+              <w:fldChar w:fldCharType="separate"/>
+            </w:r>
+            <w:r>
+              <w:rPr>
+                <w:noProof/>
+              </w:rPr>
+              <w:t>19</w:t>
+            </w:r>
+            <w:r>
+              <w:rPr>
+                <w:noProof/>
+              </w:rPr>
+              <w:fldChar w:fldCharType="end"/>
+            </w:r>
+          </w:hyperlink>
+        </w:p>
+        <w:p>
+          <w:pPr>
+            <w:pStyle w:val="TOC1"/>
+            <w:tabs>
+              <w:tab w:val="right" w:leader="dot" w:pos="9016"/>
+            </w:tabs>
+            <w:rPr>
+              <w:rFonts w:asciiTheme="minorHAnsi" w:eastAsiaTheme="minorEastAsia" w:hAnsiTheme="minorHAnsi" w:cstheme="minorBidi"/>
+              <w:noProof/>
+              <w:kern w:val="2"/>
+              <w:sz w:val="24"/>
+              <w:szCs w:val="24"/>
+              <w14:ligatures w14:val="standardContextual"/>
+            </w:rPr>
+          </w:pPr>
+          <w:hyperlink w:anchor="_Toc242050181" w:history="1">
+            <w:r>
+              <w:rPr>
+                <w:rStyle w:val="Hyperlink"/>
+                <w:noProof/>
+              </w:rPr>
               <w:t>Appendix A. Pre-registered deviations</w:t>
             </w:r>
             <w:r>
@@ -1850,7 +1916,7 @@
               <w:rPr>
                 <w:noProof/>
               </w:rPr>
-              <w:instrText xml:space="preserve"> PAGEREF _Toc242032984 \h </w:instrText>
+              <w:instrText xml:space="preserve"> PAGEREF _Toc242050181 \h </w:instrText>
             </w:r>
             <w:r>
               <w:rPr>
@@ -1867,7 +1933,7 @@
               <w:rPr>
                 <w:noProof/>
               </w:rPr>
-              <w:t>19</w:t>
+              <w:t>20</w:t>
             </w:r>
             <w:r>
               <w:rPr>
@@ -1895,7 +1961,7 @@
         <w:keepNext/>
         <w:keepLines/>
       </w:pPr>
-      <w:bookmarkStart w:id="0" w:name="_Toc242032958"/>
+      <w:bookmarkStart w:id="0" w:name="_Toc242050154"/>
       <w:r>
         <w:t>1. Executive summary</w:t>
       </w:r>
@@ -1980,6 +2046,29 @@
       </w:r>
       <w:r>
         <w:t>, and non-inferior at 5 and 50.</w:t>
+      </w:r>
+    </w:p>
+    <w:p>
+      <w:pPr>
+        <w:pStyle w:val="ListParagraph"/>
+        <w:numPr>
+          <w:ilvl w:val="0"/>
+          <w:numId w:val="2"/>
+        </w:numPr>
+        <w:spacing w:after="60"/>
+      </w:pPr>
+      <w:r>
+        <w:rPr>
+          <w:b/>
+          <w:bCs/>
+        </w:rPr>
+        <w:t>The accuracy result replicates on an unseen database.</w:t>
+      </w:r>
+      <w:r>
+        <w:t xml:space="preserve"> The system was frozen (file hashes, tag r4-confirmatory) and run once on the INCART database (32 patients, never used for any decision) with four hypotheses fixed in advance. The primary hypothesis was confirmed: the adapter is non-inferior to calibrated text at 10, 20 and 50 events and superior at 10 and 20 (+0.08 and +0.09, against +0.10 on MIT-BIH). Filtered text was again more accurate than the adapter, and the efficiency gain matched MIT-BIH (time to first token −27% / −51% / −77% at 10 / 20 / 50 even</w:t>
+      </w:r>
+      <w:r>
+        <w:t>ts).</w:t>
       </w:r>
     </w:p>
     <w:p>
@@ -2141,7 +2230,7 @@
         <w:keepNext/>
         <w:keepLines/>
       </w:pPr>
-      <w:bookmarkStart w:id="1" w:name="_Toc242032959"/>
+      <w:bookmarkStart w:id="1" w:name="_Toc242050155"/>
       <w:r>
         <w:t>2. Starting point: the dissertation</w:t>
       </w:r>
@@ -2722,7 +2811,7 @@
         <w:keepNext/>
         <w:keepLines/>
       </w:pPr>
-      <w:bookmarkStart w:id="2" w:name="_Toc242032960"/>
+      <w:bookmarkStart w:id="2" w:name="_Toc242050156"/>
       <w:r>
         <w:t>3. How Phase 1 was run</w:t>
       </w:r>
@@ -2834,7 +2923,7 @@
         <w:keepNext/>
         <w:keepLines/>
       </w:pPr>
-      <w:bookmarkStart w:id="3" w:name="_Toc242032961"/>
+      <w:bookmarkStart w:id="3" w:name="_Toc242050157"/>
       <w:r>
         <w:t>4. Weaknesses in the original evaluation and how Phase 1 addressed them</w:t>
       </w:r>
@@ -3700,7 +3789,7 @@
         <w:keepNext/>
         <w:keepLines/>
       </w:pPr>
-      <w:bookmarkStart w:id="4" w:name="_Toc242032962"/>
+      <w:bookmarkStart w:id="4" w:name="_Toc242050158"/>
       <w:r>
         <w:t>5. What changed in the system</w:t>
       </w:r>
@@ -3717,7 +3806,7 @@
           <w:noProof/>
         </w:rPr>
         <w:drawing>
-          <wp:inline distT="0" distB="0" distL="0" distR="0" wp14:anchorId="5EB93A95" wp14:editId="030942AB">
+          <wp:inline distT="0" distB="0" distL="0" distR="0" wp14:anchorId="7C8F77C8" wp14:editId="26F325EC">
             <wp:extent cx="5762625" cy="2524125"/>
             <wp:effectExtent l="0" t="0" r="0" b="0"/>
             <wp:docPr id="1" name="fig1_pipeline.png" descr="Figure 1. Pipeline before (single event) and after Phase 1 (multi-event). The highlighted block is the component trained in this work." title="fig1_pipeline.png"/>
@@ -3777,7 +3866,7 @@
         <w:keepNext/>
         <w:keepLines/>
       </w:pPr>
-      <w:bookmarkStart w:id="5" w:name="_Toc242032963"/>
+      <w:bookmarkStart w:id="5" w:name="_Toc242050159"/>
       <w:r>
         <w:t>5.1 Perception: RR-timing branch</w:t>
       </w:r>
@@ -4635,7 +4724,7 @@
         <w:keepNext/>
         <w:keepLines/>
       </w:pPr>
-      <w:bookmarkStart w:id="6" w:name="_Toc242032964"/>
+      <w:bookmarkStart w:id="6" w:name="_Toc242050160"/>
       <w:r>
         <w:t>5.2 Multi-event adapter</w:t>
       </w:r>
@@ -4699,7 +4788,7 @@
         <w:keepNext/>
         <w:keepLines/>
       </w:pPr>
-      <w:bookmarkStart w:id="7" w:name="_Toc242032965"/>
+      <w:bookmarkStart w:id="7" w:name="_Toc242050161"/>
       <w:r>
         <w:t>5.3 Recipe r4: hard negatives and side inputs (final)</w:t>
       </w:r>
@@ -4817,7 +4906,7 @@
           <w:noProof/>
         </w:rPr>
         <w:drawing>
-          <wp:inline distT="0" distB="0" distL="0" distR="0" wp14:anchorId="154F5A1D" wp14:editId="2040C2A9">
+          <wp:inline distT="0" distB="0" distL="0" distR="0" wp14:anchorId="5902A8B9" wp14:editId="560FA0D1">
             <wp:extent cx="5762625" cy="2657475"/>
             <wp:effectExtent l="0" t="0" r="0" b="0"/>
             <wp:docPr id="2" name="fig7_training_r4.png" descr="Figure 2. Validation balanced accuracy during training, recipe r4, three seeds. The best checkpoint per seed is selected on validation only; seed 303 was still improving when it reached the 3-epoch cap and was evaluated as pre-registered." title="fig7_training_r4.png"/>
@@ -4877,7 +4966,7 @@
         <w:keepNext/>
         <w:keepLines/>
       </w:pPr>
-      <w:bookmarkStart w:id="8" w:name="_Toc242032966"/>
+      <w:bookmarkStart w:id="8" w:name="_Toc242050162"/>
       <w:r>
         <w:t>5.4 Schema-constrained decoding</w:t>
       </w:r>
@@ -4897,7 +4986,7 @@
         <w:keepNext/>
         <w:keepLines/>
       </w:pPr>
-      <w:bookmarkStart w:id="9" w:name="_Toc242032967"/>
+      <w:bookmarkStart w:id="9" w:name="_Toc242050163"/>
       <w:r>
         <w:t>6. Efficiency results</w:t>
       </w:r>
@@ -4914,7 +5003,7 @@
           <w:noProof/>
         </w:rPr>
         <w:drawing>
-          <wp:inline distT="0" distB="0" distL="0" distR="0" wp14:anchorId="6F7899BE" wp14:editId="00AF11C0">
+          <wp:inline distT="0" distB="0" distL="0" distR="0" wp14:anchorId="30994313" wp14:editId="02AEFEE1">
             <wp:extent cx="5762625" cy="1962150"/>
             <wp:effectExtent l="0" t="0" r="0" b="0"/>
             <wp:docPr id="3" name="fig2_latency.png" descr="Figure 3. Median latency per request (batch 1, 21 DS2 windows per N). Left: time to first token. Right: time until the urgency tier is generated (token 7 of the constrained answer)." title="fig2_latency.png"/>
@@ -5889,7 +5978,7 @@
         <w:keepNext/>
         <w:keepLines/>
       </w:pPr>
-      <w:bookmarkStart w:id="10" w:name="_Toc242032968"/>
+      <w:bookmarkStart w:id="10" w:name="_Toc242050164"/>
       <w:r>
         <w:t>6.1 Serving conditions: batching and prefix caching (Deviation 23)</w:t>
       </w:r>
@@ -7494,7 +7583,7 @@
         <w:keepNext/>
         <w:keepLines/>
       </w:pPr>
-      <w:bookmarkStart w:id="11" w:name="_Toc242032969"/>
+      <w:bookmarkStart w:id="11" w:name="_Toc242050165"/>
       <w:r>
         <w:t>7. Accuracy results</w:t>
       </w:r>
@@ -7506,7 +7595,7 @@
         <w:keepNext/>
         <w:keepLines/>
       </w:pPr>
-      <w:bookmarkStart w:id="12" w:name="_Toc242032970"/>
+      <w:bookmarkStart w:id="12" w:name="_Toc242050166"/>
       <w:r>
         <w:t>7.1 Primary test (pre-registered, Deviation 16)</w:t>
       </w:r>
@@ -7531,7 +7620,7 @@
           <w:noProof/>
         </w:rPr>
         <w:drawing>
-          <wp:inline distT="0" distB="0" distL="0" distR="0" wp14:anchorId="5748B2D0" wp14:editId="1B00BB05">
+          <wp:inline distT="0" distB="0" distL="0" distR="0" wp14:anchorId="0E74C273" wp14:editId="30547EE9">
             <wp:extent cx="5762625" cy="2886075"/>
             <wp:effectExtent l="0" t="0" r="0" b="0"/>
             <wp:docPr id="4" name="fig3_accuracy_vs_n.png" descr="Figure 4. Balanced accuracy on the DS2 test set by window size. The final adapter (r4) stays at 0.80–0.84 for every N and sits above the previous recipe (r3) at every N; default text falls sharply from N = 5; text with a calibrated threshold recovers part of the gap." title="fig3_accuracy_vs_n.png"/>
@@ -8797,7 +8886,7 @@
         <w:keepNext/>
         <w:keepLines/>
       </w:pPr>
-      <w:bookmarkStart w:id="13" w:name="_Toc242032971"/>
+      <w:bookmarkStart w:id="13" w:name="_Toc242050167"/>
       <w:r>
         <w:t>7.2 Primary comparison against default and calibrated text</w:t>
       </w:r>
@@ -9683,7 +9772,7 @@
           <w:noProof/>
         </w:rPr>
         <w:drawing>
-          <wp:inline distT="0" distB="0" distL="0" distR="0" wp14:anchorId="06136B83" wp14:editId="32103903">
+          <wp:inline distT="0" distB="0" distL="0" distR="0" wp14:anchorId="349585EA" wp14:editId="673F309B">
             <wp:extent cx="5762625" cy="2886075"/>
             <wp:effectExtent l="0" t="0" r="0" b="0"/>
             <wp:docPr id="5" name="fig4_forest.png" descr="Figure 5. The comparisons of Table 7. Dotted red line: non-inferiority margin. Hollow markers show the previous recipe (r3) against calibrated text." title="fig4_forest.png"/>
@@ -9743,7 +9832,7 @@
         <w:keepNext/>
         <w:keepLines/>
       </w:pPr>
-      <w:bookmarkStart w:id="14" w:name="_Toc242032972"/>
+      <w:bookmarkStart w:id="14" w:name="_Toc242050168"/>
       <w:r>
         <w:t>7.3 Why text fails with many events</w:t>
       </w:r>
@@ -9760,7 +9849,7 @@
           <w:noProof/>
         </w:rPr>
         <w:drawing>
-          <wp:inline distT="0" distB="0" distL="0" distR="0" wp14:anchorId="3367F950" wp14:editId="36D44802">
+          <wp:inline distT="0" distB="0" distL="0" distR="0" wp14:anchorId="7E3898E6" wp14:editId="5C4EB3A7">
             <wp:extent cx="5762625" cy="1971675"/>
             <wp:effectExtent l="0" t="0" r="0" b="0"/>
             <wp:docPr id="6" name="fig5_why_text_fails.png" descr="Figure 6. Left: text misses urgent windows caused by a single high-confidence V/F beat (a numeric threshold, 0.85, buried in a long list) far more than runs of abnormal beats. Right: text is worst when the key beat is in the middle of the list, the 'lost in the middle' effect; the adapter (r4, 3 seeds) shows no position effect." title="fig5_why_text_fails.png"/>
@@ -9841,7 +9930,7 @@
           <w:noProof/>
         </w:rPr>
         <w:drawing>
-          <wp:inline distT="0" distB="0" distL="0" distR="0" wp14:anchorId="08DB3552" wp14:editId="5C992DEE">
+          <wp:inline distT="0" distB="0" distL="0" distR="0" wp14:anchorId="524EF07F" wp14:editId="396D2861">
             <wp:extent cx="5762625" cy="2667000"/>
             <wp:effectExtent l="0" t="0" r="0" b="0"/>
             <wp:docPr id="7" name="fig6_confusion_n50.png" descr="Figure 7. Confusion at N = 50. Text under-escalates (priority → routine, urgent → priority) and never raises a false alarm; the r4 adapter never calls an urgent window routine and escalates 3% of routine windows." title="fig6_confusion_n50.png"/>
@@ -9901,7 +9990,7 @@
         <w:keepNext/>
         <w:keepLines/>
       </w:pPr>
-      <w:bookmarkStart w:id="15" w:name="_Toc242032973"/>
+      <w:bookmarkStart w:id="15" w:name="_Toc242050169"/>
       <w:r>
         <w:t>7.4 False alarms: identified in r3, reduced in r4</w:t>
       </w:r>
@@ -9929,7 +10018,7 @@
           <w:noProof/>
         </w:rPr>
         <w:drawing>
-          <wp:inline distT="0" distB="0" distL="0" distR="0" wp14:anchorId="7B83E491" wp14:editId="0DE4781A">
+          <wp:inline distT="0" distB="0" distL="0" distR="0" wp14:anchorId="2BB2EED3" wp14:editId="0A80E97A">
             <wp:extent cx="5762625" cy="2533650"/>
             <wp:effectExtent l="0" t="0" r="0" b="0"/>
             <wp:docPr id="8" name="fig9_false_alarms.png" descr="Figure 8. Routine windows escalated to priority or urgent (bars: mean of 3 seeds; lines: seed range). Text never escalates a routine window." title="fig9_false_alarms.png"/>
@@ -11004,7 +11093,7 @@
         <w:keepNext/>
         <w:keepLines/>
       </w:pPr>
-      <w:bookmarkStart w:id="16" w:name="_Toc242032974"/>
+      <w:bookmarkStart w:id="16" w:name="_Toc242050170"/>
       <w:r>
         <w:t>7.5 Against true annotations</w:t>
       </w:r>
@@ -11024,7 +11113,7 @@
         <w:keepNext/>
         <w:keepLines/>
       </w:pPr>
-      <w:bookmarkStart w:id="17" w:name="_Toc242032975"/>
+      <w:bookmarkStart w:id="17" w:name="_Toc242050171"/>
       <w:r>
         <w:t>7.6 Filtered text baseline (Deviation 20)</w:t>
       </w:r>
@@ -12167,7 +12256,7 @@
         <w:keepNext/>
         <w:keepLines/>
       </w:pPr>
-      <w:bookmarkStart w:id="18" w:name="_Toc242032976"/>
+      <w:bookmarkStart w:id="18" w:name="_Toc242050172"/>
       <w:r>
         <w:t>8. Auditability</w:t>
       </w:r>
@@ -12284,7 +12373,7 @@
           <w:noProof/>
         </w:rPr>
         <w:drawing>
-          <wp:inline distT="0" distB="0" distL="0" distR="0" wp14:anchorId="10E046CE" wp14:editId="0708F9A6">
+          <wp:inline distT="0" distB="0" distL="0" distR="0" wp14:anchorId="0E89921D" wp14:editId="4EB71D21">
             <wp:extent cx="5762625" cy="2371725"/>
             <wp:effectExtent l="0" t="0" r="0" b="0"/>
             <wp:docPr id="9" name="fig8_auditability.png" descr="Figure 9. Balanced accuracy of decoding each event's fields from its virtual-token slot (recipe r3, mean of 3 seeds) versus from the encoder's 32-d vector." title="fig8_auditability.png"/>
@@ -12349,7 +12438,7 @@
           <w:noProof/>
         </w:rPr>
         <w:drawing>
-          <wp:inline distT="0" distB="0" distL="0" distR="0" wp14:anchorId="7E5DFA3E" wp14:editId="76560B6A">
+          <wp:inline distT="0" distB="0" distL="0" distR="0" wp14:anchorId="61E55679" wp14:editId="363357D8">
             <wp:extent cx="5762625" cy="2009775"/>
             <wp:effectExtent l="0" t="0" r="0" b="0"/>
             <wp:docPr id="10" name="fig10_side_info.png" descr="Figure 10. Facts carried per event after the r4 change, decoded from slots 0 and 49 of each seed (bars: mean; lines: range). Left: heart rate and RR interval (R²). Right: presence of a run of ≥ 3 abnormal beats (balanced accuracy; Deviation 18b, a pre-registered replacement for an R² metric that proved ill-posed on this split)." title="fig10_side_info.png"/>
@@ -12409,7 +12498,7 @@
         <w:keepNext/>
         <w:keepLines/>
       </w:pPr>
-      <w:bookmarkStart w:id="19" w:name="_Toc242032977"/>
+      <w:bookmarkStart w:id="19" w:name="_Toc242050173"/>
       <w:r>
         <w:t>9. Replication on a second sender (Deviation 22)</w:t>
       </w:r>
@@ -13862,7 +13951,7 @@
           <w:noProof/>
         </w:rPr>
         <w:drawing>
-          <wp:inline distT="0" distB="0" distL="0" distR="0" wp14:anchorId="5E00DB1D" wp14:editId="61E2E03E">
+          <wp:inline distT="0" distB="0" distL="0" distR="0" wp14:anchorId="6ABDC4EB" wp14:editId="0D386834">
             <wp:extent cx="5762625" cy="2524125"/>
             <wp:effectExtent l="0" t="0" r="0" b="0"/>
             <wp:docPr id="11" name="fig11_two_senders.png" descr="Figure 11. Both senders side by side. The pattern replicates: text with every event listed falls as N grows, the adapter stays roughly flat, and filtered text is the most accurate arm, except at N = 50 on the second sender." title="fig11_two_senders.png"/>
@@ -14005,7 +14094,7 @@
         <w:keepNext/>
         <w:keepLines/>
       </w:pPr>
-      <w:bookmarkStart w:id="20" w:name="_Toc242032978"/>
+      <w:bookmarkStart w:id="20" w:name="_Toc242050174"/>
       <w:r>
         <w:t>10. What the channel needs: ablation and compression (Deviations 24, 26, 27)</w:t>
       </w:r>
@@ -14017,7 +14106,7 @@
         <w:keepNext/>
         <w:keepLines/>
       </w:pPr>
-      <w:bookmarkStart w:id="21" w:name="_Toc242032979"/>
+      <w:bookmarkStart w:id="21" w:name="_Toc242050175"/>
       <w:r>
         <w:t>10.1 Ablation of recipe r4</w:t>
       </w:r>
@@ -15413,7 +15502,7 @@
         <w:keepNext/>
         <w:keepLines/>
       </w:pPr>
-      <w:bookmarkStart w:id="22" w:name="_Toc242032980"/>
+      <w:bookmarkStart w:id="22" w:name="_Toc242050176"/>
       <w:r>
         <w:t>10.2 How many tokens per event?</w:t>
       </w:r>
@@ -16313,7 +16402,7 @@
           <w:noProof/>
         </w:rPr>
         <w:drawing>
-          <wp:inline distT="0" distB="0" distL="0" distR="0" wp14:anchorId="57C19C43" wp14:editId="3994AC34">
+          <wp:inline distT="0" distB="0" distL="0" distR="0" wp14:anchorId="48025DE5" wp14:editId="1DD8ED37">
             <wp:extent cx="5762625" cy="2314575"/>
             <wp:effectExtent l="0" t="0" r="0" b="0"/>
             <wp:docPr id="12" name="fig12_compression.png" descr="Figure 12. Every training run at each setting. With 1 token one run in three failed; with 2 tokens accuracy is close to 4 tokens but false alarms are higher in every run; 4 tokens is the smallest setting at which all runs were reliable on both measures." title="fig12_compression.png"/>
@@ -16433,11 +16522,2476 @@
         <w:keepNext/>
         <w:keepLines/>
       </w:pPr>
-      <w:bookmarkStart w:id="23" w:name="_Toc242032981"/>
+      <w:bookmarkStart w:id="23" w:name="_Toc242050177"/>
       <w:r>
-        <w:t>11. Status of the research questions</w:t>
+        <w:t>11. External confirmatory test on INCART (Deviation 21)</w:t>
       </w:r>
       <w:bookmarkEnd w:id="23"/>
+    </w:p>
+    <w:p>
+      <w:pPr>
+        <w:spacing w:after="120"/>
+      </w:pPr>
+      <w:r>
+        <w:t>The MIT-BIH test set informed several design iterations, so it cannot confirm the final system. The confirmatory test was planned before the data were downloaded: the system was frozen (a manifest of checkpoint and code hashes, the calibration biases chosen on MIT-BIH validation data, git tag r4-confirmatory), the database was converted by a procedure fixed in advance, and the frozen system was run once. INCART has 75 half-hour recordings from 32 patients on different equipment (lead II resampled from 257 t</w:t>
+      </w:r>
+      <w:r>
+        <w:t>o 360 Hz): 175,777 beats, 1,240 test windows with every stratified cell full, and the window list was committed before any model output existed. Four hypotheses were tested in a fixed order, each at the 5% level, stopping at the first failure.</w:t>
+      </w:r>
+    </w:p>
+    <w:tbl>
+      <w:tblPr>
+        <w:tblW w:w="9026" w:type="dxa"/>
+        <w:tblBorders>
+          <w:top w:val="single" w:sz="4" w:space="0" w:color="auto"/>
+          <w:left w:val="single" w:sz="4" w:space="0" w:color="auto"/>
+          <w:bottom w:val="single" w:sz="4" w:space="0" w:color="auto"/>
+          <w:right w:val="single" w:sz="4" w:space="0" w:color="auto"/>
+          <w:insideH w:val="single" w:sz="4" w:space="0" w:color="auto"/>
+          <w:insideV w:val="single" w:sz="4" w:space="0" w:color="auto"/>
+        </w:tblBorders>
+        <w:tblCellMar>
+          <w:left w:w="10" w:type="dxa"/>
+          <w:right w:w="10" w:type="dxa"/>
+        </w:tblCellMar>
+        <w:tblLook w:val="04A0" w:firstRow="1" w:lastRow="0" w:firstColumn="1" w:lastColumn="0" w:noHBand="0" w:noVBand="1"/>
+      </w:tblPr>
+      <w:tblGrid>
+        <w:gridCol w:w="3700"/>
+        <w:gridCol w:w="1000"/>
+        <w:gridCol w:w="2300"/>
+        <w:gridCol w:w="2026"/>
+      </w:tblGrid>
+      <w:tr>
+        <w:tblPrEx>
+          <w:tblCellMar>
+            <w:top w:w="0" w:type="dxa"/>
+            <w:bottom w:w="0" w:type="dxa"/>
+          </w:tblCellMar>
+        </w:tblPrEx>
+        <w:trPr>
+          <w:cantSplit/>
+          <w:tblHeader/>
+        </w:trPr>
+        <w:tc>
+          <w:tcPr>
+            <w:tcW w:w="3700" w:type="dxa"/>
+            <w:tcBorders>
+              <w:top w:val="single" w:sz="4" w:space="0" w:color="BFBFBF"/>
+              <w:left w:val="single" w:sz="4" w:space="0" w:color="BFBFBF"/>
+              <w:bottom w:val="single" w:sz="4" w:space="0" w:color="BFBFBF"/>
+              <w:right w:val="single" w:sz="4" w:space="0" w:color="BFBFBF"/>
+            </w:tcBorders>
+            <w:shd w:val="clear" w:color="auto" w:fill="E8EEF7"/>
+            <w:tcMar>
+              <w:top w:w="60" w:type="dxa"/>
+              <w:left w:w="100" w:type="dxa"/>
+              <w:bottom w:w="60" w:type="dxa"/>
+              <w:right w:w="100" w:type="dxa"/>
+            </w:tcMar>
+          </w:tcPr>
+          <w:p>
+            <w:pPr>
+              <w:keepNext/>
+              <w:keepLines/>
+            </w:pPr>
+            <w:r>
+              <w:rPr>
+                <w:b/>
+                <w:bCs/>
+                <w:sz w:val="19"/>
+                <w:szCs w:val="19"/>
+              </w:rPr>
+              <w:t>Hypothesis</w:t>
+            </w:r>
+          </w:p>
+        </w:tc>
+        <w:tc>
+          <w:tcPr>
+            <w:tcW w:w="1000" w:type="dxa"/>
+            <w:tcBorders>
+              <w:top w:val="single" w:sz="4" w:space="0" w:color="BFBFBF"/>
+              <w:left w:val="single" w:sz="4" w:space="0" w:color="BFBFBF"/>
+              <w:bottom w:val="single" w:sz="4" w:space="0" w:color="BFBFBF"/>
+              <w:right w:val="single" w:sz="4" w:space="0" w:color="BFBFBF"/>
+            </w:tcBorders>
+            <w:shd w:val="clear" w:color="auto" w:fill="E8EEF7"/>
+            <w:tcMar>
+              <w:top w:w="60" w:type="dxa"/>
+              <w:left w:w="100" w:type="dxa"/>
+              <w:bottom w:w="60" w:type="dxa"/>
+              <w:right w:w="100" w:type="dxa"/>
+            </w:tcMar>
+          </w:tcPr>
+          <w:p>
+            <w:pPr>
+              <w:keepNext/>
+              <w:keepLines/>
+            </w:pPr>
+            <w:r>
+              <w:rPr>
+                <w:b/>
+                <w:bCs/>
+                <w:sz w:val="19"/>
+                <w:szCs w:val="19"/>
+              </w:rPr>
+              <w:t>N</w:t>
+            </w:r>
+          </w:p>
+        </w:tc>
+        <w:tc>
+          <w:tcPr>
+            <w:tcW w:w="2300" w:type="dxa"/>
+            <w:tcBorders>
+              <w:top w:val="single" w:sz="4" w:space="0" w:color="BFBFBF"/>
+              <w:left w:val="single" w:sz="4" w:space="0" w:color="BFBFBF"/>
+              <w:bottom w:val="single" w:sz="4" w:space="0" w:color="BFBFBF"/>
+              <w:right w:val="single" w:sz="4" w:space="0" w:color="BFBFBF"/>
+            </w:tcBorders>
+            <w:shd w:val="clear" w:color="auto" w:fill="E8EEF7"/>
+            <w:tcMar>
+              <w:top w:w="60" w:type="dxa"/>
+              <w:left w:w="100" w:type="dxa"/>
+              <w:bottom w:w="60" w:type="dxa"/>
+              <w:right w:w="100" w:type="dxa"/>
+            </w:tcMar>
+          </w:tcPr>
+          <w:p>
+            <w:pPr>
+              <w:keepNext/>
+              <w:keepLines/>
+            </w:pPr>
+            <w:r>
+              <w:rPr>
+                <w:b/>
+                <w:bCs/>
+                <w:sz w:val="19"/>
+                <w:szCs w:val="19"/>
+              </w:rPr>
+              <w:t>Estimate [95% CI]</w:t>
+            </w:r>
+          </w:p>
+        </w:tc>
+        <w:tc>
+          <w:tcPr>
+            <w:tcW w:w="2026" w:type="dxa"/>
+            <w:tcBorders>
+              <w:top w:val="single" w:sz="4" w:space="0" w:color="BFBFBF"/>
+              <w:left w:val="single" w:sz="4" w:space="0" w:color="BFBFBF"/>
+              <w:bottom w:val="single" w:sz="4" w:space="0" w:color="BFBFBF"/>
+              <w:right w:val="single" w:sz="4" w:space="0" w:color="BFBFBF"/>
+            </w:tcBorders>
+            <w:shd w:val="clear" w:color="auto" w:fill="E8EEF7"/>
+            <w:tcMar>
+              <w:top w:w="60" w:type="dxa"/>
+              <w:left w:w="100" w:type="dxa"/>
+              <w:bottom w:w="60" w:type="dxa"/>
+              <w:right w:w="100" w:type="dxa"/>
+            </w:tcMar>
+          </w:tcPr>
+          <w:p>
+            <w:pPr>
+              <w:keepNext/>
+              <w:keepLines/>
+            </w:pPr>
+            <w:r>
+              <w:rPr>
+                <w:b/>
+                <w:bCs/>
+                <w:sz w:val="19"/>
+                <w:szCs w:val="19"/>
+              </w:rPr>
+              <w:t>Result</w:t>
+            </w:r>
+          </w:p>
+        </w:tc>
+      </w:tr>
+      <w:tr>
+        <w:tblPrEx>
+          <w:tblCellMar>
+            <w:top w:w="0" w:type="dxa"/>
+            <w:bottom w:w="0" w:type="dxa"/>
+          </w:tblCellMar>
+        </w:tblPrEx>
+        <w:trPr>
+          <w:cantSplit/>
+        </w:trPr>
+        <w:tc>
+          <w:tcPr>
+            <w:tcW w:w="3700" w:type="dxa"/>
+            <w:tcBorders>
+              <w:top w:val="single" w:sz="4" w:space="0" w:color="BFBFBF"/>
+              <w:left w:val="single" w:sz="4" w:space="0" w:color="BFBFBF"/>
+              <w:bottom w:val="single" w:sz="4" w:space="0" w:color="BFBFBF"/>
+              <w:right w:val="single" w:sz="4" w:space="0" w:color="BFBFBF"/>
+            </w:tcBorders>
+            <w:tcMar>
+              <w:top w:w="60" w:type="dxa"/>
+              <w:left w:w="100" w:type="dxa"/>
+              <w:bottom w:w="60" w:type="dxa"/>
+              <w:right w:w="100" w:type="dxa"/>
+            </w:tcMar>
+          </w:tcPr>
+          <w:p>
+            <w:pPr>
+              <w:keepNext/>
+              <w:keepLines/>
+            </w:pPr>
+            <w:r>
+              <w:rPr>
+                <w:sz w:val="19"/>
+                <w:szCs w:val="19"/>
+              </w:rPr>
+              <w:t>H1 (primary): adapter non-inferior to calibrated text</w:t>
+            </w:r>
+          </w:p>
+        </w:tc>
+        <w:tc>
+          <w:tcPr>
+            <w:tcW w:w="1000" w:type="dxa"/>
+            <w:tcBorders>
+              <w:top w:val="single" w:sz="4" w:space="0" w:color="BFBFBF"/>
+              <w:left w:val="single" w:sz="4" w:space="0" w:color="BFBFBF"/>
+              <w:bottom w:val="single" w:sz="4" w:space="0" w:color="BFBFBF"/>
+              <w:right w:val="single" w:sz="4" w:space="0" w:color="BFBFBF"/>
+            </w:tcBorders>
+            <w:tcMar>
+              <w:top w:w="60" w:type="dxa"/>
+              <w:left w:w="100" w:type="dxa"/>
+              <w:bottom w:w="60" w:type="dxa"/>
+              <w:right w:w="100" w:type="dxa"/>
+            </w:tcMar>
+          </w:tcPr>
+          <w:p>
+            <w:pPr>
+              <w:keepNext/>
+              <w:keepLines/>
+            </w:pPr>
+            <w:r>
+              <w:rPr>
+                <w:sz w:val="19"/>
+                <w:szCs w:val="19"/>
+              </w:rPr>
+              <w:t>10</w:t>
+            </w:r>
+          </w:p>
+        </w:tc>
+        <w:tc>
+          <w:tcPr>
+            <w:tcW w:w="2300" w:type="dxa"/>
+            <w:tcBorders>
+              <w:top w:val="single" w:sz="4" w:space="0" w:color="BFBFBF"/>
+              <w:left w:val="single" w:sz="4" w:space="0" w:color="BFBFBF"/>
+              <w:bottom w:val="single" w:sz="4" w:space="0" w:color="BFBFBF"/>
+              <w:right w:val="single" w:sz="4" w:space="0" w:color="BFBFBF"/>
+            </w:tcBorders>
+            <w:tcMar>
+              <w:top w:w="60" w:type="dxa"/>
+              <w:left w:w="100" w:type="dxa"/>
+              <w:bottom w:w="60" w:type="dxa"/>
+              <w:right w:w="100" w:type="dxa"/>
+            </w:tcMar>
+          </w:tcPr>
+          <w:p>
+            <w:pPr>
+              <w:keepNext/>
+              <w:keepLines/>
+            </w:pPr>
+            <w:r>
+              <w:rPr>
+                <w:sz w:val="19"/>
+                <w:szCs w:val="19"/>
+              </w:rPr>
+              <w:t>+0.08 [+0.03, +0.15]</w:t>
+            </w:r>
+          </w:p>
+        </w:tc>
+        <w:tc>
+          <w:tcPr>
+            <w:tcW w:w="2026" w:type="dxa"/>
+            <w:tcBorders>
+              <w:top w:val="single" w:sz="4" w:space="0" w:color="BFBFBF"/>
+              <w:left w:val="single" w:sz="4" w:space="0" w:color="BFBFBF"/>
+              <w:bottom w:val="single" w:sz="4" w:space="0" w:color="BFBFBF"/>
+              <w:right w:val="single" w:sz="4" w:space="0" w:color="BFBFBF"/>
+            </w:tcBorders>
+            <w:tcMar>
+              <w:top w:w="60" w:type="dxa"/>
+              <w:left w:w="100" w:type="dxa"/>
+              <w:bottom w:w="60" w:type="dxa"/>
+              <w:right w:w="100" w:type="dxa"/>
+            </w:tcMar>
+          </w:tcPr>
+          <w:p>
+            <w:pPr>
+              <w:keepNext/>
+              <w:keepLines/>
+            </w:pPr>
+            <w:r>
+              <w:rPr>
+                <w:sz w:val="19"/>
+                <w:szCs w:val="19"/>
+              </w:rPr>
+              <w:t>Confirmed</w:t>
+            </w:r>
+          </w:p>
+        </w:tc>
+      </w:tr>
+      <w:tr>
+        <w:tblPrEx>
+          <w:tblCellMar>
+            <w:top w:w="0" w:type="dxa"/>
+            <w:bottom w:w="0" w:type="dxa"/>
+          </w:tblCellMar>
+        </w:tblPrEx>
+        <w:trPr>
+          <w:cantSplit/>
+        </w:trPr>
+        <w:tc>
+          <w:tcPr>
+            <w:tcW w:w="3700" w:type="dxa"/>
+            <w:tcBorders>
+              <w:top w:val="single" w:sz="4" w:space="0" w:color="BFBFBF"/>
+              <w:left w:val="single" w:sz="4" w:space="0" w:color="BFBFBF"/>
+              <w:bottom w:val="single" w:sz="4" w:space="0" w:color="BFBFBF"/>
+              <w:right w:val="single" w:sz="4" w:space="0" w:color="BFBFBF"/>
+            </w:tcBorders>
+            <w:tcMar>
+              <w:top w:w="60" w:type="dxa"/>
+              <w:left w:w="100" w:type="dxa"/>
+              <w:bottom w:w="60" w:type="dxa"/>
+              <w:right w:w="100" w:type="dxa"/>
+            </w:tcMar>
+          </w:tcPr>
+          <w:p>
+            <w:pPr>
+              <w:keepNext/>
+              <w:keepLines/>
+            </w:pPr>
+          </w:p>
+        </w:tc>
+        <w:tc>
+          <w:tcPr>
+            <w:tcW w:w="1000" w:type="dxa"/>
+            <w:tcBorders>
+              <w:top w:val="single" w:sz="4" w:space="0" w:color="BFBFBF"/>
+              <w:left w:val="single" w:sz="4" w:space="0" w:color="BFBFBF"/>
+              <w:bottom w:val="single" w:sz="4" w:space="0" w:color="BFBFBF"/>
+              <w:right w:val="single" w:sz="4" w:space="0" w:color="BFBFBF"/>
+            </w:tcBorders>
+            <w:tcMar>
+              <w:top w:w="60" w:type="dxa"/>
+              <w:left w:w="100" w:type="dxa"/>
+              <w:bottom w:w="60" w:type="dxa"/>
+              <w:right w:w="100" w:type="dxa"/>
+            </w:tcMar>
+          </w:tcPr>
+          <w:p>
+            <w:pPr>
+              <w:keepNext/>
+              <w:keepLines/>
+            </w:pPr>
+            <w:r>
+              <w:rPr>
+                <w:sz w:val="19"/>
+                <w:szCs w:val="19"/>
+              </w:rPr>
+              <w:t>20</w:t>
+            </w:r>
+          </w:p>
+        </w:tc>
+        <w:tc>
+          <w:tcPr>
+            <w:tcW w:w="2300" w:type="dxa"/>
+            <w:tcBorders>
+              <w:top w:val="single" w:sz="4" w:space="0" w:color="BFBFBF"/>
+              <w:left w:val="single" w:sz="4" w:space="0" w:color="BFBFBF"/>
+              <w:bottom w:val="single" w:sz="4" w:space="0" w:color="BFBFBF"/>
+              <w:right w:val="single" w:sz="4" w:space="0" w:color="BFBFBF"/>
+            </w:tcBorders>
+            <w:tcMar>
+              <w:top w:w="60" w:type="dxa"/>
+              <w:left w:w="100" w:type="dxa"/>
+              <w:bottom w:w="60" w:type="dxa"/>
+              <w:right w:w="100" w:type="dxa"/>
+            </w:tcMar>
+          </w:tcPr>
+          <w:p>
+            <w:pPr>
+              <w:keepNext/>
+              <w:keepLines/>
+            </w:pPr>
+            <w:r>
+              <w:rPr>
+                <w:sz w:val="19"/>
+                <w:szCs w:val="19"/>
+              </w:rPr>
+              <w:t>+0.09 [+0.04, +0.15]</w:t>
+            </w:r>
+          </w:p>
+        </w:tc>
+        <w:tc>
+          <w:tcPr>
+            <w:tcW w:w="2026" w:type="dxa"/>
+            <w:tcBorders>
+              <w:top w:val="single" w:sz="4" w:space="0" w:color="BFBFBF"/>
+              <w:left w:val="single" w:sz="4" w:space="0" w:color="BFBFBF"/>
+              <w:bottom w:val="single" w:sz="4" w:space="0" w:color="BFBFBF"/>
+              <w:right w:val="single" w:sz="4" w:space="0" w:color="BFBFBF"/>
+            </w:tcBorders>
+            <w:tcMar>
+              <w:top w:w="60" w:type="dxa"/>
+              <w:left w:w="100" w:type="dxa"/>
+              <w:bottom w:w="60" w:type="dxa"/>
+              <w:right w:w="100" w:type="dxa"/>
+            </w:tcMar>
+          </w:tcPr>
+          <w:p>
+            <w:pPr>
+              <w:keepNext/>
+              <w:keepLines/>
+            </w:pPr>
+          </w:p>
+        </w:tc>
+      </w:tr>
+      <w:tr>
+        <w:tblPrEx>
+          <w:tblCellMar>
+            <w:top w:w="0" w:type="dxa"/>
+            <w:bottom w:w="0" w:type="dxa"/>
+          </w:tblCellMar>
+        </w:tblPrEx>
+        <w:trPr>
+          <w:cantSplit/>
+        </w:trPr>
+        <w:tc>
+          <w:tcPr>
+            <w:tcW w:w="3700" w:type="dxa"/>
+            <w:tcBorders>
+              <w:top w:val="single" w:sz="4" w:space="0" w:color="BFBFBF"/>
+              <w:left w:val="single" w:sz="4" w:space="0" w:color="BFBFBF"/>
+              <w:bottom w:val="single" w:sz="4" w:space="0" w:color="BFBFBF"/>
+              <w:right w:val="single" w:sz="4" w:space="0" w:color="BFBFBF"/>
+            </w:tcBorders>
+            <w:tcMar>
+              <w:top w:w="60" w:type="dxa"/>
+              <w:left w:w="100" w:type="dxa"/>
+              <w:bottom w:w="60" w:type="dxa"/>
+              <w:right w:w="100" w:type="dxa"/>
+            </w:tcMar>
+          </w:tcPr>
+          <w:p>
+            <w:pPr>
+              <w:keepNext/>
+              <w:keepLines/>
+            </w:pPr>
+          </w:p>
+        </w:tc>
+        <w:tc>
+          <w:tcPr>
+            <w:tcW w:w="1000" w:type="dxa"/>
+            <w:tcBorders>
+              <w:top w:val="single" w:sz="4" w:space="0" w:color="BFBFBF"/>
+              <w:left w:val="single" w:sz="4" w:space="0" w:color="BFBFBF"/>
+              <w:bottom w:val="single" w:sz="4" w:space="0" w:color="BFBFBF"/>
+              <w:right w:val="single" w:sz="4" w:space="0" w:color="BFBFBF"/>
+            </w:tcBorders>
+            <w:tcMar>
+              <w:top w:w="60" w:type="dxa"/>
+              <w:left w:w="100" w:type="dxa"/>
+              <w:bottom w:w="60" w:type="dxa"/>
+              <w:right w:w="100" w:type="dxa"/>
+            </w:tcMar>
+          </w:tcPr>
+          <w:p>
+            <w:pPr>
+              <w:keepNext/>
+              <w:keepLines/>
+            </w:pPr>
+            <w:r>
+              <w:rPr>
+                <w:sz w:val="19"/>
+                <w:szCs w:val="19"/>
+              </w:rPr>
+              <w:t>50</w:t>
+            </w:r>
+          </w:p>
+        </w:tc>
+        <w:tc>
+          <w:tcPr>
+            <w:tcW w:w="2300" w:type="dxa"/>
+            <w:tcBorders>
+              <w:top w:val="single" w:sz="4" w:space="0" w:color="BFBFBF"/>
+              <w:left w:val="single" w:sz="4" w:space="0" w:color="BFBFBF"/>
+              <w:bottom w:val="single" w:sz="4" w:space="0" w:color="BFBFBF"/>
+              <w:right w:val="single" w:sz="4" w:space="0" w:color="BFBFBF"/>
+            </w:tcBorders>
+            <w:tcMar>
+              <w:top w:w="60" w:type="dxa"/>
+              <w:left w:w="100" w:type="dxa"/>
+              <w:bottom w:w="60" w:type="dxa"/>
+              <w:right w:w="100" w:type="dxa"/>
+            </w:tcMar>
+          </w:tcPr>
+          <w:p>
+            <w:pPr>
+              <w:keepNext/>
+              <w:keepLines/>
+            </w:pPr>
+            <w:r>
+              <w:rPr>
+                <w:sz w:val="19"/>
+                <w:szCs w:val="19"/>
+              </w:rPr>
+              <w:t>+0.05 [−0.04, +0.13]</w:t>
+            </w:r>
+          </w:p>
+        </w:tc>
+        <w:tc>
+          <w:tcPr>
+            <w:tcW w:w="2026" w:type="dxa"/>
+            <w:tcBorders>
+              <w:top w:val="single" w:sz="4" w:space="0" w:color="BFBFBF"/>
+              <w:left w:val="single" w:sz="4" w:space="0" w:color="BFBFBF"/>
+              <w:bottom w:val="single" w:sz="4" w:space="0" w:color="BFBFBF"/>
+              <w:right w:val="single" w:sz="4" w:space="0" w:color="BFBFBF"/>
+            </w:tcBorders>
+            <w:tcMar>
+              <w:top w:w="60" w:type="dxa"/>
+              <w:left w:w="100" w:type="dxa"/>
+              <w:bottom w:w="60" w:type="dxa"/>
+              <w:right w:w="100" w:type="dxa"/>
+            </w:tcMar>
+          </w:tcPr>
+          <w:p>
+            <w:pPr>
+              <w:keepNext/>
+              <w:keepLines/>
+            </w:pPr>
+          </w:p>
+        </w:tc>
+      </w:tr>
+      <w:tr>
+        <w:tblPrEx>
+          <w:tblCellMar>
+            <w:top w:w="0" w:type="dxa"/>
+            <w:bottom w:w="0" w:type="dxa"/>
+          </w:tblCellMar>
+        </w:tblPrEx>
+        <w:trPr>
+          <w:cantSplit/>
+        </w:trPr>
+        <w:tc>
+          <w:tcPr>
+            <w:tcW w:w="3700" w:type="dxa"/>
+            <w:tcBorders>
+              <w:top w:val="single" w:sz="4" w:space="0" w:color="BFBFBF"/>
+              <w:left w:val="single" w:sz="4" w:space="0" w:color="BFBFBF"/>
+              <w:bottom w:val="single" w:sz="4" w:space="0" w:color="BFBFBF"/>
+              <w:right w:val="single" w:sz="4" w:space="0" w:color="BFBFBF"/>
+            </w:tcBorders>
+            <w:tcMar>
+              <w:top w:w="60" w:type="dxa"/>
+              <w:left w:w="100" w:type="dxa"/>
+              <w:bottom w:w="60" w:type="dxa"/>
+              <w:right w:w="100" w:type="dxa"/>
+            </w:tcMar>
+          </w:tcPr>
+          <w:p>
+            <w:pPr>
+              <w:keepNext/>
+              <w:keepLines/>
+            </w:pPr>
+            <w:r>
+              <w:rPr>
+                <w:sz w:val="19"/>
+                <w:szCs w:val="19"/>
+              </w:rPr>
+              <w:t>H2: adapter superior to calibrated text</w:t>
+            </w:r>
+          </w:p>
+        </w:tc>
+        <w:tc>
+          <w:tcPr>
+            <w:tcW w:w="1000" w:type="dxa"/>
+            <w:tcBorders>
+              <w:top w:val="single" w:sz="4" w:space="0" w:color="BFBFBF"/>
+              <w:left w:val="single" w:sz="4" w:space="0" w:color="BFBFBF"/>
+              <w:bottom w:val="single" w:sz="4" w:space="0" w:color="BFBFBF"/>
+              <w:right w:val="single" w:sz="4" w:space="0" w:color="BFBFBF"/>
+            </w:tcBorders>
+            <w:tcMar>
+              <w:top w:w="60" w:type="dxa"/>
+              <w:left w:w="100" w:type="dxa"/>
+              <w:bottom w:w="60" w:type="dxa"/>
+              <w:right w:w="100" w:type="dxa"/>
+            </w:tcMar>
+          </w:tcPr>
+          <w:p>
+            <w:pPr>
+              <w:keepNext/>
+              <w:keepLines/>
+            </w:pPr>
+            <w:r>
+              <w:rPr>
+                <w:sz w:val="19"/>
+                <w:szCs w:val="19"/>
+              </w:rPr>
+              <w:t>10</w:t>
+            </w:r>
+          </w:p>
+        </w:tc>
+        <w:tc>
+          <w:tcPr>
+            <w:tcW w:w="2300" w:type="dxa"/>
+            <w:tcBorders>
+              <w:top w:val="single" w:sz="4" w:space="0" w:color="BFBFBF"/>
+              <w:left w:val="single" w:sz="4" w:space="0" w:color="BFBFBF"/>
+              <w:bottom w:val="single" w:sz="4" w:space="0" w:color="BFBFBF"/>
+              <w:right w:val="single" w:sz="4" w:space="0" w:color="BFBFBF"/>
+            </w:tcBorders>
+            <w:tcMar>
+              <w:top w:w="60" w:type="dxa"/>
+              <w:left w:w="100" w:type="dxa"/>
+              <w:bottom w:w="60" w:type="dxa"/>
+              <w:right w:w="100" w:type="dxa"/>
+            </w:tcMar>
+          </w:tcPr>
+          <w:p>
+            <w:pPr>
+              <w:keepNext/>
+              <w:keepLines/>
+            </w:pPr>
+            <w:r>
+              <w:rPr>
+                <w:sz w:val="19"/>
+                <w:szCs w:val="19"/>
+              </w:rPr>
+              <w:t>+0.08 [+0.03, +0.15]</w:t>
+            </w:r>
+          </w:p>
+        </w:tc>
+        <w:tc>
+          <w:tcPr>
+            <w:tcW w:w="2026" w:type="dxa"/>
+            <w:tcBorders>
+              <w:top w:val="single" w:sz="4" w:space="0" w:color="BFBFBF"/>
+              <w:left w:val="single" w:sz="4" w:space="0" w:color="BFBFBF"/>
+              <w:bottom w:val="single" w:sz="4" w:space="0" w:color="BFBFBF"/>
+              <w:right w:val="single" w:sz="4" w:space="0" w:color="BFBFBF"/>
+            </w:tcBorders>
+            <w:tcMar>
+              <w:top w:w="60" w:type="dxa"/>
+              <w:left w:w="100" w:type="dxa"/>
+              <w:bottom w:w="60" w:type="dxa"/>
+              <w:right w:w="100" w:type="dxa"/>
+            </w:tcMar>
+          </w:tcPr>
+          <w:p>
+            <w:pPr>
+              <w:keepNext/>
+              <w:keepLines/>
+            </w:pPr>
+            <w:r>
+              <w:rPr>
+                <w:sz w:val="19"/>
+                <w:szCs w:val="19"/>
+              </w:rPr>
+              <w:t>Confirmed</w:t>
+            </w:r>
+          </w:p>
+        </w:tc>
+      </w:tr>
+      <w:tr>
+        <w:tblPrEx>
+          <w:tblCellMar>
+            <w:top w:w="0" w:type="dxa"/>
+            <w:bottom w:w="0" w:type="dxa"/>
+          </w:tblCellMar>
+        </w:tblPrEx>
+        <w:trPr>
+          <w:cantSplit/>
+        </w:trPr>
+        <w:tc>
+          <w:tcPr>
+            <w:tcW w:w="3700" w:type="dxa"/>
+            <w:tcBorders>
+              <w:top w:val="single" w:sz="4" w:space="0" w:color="BFBFBF"/>
+              <w:left w:val="single" w:sz="4" w:space="0" w:color="BFBFBF"/>
+              <w:bottom w:val="single" w:sz="4" w:space="0" w:color="BFBFBF"/>
+              <w:right w:val="single" w:sz="4" w:space="0" w:color="BFBFBF"/>
+            </w:tcBorders>
+            <w:tcMar>
+              <w:top w:w="60" w:type="dxa"/>
+              <w:left w:w="100" w:type="dxa"/>
+              <w:bottom w:w="60" w:type="dxa"/>
+              <w:right w:w="100" w:type="dxa"/>
+            </w:tcMar>
+          </w:tcPr>
+          <w:p>
+            <w:pPr>
+              <w:keepNext/>
+              <w:keepLines/>
+            </w:pPr>
+          </w:p>
+        </w:tc>
+        <w:tc>
+          <w:tcPr>
+            <w:tcW w:w="1000" w:type="dxa"/>
+            <w:tcBorders>
+              <w:top w:val="single" w:sz="4" w:space="0" w:color="BFBFBF"/>
+              <w:left w:val="single" w:sz="4" w:space="0" w:color="BFBFBF"/>
+              <w:bottom w:val="single" w:sz="4" w:space="0" w:color="BFBFBF"/>
+              <w:right w:val="single" w:sz="4" w:space="0" w:color="BFBFBF"/>
+            </w:tcBorders>
+            <w:tcMar>
+              <w:top w:w="60" w:type="dxa"/>
+              <w:left w:w="100" w:type="dxa"/>
+              <w:bottom w:w="60" w:type="dxa"/>
+              <w:right w:w="100" w:type="dxa"/>
+            </w:tcMar>
+          </w:tcPr>
+          <w:p>
+            <w:pPr>
+              <w:keepNext/>
+              <w:keepLines/>
+            </w:pPr>
+            <w:r>
+              <w:rPr>
+                <w:sz w:val="19"/>
+                <w:szCs w:val="19"/>
+              </w:rPr>
+              <w:t>20</w:t>
+            </w:r>
+          </w:p>
+        </w:tc>
+        <w:tc>
+          <w:tcPr>
+            <w:tcW w:w="2300" w:type="dxa"/>
+            <w:tcBorders>
+              <w:top w:val="single" w:sz="4" w:space="0" w:color="BFBFBF"/>
+              <w:left w:val="single" w:sz="4" w:space="0" w:color="BFBFBF"/>
+              <w:bottom w:val="single" w:sz="4" w:space="0" w:color="BFBFBF"/>
+              <w:right w:val="single" w:sz="4" w:space="0" w:color="BFBFBF"/>
+            </w:tcBorders>
+            <w:tcMar>
+              <w:top w:w="60" w:type="dxa"/>
+              <w:left w:w="100" w:type="dxa"/>
+              <w:bottom w:w="60" w:type="dxa"/>
+              <w:right w:w="100" w:type="dxa"/>
+            </w:tcMar>
+          </w:tcPr>
+          <w:p>
+            <w:pPr>
+              <w:keepNext/>
+              <w:keepLines/>
+            </w:pPr>
+            <w:r>
+              <w:rPr>
+                <w:sz w:val="19"/>
+                <w:szCs w:val="19"/>
+              </w:rPr>
+              <w:t>+0.09 [+0.04, +0.15]</w:t>
+            </w:r>
+          </w:p>
+        </w:tc>
+        <w:tc>
+          <w:tcPr>
+            <w:tcW w:w="2026" w:type="dxa"/>
+            <w:tcBorders>
+              <w:top w:val="single" w:sz="4" w:space="0" w:color="BFBFBF"/>
+              <w:left w:val="single" w:sz="4" w:space="0" w:color="BFBFBF"/>
+              <w:bottom w:val="single" w:sz="4" w:space="0" w:color="BFBFBF"/>
+              <w:right w:val="single" w:sz="4" w:space="0" w:color="BFBFBF"/>
+            </w:tcBorders>
+            <w:tcMar>
+              <w:top w:w="60" w:type="dxa"/>
+              <w:left w:w="100" w:type="dxa"/>
+              <w:bottom w:w="60" w:type="dxa"/>
+              <w:right w:w="100" w:type="dxa"/>
+            </w:tcMar>
+          </w:tcPr>
+          <w:p>
+            <w:pPr>
+              <w:keepNext/>
+              <w:keepLines/>
+            </w:pPr>
+          </w:p>
+        </w:tc>
+      </w:tr>
+      <w:tr>
+        <w:tblPrEx>
+          <w:tblCellMar>
+            <w:top w:w="0" w:type="dxa"/>
+            <w:bottom w:w="0" w:type="dxa"/>
+          </w:tblCellMar>
+        </w:tblPrEx>
+        <w:trPr>
+          <w:cantSplit/>
+        </w:trPr>
+        <w:tc>
+          <w:tcPr>
+            <w:tcW w:w="3700" w:type="dxa"/>
+            <w:tcBorders>
+              <w:top w:val="single" w:sz="4" w:space="0" w:color="BFBFBF"/>
+              <w:left w:val="single" w:sz="4" w:space="0" w:color="BFBFBF"/>
+              <w:bottom w:val="single" w:sz="4" w:space="0" w:color="BFBFBF"/>
+              <w:right w:val="single" w:sz="4" w:space="0" w:color="BFBFBF"/>
+            </w:tcBorders>
+            <w:tcMar>
+              <w:top w:w="60" w:type="dxa"/>
+              <w:left w:w="100" w:type="dxa"/>
+              <w:bottom w:w="60" w:type="dxa"/>
+              <w:right w:w="100" w:type="dxa"/>
+            </w:tcMar>
+          </w:tcPr>
+          <w:p>
+            <w:pPr>
+              <w:keepNext/>
+              <w:keepLines/>
+            </w:pPr>
+            <w:r>
+              <w:rPr>
+                <w:sz w:val="19"/>
+                <w:szCs w:val="19"/>
+              </w:rPr>
+              <w:t>H3: adapter non-inferior to calibrated filtered text</w:t>
+            </w:r>
+          </w:p>
+        </w:tc>
+        <w:tc>
+          <w:tcPr>
+            <w:tcW w:w="1000" w:type="dxa"/>
+            <w:tcBorders>
+              <w:top w:val="single" w:sz="4" w:space="0" w:color="BFBFBF"/>
+              <w:left w:val="single" w:sz="4" w:space="0" w:color="BFBFBF"/>
+              <w:bottom w:val="single" w:sz="4" w:space="0" w:color="BFBFBF"/>
+              <w:right w:val="single" w:sz="4" w:space="0" w:color="BFBFBF"/>
+            </w:tcBorders>
+            <w:tcMar>
+              <w:top w:w="60" w:type="dxa"/>
+              <w:left w:w="100" w:type="dxa"/>
+              <w:bottom w:w="60" w:type="dxa"/>
+              <w:right w:w="100" w:type="dxa"/>
+            </w:tcMar>
+          </w:tcPr>
+          <w:p>
+            <w:pPr>
+              <w:keepNext/>
+              <w:keepLines/>
+            </w:pPr>
+            <w:r>
+              <w:rPr>
+                <w:sz w:val="19"/>
+                <w:szCs w:val="19"/>
+              </w:rPr>
+              <w:t>10</w:t>
+            </w:r>
+          </w:p>
+        </w:tc>
+        <w:tc>
+          <w:tcPr>
+            <w:tcW w:w="2300" w:type="dxa"/>
+            <w:tcBorders>
+              <w:top w:val="single" w:sz="4" w:space="0" w:color="BFBFBF"/>
+              <w:left w:val="single" w:sz="4" w:space="0" w:color="BFBFBF"/>
+              <w:bottom w:val="single" w:sz="4" w:space="0" w:color="BFBFBF"/>
+              <w:right w:val="single" w:sz="4" w:space="0" w:color="BFBFBF"/>
+            </w:tcBorders>
+            <w:tcMar>
+              <w:top w:w="60" w:type="dxa"/>
+              <w:left w:w="100" w:type="dxa"/>
+              <w:bottom w:w="60" w:type="dxa"/>
+              <w:right w:w="100" w:type="dxa"/>
+            </w:tcMar>
+          </w:tcPr>
+          <w:p>
+            <w:pPr>
+              <w:keepNext/>
+              <w:keepLines/>
+            </w:pPr>
+            <w:r>
+              <w:rPr>
+                <w:sz w:val="19"/>
+                <w:szCs w:val="19"/>
+              </w:rPr>
+              <w:t>−</w:t>
+            </w:r>
+            <w:r>
+              <w:rPr>
+                <w:sz w:val="19"/>
+                <w:szCs w:val="19"/>
+              </w:rPr>
+              <w:t>0.11 [−0.17, −0.05]</w:t>
+            </w:r>
+          </w:p>
+        </w:tc>
+        <w:tc>
+          <w:tcPr>
+            <w:tcW w:w="2026" w:type="dxa"/>
+            <w:tcBorders>
+              <w:top w:val="single" w:sz="4" w:space="0" w:color="BFBFBF"/>
+              <w:left w:val="single" w:sz="4" w:space="0" w:color="BFBFBF"/>
+              <w:bottom w:val="single" w:sz="4" w:space="0" w:color="BFBFBF"/>
+              <w:right w:val="single" w:sz="4" w:space="0" w:color="BFBFBF"/>
+            </w:tcBorders>
+            <w:tcMar>
+              <w:top w:w="60" w:type="dxa"/>
+              <w:left w:w="100" w:type="dxa"/>
+              <w:bottom w:w="60" w:type="dxa"/>
+              <w:right w:w="100" w:type="dxa"/>
+            </w:tcMar>
+          </w:tcPr>
+          <w:p>
+            <w:pPr>
+              <w:keepNext/>
+              <w:keepLines/>
+            </w:pPr>
+            <w:r>
+              <w:rPr>
+                <w:sz w:val="19"/>
+                <w:szCs w:val="19"/>
+              </w:rPr>
+              <w:t>Not confirmed</w:t>
+            </w:r>
+          </w:p>
+        </w:tc>
+      </w:tr>
+      <w:tr>
+        <w:tblPrEx>
+          <w:tblCellMar>
+            <w:top w:w="0" w:type="dxa"/>
+            <w:bottom w:w="0" w:type="dxa"/>
+          </w:tblCellMar>
+        </w:tblPrEx>
+        <w:trPr>
+          <w:cantSplit/>
+        </w:trPr>
+        <w:tc>
+          <w:tcPr>
+            <w:tcW w:w="3700" w:type="dxa"/>
+            <w:tcBorders>
+              <w:top w:val="single" w:sz="4" w:space="0" w:color="BFBFBF"/>
+              <w:left w:val="single" w:sz="4" w:space="0" w:color="BFBFBF"/>
+              <w:bottom w:val="single" w:sz="4" w:space="0" w:color="BFBFBF"/>
+              <w:right w:val="single" w:sz="4" w:space="0" w:color="BFBFBF"/>
+            </w:tcBorders>
+            <w:tcMar>
+              <w:top w:w="60" w:type="dxa"/>
+              <w:left w:w="100" w:type="dxa"/>
+              <w:bottom w:w="60" w:type="dxa"/>
+              <w:right w:w="100" w:type="dxa"/>
+            </w:tcMar>
+          </w:tcPr>
+          <w:p>
+            <w:pPr>
+              <w:keepNext/>
+              <w:keepLines/>
+            </w:pPr>
+          </w:p>
+        </w:tc>
+        <w:tc>
+          <w:tcPr>
+            <w:tcW w:w="1000" w:type="dxa"/>
+            <w:tcBorders>
+              <w:top w:val="single" w:sz="4" w:space="0" w:color="BFBFBF"/>
+              <w:left w:val="single" w:sz="4" w:space="0" w:color="BFBFBF"/>
+              <w:bottom w:val="single" w:sz="4" w:space="0" w:color="BFBFBF"/>
+              <w:right w:val="single" w:sz="4" w:space="0" w:color="BFBFBF"/>
+            </w:tcBorders>
+            <w:tcMar>
+              <w:top w:w="60" w:type="dxa"/>
+              <w:left w:w="100" w:type="dxa"/>
+              <w:bottom w:w="60" w:type="dxa"/>
+              <w:right w:w="100" w:type="dxa"/>
+            </w:tcMar>
+          </w:tcPr>
+          <w:p>
+            <w:pPr>
+              <w:keepNext/>
+              <w:keepLines/>
+            </w:pPr>
+            <w:r>
+              <w:rPr>
+                <w:sz w:val="19"/>
+                <w:szCs w:val="19"/>
+              </w:rPr>
+              <w:t>20</w:t>
+            </w:r>
+          </w:p>
+        </w:tc>
+        <w:tc>
+          <w:tcPr>
+            <w:tcW w:w="2300" w:type="dxa"/>
+            <w:tcBorders>
+              <w:top w:val="single" w:sz="4" w:space="0" w:color="BFBFBF"/>
+              <w:left w:val="single" w:sz="4" w:space="0" w:color="BFBFBF"/>
+              <w:bottom w:val="single" w:sz="4" w:space="0" w:color="BFBFBF"/>
+              <w:right w:val="single" w:sz="4" w:space="0" w:color="BFBFBF"/>
+            </w:tcBorders>
+            <w:tcMar>
+              <w:top w:w="60" w:type="dxa"/>
+              <w:left w:w="100" w:type="dxa"/>
+              <w:bottom w:w="60" w:type="dxa"/>
+              <w:right w:w="100" w:type="dxa"/>
+            </w:tcMar>
+          </w:tcPr>
+          <w:p>
+            <w:pPr>
+              <w:keepNext/>
+              <w:keepLines/>
+            </w:pPr>
+            <w:r>
+              <w:rPr>
+                <w:sz w:val="19"/>
+                <w:szCs w:val="19"/>
+              </w:rPr>
+              <w:t>−</w:t>
+            </w:r>
+            <w:r>
+              <w:rPr>
+                <w:sz w:val="19"/>
+                <w:szCs w:val="19"/>
+              </w:rPr>
+              <w:t>0.11 [−0.16, −0.06]</w:t>
+            </w:r>
+          </w:p>
+        </w:tc>
+        <w:tc>
+          <w:tcPr>
+            <w:tcW w:w="2026" w:type="dxa"/>
+            <w:tcBorders>
+              <w:top w:val="single" w:sz="4" w:space="0" w:color="BFBFBF"/>
+              <w:left w:val="single" w:sz="4" w:space="0" w:color="BFBFBF"/>
+              <w:bottom w:val="single" w:sz="4" w:space="0" w:color="BFBFBF"/>
+              <w:right w:val="single" w:sz="4" w:space="0" w:color="BFBFBF"/>
+            </w:tcBorders>
+            <w:tcMar>
+              <w:top w:w="60" w:type="dxa"/>
+              <w:left w:w="100" w:type="dxa"/>
+              <w:bottom w:w="60" w:type="dxa"/>
+              <w:right w:w="100" w:type="dxa"/>
+            </w:tcMar>
+          </w:tcPr>
+          <w:p>
+            <w:pPr>
+              <w:keepNext/>
+              <w:keepLines/>
+            </w:pPr>
+          </w:p>
+        </w:tc>
+      </w:tr>
+      <w:tr>
+        <w:tblPrEx>
+          <w:tblCellMar>
+            <w:top w:w="0" w:type="dxa"/>
+            <w:bottom w:w="0" w:type="dxa"/>
+          </w:tblCellMar>
+        </w:tblPrEx>
+        <w:trPr>
+          <w:cantSplit/>
+        </w:trPr>
+        <w:tc>
+          <w:tcPr>
+            <w:tcW w:w="3700" w:type="dxa"/>
+            <w:tcBorders>
+              <w:top w:val="single" w:sz="4" w:space="0" w:color="BFBFBF"/>
+              <w:left w:val="single" w:sz="4" w:space="0" w:color="BFBFBF"/>
+              <w:bottom w:val="single" w:sz="4" w:space="0" w:color="BFBFBF"/>
+              <w:right w:val="single" w:sz="4" w:space="0" w:color="BFBFBF"/>
+            </w:tcBorders>
+            <w:tcMar>
+              <w:top w:w="60" w:type="dxa"/>
+              <w:left w:w="100" w:type="dxa"/>
+              <w:bottom w:w="60" w:type="dxa"/>
+              <w:right w:w="100" w:type="dxa"/>
+            </w:tcMar>
+          </w:tcPr>
+          <w:p>
+            <w:pPr>
+              <w:keepNext/>
+              <w:keepLines/>
+            </w:pPr>
+          </w:p>
+        </w:tc>
+        <w:tc>
+          <w:tcPr>
+            <w:tcW w:w="1000" w:type="dxa"/>
+            <w:tcBorders>
+              <w:top w:val="single" w:sz="4" w:space="0" w:color="BFBFBF"/>
+              <w:left w:val="single" w:sz="4" w:space="0" w:color="BFBFBF"/>
+              <w:bottom w:val="single" w:sz="4" w:space="0" w:color="BFBFBF"/>
+              <w:right w:val="single" w:sz="4" w:space="0" w:color="BFBFBF"/>
+            </w:tcBorders>
+            <w:tcMar>
+              <w:top w:w="60" w:type="dxa"/>
+              <w:left w:w="100" w:type="dxa"/>
+              <w:bottom w:w="60" w:type="dxa"/>
+              <w:right w:w="100" w:type="dxa"/>
+            </w:tcMar>
+          </w:tcPr>
+          <w:p>
+            <w:pPr>
+              <w:keepNext/>
+              <w:keepLines/>
+            </w:pPr>
+            <w:r>
+              <w:rPr>
+                <w:sz w:val="19"/>
+                <w:szCs w:val="19"/>
+              </w:rPr>
+              <w:t>50</w:t>
+            </w:r>
+          </w:p>
+        </w:tc>
+        <w:tc>
+          <w:tcPr>
+            <w:tcW w:w="2300" w:type="dxa"/>
+            <w:tcBorders>
+              <w:top w:val="single" w:sz="4" w:space="0" w:color="BFBFBF"/>
+              <w:left w:val="single" w:sz="4" w:space="0" w:color="BFBFBF"/>
+              <w:bottom w:val="single" w:sz="4" w:space="0" w:color="BFBFBF"/>
+              <w:right w:val="single" w:sz="4" w:space="0" w:color="BFBFBF"/>
+            </w:tcBorders>
+            <w:tcMar>
+              <w:top w:w="60" w:type="dxa"/>
+              <w:left w:w="100" w:type="dxa"/>
+              <w:bottom w:w="60" w:type="dxa"/>
+              <w:right w:w="100" w:type="dxa"/>
+            </w:tcMar>
+          </w:tcPr>
+          <w:p>
+            <w:pPr>
+              <w:keepNext/>
+              <w:keepLines/>
+            </w:pPr>
+            <w:r>
+              <w:rPr>
+                <w:sz w:val="19"/>
+                <w:szCs w:val="19"/>
+              </w:rPr>
+              <w:t>−</w:t>
+            </w:r>
+            <w:r>
+              <w:rPr>
+                <w:sz w:val="19"/>
+                <w:szCs w:val="19"/>
+              </w:rPr>
+              <w:t>0.07 [−0.15, −0.004]</w:t>
+            </w:r>
+          </w:p>
+        </w:tc>
+        <w:tc>
+          <w:tcPr>
+            <w:tcW w:w="2026" w:type="dxa"/>
+            <w:tcBorders>
+              <w:top w:val="single" w:sz="4" w:space="0" w:color="BFBFBF"/>
+              <w:left w:val="single" w:sz="4" w:space="0" w:color="BFBFBF"/>
+              <w:bottom w:val="single" w:sz="4" w:space="0" w:color="BFBFBF"/>
+              <w:right w:val="single" w:sz="4" w:space="0" w:color="BFBFBF"/>
+            </w:tcBorders>
+            <w:tcMar>
+              <w:top w:w="60" w:type="dxa"/>
+              <w:left w:w="100" w:type="dxa"/>
+              <w:bottom w:w="60" w:type="dxa"/>
+              <w:right w:w="100" w:type="dxa"/>
+            </w:tcMar>
+          </w:tcPr>
+          <w:p>
+            <w:pPr>
+              <w:keepNext/>
+              <w:keepLines/>
+            </w:pPr>
+          </w:p>
+        </w:tc>
+      </w:tr>
+      <w:tr>
+        <w:tblPrEx>
+          <w:tblCellMar>
+            <w:top w:w="0" w:type="dxa"/>
+            <w:bottom w:w="0" w:type="dxa"/>
+          </w:tblCellMar>
+        </w:tblPrEx>
+        <w:trPr>
+          <w:cantSplit/>
+        </w:trPr>
+        <w:tc>
+          <w:tcPr>
+            <w:tcW w:w="3700" w:type="dxa"/>
+            <w:tcBorders>
+              <w:top w:val="single" w:sz="4" w:space="0" w:color="BFBFBF"/>
+              <w:left w:val="single" w:sz="4" w:space="0" w:color="BFBFBF"/>
+              <w:bottom w:val="single" w:sz="4" w:space="0" w:color="BFBFBF"/>
+              <w:right w:val="single" w:sz="4" w:space="0" w:color="BFBFBF"/>
+            </w:tcBorders>
+            <w:tcMar>
+              <w:top w:w="60" w:type="dxa"/>
+              <w:left w:w="100" w:type="dxa"/>
+              <w:bottom w:w="60" w:type="dxa"/>
+              <w:right w:w="100" w:type="dxa"/>
+            </w:tcMar>
+          </w:tcPr>
+          <w:p>
+            <w:pPr>
+              <w:keepNext/>
+              <w:keepLines/>
+            </w:pPr>
+            <w:r>
+              <w:rPr>
+                <w:sz w:val="19"/>
+                <w:szCs w:val="19"/>
+              </w:rPr>
+              <w:t>H4: faster time to first token than text</w:t>
+            </w:r>
+          </w:p>
+        </w:tc>
+        <w:tc>
+          <w:tcPr>
+            <w:tcW w:w="1000" w:type="dxa"/>
+            <w:tcBorders>
+              <w:top w:val="single" w:sz="4" w:space="0" w:color="BFBFBF"/>
+              <w:left w:val="single" w:sz="4" w:space="0" w:color="BFBFBF"/>
+              <w:bottom w:val="single" w:sz="4" w:space="0" w:color="BFBFBF"/>
+              <w:right w:val="single" w:sz="4" w:space="0" w:color="BFBFBF"/>
+            </w:tcBorders>
+            <w:tcMar>
+              <w:top w:w="60" w:type="dxa"/>
+              <w:left w:w="100" w:type="dxa"/>
+              <w:bottom w:w="60" w:type="dxa"/>
+              <w:right w:w="100" w:type="dxa"/>
+            </w:tcMar>
+          </w:tcPr>
+          <w:p>
+            <w:pPr>
+              <w:keepNext/>
+              <w:keepLines/>
+            </w:pPr>
+            <w:r>
+              <w:rPr>
+                <w:sz w:val="19"/>
+                <w:szCs w:val="19"/>
+              </w:rPr>
+              <w:t>10 / 20 / 50</w:t>
+            </w:r>
+          </w:p>
+        </w:tc>
+        <w:tc>
+          <w:tcPr>
+            <w:tcW w:w="2300" w:type="dxa"/>
+            <w:tcBorders>
+              <w:top w:val="single" w:sz="4" w:space="0" w:color="BFBFBF"/>
+              <w:left w:val="single" w:sz="4" w:space="0" w:color="BFBFBF"/>
+              <w:bottom w:val="single" w:sz="4" w:space="0" w:color="BFBFBF"/>
+              <w:right w:val="single" w:sz="4" w:space="0" w:color="BFBFBF"/>
+            </w:tcBorders>
+            <w:tcMar>
+              <w:top w:w="60" w:type="dxa"/>
+              <w:left w:w="100" w:type="dxa"/>
+              <w:bottom w:w="60" w:type="dxa"/>
+              <w:right w:w="100" w:type="dxa"/>
+            </w:tcMar>
+          </w:tcPr>
+          <w:p>
+            <w:pPr>
+              <w:keepNext/>
+              <w:keepLines/>
+            </w:pPr>
+            <w:r>
+              <w:rPr>
+                <w:sz w:val="19"/>
+                <w:szCs w:val="19"/>
+              </w:rPr>
+              <w:t>−</w:t>
+            </w:r>
+            <w:r>
+              <w:rPr>
+                <w:sz w:val="19"/>
+                <w:szCs w:val="19"/>
+              </w:rPr>
+              <w:t>27% / −51% / −77%*</w:t>
+            </w:r>
+          </w:p>
+        </w:tc>
+        <w:tc>
+          <w:tcPr>
+            <w:tcW w:w="2026" w:type="dxa"/>
+            <w:tcBorders>
+              <w:top w:val="single" w:sz="4" w:space="0" w:color="BFBFBF"/>
+              <w:left w:val="single" w:sz="4" w:space="0" w:color="BFBFBF"/>
+              <w:bottom w:val="single" w:sz="4" w:space="0" w:color="BFBFBF"/>
+              <w:right w:val="single" w:sz="4" w:space="0" w:color="BFBFBF"/>
+            </w:tcBorders>
+            <w:tcMar>
+              <w:top w:w="60" w:type="dxa"/>
+              <w:left w:w="100" w:type="dxa"/>
+              <w:bottom w:w="60" w:type="dxa"/>
+              <w:right w:w="100" w:type="dxa"/>
+            </w:tcMar>
+          </w:tcPr>
+          <w:p>
+            <w:pPr>
+              <w:keepNext/>
+              <w:keepLines/>
+            </w:pPr>
+            <w:r>
+              <w:rPr>
+                <w:sz w:val="19"/>
+                <w:szCs w:val="19"/>
+              </w:rPr>
+              <w:t>Not tested in sequence (H3 failed); descriptive</w:t>
+            </w:r>
+          </w:p>
+        </w:tc>
+      </w:tr>
+    </w:tbl>
+    <w:p>
+      <w:pPr>
+        <w:spacing w:before="60" w:after="240"/>
+      </w:pPr>
+      <w:r>
+        <w:rPr>
+          <w:i/>
+          <w:iCs/>
+          <w:color w:val="52514E"/>
+          <w:sz w:val="18"/>
+          <w:szCs w:val="18"/>
+        </w:rPr>
+        <w:t>Table 13. INCART hypotheses (adapter: mean of three seeds; patient-cluster bootstrap, margin −0.05). *The N = 50 timing was re-measured under the GPU memory cap (Deviation 21a): the original run was distorted by memory paging (compact text 6.9 s instead of about 0.86 s).</w:t>
+      </w:r>
+    </w:p>
+    <w:tbl>
+      <w:tblPr>
+        <w:tblW w:w="9026" w:type="dxa"/>
+        <w:tblBorders>
+          <w:top w:val="single" w:sz="4" w:space="0" w:color="auto"/>
+          <w:left w:val="single" w:sz="4" w:space="0" w:color="auto"/>
+          <w:bottom w:val="single" w:sz="4" w:space="0" w:color="auto"/>
+          <w:right w:val="single" w:sz="4" w:space="0" w:color="auto"/>
+          <w:insideH w:val="single" w:sz="4" w:space="0" w:color="auto"/>
+          <w:insideV w:val="single" w:sz="4" w:space="0" w:color="auto"/>
+        </w:tblBorders>
+        <w:tblCellMar>
+          <w:left w:w="10" w:type="dxa"/>
+          <w:right w:w="10" w:type="dxa"/>
+        </w:tblCellMar>
+        <w:tblLook w:val="04A0" w:firstRow="1" w:lastRow="0" w:firstColumn="1" w:lastColumn="0" w:noHBand="0" w:noVBand="1"/>
+      </w:tblPr>
+      <w:tblGrid>
+        <w:gridCol w:w="800"/>
+        <w:gridCol w:w="2000"/>
+        <w:gridCol w:w="1800"/>
+        <w:gridCol w:w="2200"/>
+        <w:gridCol w:w="2226"/>
+      </w:tblGrid>
+      <w:tr>
+        <w:tblPrEx>
+          <w:tblCellMar>
+            <w:top w:w="0" w:type="dxa"/>
+            <w:bottom w:w="0" w:type="dxa"/>
+          </w:tblCellMar>
+        </w:tblPrEx>
+        <w:trPr>
+          <w:cantSplit/>
+          <w:tblHeader/>
+        </w:trPr>
+        <w:tc>
+          <w:tcPr>
+            <w:tcW w:w="800" w:type="dxa"/>
+            <w:tcBorders>
+              <w:top w:val="single" w:sz="4" w:space="0" w:color="BFBFBF"/>
+              <w:left w:val="single" w:sz="4" w:space="0" w:color="BFBFBF"/>
+              <w:bottom w:val="single" w:sz="4" w:space="0" w:color="BFBFBF"/>
+              <w:right w:val="single" w:sz="4" w:space="0" w:color="BFBFBF"/>
+            </w:tcBorders>
+            <w:shd w:val="clear" w:color="auto" w:fill="E8EEF7"/>
+            <w:tcMar>
+              <w:top w:w="60" w:type="dxa"/>
+              <w:left w:w="100" w:type="dxa"/>
+              <w:bottom w:w="60" w:type="dxa"/>
+              <w:right w:w="100" w:type="dxa"/>
+            </w:tcMar>
+          </w:tcPr>
+          <w:p>
+            <w:pPr>
+              <w:keepNext/>
+              <w:keepLines/>
+            </w:pPr>
+            <w:r>
+              <w:rPr>
+                <w:b/>
+                <w:bCs/>
+                <w:sz w:val="19"/>
+                <w:szCs w:val="19"/>
+              </w:rPr>
+              <w:t>N</w:t>
+            </w:r>
+          </w:p>
+        </w:tc>
+        <w:tc>
+          <w:tcPr>
+            <w:tcW w:w="2000" w:type="dxa"/>
+            <w:tcBorders>
+              <w:top w:val="single" w:sz="4" w:space="0" w:color="BFBFBF"/>
+              <w:left w:val="single" w:sz="4" w:space="0" w:color="BFBFBF"/>
+              <w:bottom w:val="single" w:sz="4" w:space="0" w:color="BFBFBF"/>
+              <w:right w:val="single" w:sz="4" w:space="0" w:color="BFBFBF"/>
+            </w:tcBorders>
+            <w:shd w:val="clear" w:color="auto" w:fill="E8EEF7"/>
+            <w:tcMar>
+              <w:top w:w="60" w:type="dxa"/>
+              <w:left w:w="100" w:type="dxa"/>
+              <w:bottom w:w="60" w:type="dxa"/>
+              <w:right w:w="100" w:type="dxa"/>
+            </w:tcMar>
+          </w:tcPr>
+          <w:p>
+            <w:pPr>
+              <w:keepNext/>
+              <w:keepLines/>
+            </w:pPr>
+            <w:r>
+              <w:rPr>
+                <w:b/>
+                <w:bCs/>
+                <w:sz w:val="19"/>
+                <w:szCs w:val="19"/>
+              </w:rPr>
+              <w:t>Adapter (3 seeds)</w:t>
+            </w:r>
+          </w:p>
+        </w:tc>
+        <w:tc>
+          <w:tcPr>
+            <w:tcW w:w="1800" w:type="dxa"/>
+            <w:tcBorders>
+              <w:top w:val="single" w:sz="4" w:space="0" w:color="BFBFBF"/>
+              <w:left w:val="single" w:sz="4" w:space="0" w:color="BFBFBF"/>
+              <w:bottom w:val="single" w:sz="4" w:space="0" w:color="BFBFBF"/>
+              <w:right w:val="single" w:sz="4" w:space="0" w:color="BFBFBF"/>
+            </w:tcBorders>
+            <w:shd w:val="clear" w:color="auto" w:fill="E8EEF7"/>
+            <w:tcMar>
+              <w:top w:w="60" w:type="dxa"/>
+              <w:left w:w="100" w:type="dxa"/>
+              <w:bottom w:w="60" w:type="dxa"/>
+              <w:right w:w="100" w:type="dxa"/>
+            </w:tcMar>
+          </w:tcPr>
+          <w:p>
+            <w:pPr>
+              <w:keepNext/>
+              <w:keepLines/>
+            </w:pPr>
+            <w:r>
+              <w:rPr>
+                <w:b/>
+                <w:bCs/>
+                <w:sz w:val="19"/>
+                <w:szCs w:val="19"/>
+              </w:rPr>
+              <w:t>Text</w:t>
+            </w:r>
+          </w:p>
+        </w:tc>
+        <w:tc>
+          <w:tcPr>
+            <w:tcW w:w="2200" w:type="dxa"/>
+            <w:tcBorders>
+              <w:top w:val="single" w:sz="4" w:space="0" w:color="BFBFBF"/>
+              <w:left w:val="single" w:sz="4" w:space="0" w:color="BFBFBF"/>
+              <w:bottom w:val="single" w:sz="4" w:space="0" w:color="BFBFBF"/>
+              <w:right w:val="single" w:sz="4" w:space="0" w:color="BFBFBF"/>
+            </w:tcBorders>
+            <w:shd w:val="clear" w:color="auto" w:fill="E8EEF7"/>
+            <w:tcMar>
+              <w:top w:w="60" w:type="dxa"/>
+              <w:left w:w="100" w:type="dxa"/>
+              <w:bottom w:w="60" w:type="dxa"/>
+              <w:right w:w="100" w:type="dxa"/>
+            </w:tcMar>
+          </w:tcPr>
+          <w:p>
+            <w:pPr>
+              <w:keepNext/>
+              <w:keepLines/>
+            </w:pPr>
+            <w:r>
+              <w:rPr>
+                <w:b/>
+                <w:bCs/>
+                <w:sz w:val="19"/>
+                <w:szCs w:val="19"/>
+              </w:rPr>
+              <w:t>Text, calibrated</w:t>
+            </w:r>
+          </w:p>
+        </w:tc>
+        <w:tc>
+          <w:tcPr>
+            <w:tcW w:w="2226" w:type="dxa"/>
+            <w:tcBorders>
+              <w:top w:val="single" w:sz="4" w:space="0" w:color="BFBFBF"/>
+              <w:left w:val="single" w:sz="4" w:space="0" w:color="BFBFBF"/>
+              <w:bottom w:val="single" w:sz="4" w:space="0" w:color="BFBFBF"/>
+              <w:right w:val="single" w:sz="4" w:space="0" w:color="BFBFBF"/>
+            </w:tcBorders>
+            <w:shd w:val="clear" w:color="auto" w:fill="E8EEF7"/>
+            <w:tcMar>
+              <w:top w:w="60" w:type="dxa"/>
+              <w:left w:w="100" w:type="dxa"/>
+              <w:bottom w:w="60" w:type="dxa"/>
+              <w:right w:w="100" w:type="dxa"/>
+            </w:tcMar>
+          </w:tcPr>
+          <w:p>
+            <w:pPr>
+              <w:keepNext/>
+              <w:keepLines/>
+            </w:pPr>
+            <w:r>
+              <w:rPr>
+                <w:b/>
+                <w:bCs/>
+                <w:sz w:val="19"/>
+                <w:szCs w:val="19"/>
+              </w:rPr>
+              <w:t>Filtered text</w:t>
+            </w:r>
+          </w:p>
+        </w:tc>
+      </w:tr>
+      <w:tr>
+        <w:tblPrEx>
+          <w:tblCellMar>
+            <w:top w:w="0" w:type="dxa"/>
+            <w:bottom w:w="0" w:type="dxa"/>
+          </w:tblCellMar>
+        </w:tblPrEx>
+        <w:trPr>
+          <w:cantSplit/>
+        </w:trPr>
+        <w:tc>
+          <w:tcPr>
+            <w:tcW w:w="800" w:type="dxa"/>
+            <w:tcBorders>
+              <w:top w:val="single" w:sz="4" w:space="0" w:color="BFBFBF"/>
+              <w:left w:val="single" w:sz="4" w:space="0" w:color="BFBFBF"/>
+              <w:bottom w:val="single" w:sz="4" w:space="0" w:color="BFBFBF"/>
+              <w:right w:val="single" w:sz="4" w:space="0" w:color="BFBFBF"/>
+            </w:tcBorders>
+            <w:tcMar>
+              <w:top w:w="60" w:type="dxa"/>
+              <w:left w:w="100" w:type="dxa"/>
+              <w:bottom w:w="60" w:type="dxa"/>
+              <w:right w:w="100" w:type="dxa"/>
+            </w:tcMar>
+          </w:tcPr>
+          <w:p>
+            <w:pPr>
+              <w:keepNext/>
+              <w:keepLines/>
+            </w:pPr>
+            <w:r>
+              <w:rPr>
+                <w:sz w:val="19"/>
+                <w:szCs w:val="19"/>
+              </w:rPr>
+              <w:t>1</w:t>
+            </w:r>
+          </w:p>
+        </w:tc>
+        <w:tc>
+          <w:tcPr>
+            <w:tcW w:w="2000" w:type="dxa"/>
+            <w:tcBorders>
+              <w:top w:val="single" w:sz="4" w:space="0" w:color="BFBFBF"/>
+              <w:left w:val="single" w:sz="4" w:space="0" w:color="BFBFBF"/>
+              <w:bottom w:val="single" w:sz="4" w:space="0" w:color="BFBFBF"/>
+              <w:right w:val="single" w:sz="4" w:space="0" w:color="BFBFBF"/>
+            </w:tcBorders>
+            <w:tcMar>
+              <w:top w:w="60" w:type="dxa"/>
+              <w:left w:w="100" w:type="dxa"/>
+              <w:bottom w:w="60" w:type="dxa"/>
+              <w:right w:w="100" w:type="dxa"/>
+            </w:tcMar>
+          </w:tcPr>
+          <w:p>
+            <w:pPr>
+              <w:keepNext/>
+              <w:keepLines/>
+            </w:pPr>
+            <w:r>
+              <w:rPr>
+                <w:sz w:val="19"/>
+                <w:szCs w:val="19"/>
+              </w:rPr>
+              <w:t>0.746</w:t>
+            </w:r>
+          </w:p>
+        </w:tc>
+        <w:tc>
+          <w:tcPr>
+            <w:tcW w:w="1800" w:type="dxa"/>
+            <w:tcBorders>
+              <w:top w:val="single" w:sz="4" w:space="0" w:color="BFBFBF"/>
+              <w:left w:val="single" w:sz="4" w:space="0" w:color="BFBFBF"/>
+              <w:bottom w:val="single" w:sz="4" w:space="0" w:color="BFBFBF"/>
+              <w:right w:val="single" w:sz="4" w:space="0" w:color="BFBFBF"/>
+            </w:tcBorders>
+            <w:tcMar>
+              <w:top w:w="60" w:type="dxa"/>
+              <w:left w:w="100" w:type="dxa"/>
+              <w:bottom w:w="60" w:type="dxa"/>
+              <w:right w:w="100" w:type="dxa"/>
+            </w:tcMar>
+          </w:tcPr>
+          <w:p>
+            <w:pPr>
+              <w:keepNext/>
+              <w:keepLines/>
+            </w:pPr>
+            <w:r>
+              <w:rPr>
+                <w:sz w:val="19"/>
+                <w:szCs w:val="19"/>
+              </w:rPr>
+              <w:t>0.983</w:t>
+            </w:r>
+          </w:p>
+        </w:tc>
+        <w:tc>
+          <w:tcPr>
+            <w:tcW w:w="2200" w:type="dxa"/>
+            <w:tcBorders>
+              <w:top w:val="single" w:sz="4" w:space="0" w:color="BFBFBF"/>
+              <w:left w:val="single" w:sz="4" w:space="0" w:color="BFBFBF"/>
+              <w:bottom w:val="single" w:sz="4" w:space="0" w:color="BFBFBF"/>
+              <w:right w:val="single" w:sz="4" w:space="0" w:color="BFBFBF"/>
+            </w:tcBorders>
+            <w:tcMar>
+              <w:top w:w="60" w:type="dxa"/>
+              <w:left w:w="100" w:type="dxa"/>
+              <w:bottom w:w="60" w:type="dxa"/>
+              <w:right w:w="100" w:type="dxa"/>
+            </w:tcMar>
+          </w:tcPr>
+          <w:p>
+            <w:pPr>
+              <w:keepNext/>
+              <w:keepLines/>
+            </w:pPr>
+            <w:r>
+              <w:rPr>
+                <w:sz w:val="19"/>
+                <w:szCs w:val="19"/>
+              </w:rPr>
+              <w:t>0.978</w:t>
+            </w:r>
+          </w:p>
+        </w:tc>
+        <w:tc>
+          <w:tcPr>
+            <w:tcW w:w="2226" w:type="dxa"/>
+            <w:tcBorders>
+              <w:top w:val="single" w:sz="4" w:space="0" w:color="BFBFBF"/>
+              <w:left w:val="single" w:sz="4" w:space="0" w:color="BFBFBF"/>
+              <w:bottom w:val="single" w:sz="4" w:space="0" w:color="BFBFBF"/>
+              <w:right w:val="single" w:sz="4" w:space="0" w:color="BFBFBF"/>
+            </w:tcBorders>
+            <w:tcMar>
+              <w:top w:w="60" w:type="dxa"/>
+              <w:left w:w="100" w:type="dxa"/>
+              <w:bottom w:w="60" w:type="dxa"/>
+              <w:right w:w="100" w:type="dxa"/>
+            </w:tcMar>
+          </w:tcPr>
+          <w:p>
+            <w:pPr>
+              <w:keepNext/>
+              <w:keepLines/>
+            </w:pPr>
+            <w:r>
+              <w:rPr>
+                <w:sz w:val="19"/>
+                <w:szCs w:val="19"/>
+              </w:rPr>
+              <w:t>0.972</w:t>
+            </w:r>
+          </w:p>
+        </w:tc>
+      </w:tr>
+      <w:tr>
+        <w:tblPrEx>
+          <w:tblCellMar>
+            <w:top w:w="0" w:type="dxa"/>
+            <w:bottom w:w="0" w:type="dxa"/>
+          </w:tblCellMar>
+        </w:tblPrEx>
+        <w:trPr>
+          <w:cantSplit/>
+        </w:trPr>
+        <w:tc>
+          <w:tcPr>
+            <w:tcW w:w="800" w:type="dxa"/>
+            <w:tcBorders>
+              <w:top w:val="single" w:sz="4" w:space="0" w:color="BFBFBF"/>
+              <w:left w:val="single" w:sz="4" w:space="0" w:color="BFBFBF"/>
+              <w:bottom w:val="single" w:sz="4" w:space="0" w:color="BFBFBF"/>
+              <w:right w:val="single" w:sz="4" w:space="0" w:color="BFBFBF"/>
+            </w:tcBorders>
+            <w:tcMar>
+              <w:top w:w="60" w:type="dxa"/>
+              <w:left w:w="100" w:type="dxa"/>
+              <w:bottom w:w="60" w:type="dxa"/>
+              <w:right w:w="100" w:type="dxa"/>
+            </w:tcMar>
+          </w:tcPr>
+          <w:p>
+            <w:pPr>
+              <w:keepNext/>
+              <w:keepLines/>
+            </w:pPr>
+            <w:r>
+              <w:rPr>
+                <w:sz w:val="19"/>
+                <w:szCs w:val="19"/>
+              </w:rPr>
+              <w:t>5</w:t>
+            </w:r>
+          </w:p>
+        </w:tc>
+        <w:tc>
+          <w:tcPr>
+            <w:tcW w:w="2000" w:type="dxa"/>
+            <w:tcBorders>
+              <w:top w:val="single" w:sz="4" w:space="0" w:color="BFBFBF"/>
+              <w:left w:val="single" w:sz="4" w:space="0" w:color="BFBFBF"/>
+              <w:bottom w:val="single" w:sz="4" w:space="0" w:color="BFBFBF"/>
+              <w:right w:val="single" w:sz="4" w:space="0" w:color="BFBFBF"/>
+            </w:tcBorders>
+            <w:tcMar>
+              <w:top w:w="60" w:type="dxa"/>
+              <w:left w:w="100" w:type="dxa"/>
+              <w:bottom w:w="60" w:type="dxa"/>
+              <w:right w:w="100" w:type="dxa"/>
+            </w:tcMar>
+          </w:tcPr>
+          <w:p>
+            <w:pPr>
+              <w:keepNext/>
+              <w:keepLines/>
+            </w:pPr>
+            <w:r>
+              <w:rPr>
+                <w:sz w:val="19"/>
+                <w:szCs w:val="19"/>
+              </w:rPr>
+              <w:t>0.789</w:t>
+            </w:r>
+          </w:p>
+        </w:tc>
+        <w:tc>
+          <w:tcPr>
+            <w:tcW w:w="1800" w:type="dxa"/>
+            <w:tcBorders>
+              <w:top w:val="single" w:sz="4" w:space="0" w:color="BFBFBF"/>
+              <w:left w:val="single" w:sz="4" w:space="0" w:color="BFBFBF"/>
+              <w:bottom w:val="single" w:sz="4" w:space="0" w:color="BFBFBF"/>
+              <w:right w:val="single" w:sz="4" w:space="0" w:color="BFBFBF"/>
+            </w:tcBorders>
+            <w:tcMar>
+              <w:top w:w="60" w:type="dxa"/>
+              <w:left w:w="100" w:type="dxa"/>
+              <w:bottom w:w="60" w:type="dxa"/>
+              <w:right w:w="100" w:type="dxa"/>
+            </w:tcMar>
+          </w:tcPr>
+          <w:p>
+            <w:pPr>
+              <w:keepNext/>
+              <w:keepLines/>
+            </w:pPr>
+            <w:r>
+              <w:rPr>
+                <w:sz w:val="19"/>
+                <w:szCs w:val="19"/>
+              </w:rPr>
+              <w:t>0.722</w:t>
+            </w:r>
+          </w:p>
+        </w:tc>
+        <w:tc>
+          <w:tcPr>
+            <w:tcW w:w="2200" w:type="dxa"/>
+            <w:tcBorders>
+              <w:top w:val="single" w:sz="4" w:space="0" w:color="BFBFBF"/>
+              <w:left w:val="single" w:sz="4" w:space="0" w:color="BFBFBF"/>
+              <w:bottom w:val="single" w:sz="4" w:space="0" w:color="BFBFBF"/>
+              <w:right w:val="single" w:sz="4" w:space="0" w:color="BFBFBF"/>
+            </w:tcBorders>
+            <w:tcMar>
+              <w:top w:w="60" w:type="dxa"/>
+              <w:left w:w="100" w:type="dxa"/>
+              <w:bottom w:w="60" w:type="dxa"/>
+              <w:right w:w="100" w:type="dxa"/>
+            </w:tcMar>
+          </w:tcPr>
+          <w:p>
+            <w:pPr>
+              <w:keepNext/>
+              <w:keepLines/>
+            </w:pPr>
+            <w:r>
+              <w:rPr>
+                <w:sz w:val="19"/>
+                <w:szCs w:val="19"/>
+              </w:rPr>
+              <w:t>0.806</w:t>
+            </w:r>
+          </w:p>
+        </w:tc>
+        <w:tc>
+          <w:tcPr>
+            <w:tcW w:w="2226" w:type="dxa"/>
+            <w:tcBorders>
+              <w:top w:val="single" w:sz="4" w:space="0" w:color="BFBFBF"/>
+              <w:left w:val="single" w:sz="4" w:space="0" w:color="BFBFBF"/>
+              <w:bottom w:val="single" w:sz="4" w:space="0" w:color="BFBFBF"/>
+              <w:right w:val="single" w:sz="4" w:space="0" w:color="BFBFBF"/>
+            </w:tcBorders>
+            <w:tcMar>
+              <w:top w:w="60" w:type="dxa"/>
+              <w:left w:w="100" w:type="dxa"/>
+              <w:bottom w:w="60" w:type="dxa"/>
+              <w:right w:w="100" w:type="dxa"/>
+            </w:tcMar>
+          </w:tcPr>
+          <w:p>
+            <w:pPr>
+              <w:keepNext/>
+              <w:keepLines/>
+            </w:pPr>
+            <w:r>
+              <w:rPr>
+                <w:sz w:val="19"/>
+                <w:szCs w:val="19"/>
+              </w:rPr>
+              <w:t>0.939</w:t>
+            </w:r>
+          </w:p>
+        </w:tc>
+      </w:tr>
+      <w:tr>
+        <w:tblPrEx>
+          <w:tblCellMar>
+            <w:top w:w="0" w:type="dxa"/>
+            <w:bottom w:w="0" w:type="dxa"/>
+          </w:tblCellMar>
+        </w:tblPrEx>
+        <w:trPr>
+          <w:cantSplit/>
+        </w:trPr>
+        <w:tc>
+          <w:tcPr>
+            <w:tcW w:w="800" w:type="dxa"/>
+            <w:tcBorders>
+              <w:top w:val="single" w:sz="4" w:space="0" w:color="BFBFBF"/>
+              <w:left w:val="single" w:sz="4" w:space="0" w:color="BFBFBF"/>
+              <w:bottom w:val="single" w:sz="4" w:space="0" w:color="BFBFBF"/>
+              <w:right w:val="single" w:sz="4" w:space="0" w:color="BFBFBF"/>
+            </w:tcBorders>
+            <w:tcMar>
+              <w:top w:w="60" w:type="dxa"/>
+              <w:left w:w="100" w:type="dxa"/>
+              <w:bottom w:w="60" w:type="dxa"/>
+              <w:right w:w="100" w:type="dxa"/>
+            </w:tcMar>
+          </w:tcPr>
+          <w:p>
+            <w:pPr>
+              <w:keepNext/>
+              <w:keepLines/>
+            </w:pPr>
+            <w:r>
+              <w:rPr>
+                <w:sz w:val="19"/>
+                <w:szCs w:val="19"/>
+              </w:rPr>
+              <w:t>10</w:t>
+            </w:r>
+          </w:p>
+        </w:tc>
+        <w:tc>
+          <w:tcPr>
+            <w:tcW w:w="2000" w:type="dxa"/>
+            <w:tcBorders>
+              <w:top w:val="single" w:sz="4" w:space="0" w:color="BFBFBF"/>
+              <w:left w:val="single" w:sz="4" w:space="0" w:color="BFBFBF"/>
+              <w:bottom w:val="single" w:sz="4" w:space="0" w:color="BFBFBF"/>
+              <w:right w:val="single" w:sz="4" w:space="0" w:color="BFBFBF"/>
+            </w:tcBorders>
+            <w:tcMar>
+              <w:top w:w="60" w:type="dxa"/>
+              <w:left w:w="100" w:type="dxa"/>
+              <w:bottom w:w="60" w:type="dxa"/>
+              <w:right w:w="100" w:type="dxa"/>
+            </w:tcMar>
+          </w:tcPr>
+          <w:p>
+            <w:pPr>
+              <w:keepNext/>
+              <w:keepLines/>
+            </w:pPr>
+            <w:r>
+              <w:rPr>
+                <w:sz w:val="19"/>
+                <w:szCs w:val="19"/>
+              </w:rPr>
+              <w:t>0.815</w:t>
+            </w:r>
+          </w:p>
+        </w:tc>
+        <w:tc>
+          <w:tcPr>
+            <w:tcW w:w="1800" w:type="dxa"/>
+            <w:tcBorders>
+              <w:top w:val="single" w:sz="4" w:space="0" w:color="BFBFBF"/>
+              <w:left w:val="single" w:sz="4" w:space="0" w:color="BFBFBF"/>
+              <w:bottom w:val="single" w:sz="4" w:space="0" w:color="BFBFBF"/>
+              <w:right w:val="single" w:sz="4" w:space="0" w:color="BFBFBF"/>
+            </w:tcBorders>
+            <w:tcMar>
+              <w:top w:w="60" w:type="dxa"/>
+              <w:left w:w="100" w:type="dxa"/>
+              <w:bottom w:w="60" w:type="dxa"/>
+              <w:right w:w="100" w:type="dxa"/>
+            </w:tcMar>
+          </w:tcPr>
+          <w:p>
+            <w:pPr>
+              <w:keepNext/>
+              <w:keepLines/>
+            </w:pPr>
+            <w:r>
+              <w:rPr>
+                <w:sz w:val="19"/>
+                <w:szCs w:val="19"/>
+              </w:rPr>
+              <w:t>0.583</w:t>
+            </w:r>
+          </w:p>
+        </w:tc>
+        <w:tc>
+          <w:tcPr>
+            <w:tcW w:w="2200" w:type="dxa"/>
+            <w:tcBorders>
+              <w:top w:val="single" w:sz="4" w:space="0" w:color="BFBFBF"/>
+              <w:left w:val="single" w:sz="4" w:space="0" w:color="BFBFBF"/>
+              <w:bottom w:val="single" w:sz="4" w:space="0" w:color="BFBFBF"/>
+              <w:right w:val="single" w:sz="4" w:space="0" w:color="BFBFBF"/>
+            </w:tcBorders>
+            <w:tcMar>
+              <w:top w:w="60" w:type="dxa"/>
+              <w:left w:w="100" w:type="dxa"/>
+              <w:bottom w:w="60" w:type="dxa"/>
+              <w:right w:w="100" w:type="dxa"/>
+            </w:tcMar>
+          </w:tcPr>
+          <w:p>
+            <w:pPr>
+              <w:keepNext/>
+              <w:keepLines/>
+            </w:pPr>
+            <w:r>
+              <w:rPr>
+                <w:sz w:val="19"/>
+                <w:szCs w:val="19"/>
+              </w:rPr>
+              <w:t>0.733</w:t>
+            </w:r>
+          </w:p>
+        </w:tc>
+        <w:tc>
+          <w:tcPr>
+            <w:tcW w:w="2226" w:type="dxa"/>
+            <w:tcBorders>
+              <w:top w:val="single" w:sz="4" w:space="0" w:color="BFBFBF"/>
+              <w:left w:val="single" w:sz="4" w:space="0" w:color="BFBFBF"/>
+              <w:bottom w:val="single" w:sz="4" w:space="0" w:color="BFBFBF"/>
+              <w:right w:val="single" w:sz="4" w:space="0" w:color="BFBFBF"/>
+            </w:tcBorders>
+            <w:tcMar>
+              <w:top w:w="60" w:type="dxa"/>
+              <w:left w:w="100" w:type="dxa"/>
+              <w:bottom w:w="60" w:type="dxa"/>
+              <w:right w:w="100" w:type="dxa"/>
+            </w:tcMar>
+          </w:tcPr>
+          <w:p>
+            <w:pPr>
+              <w:keepNext/>
+              <w:keepLines/>
+            </w:pPr>
+            <w:r>
+              <w:rPr>
+                <w:sz w:val="19"/>
+                <w:szCs w:val="19"/>
+              </w:rPr>
+              <w:t>0.939</w:t>
+            </w:r>
+          </w:p>
+        </w:tc>
+      </w:tr>
+      <w:tr>
+        <w:tblPrEx>
+          <w:tblCellMar>
+            <w:top w:w="0" w:type="dxa"/>
+            <w:bottom w:w="0" w:type="dxa"/>
+          </w:tblCellMar>
+        </w:tblPrEx>
+        <w:trPr>
+          <w:cantSplit/>
+        </w:trPr>
+        <w:tc>
+          <w:tcPr>
+            <w:tcW w:w="800" w:type="dxa"/>
+            <w:tcBorders>
+              <w:top w:val="single" w:sz="4" w:space="0" w:color="BFBFBF"/>
+              <w:left w:val="single" w:sz="4" w:space="0" w:color="BFBFBF"/>
+              <w:bottom w:val="single" w:sz="4" w:space="0" w:color="BFBFBF"/>
+              <w:right w:val="single" w:sz="4" w:space="0" w:color="BFBFBF"/>
+            </w:tcBorders>
+            <w:tcMar>
+              <w:top w:w="60" w:type="dxa"/>
+              <w:left w:w="100" w:type="dxa"/>
+              <w:bottom w:w="60" w:type="dxa"/>
+              <w:right w:w="100" w:type="dxa"/>
+            </w:tcMar>
+          </w:tcPr>
+          <w:p>
+            <w:pPr>
+              <w:keepNext/>
+              <w:keepLines/>
+            </w:pPr>
+            <w:r>
+              <w:rPr>
+                <w:sz w:val="19"/>
+                <w:szCs w:val="19"/>
+              </w:rPr>
+              <w:t>20</w:t>
+            </w:r>
+          </w:p>
+        </w:tc>
+        <w:tc>
+          <w:tcPr>
+            <w:tcW w:w="2000" w:type="dxa"/>
+            <w:tcBorders>
+              <w:top w:val="single" w:sz="4" w:space="0" w:color="BFBFBF"/>
+              <w:left w:val="single" w:sz="4" w:space="0" w:color="BFBFBF"/>
+              <w:bottom w:val="single" w:sz="4" w:space="0" w:color="BFBFBF"/>
+              <w:right w:val="single" w:sz="4" w:space="0" w:color="BFBFBF"/>
+            </w:tcBorders>
+            <w:tcMar>
+              <w:top w:w="60" w:type="dxa"/>
+              <w:left w:w="100" w:type="dxa"/>
+              <w:bottom w:w="60" w:type="dxa"/>
+              <w:right w:w="100" w:type="dxa"/>
+            </w:tcMar>
+          </w:tcPr>
+          <w:p>
+            <w:pPr>
+              <w:keepNext/>
+              <w:keepLines/>
+            </w:pPr>
+            <w:r>
+              <w:rPr>
+                <w:sz w:val="19"/>
+                <w:szCs w:val="19"/>
+              </w:rPr>
+              <w:t>0.822</w:t>
+            </w:r>
+          </w:p>
+        </w:tc>
+        <w:tc>
+          <w:tcPr>
+            <w:tcW w:w="1800" w:type="dxa"/>
+            <w:tcBorders>
+              <w:top w:val="single" w:sz="4" w:space="0" w:color="BFBFBF"/>
+              <w:left w:val="single" w:sz="4" w:space="0" w:color="BFBFBF"/>
+              <w:bottom w:val="single" w:sz="4" w:space="0" w:color="BFBFBF"/>
+              <w:right w:val="single" w:sz="4" w:space="0" w:color="BFBFBF"/>
+            </w:tcBorders>
+            <w:tcMar>
+              <w:top w:w="60" w:type="dxa"/>
+              <w:left w:w="100" w:type="dxa"/>
+              <w:bottom w:w="60" w:type="dxa"/>
+              <w:right w:w="100" w:type="dxa"/>
+            </w:tcMar>
+          </w:tcPr>
+          <w:p>
+            <w:pPr>
+              <w:keepNext/>
+              <w:keepLines/>
+            </w:pPr>
+            <w:r>
+              <w:rPr>
+                <w:sz w:val="19"/>
+                <w:szCs w:val="19"/>
+              </w:rPr>
+              <w:t>0.517</w:t>
+            </w:r>
+          </w:p>
+        </w:tc>
+        <w:tc>
+          <w:tcPr>
+            <w:tcW w:w="2200" w:type="dxa"/>
+            <w:tcBorders>
+              <w:top w:val="single" w:sz="4" w:space="0" w:color="BFBFBF"/>
+              <w:left w:val="single" w:sz="4" w:space="0" w:color="BFBFBF"/>
+              <w:bottom w:val="single" w:sz="4" w:space="0" w:color="BFBFBF"/>
+              <w:right w:val="single" w:sz="4" w:space="0" w:color="BFBFBF"/>
+            </w:tcBorders>
+            <w:tcMar>
+              <w:top w:w="60" w:type="dxa"/>
+              <w:left w:w="100" w:type="dxa"/>
+              <w:bottom w:w="60" w:type="dxa"/>
+              <w:right w:w="100" w:type="dxa"/>
+            </w:tcMar>
+          </w:tcPr>
+          <w:p>
+            <w:pPr>
+              <w:keepNext/>
+              <w:keepLines/>
+            </w:pPr>
+            <w:r>
+              <w:rPr>
+                <w:sz w:val="19"/>
+                <w:szCs w:val="19"/>
+              </w:rPr>
+              <w:t>0.728</w:t>
+            </w:r>
+          </w:p>
+        </w:tc>
+        <w:tc>
+          <w:tcPr>
+            <w:tcW w:w="2226" w:type="dxa"/>
+            <w:tcBorders>
+              <w:top w:val="single" w:sz="4" w:space="0" w:color="BFBFBF"/>
+              <w:left w:val="single" w:sz="4" w:space="0" w:color="BFBFBF"/>
+              <w:bottom w:val="single" w:sz="4" w:space="0" w:color="BFBFBF"/>
+              <w:right w:val="single" w:sz="4" w:space="0" w:color="BFBFBF"/>
+            </w:tcBorders>
+            <w:tcMar>
+              <w:top w:w="60" w:type="dxa"/>
+              <w:left w:w="100" w:type="dxa"/>
+              <w:bottom w:w="60" w:type="dxa"/>
+              <w:right w:w="100" w:type="dxa"/>
+            </w:tcMar>
+          </w:tcPr>
+          <w:p>
+            <w:pPr>
+              <w:keepNext/>
+              <w:keepLines/>
+            </w:pPr>
+            <w:r>
+              <w:rPr>
+                <w:sz w:val="19"/>
+                <w:szCs w:val="19"/>
+              </w:rPr>
+              <w:t>0.933</w:t>
+            </w:r>
+          </w:p>
+        </w:tc>
+      </w:tr>
+      <w:tr>
+        <w:tblPrEx>
+          <w:tblCellMar>
+            <w:top w:w="0" w:type="dxa"/>
+            <w:bottom w:w="0" w:type="dxa"/>
+          </w:tblCellMar>
+        </w:tblPrEx>
+        <w:trPr>
+          <w:cantSplit/>
+        </w:trPr>
+        <w:tc>
+          <w:tcPr>
+            <w:tcW w:w="800" w:type="dxa"/>
+            <w:tcBorders>
+              <w:top w:val="single" w:sz="4" w:space="0" w:color="BFBFBF"/>
+              <w:left w:val="single" w:sz="4" w:space="0" w:color="BFBFBF"/>
+              <w:bottom w:val="single" w:sz="4" w:space="0" w:color="BFBFBF"/>
+              <w:right w:val="single" w:sz="4" w:space="0" w:color="BFBFBF"/>
+            </w:tcBorders>
+            <w:tcMar>
+              <w:top w:w="60" w:type="dxa"/>
+              <w:left w:w="100" w:type="dxa"/>
+              <w:bottom w:w="60" w:type="dxa"/>
+              <w:right w:w="100" w:type="dxa"/>
+            </w:tcMar>
+          </w:tcPr>
+          <w:p>
+            <w:pPr>
+              <w:keepNext/>
+              <w:keepLines/>
+            </w:pPr>
+            <w:r>
+              <w:rPr>
+                <w:sz w:val="19"/>
+                <w:szCs w:val="19"/>
+              </w:rPr>
+              <w:t>50</w:t>
+            </w:r>
+          </w:p>
+        </w:tc>
+        <w:tc>
+          <w:tcPr>
+            <w:tcW w:w="2000" w:type="dxa"/>
+            <w:tcBorders>
+              <w:top w:val="single" w:sz="4" w:space="0" w:color="BFBFBF"/>
+              <w:left w:val="single" w:sz="4" w:space="0" w:color="BFBFBF"/>
+              <w:bottom w:val="single" w:sz="4" w:space="0" w:color="BFBFBF"/>
+              <w:right w:val="single" w:sz="4" w:space="0" w:color="BFBFBF"/>
+            </w:tcBorders>
+            <w:tcMar>
+              <w:top w:w="60" w:type="dxa"/>
+              <w:left w:w="100" w:type="dxa"/>
+              <w:bottom w:w="60" w:type="dxa"/>
+              <w:right w:w="100" w:type="dxa"/>
+            </w:tcMar>
+          </w:tcPr>
+          <w:p>
+            <w:pPr>
+              <w:keepNext/>
+              <w:keepLines/>
+            </w:pPr>
+            <w:r>
+              <w:rPr>
+                <w:sz w:val="19"/>
+                <w:szCs w:val="19"/>
+              </w:rPr>
+              <w:t>0.822</w:t>
+            </w:r>
+          </w:p>
+        </w:tc>
+        <w:tc>
+          <w:tcPr>
+            <w:tcW w:w="1800" w:type="dxa"/>
+            <w:tcBorders>
+              <w:top w:val="single" w:sz="4" w:space="0" w:color="BFBFBF"/>
+              <w:left w:val="single" w:sz="4" w:space="0" w:color="BFBFBF"/>
+              <w:bottom w:val="single" w:sz="4" w:space="0" w:color="BFBFBF"/>
+              <w:right w:val="single" w:sz="4" w:space="0" w:color="BFBFBF"/>
+            </w:tcBorders>
+            <w:tcMar>
+              <w:top w:w="60" w:type="dxa"/>
+              <w:left w:w="100" w:type="dxa"/>
+              <w:bottom w:w="60" w:type="dxa"/>
+              <w:right w:w="100" w:type="dxa"/>
+            </w:tcMar>
+          </w:tcPr>
+          <w:p>
+            <w:pPr>
+              <w:keepNext/>
+              <w:keepLines/>
+            </w:pPr>
+            <w:r>
+              <w:rPr>
+                <w:sz w:val="19"/>
+                <w:szCs w:val="19"/>
+              </w:rPr>
+              <w:t>0.533</w:t>
+            </w:r>
+          </w:p>
+        </w:tc>
+        <w:tc>
+          <w:tcPr>
+            <w:tcW w:w="2200" w:type="dxa"/>
+            <w:tcBorders>
+              <w:top w:val="single" w:sz="4" w:space="0" w:color="BFBFBF"/>
+              <w:left w:val="single" w:sz="4" w:space="0" w:color="BFBFBF"/>
+              <w:bottom w:val="single" w:sz="4" w:space="0" w:color="BFBFBF"/>
+              <w:right w:val="single" w:sz="4" w:space="0" w:color="BFBFBF"/>
+            </w:tcBorders>
+            <w:tcMar>
+              <w:top w:w="60" w:type="dxa"/>
+              <w:left w:w="100" w:type="dxa"/>
+              <w:bottom w:w="60" w:type="dxa"/>
+              <w:right w:w="100" w:type="dxa"/>
+            </w:tcMar>
+          </w:tcPr>
+          <w:p>
+            <w:pPr>
+              <w:keepNext/>
+              <w:keepLines/>
+            </w:pPr>
+            <w:r>
+              <w:rPr>
+                <w:sz w:val="19"/>
+                <w:szCs w:val="19"/>
+              </w:rPr>
+              <w:t>0.775</w:t>
+            </w:r>
+          </w:p>
+        </w:tc>
+        <w:tc>
+          <w:tcPr>
+            <w:tcW w:w="2226" w:type="dxa"/>
+            <w:tcBorders>
+              <w:top w:val="single" w:sz="4" w:space="0" w:color="BFBFBF"/>
+              <w:left w:val="single" w:sz="4" w:space="0" w:color="BFBFBF"/>
+              <w:bottom w:val="single" w:sz="4" w:space="0" w:color="BFBFBF"/>
+              <w:right w:val="single" w:sz="4" w:space="0" w:color="BFBFBF"/>
+            </w:tcBorders>
+            <w:tcMar>
+              <w:top w:w="60" w:type="dxa"/>
+              <w:left w:w="100" w:type="dxa"/>
+              <w:bottom w:w="60" w:type="dxa"/>
+              <w:right w:w="100" w:type="dxa"/>
+            </w:tcMar>
+          </w:tcPr>
+          <w:p>
+            <w:pPr>
+              <w:keepNext/>
+              <w:keepLines/>
+            </w:pPr>
+            <w:r>
+              <w:rPr>
+                <w:sz w:val="19"/>
+                <w:szCs w:val="19"/>
+              </w:rPr>
+              <w:t>0.892</w:t>
+            </w:r>
+          </w:p>
+        </w:tc>
+      </w:tr>
+    </w:tbl>
+    <w:p>
+      <w:pPr>
+        <w:spacing w:before="60" w:after="240"/>
+      </w:pPr>
+      <w:r>
+        <w:rPr>
+          <w:i/>
+          <w:iCs/>
+          <w:color w:val="52514E"/>
+          <w:sz w:val="18"/>
+          <w:szCs w:val="18"/>
+        </w:rPr>
+        <w:t>Table 14. Balanced accuracy on INCART by number of events (default decoding unless stated).</w:t>
+      </w:r>
+    </w:p>
+    <w:p>
+      <w:pPr>
+        <w:pStyle w:val="ListParagraph"/>
+        <w:numPr>
+          <w:ilvl w:val="0"/>
+          <w:numId w:val="2"/>
+        </w:numPr>
+        <w:spacing w:after="60"/>
+      </w:pPr>
+      <w:r>
+        <w:rPr>
+          <w:b/>
+          <w:bCs/>
+        </w:rPr>
+        <w:t>The primary accuracy claim replicates on external data.</w:t>
+      </w:r>
+      <w:r>
+        <w:t xml:space="preserve"> The adapter's advantage over calibrated text (+0.08 and +0.09 at 10 and 20 events) is close to MIT-BIH's (+0.10), on a different database, recording system and set of patients; at 50 events it is non-inferior.</w:t>
+      </w:r>
+    </w:p>
+    <w:p>
+      <w:pPr>
+        <w:pStyle w:val="ListParagraph"/>
+        <w:numPr>
+          <w:ilvl w:val="0"/>
+          <w:numId w:val="2"/>
+        </w:numPr>
+        <w:spacing w:after="60"/>
+      </w:pPr>
+      <w:r>
+        <w:rPr>
+          <w:b/>
+          <w:bCs/>
+        </w:rPr>
+        <w:t>The negative result also replicates:</w:t>
+      </w:r>
+      <w:r>
+        <w:t xml:space="preserve"> filtered text is the most accurate arm at every number of events above one, so the design rule (filter when the question is known in advance) holds on independent data.</w:t>
+      </w:r>
+    </w:p>
+    <w:p>
+      <w:pPr>
+        <w:pStyle w:val="ListParagraph"/>
+        <w:numPr>
+          <w:ilvl w:val="0"/>
+          <w:numId w:val="2"/>
+        </w:numPr>
+        <w:spacing w:after="60"/>
+      </w:pPr>
+      <w:r>
+        <w:rPr>
+          <w:b/>
+          <w:bCs/>
+        </w:rPr>
+        <w:t>Efficiency replicates (descriptively).</w:t>
+      </w:r>
+      <w:r>
+        <w:t xml:space="preserve"> Time to first token −27% / −51% / −77% against compact text at 10 / 20 / 50 events (MIT-BIH −24% / −50% / −78%); no difference from filtered text. H4 is formally untested only because the registered order placed it after H3; in hindsight it should have come first.</w:t>
+      </w:r>
+    </w:p>
+    <w:p>
+      <w:pPr>
+        <w:pStyle w:val="ListParagraph"/>
+        <w:numPr>
+          <w:ilvl w:val="0"/>
+          <w:numId w:val="2"/>
+        </w:numPr>
+        <w:spacing w:after="60"/>
+      </w:pPr>
+      <w:r>
+        <w:rPr>
+          <w:b/>
+          <w:bCs/>
+        </w:rPr>
+        <w:t>Reliability:</w:t>
+      </w:r>
+      <w:r>
+        <w:t xml:space="preserve"> every arm gave a valid answer on every window; the adapter escalated 0.2–3.3% of routine windows (text 0%).</w:t>
+      </w:r>
+    </w:p>
+    <w:p>
+      <w:pPr>
+        <w:pStyle w:val="ListParagraph"/>
+        <w:numPr>
+          <w:ilvl w:val="0"/>
+          <w:numId w:val="2"/>
+        </w:numPr>
+        <w:spacing w:after="60"/>
+      </w:pPr>
+      <w:r>
+        <w:rPr>
+          <w:b/>
+          <w:bCs/>
+        </w:rPr>
+        <w:t>One technical deviation (21a):</w:t>
+      </w:r>
+      <w:r>
+        <w:t xml:space="preserve"> the timing routine has no memory cap, and compact text at 50 events was paged to system memory during the run. That step alone was re-measured under the cap, on the same windows with the frozen code unchanged, after registering the change; the original measurement is kept on record. No accuracy result is affected.</w:t>
+      </w:r>
+    </w:p>
+    <w:p>
+      <w:pPr>
+        <w:pStyle w:val="Heading1"/>
+        <w:keepNext/>
+        <w:keepLines/>
+      </w:pPr>
+      <w:bookmarkStart w:id="24" w:name="_Toc242050178"/>
+      <w:r>
+        <w:t>12. Status of the research questions</w:t>
+      </w:r>
+      <w:bookmarkEnd w:id="24"/>
     </w:p>
     <w:tbl>
       <w:tblPr>
@@ -16769,7 +19323,7 @@
                 <w:sz w:val="19"/>
                 <w:szCs w:val="19"/>
               </w:rPr>
-              <w:t>Resolved with seeds and held-out patients: superior to calibrated text at N = 10–20 and non-inferior at 5 and 50 (r4); superior to default text at N = 5–50; false alarms reduced to 3.6% (text 0%); text remains preferable for single events. Filtered text is more accurate at every N; second sender superior to calibrated text at N = 10 and non-inferior at 20 and 50</w:t>
+              <w:t>Resolved with seeds and held-out patients: superior to calibrated text at N = 10–20 and non-inferior at 5 and 50 (r4); superior to default text at N = 5–50; false alarms reduced to 3.6% (text 0%); text remains preferable for single events. Confirmed on an unseen database (INCART: non-inferior at 10–50 events, superior at 10 and 20). Filtered text is more accurate at every N; second sender superior to calibrated text at N = 10 and non-inferior at 20 and 50</w:t>
             </w:r>
           </w:p>
         </w:tc>
@@ -16888,7 +19442,7 @@
           <w:sz w:val="18"/>
           <w:szCs w:val="18"/>
         </w:rPr>
-        <w:t>Table 13. Research questions: dissertation answer and how Phase 1 refined or extended it.</w:t>
+        <w:t>Table 15. Research questions: dissertation answer and how Phase 1 refined or extended it.</w:t>
       </w:r>
     </w:p>
     <w:p>
@@ -16897,11 +19451,11 @@
         <w:keepNext/>
         <w:keepLines/>
       </w:pPr>
-      <w:bookmarkStart w:id="24" w:name="_Toc242032982"/>
+      <w:bookmarkStart w:id="25" w:name="_Toc242050179"/>
       <w:r>
-        <w:t>12. Limitations and threats to validity</w:t>
+        <w:t>13. Limitations and threats to validity</w:t>
       </w:r>
-      <w:bookmarkEnd w:id="24"/>
+      <w:bookmarkEnd w:id="25"/>
     </w:p>
     <w:p>
       <w:pPr>
@@ -16913,7 +19467,7 @@
         <w:spacing w:after="60"/>
       </w:pPr>
       <w:r>
-        <w:t>Many design changes (Deviations 9–19) were made after early results. Each was logged before the data it affected, but the DS2 test set has now informed several iterations. A confirmatory test of the frozen system on an unseen database (INCART) is pre-registered (Deviation 21).</w:t>
+        <w:t>Many design changes (Deviations 9–19) were made after early results. Each was logged before the data it affected, and the DS2 test set informed several iterations. This is addressed by the confirmatory test on INCART (Section 11), where the primary accuracy result replicated.</w:t>
       </w:r>
     </w:p>
     <w:p>
@@ -17036,11 +19590,11 @@
         <w:keepNext/>
         <w:keepLines/>
       </w:pPr>
-      <w:bookmarkStart w:id="25" w:name="_Toc242032983"/>
+      <w:bookmarkStart w:id="26" w:name="_Toc242050180"/>
       <w:r>
-        <w:t>13. Proposed next steps</w:t>
+        <w:t>14. Proposed next steps</w:t>
       </w:r>
-      <w:bookmarkEnd w:id="25"/>
+      <w:bookmarkEnd w:id="26"/>
     </w:p>
     <w:p>
       <w:pPr>
@@ -17056,10 +19610,10 @@
           <w:b/>
           <w:bCs/>
         </w:rPr>
-        <w:t>Confirmatory test on INCART</w:t>
+        <w:t>Paper:</w:t>
       </w:r>
       <w:r>
-        <w:t xml:space="preserve"> (32 patients, never used for any decision): the system is frozen and versioned first, then run once with fixed hypotheses (Deviation 21).</w:t>
+        <w:t xml:space="preserve"> a full draft for Information Fusion exists (all sections, including the INCART result); after supervisor review it will be revised and made submission-ready by 19 October 2026, with code, the analysis plan and all deviations released.</w:t>
       </w:r>
     </w:p>
     <w:p>
@@ -17100,7 +19654,7 @@
         <w:spacing w:after="120"/>
       </w:pPr>
       <w:r>
-        <w:t>Questions: (1) The framing is efficient communication between agents, with ECG triage as the case study; is TMLR or Engineering Applications of Artificial Intelligence the better fit? (2) Is one receiving language model acceptable for submission, with a second as future work? (3) Should a small clinician rating study be planned, given the ethics lead time? (4) How should the updated methods description (192 per-example updates) be recorded alongside the submitted dissertation?</w:t>
+        <w:t>Questions: (1) The draft is prepared for Information Fusion, framed as efficient communication between agents with ECG triage as the case study; is that the right venue? (2) Is one receiving language model acceptable for submission, with a second as future work? (3) Should a small clinician rating study be planned, given the ethics lead time? (4) How should the updated methods description (192 per-example updates) be recorded alongside the submitted dissertation?</w:t>
       </w:r>
     </w:p>
     <w:p>
@@ -17109,11 +19663,11 @@
         <w:keepNext/>
         <w:keepLines/>
       </w:pPr>
-      <w:bookmarkStart w:id="26" w:name="_Toc242032984"/>
+      <w:bookmarkStart w:id="27" w:name="_Toc242050181"/>
       <w:r>
         <w:t>Appendix A. Pre-registered deviations</w:t>
       </w:r>
-      <w:bookmarkEnd w:id="26"/>
+      <w:bookmarkEnd w:id="27"/>
     </w:p>
     <w:tbl>
       <w:tblPr>
@@ -18799,7 +21353,7 @@
                 <w:sz w:val="19"/>
                 <w:szCs w:val="19"/>
               </w:rPr>
-              <w:t>21</w:t>
+              <w:t>21 / 21a</w:t>
             </w:r>
           </w:p>
         </w:tc>
@@ -18829,7 +21383,7 @@
                 <w:sz w:val="19"/>
                 <w:szCs w:val="19"/>
               </w:rPr>
-              <w:t>Confirmatory test of the frozen system on INCART</w:t>
+              <w:t>Confirmatory test of the frozen system on INCART (H1, H2 confirmed; H3 not; H4 not tested in sequence); N = 50 timing re-measured under the memory cap</w:t>
             </w:r>
           </w:p>
         </w:tc>
@@ -18859,7 +21413,7 @@
                 <w:sz w:val="19"/>
                 <w:szCs w:val="19"/>
               </w:rPr>
-              <w:t>DS2 has informed several iterations</w:t>
+              <w:t>DS2 has informed several iterations; memory paging in the timing step</w:t>
             </w:r>
           </w:p>
         </w:tc>
@@ -19483,7 +22037,7 @@
           <w:sz w:val="18"/>
           <w:szCs w:val="18"/>
         </w:rPr>
-        <w:t>Table 14. Deviations 1–27 (full text in the analysis plan).</w:t>
+        <w:t>Table 16. Deviations 1–27 (full text in the analysis plan).</w:t>
       </w:r>
     </w:p>
     <w:sectPr>
@@ -19597,10 +22151,10 @@
 <file path=word/numbering.xml><?xml version="1.0" encoding="utf-8"?>
 <w:numbering xmlns:wpc="http://schemas.microsoft.com/office/word/2010/wordprocessingCanvas" xmlns:cx="http://schemas.microsoft.com/office/drawing/2014/chartex" xmlns:cx1="http://schemas.microsoft.com/office/drawing/2015/9/8/chartex" xmlns:cx2="http://schemas.microsoft.com/office/drawing/2015/10/21/chartex" xmlns:cx3="http://schemas.microsoft.com/office/drawing/2016/5/9/chartex" xmlns:cx4="http://schemas.microsoft.com/office/drawing/2016/5/10/chartex" xmlns:cx5="http://schemas.microsoft.com/office/drawing/2016/5/11/chartex" xmlns:cx6="http://schemas.microsoft.com/office/drawing/2016/5/12/chartex" xmlns:cx7="http://schemas.microsoft.com/office/drawing/2016/5/13/chartex" xmlns:cx8="http://schemas.microsoft.com/office/drawing/2016/5/14/chartex" xmlns:mc="http://schemas.openxmlformats.org/markup-compatibility/2006" xmlns:aink="http://schemas.microsoft.com/office/drawing/2016/ink" xmlns:am3d="http://schemas.microsoft.com/office/drawing/2017/model3d" xmlns:o="urn:schemas-microsoft-com:office:office" xmlns:oel="http://schemas.microsoft.com/office/2019/extlst" xmlns:r="http://schemas.openxmlformats.org/officeDocument/2006/relationships" xmlns:m="http://schemas.openxmlformats.org/officeDocument/2006/math" xmlns:v="urn:schemas-microsoft-com:vml" xmlns:wp14="http://schemas.microsoft.com/office/word/2010/wordprocessingDrawing" xmlns:wp="http://schemas.openxmlformats.org/drawingml/2006/wordprocessingDrawing" xmlns:w10="urn:schemas-microsoft-com:office:word" xmlns:w="http://schemas.openxmlformats.org/wordprocessingml/2006/main" xmlns:w14="http://schemas.microsoft.com/office/word/2010/wordml" xmlns:w15="http://schemas.microsoft.com/office/word/2012/wordml" xmlns:w16cex="http://schemas.microsoft.com/office/word/2018/wordml/cex" xmlns:w16cid="http://schemas.microsoft.com/office/word/2016/wordml/cid" xmlns:w16="http://schemas.microsoft.com/office/word/2018/wordml" xmlns:w16du="http://schemas.microsoft.com/office/word/2023/wordml/word16du" xmlns:w16sdtdh="http://schemas.microsoft.com/office/word/2020/wordml/sdtdatahash" xmlns:w16sdtfl="http://schemas.microsoft.com/office/word/2024/wordml/sdtformatlock" xmlns:w16se="http://schemas.microsoft.com/office/word/2015/wordml/symex" xmlns:wpg="http://schemas.microsoft.com/office/word/2010/wordprocessingGroup" xmlns:wpi="http://schemas.microsoft.com/office/word/2010/wordprocessingInk" xmlns:wne="http://schemas.microsoft.com/office/word/2006/wordml" xmlns:wps="http://schemas.microsoft.com/office/word/2010/wordprocessingShape" mc:Ignorable="w14 w15 w16se w16cid w16 w16cex w16sdtdh w16sdtfl w16du wp14">
   <w:abstractNum w:abstractNumId="0" w15:restartNumberingAfterBreak="0">
-    <w:nsid w:val="373C25A7"/>
+    <w:nsid w:val="05250780"/>
     <w:multiLevelType w:val="hybridMultilevel"/>
-    <w:tmpl w:val="53A8AF72"/>
-    <w:lvl w:ilvl="0" w:tplc="4AB2F0EC">
+    <w:tmpl w:val="EB54817A"/>
+    <w:lvl w:ilvl="0" w:tplc="8EC0C34C">
       <w:start w:val="1"/>
       <w:numFmt w:val="bullet"/>
       <w:lvlText w:val="•"/>
@@ -19609,52 +22163,106 @@
         <w:ind w:left="540" w:hanging="270"/>
       </w:pPr>
     </w:lvl>
-    <w:lvl w:ilvl="1" w:tplc="1B169058">
+    <w:lvl w:ilvl="1" w:tplc="F3FCB0AE">
       <w:numFmt w:val="decimal"/>
       <w:lvlText w:val=""/>
       <w:lvlJc w:val="left"/>
     </w:lvl>
-    <w:lvl w:ilvl="2" w:tplc="21760B50">
+    <w:lvl w:ilvl="2" w:tplc="81AE5358">
       <w:numFmt w:val="decimal"/>
       <w:lvlText w:val=""/>
       <w:lvlJc w:val="left"/>
     </w:lvl>
-    <w:lvl w:ilvl="3" w:tplc="6DB41986">
+    <w:lvl w:ilvl="3" w:tplc="E9863E1C">
       <w:numFmt w:val="decimal"/>
       <w:lvlText w:val=""/>
       <w:lvlJc w:val="left"/>
     </w:lvl>
-    <w:lvl w:ilvl="4" w:tplc="7AFCBCFC">
+    <w:lvl w:ilvl="4" w:tplc="21D8B7D2">
       <w:numFmt w:val="decimal"/>
       <w:lvlText w:val=""/>
       <w:lvlJc w:val="left"/>
     </w:lvl>
-    <w:lvl w:ilvl="5" w:tplc="A7449098">
+    <w:lvl w:ilvl="5" w:tplc="992E0FB4">
       <w:numFmt w:val="decimal"/>
       <w:lvlText w:val=""/>
       <w:lvlJc w:val="left"/>
     </w:lvl>
-    <w:lvl w:ilvl="6" w:tplc="B2E6AFDC">
+    <w:lvl w:ilvl="6" w:tplc="EA80D9C8">
       <w:numFmt w:val="decimal"/>
       <w:lvlText w:val=""/>
       <w:lvlJc w:val="left"/>
     </w:lvl>
-    <w:lvl w:ilvl="7" w:tplc="0332E8F6">
+    <w:lvl w:ilvl="7" w:tplc="523C2DC6">
       <w:numFmt w:val="decimal"/>
       <w:lvlText w:val=""/>
       <w:lvlJc w:val="left"/>
     </w:lvl>
-    <w:lvl w:ilvl="8" w:tplc="B2E0EF28">
+    <w:lvl w:ilvl="8" w:tplc="81169002">
       <w:numFmt w:val="decimal"/>
       <w:lvlText w:val=""/>
       <w:lvlJc w:val="left"/>
     </w:lvl>
   </w:abstractNum>
   <w:abstractNum w:abstractNumId="1" w15:restartNumberingAfterBreak="0">
-    <w:nsid w:val="5F0A511C"/>
+    <w:nsid w:val="14860ACF"/>
     <w:multiLevelType w:val="hybridMultilevel"/>
-    <w:tmpl w:val="0D0605E8"/>
-    <w:lvl w:ilvl="0" w:tplc="E6F4ACCA" w:tentative="1">
+    <w:tmpl w:val="ACD8559C"/>
+    <w:lvl w:ilvl="0" w:tplc="9FA883BA">
+      <w:start w:val="1"/>
+      <w:numFmt w:val="decimal"/>
+      <w:lvlText w:val="%1."/>
+      <w:lvlJc w:val="left"/>
+      <w:pPr>
+        <w:ind w:left="540" w:hanging="300"/>
+      </w:pPr>
+    </w:lvl>
+    <w:lvl w:ilvl="1" w:tplc="D6F626D2">
+      <w:numFmt w:val="decimal"/>
+      <w:lvlText w:val=""/>
+      <w:lvlJc w:val="left"/>
+    </w:lvl>
+    <w:lvl w:ilvl="2" w:tplc="BFE8BB08">
+      <w:numFmt w:val="decimal"/>
+      <w:lvlText w:val=""/>
+      <w:lvlJc w:val="left"/>
+    </w:lvl>
+    <w:lvl w:ilvl="3" w:tplc="A13C2A78">
+      <w:numFmt w:val="decimal"/>
+      <w:lvlText w:val=""/>
+      <w:lvlJc w:val="left"/>
+    </w:lvl>
+    <w:lvl w:ilvl="4" w:tplc="906265FC">
+      <w:numFmt w:val="decimal"/>
+      <w:lvlText w:val=""/>
+      <w:lvlJc w:val="left"/>
+    </w:lvl>
+    <w:lvl w:ilvl="5" w:tplc="DE307B0A">
+      <w:numFmt w:val="decimal"/>
+      <w:lvlText w:val=""/>
+      <w:lvlJc w:val="left"/>
+    </w:lvl>
+    <w:lvl w:ilvl="6" w:tplc="8BBE5914">
+      <w:numFmt w:val="decimal"/>
+      <w:lvlText w:val=""/>
+      <w:lvlJc w:val="left"/>
+    </w:lvl>
+    <w:lvl w:ilvl="7" w:tplc="EA681ED4">
+      <w:numFmt w:val="decimal"/>
+      <w:lvlText w:val=""/>
+      <w:lvlJc w:val="left"/>
+    </w:lvl>
+    <w:lvl w:ilvl="8" w:tplc="FE606876">
+      <w:numFmt w:val="decimal"/>
+      <w:lvlText w:val=""/>
+      <w:lvlJc w:val="left"/>
+    </w:lvl>
+  </w:abstractNum>
+  <w:abstractNum w:abstractNumId="2" w15:restartNumberingAfterBreak="0">
+    <w:nsid w:val="6A115232"/>
+    <w:multiLevelType w:val="hybridMultilevel"/>
+    <w:tmpl w:val="11A063C4"/>
+    <w:lvl w:ilvl="0" w:tplc="E1086CE0" w:tentative="1">
       <w:start w:val="1"/>
       <w:numFmt w:val="bullet"/>
       <w:lvlText w:val="●"/>
@@ -19663,7 +22271,7 @@
         <w:ind w:left="720" w:hanging="360"/>
       </w:pPr>
     </w:lvl>
-    <w:lvl w:ilvl="1" w:tplc="41E08F96" w:tentative="1">
+    <w:lvl w:ilvl="1" w:tplc="3176E7B2" w:tentative="1">
       <w:start w:val="1"/>
       <w:numFmt w:val="bullet"/>
       <w:lvlText w:val="○"/>
@@ -19672,7 +22280,7 @@
         <w:ind w:left="1440" w:hanging="360"/>
       </w:pPr>
     </w:lvl>
-    <w:lvl w:ilvl="2" w:tplc="1408CCF2" w:tentative="1">
+    <w:lvl w:ilvl="2" w:tplc="4FDAEBE0" w:tentative="1">
       <w:start w:val="1"/>
       <w:numFmt w:val="bullet"/>
       <w:lvlText w:val="■"/>
@@ -19681,7 +22289,7 @@
         <w:ind w:left="2160" w:hanging="360"/>
       </w:pPr>
     </w:lvl>
-    <w:lvl w:ilvl="3" w:tplc="D8BC435A" w:tentative="1">
+    <w:lvl w:ilvl="3" w:tplc="8DA8CCC8" w:tentative="1">
       <w:start w:val="1"/>
       <w:numFmt w:val="bullet"/>
       <w:lvlText w:val="●"/>
@@ -19690,7 +22298,7 @@
         <w:ind w:left="2880" w:hanging="360"/>
       </w:pPr>
     </w:lvl>
-    <w:lvl w:ilvl="4" w:tplc="304C37CA" w:tentative="1">
+    <w:lvl w:ilvl="4" w:tplc="CB1EE36C" w:tentative="1">
       <w:start w:val="1"/>
       <w:numFmt w:val="bullet"/>
       <w:lvlText w:val="○"/>
@@ -19699,7 +22307,7 @@
         <w:ind w:left="3600" w:hanging="360"/>
       </w:pPr>
     </w:lvl>
-    <w:lvl w:ilvl="5" w:tplc="B954400C" w:tentative="1">
+    <w:lvl w:ilvl="5" w:tplc="32E4C60A" w:tentative="1">
       <w:start w:val="1"/>
       <w:numFmt w:val="bullet"/>
       <w:lvlText w:val="■"/>
@@ -19708,7 +22316,7 @@
         <w:ind w:left="4320" w:hanging="360"/>
       </w:pPr>
     </w:lvl>
-    <w:lvl w:ilvl="6" w:tplc="5CBC18AC" w:tentative="1">
+    <w:lvl w:ilvl="6" w:tplc="E5661072" w:tentative="1">
       <w:start w:val="1"/>
       <w:numFmt w:val="bullet"/>
       <w:lvlText w:val="●"/>
@@ -19717,7 +22325,7 @@
         <w:ind w:left="5040" w:hanging="360"/>
       </w:pPr>
     </w:lvl>
-    <w:lvl w:ilvl="7" w:tplc="FB241F94" w:tentative="1">
+    <w:lvl w:ilvl="7" w:tplc="21BEC57E" w:tentative="1">
       <w:start w:val="1"/>
       <w:numFmt w:val="bullet"/>
       <w:lvlText w:val="●"/>
@@ -19726,7 +22334,7 @@
         <w:ind w:left="5760" w:hanging="360"/>
       </w:pPr>
     </w:lvl>
-    <w:lvl w:ilvl="8" w:tplc="CB8AE138" w:tentative="1">
+    <w:lvl w:ilvl="8" w:tplc="294A4868" w:tentative="1">
       <w:start w:val="1"/>
       <w:numFmt w:val="bullet"/>
       <w:lvlText w:val="●"/>
@@ -19736,74 +22344,20 @@
       </w:pPr>
     </w:lvl>
   </w:abstractNum>
-  <w:abstractNum w:abstractNumId="2" w15:restartNumberingAfterBreak="0">
-    <w:nsid w:val="5F823B95"/>
-    <w:multiLevelType w:val="hybridMultilevel"/>
-    <w:tmpl w:val="28B2A324"/>
-    <w:lvl w:ilvl="0" w:tplc="12D25546">
-      <w:start w:val="1"/>
-      <w:numFmt w:val="decimal"/>
-      <w:lvlText w:val="%1."/>
-      <w:lvlJc w:val="left"/>
-      <w:pPr>
-        <w:ind w:left="540" w:hanging="300"/>
-      </w:pPr>
-    </w:lvl>
-    <w:lvl w:ilvl="1" w:tplc="CA720560">
-      <w:numFmt w:val="decimal"/>
-      <w:lvlText w:val=""/>
-      <w:lvlJc w:val="left"/>
-    </w:lvl>
-    <w:lvl w:ilvl="2" w:tplc="B060D49A">
-      <w:numFmt w:val="decimal"/>
-      <w:lvlText w:val=""/>
-      <w:lvlJc w:val="left"/>
-    </w:lvl>
-    <w:lvl w:ilvl="3" w:tplc="A1E0B25A">
-      <w:numFmt w:val="decimal"/>
-      <w:lvlText w:val=""/>
-      <w:lvlJc w:val="left"/>
-    </w:lvl>
-    <w:lvl w:ilvl="4" w:tplc="935E0890">
-      <w:numFmt w:val="decimal"/>
-      <w:lvlText w:val=""/>
-      <w:lvlJc w:val="left"/>
-    </w:lvl>
-    <w:lvl w:ilvl="5" w:tplc="F4E0C1B0">
-      <w:numFmt w:val="decimal"/>
-      <w:lvlText w:val=""/>
-      <w:lvlJc w:val="left"/>
-    </w:lvl>
-    <w:lvl w:ilvl="6" w:tplc="302EDC82">
-      <w:numFmt w:val="decimal"/>
-      <w:lvlText w:val=""/>
-      <w:lvlJc w:val="left"/>
-    </w:lvl>
-    <w:lvl w:ilvl="7" w:tplc="FFAC2918">
-      <w:numFmt w:val="decimal"/>
-      <w:lvlText w:val=""/>
-      <w:lvlJc w:val="left"/>
-    </w:lvl>
-    <w:lvl w:ilvl="8" w:tplc="FBFC9B6C">
-      <w:numFmt w:val="decimal"/>
-      <w:lvlText w:val=""/>
-      <w:lvlJc w:val="left"/>
-    </w:lvl>
-  </w:abstractNum>
-  <w:num w:numId="1" w16cid:durableId="562370846">
-    <w:abstractNumId w:val="1"/>
+  <w:num w:numId="1" w16cid:durableId="347218438">
+    <w:abstractNumId w:val="2"/>
     <w:lvlOverride w:ilvl="0">
       <w:startOverride w:val="1"/>
     </w:lvlOverride>
   </w:num>
-  <w:num w:numId="2" w16cid:durableId="2126581823">
+  <w:num w:numId="2" w16cid:durableId="1735084718">
     <w:abstractNumId w:val="0"/>
     <w:lvlOverride w:ilvl="0">
       <w:startOverride w:val="1"/>
     </w:lvlOverride>
   </w:num>
-  <w:num w:numId="3" w16cid:durableId="351537759">
-    <w:abstractNumId w:val="2"/>
+  <w:num w:numId="3" w16cid:durableId="922567430">
+    <w:abstractNumId w:val="1"/>
     <w:lvlOverride w:ilvl="0">
       <w:startOverride w:val="1"/>
     </w:lvlOverride>
@@ -20440,7 +22994,7 @@
     <w:autoRedefine/>
     <w:uiPriority w:val="39"/>
     <w:unhideWhenUsed/>
-    <w:rsid w:val="00A86867"/>
+    <w:rsid w:val="00A74C57"/>
     <w:pPr>
       <w:spacing w:after="100"/>
     </w:pPr>
@@ -20452,7 +23006,7 @@
     <w:autoRedefine/>
     <w:uiPriority w:val="39"/>
     <w:unhideWhenUsed/>
-    <w:rsid w:val="00A86867"/>
+    <w:rsid w:val="00A74C57"/>
     <w:pPr>
       <w:spacing w:after="100"/>
       <w:ind w:left="210"/>

</xml_diff>